<commit_message>
add implementation for longest consecutive sequence using hash table
</commit_message>
<xml_diff>
--- a/docs/PATTERNS.docx
+++ b/docs/PATTERNS.docx
@@ -5,16 +5,111 @@
     <w:p>
       <w:pPr>
         <w:rPr>
-          <w:lang w:val="en-US"/>
-        </w:rPr>
-      </w:pPr>
-      <w:r>
-        <w:rPr>
           <w:b/>
           <w:bCs/>
           <w:color w:val="C00000"/>
           <w:lang w:val="en-US"/>
         </w:rPr>
+      </w:pPr>
+      <w:proofErr w:type="gramStart"/>
+      <w:r>
+        <w:rPr>
+          <w:b/>
+          <w:bCs/>
+          <w:color w:val="C00000"/>
+          <w:lang w:val="en-US"/>
+        </w:rPr>
+        <w:t>TOP-K</w:t>
+      </w:r>
+      <w:proofErr w:type="gramEnd"/>
+      <w:r>
+        <w:rPr>
+          <w:b/>
+          <w:bCs/>
+          <w:color w:val="C00000"/>
+          <w:lang w:val="en-US"/>
+        </w:rPr>
+        <w:t xml:space="preserve"> ITEMS: </w:t>
+      </w:r>
+      <w:r>
+        <w:rPr>
+          <w:lang w:val="en-US"/>
+        </w:rPr>
+        <w:t xml:space="preserve">BUCKET SORT </w:t>
+      </w:r>
+      <w:r>
+        <w:rPr>
+          <w:lang w:val="en-US"/>
+        </w:rPr>
+        <w:sym w:font="Wingdings" w:char="F0E0"/>
+      </w:r>
+      <w:r>
+        <w:rPr>
+          <w:lang w:val="en-US"/>
+        </w:rPr>
+        <w:t xml:space="preserve"> see </w:t>
+      </w:r>
+      <w:r>
+        <w:rPr>
+          <w:i/>
+          <w:iCs/>
+          <w:lang w:val="en-US"/>
+        </w:rPr>
+        <w:t>1_Arrays&amp;</w:t>
+      </w:r>
+      <w:proofErr w:type="gramStart"/>
+      <w:r>
+        <w:rPr>
+          <w:i/>
+          <w:iCs/>
+          <w:lang w:val="en-US"/>
+        </w:rPr>
+        <w:t>String</w:t>
+      </w:r>
+      <w:r>
+        <w:rPr>
+          <w:i/>
+          <w:iCs/>
+          <w:lang w:val="en-US"/>
+        </w:rPr>
+        <w:t xml:space="preserve"> </w:t>
+      </w:r>
+      <w:r>
+        <w:rPr>
+          <w:lang w:val="en-US"/>
+        </w:rPr>
+        <w:t xml:space="preserve"> problem</w:t>
+      </w:r>
+      <w:proofErr w:type="gramEnd"/>
+      <w:r>
+        <w:rPr>
+          <w:lang w:val="en-US"/>
+        </w:rPr>
+        <w:t xml:space="preserve"> </w:t>
+      </w:r>
+      <w:r>
+        <w:rPr>
+          <w:b/>
+          <w:bCs/>
+          <w:highlight w:val="yellow"/>
+          <w:lang w:val="en-US"/>
+        </w:rPr>
+        <w:t>347</w:t>
+      </w:r>
+    </w:p>
+    <w:p>
+      <w:pPr>
+        <w:rPr>
+          <w:lang w:val="en-US"/>
+        </w:rPr>
+      </w:pPr>
+      <w:r>
+        <w:rPr>
+          <w:b/>
+          <w:bCs/>
+          <w:color w:val="C00000"/>
+          <w:lang w:val="en-US"/>
+        </w:rPr>
         <w:t>PREFIX &amp; SUFFIX SUM</w:t>
       </w:r>
       <w:r>
@@ -25,33 +120,26 @@
       </w:r>
       <w:r>
         <w:rPr>
-          <w:lang w:val="en-US"/>
-        </w:rPr>
-        <w:t>1_</w:t>
-      </w:r>
-      <w:r>
-        <w:rPr>
-          <w:lang w:val="en-US"/>
-        </w:rPr>
-        <w:t>Array</w:t>
-      </w:r>
-      <w:r>
-        <w:rPr>
-          <w:lang w:val="en-US"/>
-        </w:rPr>
-        <w:t>s</w:t>
-      </w:r>
-      <w:r>
-        <w:rPr>
-          <w:lang w:val="en-US"/>
-        </w:rPr>
-        <w:t>&amp;</w:t>
-      </w:r>
-      <w:r>
-        <w:rPr>
-          <w:lang w:val="en-US"/>
-        </w:rPr>
-        <w:t>String problem 238</w:t>
+          <w:i/>
+          <w:iCs/>
+          <w:lang w:val="en-US"/>
+        </w:rPr>
+        <w:t>1_Arrays&amp;String</w:t>
+      </w:r>
+      <w:r>
+        <w:rPr>
+          <w:lang w:val="en-US"/>
+        </w:rPr>
+        <w:t xml:space="preserve"> problem </w:t>
+      </w:r>
+      <w:r>
+        <w:rPr>
+          <w:b/>
+          <w:bCs/>
+          <w:highlight w:val="yellow"/>
+          <w:lang w:val="en-US"/>
+        </w:rPr>
+        <w:t>238</w:t>
       </w:r>
     </w:p>
     <w:sectPr>

</xml_diff>

<commit_message>
Add new string conversion methods to patterns document
</commit_message>
<xml_diff>
--- a/docs/PATTERNS.docx
+++ b/docs/PATTERNS.docx
@@ -55,7 +55,6 @@
           <w:lang w:val="en-US"/>
         </w:rPr>
       </w:pPr>
-      <w:proofErr w:type="gramStart"/>
       <w:r>
         <w:rPr>
           <w:b/>
@@ -63,17 +62,7 @@
           <w:color w:val="C00000"/>
           <w:lang w:val="en-US"/>
         </w:rPr>
-        <w:t>TOP-K</w:t>
-      </w:r>
-      <w:proofErr w:type="gramEnd"/>
-      <w:r>
-        <w:rPr>
-          <w:b/>
-          <w:bCs/>
-          <w:color w:val="C00000"/>
-          <w:lang w:val="en-US"/>
-        </w:rPr>
-        <w:t xml:space="preserve"> ITEMS: </w:t>
+        <w:t xml:space="preserve">TOP-K ITEMS: </w:t>
       </w:r>
       <w:r>
         <w:rPr>
@@ -107,37 +96,21 @@
           <w:iCs/>
           <w:lang w:val="en-US"/>
         </w:rPr>
-        <w:t>1_Arrays&amp;</w:t>
-      </w:r>
-      <w:proofErr w:type="gramStart"/>
+        <w:t>1_Arrays&amp;String</w:t>
+      </w:r>
       <w:r>
         <w:rPr>
           <w:i/>
           <w:iCs/>
           <w:lang w:val="en-US"/>
         </w:rPr>
-        <w:t>String</w:t>
-      </w:r>
-      <w:r>
-        <w:rPr>
-          <w:i/>
-          <w:iCs/>
-          <w:lang w:val="en-US"/>
-        </w:rPr>
         <w:t xml:space="preserve"> </w:t>
       </w:r>
       <w:r>
         <w:rPr>
           <w:lang w:val="en-US"/>
         </w:rPr>
-        <w:t xml:space="preserve"> problem</w:t>
-      </w:r>
-      <w:proofErr w:type="gramEnd"/>
-      <w:r>
-        <w:rPr>
-          <w:lang w:val="en-US"/>
-        </w:rPr>
-        <w:t xml:space="preserve"> </w:t>
+        <w:t xml:space="preserve"> problem </w:t>
       </w:r>
       <w:r>
         <w:rPr>
@@ -206,6 +179,8 @@
     <w:p>
       <w:pPr>
         <w:rPr>
+          <w:b/>
+          <w:bCs/>
           <w:lang w:val="en-US"/>
         </w:rPr>
       </w:pPr>
@@ -216,25 +191,7 @@
           <w:color w:val="C00000"/>
           <w:lang w:val="en-US"/>
         </w:rPr>
-        <w:t>LONGEST CONSECUTIVE SEQUENCE</w:t>
-      </w:r>
-      <w:r>
-        <w:rPr>
-          <w:b/>
-          <w:bCs/>
-          <w:color w:val="C00000"/>
-          <w:lang w:val="en-US"/>
-        </w:rPr>
-        <w:t>:</w:t>
-      </w:r>
-      <w:r>
-        <w:rPr>
-          <w:b/>
-          <w:bCs/>
-          <w:color w:val="C00000"/>
-          <w:lang w:val="en-US"/>
-        </w:rPr>
-        <w:t xml:space="preserve"> </w:t>
+        <w:t xml:space="preserve">LONGEST CONSECUTIVE SEQUENCE: </w:t>
       </w:r>
       <w:r>
         <w:rPr>
@@ -328,6 +285,719 @@
         </w:rPr>
         <w:t>8</w:t>
       </w:r>
+    </w:p>
+    <w:p>
+      <w:pPr>
+        <w:rPr>
+          <w:b/>
+          <w:bCs/>
+          <w:lang w:val="en-US"/>
+        </w:rPr>
+      </w:pPr>
+    </w:p>
+    <w:p>
+      <w:pPr>
+        <w:rPr>
+          <w:b/>
+          <w:bCs/>
+          <w:lang w:val="en-US"/>
+        </w:rPr>
+      </w:pPr>
+      <w:r>
+        <w:rPr>
+          <w:b/>
+          <w:bCs/>
+          <w:color w:val="C00000"/>
+          <w:lang w:val="en-US"/>
+        </w:rPr>
+        <w:t>CONVERT STRING INTO INT READING FROM LEFT TO RIGHT:</w:t>
+      </w:r>
+    </w:p>
+    <w:p>
+      <w:pPr>
+        <w:shd w:val="clear" w:color="auto" w:fill="121314"/>
+        <w:spacing w:after="0" w:line="285" w:lineRule="atLeast"/>
+        <w:rPr>
+          <w:rFonts w:ascii="Consolas" w:eastAsia="Times New Roman" w:hAnsi="Consolas" w:cs="Times New Roman"/>
+          <w:color w:val="BBBEBF"/>
+          <w:kern w:val="0"/>
+          <w:sz w:val="21"/>
+          <w:szCs w:val="21"/>
+          <w:lang w:eastAsia="it-IT"/>
+          <w14:ligatures w14:val="none"/>
+        </w:rPr>
+      </w:pPr>
+      <w:proofErr w:type="spellStart"/>
+      <w:r>
+        <w:rPr>
+          <w:rFonts w:ascii="Consolas" w:eastAsia="Times New Roman" w:hAnsi="Consolas" w:cs="Times New Roman"/>
+          <w:color w:val="C9D1D9"/>
+          <w:kern w:val="0"/>
+          <w:sz w:val="21"/>
+          <w:szCs w:val="21"/>
+          <w:lang w:eastAsia="it-IT"/>
+          <w14:ligatures w14:val="none"/>
+        </w:rPr>
+        <w:t>multiplier</w:t>
+      </w:r>
+      <w:proofErr w:type="spellEnd"/>
+      <w:r>
+        <w:rPr>
+          <w:rFonts w:ascii="Consolas" w:eastAsia="Times New Roman" w:hAnsi="Consolas" w:cs="Times New Roman"/>
+          <w:color w:val="C9D1D9"/>
+          <w:kern w:val="0"/>
+          <w:sz w:val="21"/>
+          <w:szCs w:val="21"/>
+          <w:lang w:eastAsia="it-IT"/>
+          <w14:ligatures w14:val="none"/>
+        </w:rPr>
+        <w:t xml:space="preserve"> </w:t>
+      </w:r>
+      <w:r>
+        <w:rPr>
+          <w:rFonts w:ascii="Consolas" w:eastAsia="Times New Roman" w:hAnsi="Consolas" w:cs="Times New Roman"/>
+          <w:color w:val="D4D4D4"/>
+          <w:kern w:val="0"/>
+          <w:sz w:val="21"/>
+          <w:szCs w:val="21"/>
+          <w:lang w:eastAsia="it-IT"/>
+          <w14:ligatures w14:val="none"/>
+        </w:rPr>
+        <w:t>=</w:t>
+      </w:r>
+      <w:r>
+        <w:rPr>
+          <w:rFonts w:ascii="Consolas" w:eastAsia="Times New Roman" w:hAnsi="Consolas" w:cs="Times New Roman"/>
+          <w:color w:val="C9D1D9"/>
+          <w:kern w:val="0"/>
+          <w:sz w:val="21"/>
+          <w:szCs w:val="21"/>
+          <w:lang w:eastAsia="it-IT"/>
+          <w14:ligatures w14:val="none"/>
+        </w:rPr>
+        <w:t xml:space="preserve"> </w:t>
+      </w:r>
+      <w:r>
+        <w:rPr>
+          <w:rFonts w:ascii="Consolas" w:eastAsia="Times New Roman" w:hAnsi="Consolas" w:cs="Times New Roman"/>
+          <w:color w:val="B5CEA8"/>
+          <w:kern w:val="0"/>
+          <w:sz w:val="21"/>
+          <w:szCs w:val="21"/>
+          <w:lang w:eastAsia="it-IT"/>
+          <w14:ligatures w14:val="none"/>
+        </w:rPr>
+        <w:t>1</w:t>
+      </w:r>
+      <w:r>
+        <w:rPr>
+          <w:rFonts w:ascii="Consolas" w:eastAsia="Times New Roman" w:hAnsi="Consolas" w:cs="Times New Roman"/>
+          <w:color w:val="C9D1D9"/>
+          <w:kern w:val="0"/>
+          <w:sz w:val="21"/>
+          <w:szCs w:val="21"/>
+          <w:lang w:eastAsia="it-IT"/>
+          <w14:ligatures w14:val="none"/>
+        </w:rPr>
+        <w:t>;</w:t>
+      </w:r>
+    </w:p>
+    <w:p>
+      <w:pPr>
+        <w:shd w:val="clear" w:color="auto" w:fill="121314"/>
+        <w:spacing w:after="0" w:line="285" w:lineRule="atLeast"/>
+        <w:rPr>
+          <w:rFonts w:ascii="Consolas" w:eastAsia="Times New Roman" w:hAnsi="Consolas" w:cs="Times New Roman"/>
+          <w:color w:val="C9D1D9"/>
+          <w:kern w:val="0"/>
+          <w:sz w:val="21"/>
+          <w:szCs w:val="21"/>
+          <w:lang w:val="en-US" w:eastAsia="it-IT"/>
+          <w14:ligatures w14:val="none"/>
+        </w:rPr>
+      </w:pPr>
+    </w:p>
+    <w:p>
+      <w:pPr>
+        <w:shd w:val="clear" w:color="auto" w:fill="121314"/>
+        <w:spacing w:after="0" w:line="285" w:lineRule="atLeast"/>
+        <w:rPr>
+          <w:rFonts w:ascii="Consolas" w:eastAsia="Times New Roman" w:hAnsi="Consolas" w:cs="Times New Roman"/>
+          <w:color w:val="C9D1D9"/>
+          <w:kern w:val="0"/>
+          <w:sz w:val="21"/>
+          <w:szCs w:val="21"/>
+          <w:lang w:val="en-US" w:eastAsia="it-IT"/>
+          <w14:ligatures w14:val="none"/>
+        </w:rPr>
+      </w:pPr>
+      <w:r>
+        <w:rPr>
+          <w:rFonts w:ascii="Consolas" w:eastAsia="Times New Roman" w:hAnsi="Consolas" w:cs="Times New Roman"/>
+          <w:color w:val="C9D1D9"/>
+          <w:kern w:val="0"/>
+          <w:sz w:val="21"/>
+          <w:szCs w:val="21"/>
+          <w:lang w:val="en-US" w:eastAsia="it-IT"/>
+          <w14:ligatures w14:val="none"/>
+        </w:rPr>
+        <w:t>…</w:t>
+      </w:r>
+    </w:p>
+    <w:p>
+      <w:pPr>
+        <w:shd w:val="clear" w:color="auto" w:fill="121314"/>
+        <w:spacing w:after="0" w:line="285" w:lineRule="atLeast"/>
+        <w:rPr>
+          <w:rFonts w:ascii="Consolas" w:eastAsia="Times New Roman" w:hAnsi="Consolas" w:cs="Times New Roman"/>
+          <w:color w:val="BBBEBF"/>
+          <w:kern w:val="0"/>
+          <w:sz w:val="21"/>
+          <w:szCs w:val="21"/>
+          <w:lang w:val="en-US" w:eastAsia="it-IT"/>
+          <w14:ligatures w14:val="none"/>
+        </w:rPr>
+      </w:pPr>
+      <w:proofErr w:type="spellStart"/>
+      <w:r>
+        <w:rPr>
+          <w:rFonts w:ascii="Consolas" w:eastAsia="Times New Roman" w:hAnsi="Consolas" w:cs="Times New Roman"/>
+          <w:color w:val="C9D1D9"/>
+          <w:kern w:val="0"/>
+          <w:sz w:val="21"/>
+          <w:szCs w:val="21"/>
+          <w:lang w:val="en-US" w:eastAsia="it-IT"/>
+          <w14:ligatures w14:val="none"/>
+        </w:rPr>
+        <w:t>totWords</w:t>
+      </w:r>
+      <w:proofErr w:type="spellEnd"/>
+      <w:r>
+        <w:rPr>
+          <w:rFonts w:ascii="Consolas" w:eastAsia="Times New Roman" w:hAnsi="Consolas" w:cs="Times New Roman"/>
+          <w:color w:val="C9D1D9"/>
+          <w:kern w:val="0"/>
+          <w:sz w:val="21"/>
+          <w:szCs w:val="21"/>
+          <w:lang w:val="en-US" w:eastAsia="it-IT"/>
+          <w14:ligatures w14:val="none"/>
+        </w:rPr>
+        <w:t xml:space="preserve"> </w:t>
+      </w:r>
+      <w:r>
+        <w:rPr>
+          <w:rFonts w:ascii="Consolas" w:eastAsia="Times New Roman" w:hAnsi="Consolas" w:cs="Times New Roman"/>
+          <w:color w:val="D4D4D4"/>
+          <w:kern w:val="0"/>
+          <w:sz w:val="21"/>
+          <w:szCs w:val="21"/>
+          <w:lang w:val="en-US" w:eastAsia="it-IT"/>
+          <w14:ligatures w14:val="none"/>
+        </w:rPr>
+        <w:t>+=</w:t>
+      </w:r>
+      <w:r>
+        <w:rPr>
+          <w:rFonts w:ascii="Consolas" w:eastAsia="Times New Roman" w:hAnsi="Consolas" w:cs="Times New Roman"/>
+          <w:color w:val="C9D1D9"/>
+          <w:kern w:val="0"/>
+          <w:sz w:val="21"/>
+          <w:szCs w:val="21"/>
+          <w:lang w:val="en-US" w:eastAsia="it-IT"/>
+          <w14:ligatures w14:val="none"/>
+        </w:rPr>
+        <w:t xml:space="preserve"> (</w:t>
+      </w:r>
+      <w:r>
+        <w:rPr>
+          <w:rFonts w:ascii="Consolas" w:eastAsia="Times New Roman" w:hAnsi="Consolas" w:cs="Times New Roman"/>
+          <w:color w:val="FFA657"/>
+          <w:kern w:val="0"/>
+          <w:sz w:val="21"/>
+          <w:szCs w:val="21"/>
+          <w:lang w:val="en-US" w:eastAsia="it-IT"/>
+          <w14:ligatures w14:val="none"/>
+        </w:rPr>
+        <w:t>str</w:t>
+      </w:r>
+      <w:r>
+        <w:rPr>
+          <w:rFonts w:ascii="Consolas" w:eastAsia="Times New Roman" w:hAnsi="Consolas" w:cs="Times New Roman"/>
+          <w:color w:val="C9D1D9"/>
+          <w:kern w:val="0"/>
+          <w:sz w:val="21"/>
+          <w:szCs w:val="21"/>
+          <w:lang w:val="en-US" w:eastAsia="it-IT"/>
+          <w14:ligatures w14:val="none"/>
+        </w:rPr>
+        <w:t xml:space="preserve">[p] </w:t>
+      </w:r>
+      <w:r>
+        <w:rPr>
+          <w:rFonts w:ascii="Consolas" w:eastAsia="Times New Roman" w:hAnsi="Consolas" w:cs="Times New Roman"/>
+          <w:color w:val="D4D4D4"/>
+          <w:kern w:val="0"/>
+          <w:sz w:val="21"/>
+          <w:szCs w:val="21"/>
+          <w:lang w:val="en-US" w:eastAsia="it-IT"/>
+          <w14:ligatures w14:val="none"/>
+        </w:rPr>
+        <w:t>-</w:t>
+      </w:r>
+      <w:r>
+        <w:rPr>
+          <w:rFonts w:ascii="Consolas" w:eastAsia="Times New Roman" w:hAnsi="Consolas" w:cs="Times New Roman"/>
+          <w:color w:val="C9D1D9"/>
+          <w:kern w:val="0"/>
+          <w:sz w:val="21"/>
+          <w:szCs w:val="21"/>
+          <w:lang w:val="en-US" w:eastAsia="it-IT"/>
+          <w14:ligatures w14:val="none"/>
+        </w:rPr>
+        <w:t xml:space="preserve"> </w:t>
+      </w:r>
+      <w:r>
+        <w:rPr>
+          <w:rFonts w:ascii="Consolas" w:eastAsia="Times New Roman" w:hAnsi="Consolas" w:cs="Times New Roman"/>
+          <w:color w:val="A5D6FF"/>
+          <w:kern w:val="0"/>
+          <w:sz w:val="21"/>
+          <w:szCs w:val="21"/>
+          <w:lang w:val="en-US" w:eastAsia="it-IT"/>
+          <w14:ligatures w14:val="none"/>
+        </w:rPr>
+        <w:t>'0'</w:t>
+      </w:r>
+      <w:r>
+        <w:rPr>
+          <w:rFonts w:ascii="Consolas" w:eastAsia="Times New Roman" w:hAnsi="Consolas" w:cs="Times New Roman"/>
+          <w:color w:val="C9D1D9"/>
+          <w:kern w:val="0"/>
+          <w:sz w:val="21"/>
+          <w:szCs w:val="21"/>
+          <w:lang w:val="en-US" w:eastAsia="it-IT"/>
+          <w14:ligatures w14:val="none"/>
+        </w:rPr>
+        <w:t xml:space="preserve">) </w:t>
+      </w:r>
+      <w:r>
+        <w:rPr>
+          <w:rFonts w:ascii="Consolas" w:eastAsia="Times New Roman" w:hAnsi="Consolas" w:cs="Times New Roman"/>
+          <w:color w:val="D4D4D4"/>
+          <w:kern w:val="0"/>
+          <w:sz w:val="21"/>
+          <w:szCs w:val="21"/>
+          <w:lang w:val="en-US" w:eastAsia="it-IT"/>
+          <w14:ligatures w14:val="none"/>
+        </w:rPr>
+        <w:t>*</w:t>
+      </w:r>
+      <w:r>
+        <w:rPr>
+          <w:rFonts w:ascii="Consolas" w:eastAsia="Times New Roman" w:hAnsi="Consolas" w:cs="Times New Roman"/>
+          <w:color w:val="C9D1D9"/>
+          <w:kern w:val="0"/>
+          <w:sz w:val="21"/>
+          <w:szCs w:val="21"/>
+          <w:lang w:val="en-US" w:eastAsia="it-IT"/>
+          <w14:ligatures w14:val="none"/>
+        </w:rPr>
+        <w:t xml:space="preserve"> multiplier;</w:t>
+      </w:r>
+    </w:p>
+    <w:p>
+      <w:pPr>
+        <w:shd w:val="clear" w:color="auto" w:fill="121314"/>
+        <w:spacing w:after="0" w:line="285" w:lineRule="atLeast"/>
+        <w:rPr>
+          <w:rFonts w:ascii="Consolas" w:eastAsia="Times New Roman" w:hAnsi="Consolas" w:cs="Times New Roman"/>
+          <w:color w:val="BBBEBF"/>
+          <w:kern w:val="0"/>
+          <w:sz w:val="21"/>
+          <w:szCs w:val="21"/>
+          <w:lang w:eastAsia="it-IT"/>
+          <w14:ligatures w14:val="none"/>
+        </w:rPr>
+      </w:pPr>
+      <w:proofErr w:type="spellStart"/>
+      <w:r>
+        <w:rPr>
+          <w:rFonts w:ascii="Consolas" w:eastAsia="Times New Roman" w:hAnsi="Consolas" w:cs="Times New Roman"/>
+          <w:color w:val="C9D1D9"/>
+          <w:kern w:val="0"/>
+          <w:sz w:val="21"/>
+          <w:szCs w:val="21"/>
+          <w:lang w:eastAsia="it-IT"/>
+          <w14:ligatures w14:val="none"/>
+        </w:rPr>
+        <w:t>multiplier</w:t>
+      </w:r>
+      <w:proofErr w:type="spellEnd"/>
+      <w:r>
+        <w:rPr>
+          <w:rFonts w:ascii="Consolas" w:eastAsia="Times New Roman" w:hAnsi="Consolas" w:cs="Times New Roman"/>
+          <w:color w:val="C9D1D9"/>
+          <w:kern w:val="0"/>
+          <w:sz w:val="21"/>
+          <w:szCs w:val="21"/>
+          <w:lang w:eastAsia="it-IT"/>
+          <w14:ligatures w14:val="none"/>
+        </w:rPr>
+        <w:t xml:space="preserve"> </w:t>
+      </w:r>
+      <w:r>
+        <w:rPr>
+          <w:rFonts w:ascii="Consolas" w:eastAsia="Times New Roman" w:hAnsi="Consolas" w:cs="Times New Roman"/>
+          <w:color w:val="D4D4D4"/>
+          <w:kern w:val="0"/>
+          <w:sz w:val="21"/>
+          <w:szCs w:val="21"/>
+          <w:lang w:eastAsia="it-IT"/>
+          <w14:ligatures w14:val="none"/>
+        </w:rPr>
+        <w:t>*=</w:t>
+      </w:r>
+      <w:r>
+        <w:rPr>
+          <w:rFonts w:ascii="Consolas" w:eastAsia="Times New Roman" w:hAnsi="Consolas" w:cs="Times New Roman"/>
+          <w:color w:val="C9D1D9"/>
+          <w:kern w:val="0"/>
+          <w:sz w:val="21"/>
+          <w:szCs w:val="21"/>
+          <w:lang w:eastAsia="it-IT"/>
+          <w14:ligatures w14:val="none"/>
+        </w:rPr>
+        <w:t xml:space="preserve"> </w:t>
+      </w:r>
+      <w:r>
+        <w:rPr>
+          <w:rFonts w:ascii="Consolas" w:eastAsia="Times New Roman" w:hAnsi="Consolas" w:cs="Times New Roman"/>
+          <w:color w:val="B5CEA8"/>
+          <w:kern w:val="0"/>
+          <w:sz w:val="21"/>
+          <w:szCs w:val="21"/>
+          <w:lang w:eastAsia="it-IT"/>
+          <w14:ligatures w14:val="none"/>
+        </w:rPr>
+        <w:t>10</w:t>
+      </w:r>
+      <w:r>
+        <w:rPr>
+          <w:rFonts w:ascii="Consolas" w:eastAsia="Times New Roman" w:hAnsi="Consolas" w:cs="Times New Roman"/>
+          <w:color w:val="C9D1D9"/>
+          <w:kern w:val="0"/>
+          <w:sz w:val="21"/>
+          <w:szCs w:val="21"/>
+          <w:lang w:eastAsia="it-IT"/>
+          <w14:ligatures w14:val="none"/>
+        </w:rPr>
+        <w:t>;</w:t>
+      </w:r>
+    </w:p>
+    <w:p>
+      <w:pPr>
+        <w:rPr>
+          <w:lang w:val="en-US"/>
+        </w:rPr>
+      </w:pPr>
+    </w:p>
+    <w:p>
+      <w:pPr>
+        <w:rPr>
+          <w:b/>
+          <w:bCs/>
+          <w:lang w:val="en-US"/>
+        </w:rPr>
+      </w:pPr>
+      <w:r>
+        <w:rPr>
+          <w:b/>
+          <w:bCs/>
+          <w:color w:val="C00000"/>
+          <w:lang w:val="en-US"/>
+        </w:rPr>
+        <w:t xml:space="preserve">CONVERT STRING INTO INT READING FROM </w:t>
+      </w:r>
+      <w:r>
+        <w:rPr>
+          <w:b/>
+          <w:bCs/>
+          <w:color w:val="C00000"/>
+          <w:lang w:val="en-US"/>
+        </w:rPr>
+        <w:t>RIGHT</w:t>
+      </w:r>
+      <w:r>
+        <w:rPr>
+          <w:b/>
+          <w:bCs/>
+          <w:color w:val="C00000"/>
+          <w:lang w:val="en-US"/>
+        </w:rPr>
+        <w:t xml:space="preserve"> TO </w:t>
+      </w:r>
+      <w:r>
+        <w:rPr>
+          <w:b/>
+          <w:bCs/>
+          <w:color w:val="C00000"/>
+          <w:lang w:val="en-US"/>
+        </w:rPr>
+        <w:t>LEFT</w:t>
+      </w:r>
+      <w:r>
+        <w:rPr>
+          <w:b/>
+          <w:bCs/>
+          <w:color w:val="C00000"/>
+          <w:lang w:val="en-US"/>
+        </w:rPr>
+        <w:t>:</w:t>
+      </w:r>
+    </w:p>
+    <w:p>
+      <w:pPr>
+        <w:shd w:val="clear" w:color="auto" w:fill="121314"/>
+        <w:spacing w:after="0" w:line="285" w:lineRule="atLeast"/>
+        <w:rPr>
+          <w:rFonts w:ascii="Consolas" w:eastAsia="Times New Roman" w:hAnsi="Consolas" w:cs="Times New Roman"/>
+          <w:color w:val="BBBEBF"/>
+          <w:kern w:val="0"/>
+          <w:sz w:val="21"/>
+          <w:szCs w:val="21"/>
+          <w:lang w:eastAsia="it-IT"/>
+          <w14:ligatures w14:val="none"/>
+        </w:rPr>
+      </w:pPr>
+      <w:proofErr w:type="spellStart"/>
+      <w:r>
+        <w:rPr>
+          <w:rFonts w:ascii="Consolas" w:eastAsia="Times New Roman" w:hAnsi="Consolas" w:cs="Times New Roman"/>
+          <w:color w:val="C9D1D9"/>
+          <w:kern w:val="0"/>
+          <w:sz w:val="21"/>
+          <w:szCs w:val="21"/>
+          <w:lang w:eastAsia="it-IT"/>
+          <w14:ligatures w14:val="none"/>
+        </w:rPr>
+        <w:t>curLen</w:t>
+      </w:r>
+      <w:proofErr w:type="spellEnd"/>
+      <w:r>
+        <w:rPr>
+          <w:rFonts w:ascii="Consolas" w:eastAsia="Times New Roman" w:hAnsi="Consolas" w:cs="Times New Roman"/>
+          <w:color w:val="C9D1D9"/>
+          <w:kern w:val="0"/>
+          <w:sz w:val="21"/>
+          <w:szCs w:val="21"/>
+          <w:lang w:eastAsia="it-IT"/>
+          <w14:ligatures w14:val="none"/>
+        </w:rPr>
+        <w:t xml:space="preserve"> </w:t>
+      </w:r>
+      <w:r>
+        <w:rPr>
+          <w:rFonts w:ascii="Consolas" w:eastAsia="Times New Roman" w:hAnsi="Consolas" w:cs="Times New Roman"/>
+          <w:color w:val="D4D4D4"/>
+          <w:kern w:val="0"/>
+          <w:sz w:val="21"/>
+          <w:szCs w:val="21"/>
+          <w:lang w:eastAsia="it-IT"/>
+          <w14:ligatures w14:val="none"/>
+        </w:rPr>
+        <w:t>=</w:t>
+      </w:r>
+      <w:r>
+        <w:rPr>
+          <w:rFonts w:ascii="Consolas" w:eastAsia="Times New Roman" w:hAnsi="Consolas" w:cs="Times New Roman"/>
+          <w:color w:val="C9D1D9"/>
+          <w:kern w:val="0"/>
+          <w:sz w:val="21"/>
+          <w:szCs w:val="21"/>
+          <w:lang w:eastAsia="it-IT"/>
+          <w14:ligatures w14:val="none"/>
+        </w:rPr>
+        <w:t xml:space="preserve"> (</w:t>
+      </w:r>
+      <w:proofErr w:type="spellStart"/>
+      <w:r>
+        <w:rPr>
+          <w:rFonts w:ascii="Consolas" w:eastAsia="Times New Roman" w:hAnsi="Consolas" w:cs="Times New Roman"/>
+          <w:color w:val="C9D1D9"/>
+          <w:kern w:val="0"/>
+          <w:sz w:val="21"/>
+          <w:szCs w:val="21"/>
+          <w:lang w:eastAsia="it-IT"/>
+          <w14:ligatures w14:val="none"/>
+        </w:rPr>
+        <w:t>curLen</w:t>
+      </w:r>
+      <w:proofErr w:type="spellEnd"/>
+      <w:r>
+        <w:rPr>
+          <w:rFonts w:ascii="Consolas" w:eastAsia="Times New Roman" w:hAnsi="Consolas" w:cs="Times New Roman"/>
+          <w:color w:val="C9D1D9"/>
+          <w:kern w:val="0"/>
+          <w:sz w:val="21"/>
+          <w:szCs w:val="21"/>
+          <w:lang w:eastAsia="it-IT"/>
+          <w14:ligatures w14:val="none"/>
+        </w:rPr>
+        <w:t xml:space="preserve"> </w:t>
+      </w:r>
+      <w:r>
+        <w:rPr>
+          <w:rFonts w:ascii="Consolas" w:eastAsia="Times New Roman" w:hAnsi="Consolas" w:cs="Times New Roman"/>
+          <w:color w:val="D4D4D4"/>
+          <w:kern w:val="0"/>
+          <w:sz w:val="21"/>
+          <w:szCs w:val="21"/>
+          <w:lang w:eastAsia="it-IT"/>
+          <w14:ligatures w14:val="none"/>
+        </w:rPr>
+        <w:t>*</w:t>
+      </w:r>
+      <w:r>
+        <w:rPr>
+          <w:rFonts w:ascii="Consolas" w:eastAsia="Times New Roman" w:hAnsi="Consolas" w:cs="Times New Roman"/>
+          <w:color w:val="C9D1D9"/>
+          <w:kern w:val="0"/>
+          <w:sz w:val="21"/>
+          <w:szCs w:val="21"/>
+          <w:lang w:eastAsia="it-IT"/>
+          <w14:ligatures w14:val="none"/>
+        </w:rPr>
+        <w:t xml:space="preserve"> </w:t>
+      </w:r>
+      <w:r>
+        <w:rPr>
+          <w:rFonts w:ascii="Consolas" w:eastAsia="Times New Roman" w:hAnsi="Consolas" w:cs="Times New Roman"/>
+          <w:color w:val="B5CEA8"/>
+          <w:kern w:val="0"/>
+          <w:sz w:val="21"/>
+          <w:szCs w:val="21"/>
+          <w:lang w:eastAsia="it-IT"/>
+          <w14:ligatures w14:val="none"/>
+        </w:rPr>
+        <w:t>10</w:t>
+      </w:r>
+      <w:r>
+        <w:rPr>
+          <w:rFonts w:ascii="Consolas" w:eastAsia="Times New Roman" w:hAnsi="Consolas" w:cs="Times New Roman"/>
+          <w:color w:val="C9D1D9"/>
+          <w:kern w:val="0"/>
+          <w:sz w:val="21"/>
+          <w:szCs w:val="21"/>
+          <w:lang w:eastAsia="it-IT"/>
+          <w14:ligatures w14:val="none"/>
+        </w:rPr>
+        <w:t xml:space="preserve">) </w:t>
+      </w:r>
+      <w:r>
+        <w:rPr>
+          <w:rFonts w:ascii="Consolas" w:eastAsia="Times New Roman" w:hAnsi="Consolas" w:cs="Times New Roman"/>
+          <w:color w:val="D4D4D4"/>
+          <w:kern w:val="0"/>
+          <w:sz w:val="21"/>
+          <w:szCs w:val="21"/>
+          <w:lang w:eastAsia="it-IT"/>
+          <w14:ligatures w14:val="none"/>
+        </w:rPr>
+        <w:t>+</w:t>
+      </w:r>
+      <w:r>
+        <w:rPr>
+          <w:rFonts w:ascii="Consolas" w:eastAsia="Times New Roman" w:hAnsi="Consolas" w:cs="Times New Roman"/>
+          <w:color w:val="C9D1D9"/>
+          <w:kern w:val="0"/>
+          <w:sz w:val="21"/>
+          <w:szCs w:val="21"/>
+          <w:lang w:eastAsia="it-IT"/>
+          <w14:ligatures w14:val="none"/>
+        </w:rPr>
+        <w:t xml:space="preserve"> </w:t>
+      </w:r>
+      <w:proofErr w:type="spellStart"/>
+      <w:r>
+        <w:rPr>
+          <w:rFonts w:ascii="Consolas" w:eastAsia="Times New Roman" w:hAnsi="Consolas" w:cs="Times New Roman"/>
+          <w:color w:val="FFA657"/>
+          <w:kern w:val="0"/>
+          <w:sz w:val="21"/>
+          <w:szCs w:val="21"/>
+          <w:lang w:eastAsia="it-IT"/>
+          <w14:ligatures w14:val="none"/>
+        </w:rPr>
+        <w:t>str</w:t>
+      </w:r>
+      <w:proofErr w:type="spellEnd"/>
+      <w:r>
+        <w:rPr>
+          <w:rFonts w:ascii="Consolas" w:eastAsia="Times New Roman" w:hAnsi="Consolas" w:cs="Times New Roman"/>
+          <w:color w:val="C9D1D9"/>
+          <w:kern w:val="0"/>
+          <w:sz w:val="21"/>
+          <w:szCs w:val="21"/>
+          <w:lang w:eastAsia="it-IT"/>
+          <w14:ligatures w14:val="none"/>
+        </w:rPr>
+        <w:t xml:space="preserve">[i] </w:t>
+      </w:r>
+      <w:r>
+        <w:rPr>
+          <w:rFonts w:ascii="Consolas" w:eastAsia="Times New Roman" w:hAnsi="Consolas" w:cs="Times New Roman"/>
+          <w:color w:val="D4D4D4"/>
+          <w:kern w:val="0"/>
+          <w:sz w:val="21"/>
+          <w:szCs w:val="21"/>
+          <w:lang w:eastAsia="it-IT"/>
+          <w14:ligatures w14:val="none"/>
+        </w:rPr>
+        <w:t>-</w:t>
+      </w:r>
+      <w:r>
+        <w:rPr>
+          <w:rFonts w:ascii="Consolas" w:eastAsia="Times New Roman" w:hAnsi="Consolas" w:cs="Times New Roman"/>
+          <w:color w:val="C9D1D9"/>
+          <w:kern w:val="0"/>
+          <w:sz w:val="21"/>
+          <w:szCs w:val="21"/>
+          <w:lang w:eastAsia="it-IT"/>
+          <w14:ligatures w14:val="none"/>
+        </w:rPr>
+        <w:t xml:space="preserve"> </w:t>
+      </w:r>
+      <w:r>
+        <w:rPr>
+          <w:rFonts w:ascii="Consolas" w:eastAsia="Times New Roman" w:hAnsi="Consolas" w:cs="Times New Roman"/>
+          <w:color w:val="A5D6FF"/>
+          <w:kern w:val="0"/>
+          <w:sz w:val="21"/>
+          <w:szCs w:val="21"/>
+          <w:lang w:eastAsia="it-IT"/>
+          <w14:ligatures w14:val="none"/>
+        </w:rPr>
+        <w:t>'0'</w:t>
+      </w:r>
+      <w:r>
+        <w:rPr>
+          <w:rFonts w:ascii="Consolas" w:eastAsia="Times New Roman" w:hAnsi="Consolas" w:cs="Times New Roman"/>
+          <w:color w:val="C9D1D9"/>
+          <w:kern w:val="0"/>
+          <w:sz w:val="21"/>
+          <w:szCs w:val="21"/>
+          <w:lang w:eastAsia="it-IT"/>
+          <w14:ligatures w14:val="none"/>
+        </w:rPr>
+        <w:t>;</w:t>
+      </w:r>
+    </w:p>
+    <w:p>
+      <w:pPr>
+        <w:rPr>
+          <w:lang w:val="en-US"/>
+        </w:rPr>
+      </w:pPr>
     </w:p>
     <w:sectPr>
       <w:pgSz w:w="11906" w:h="16838"/>
@@ -942,7 +1612,6 @@
   <w:style w:type="character" w:default="1" w:styleId="Carpredefinitoparagrafo">
     <w:name w:val="Default Paragraph Font"/>
     <w:uiPriority w:val="1"/>
-    <w:semiHidden/>
     <w:unhideWhenUsed/>
   </w:style>
   <w:style w:type="table" w:default="1" w:styleId="Tabellanormale">

</xml_diff>

<commit_message>
Add implementation for Reverse Polish Notation evaluation using stack data structure
</commit_message>
<xml_diff>
--- a/docs/PATTERNS.docx
+++ b/docs/PATTERNS.docx
@@ -319,36 +319,350 @@
         <w:spacing w:after="0" w:line="285" w:lineRule="atLeast"/>
         <w:rPr>
           <w:rFonts w:ascii="Consolas" w:eastAsia="Times New Roman" w:hAnsi="Consolas" w:cs="Times New Roman"/>
+          <w:color w:val="C9D1D9"/>
+          <w:kern w:val="0"/>
+          <w:sz w:val="21"/>
+          <w:szCs w:val="21"/>
+          <w:lang w:val="en-US" w:eastAsia="it-IT"/>
+          <w14:ligatures w14:val="none"/>
+        </w:rPr>
+      </w:pPr>
+      <w:r>
+        <w:rPr>
+          <w:rFonts w:ascii="Consolas" w:eastAsia="Times New Roman" w:hAnsi="Consolas" w:cs="Times New Roman"/>
+          <w:color w:val="C9D1D9"/>
+          <w:kern w:val="0"/>
+          <w:sz w:val="21"/>
+          <w:szCs w:val="21"/>
+          <w:lang w:val="en-US" w:eastAsia="it-IT"/>
+          <w14:ligatures w14:val="none"/>
+        </w:rPr>
+        <w:t>val</w:t>
+      </w:r>
+      <w:r>
+        <w:rPr>
+          <w:rFonts w:ascii="Consolas" w:eastAsia="Times New Roman" w:hAnsi="Consolas" w:cs="Times New Roman"/>
+          <w:color w:val="C9D1D9"/>
+          <w:kern w:val="0"/>
+          <w:sz w:val="21"/>
+          <w:szCs w:val="21"/>
+          <w:lang w:val="en-US" w:eastAsia="it-IT"/>
+          <w14:ligatures w14:val="none"/>
+        </w:rPr>
+        <w:t xml:space="preserve"> </w:t>
+      </w:r>
+      <w:r>
+        <w:rPr>
+          <w:rFonts w:ascii="Consolas" w:eastAsia="Times New Roman" w:hAnsi="Consolas" w:cs="Times New Roman"/>
+          <w:color w:val="C9D1D9"/>
+          <w:kern w:val="0"/>
+          <w:sz w:val="21"/>
+          <w:szCs w:val="21"/>
+          <w:lang w:val="en-US" w:eastAsia="it-IT"/>
+          <w14:ligatures w14:val="none"/>
+        </w:rPr>
+        <w:t>= 0;</w:t>
+      </w:r>
+    </w:p>
+    <w:p>
+      <w:pPr>
+        <w:shd w:val="clear" w:color="auto" w:fill="121314"/>
+        <w:spacing w:after="0" w:line="285" w:lineRule="atLeast"/>
+        <w:rPr>
+          <w:rFonts w:ascii="Consolas" w:eastAsia="Times New Roman" w:hAnsi="Consolas" w:cs="Times New Roman"/>
+          <w:color w:val="C9D1D9"/>
+          <w:kern w:val="0"/>
+          <w:sz w:val="21"/>
+          <w:szCs w:val="21"/>
+          <w:lang w:val="en-US" w:eastAsia="it-IT"/>
+          <w14:ligatures w14:val="none"/>
+        </w:rPr>
+      </w:pPr>
+      <w:r>
+        <w:rPr>
+          <w:rFonts w:ascii="Consolas" w:eastAsia="Times New Roman" w:hAnsi="Consolas" w:cs="Times New Roman"/>
+          <w:color w:val="C9D1D9"/>
+          <w:kern w:val="0"/>
+          <w:sz w:val="21"/>
+          <w:szCs w:val="21"/>
+          <w:lang w:val="en-US" w:eastAsia="it-IT"/>
+          <w14:ligatures w14:val="none"/>
+        </w:rPr>
+        <w:t>for p in len(str)</w:t>
+      </w:r>
+    </w:p>
+    <w:p>
+      <w:pPr>
+        <w:shd w:val="clear" w:color="auto" w:fill="121314"/>
+        <w:spacing w:after="0" w:line="285" w:lineRule="atLeast"/>
+        <w:ind w:firstLine="708"/>
+        <w:rPr>
+          <w:rFonts w:ascii="Consolas" w:eastAsia="Times New Roman" w:hAnsi="Consolas" w:cs="Times New Roman"/>
+          <w:color w:val="C9D1D9"/>
+          <w:kern w:val="0"/>
+          <w:sz w:val="21"/>
+          <w:szCs w:val="21"/>
+          <w:lang w:val="en-US" w:eastAsia="it-IT"/>
+          <w14:ligatures w14:val="none"/>
+        </w:rPr>
+      </w:pPr>
+      <w:r>
+        <w:rPr>
+          <w:rFonts w:ascii="Consolas" w:eastAsia="Times New Roman" w:hAnsi="Consolas" w:cs="Times New Roman"/>
+          <w:color w:val="C9D1D9"/>
+          <w:kern w:val="0"/>
+          <w:sz w:val="21"/>
+          <w:szCs w:val="21"/>
+          <w:lang w:val="en-US" w:eastAsia="it-IT"/>
+          <w14:ligatures w14:val="none"/>
+        </w:rPr>
+        <w:t>val</w:t>
+      </w:r>
+      <w:r>
+        <w:rPr>
+          <w:rFonts w:ascii="Consolas" w:eastAsia="Times New Roman" w:hAnsi="Consolas" w:cs="Times New Roman"/>
+          <w:color w:val="C9D1D9"/>
+          <w:kern w:val="0"/>
+          <w:sz w:val="21"/>
+          <w:szCs w:val="21"/>
+          <w:lang w:val="en-US" w:eastAsia="it-IT"/>
+          <w14:ligatures w14:val="none"/>
+        </w:rPr>
+        <w:t xml:space="preserve"> </w:t>
+      </w:r>
+      <w:r>
+        <w:rPr>
+          <w:rFonts w:ascii="Consolas" w:eastAsia="Times New Roman" w:hAnsi="Consolas" w:cs="Times New Roman"/>
+          <w:color w:val="D4D4D4"/>
+          <w:kern w:val="0"/>
+          <w:sz w:val="21"/>
+          <w:szCs w:val="21"/>
+          <w:lang w:val="en-US" w:eastAsia="it-IT"/>
+          <w14:ligatures w14:val="none"/>
+        </w:rPr>
+        <w:t>*</w:t>
+      </w:r>
+      <w:r>
+        <w:rPr>
+          <w:rFonts w:ascii="Consolas" w:eastAsia="Times New Roman" w:hAnsi="Consolas" w:cs="Times New Roman"/>
+          <w:color w:val="D4D4D4"/>
+          <w:kern w:val="0"/>
+          <w:sz w:val="21"/>
+          <w:szCs w:val="21"/>
+          <w:lang w:val="en-US" w:eastAsia="it-IT"/>
+          <w14:ligatures w14:val="none"/>
+        </w:rPr>
+        <w:t>=</w:t>
+      </w:r>
+      <w:r>
+        <w:rPr>
+          <w:rFonts w:ascii="Consolas" w:eastAsia="Times New Roman" w:hAnsi="Consolas" w:cs="Times New Roman"/>
+          <w:color w:val="C9D1D9"/>
+          <w:kern w:val="0"/>
+          <w:sz w:val="21"/>
+          <w:szCs w:val="21"/>
+          <w:lang w:val="en-US" w:eastAsia="it-IT"/>
+          <w14:ligatures w14:val="none"/>
+        </w:rPr>
+        <w:t xml:space="preserve"> </w:t>
+      </w:r>
+      <w:r>
+        <w:rPr>
+          <w:rFonts w:ascii="Consolas" w:eastAsia="Times New Roman" w:hAnsi="Consolas" w:cs="Times New Roman"/>
+          <w:color w:val="C9D1D9"/>
+          <w:kern w:val="0"/>
+          <w:sz w:val="21"/>
+          <w:szCs w:val="21"/>
+          <w:lang w:val="en-US" w:eastAsia="it-IT"/>
+          <w14:ligatures w14:val="none"/>
+        </w:rPr>
+        <w:t>10</w:t>
+      </w:r>
+      <w:r>
+        <w:rPr>
+          <w:rFonts w:ascii="Consolas" w:eastAsia="Times New Roman" w:hAnsi="Consolas" w:cs="Times New Roman"/>
+          <w:color w:val="C9D1D9"/>
+          <w:kern w:val="0"/>
+          <w:sz w:val="21"/>
+          <w:szCs w:val="21"/>
+          <w:lang w:val="en-US" w:eastAsia="it-IT"/>
+          <w14:ligatures w14:val="none"/>
+        </w:rPr>
+        <w:t>;</w:t>
+      </w:r>
+    </w:p>
+    <w:p>
+      <w:pPr>
+        <w:shd w:val="clear" w:color="auto" w:fill="121314"/>
+        <w:spacing w:after="0" w:line="285" w:lineRule="atLeast"/>
+        <w:ind w:firstLine="708"/>
+        <w:rPr>
+          <w:rFonts w:ascii="Consolas" w:eastAsia="Times New Roman" w:hAnsi="Consolas" w:cs="Times New Roman"/>
           <w:color w:val="BBBEBF"/>
           <w:kern w:val="0"/>
           <w:sz w:val="21"/>
           <w:szCs w:val="21"/>
-          <w:lang w:eastAsia="it-IT"/>
+          <w:lang w:val="en-US" w:eastAsia="it-IT"/>
           <w14:ligatures w14:val="none"/>
         </w:rPr>
       </w:pPr>
-      <w:proofErr w:type="spellStart"/>
-      <w:r>
-        <w:rPr>
-          <w:rFonts w:ascii="Consolas" w:eastAsia="Times New Roman" w:hAnsi="Consolas" w:cs="Times New Roman"/>
-          <w:color w:val="C9D1D9"/>
-          <w:kern w:val="0"/>
-          <w:sz w:val="21"/>
-          <w:szCs w:val="21"/>
-          <w:lang w:eastAsia="it-IT"/>
+      <w:r>
+        <w:rPr>
+          <w:rFonts w:ascii="Consolas" w:eastAsia="Times New Roman" w:hAnsi="Consolas" w:cs="Times New Roman"/>
+          <w:color w:val="C9D1D9"/>
+          <w:kern w:val="0"/>
+          <w:sz w:val="21"/>
+          <w:szCs w:val="21"/>
+          <w:lang w:val="en-US" w:eastAsia="it-IT"/>
+          <w14:ligatures w14:val="none"/>
+        </w:rPr>
+        <w:t>val += (</w:t>
+      </w:r>
+      <w:r>
+        <w:rPr>
+          <w:rFonts w:ascii="Consolas" w:eastAsia="Times New Roman" w:hAnsi="Consolas" w:cs="Times New Roman"/>
+          <w:color w:val="FFA657"/>
+          <w:kern w:val="0"/>
+          <w:sz w:val="21"/>
+          <w:szCs w:val="21"/>
+          <w:lang w:val="en-US" w:eastAsia="it-IT"/>
+          <w14:ligatures w14:val="none"/>
+        </w:rPr>
+        <w:t>str</w:t>
+      </w:r>
+      <w:r>
+        <w:rPr>
+          <w:rFonts w:ascii="Consolas" w:eastAsia="Times New Roman" w:hAnsi="Consolas" w:cs="Times New Roman"/>
+          <w:color w:val="C9D1D9"/>
+          <w:kern w:val="0"/>
+          <w:sz w:val="21"/>
+          <w:szCs w:val="21"/>
+          <w:lang w:val="en-US" w:eastAsia="it-IT"/>
+          <w14:ligatures w14:val="none"/>
+        </w:rPr>
+        <w:t xml:space="preserve">[p] </w:t>
+      </w:r>
+      <w:r>
+        <w:rPr>
+          <w:rFonts w:ascii="Consolas" w:eastAsia="Times New Roman" w:hAnsi="Consolas" w:cs="Times New Roman"/>
+          <w:color w:val="D4D4D4"/>
+          <w:kern w:val="0"/>
+          <w:sz w:val="21"/>
+          <w:szCs w:val="21"/>
+          <w:lang w:val="en-US" w:eastAsia="it-IT"/>
+          <w14:ligatures w14:val="none"/>
+        </w:rPr>
+        <w:t>-</w:t>
+      </w:r>
+      <w:r>
+        <w:rPr>
+          <w:rFonts w:ascii="Consolas" w:eastAsia="Times New Roman" w:hAnsi="Consolas" w:cs="Times New Roman"/>
+          <w:color w:val="C9D1D9"/>
+          <w:kern w:val="0"/>
+          <w:sz w:val="21"/>
+          <w:szCs w:val="21"/>
+          <w:lang w:val="en-US" w:eastAsia="it-IT"/>
+          <w14:ligatures w14:val="none"/>
+        </w:rPr>
+        <w:t xml:space="preserve"> </w:t>
+      </w:r>
+      <w:r>
+        <w:rPr>
+          <w:rFonts w:ascii="Consolas" w:eastAsia="Times New Roman" w:hAnsi="Consolas" w:cs="Times New Roman"/>
+          <w:color w:val="A5D6FF"/>
+          <w:kern w:val="0"/>
+          <w:sz w:val="21"/>
+          <w:szCs w:val="21"/>
+          <w:lang w:val="en-US" w:eastAsia="it-IT"/>
+          <w14:ligatures w14:val="none"/>
+        </w:rPr>
+        <w:t>'0'</w:t>
+      </w:r>
+      <w:r>
+        <w:rPr>
+          <w:rFonts w:ascii="Consolas" w:eastAsia="Times New Roman" w:hAnsi="Consolas" w:cs="Times New Roman"/>
+          <w:color w:val="C9D1D9"/>
+          <w:kern w:val="0"/>
+          <w:sz w:val="21"/>
+          <w:szCs w:val="21"/>
+          <w:lang w:val="en-US" w:eastAsia="it-IT"/>
+          <w14:ligatures w14:val="none"/>
+        </w:rPr>
+        <w:t>)</w:t>
+      </w:r>
+      <w:r>
+        <w:rPr>
+          <w:rFonts w:ascii="Consolas" w:eastAsia="Times New Roman" w:hAnsi="Consolas" w:cs="Times New Roman"/>
+          <w:color w:val="C9D1D9"/>
+          <w:kern w:val="0"/>
+          <w:sz w:val="21"/>
+          <w:szCs w:val="21"/>
+          <w:lang w:val="en-US" w:eastAsia="it-IT"/>
+          <w14:ligatures w14:val="none"/>
+        </w:rPr>
+        <w:t>;</w:t>
+      </w:r>
+    </w:p>
+    <w:p>
+      <w:pPr>
+        <w:rPr>
+          <w:lang w:val="en-US"/>
+        </w:rPr>
+      </w:pPr>
+    </w:p>
+    <w:p>
+      <w:pPr>
+        <w:rPr>
+          <w:b/>
+          <w:bCs/>
+          <w:color w:val="C00000"/>
+          <w:lang w:val="en-US"/>
+        </w:rPr>
+      </w:pPr>
+      <w:r>
+        <w:rPr>
+          <w:b/>
+          <w:bCs/>
+          <w:color w:val="C00000"/>
+          <w:lang w:val="en-US"/>
+        </w:rPr>
+        <w:t>CONVERT STRING INTO INT READING FROM RIGHT TO LEFT:</w:t>
+      </w:r>
+    </w:p>
+    <w:p>
+      <w:pPr>
+        <w:shd w:val="clear" w:color="auto" w:fill="121314"/>
+        <w:spacing w:after="0" w:line="285" w:lineRule="atLeast"/>
+        <w:rPr>
+          <w:rFonts w:ascii="Consolas" w:eastAsia="Times New Roman" w:hAnsi="Consolas" w:cs="Times New Roman"/>
+          <w:color w:val="BBBEBF"/>
+          <w:kern w:val="0"/>
+          <w:sz w:val="21"/>
+          <w:szCs w:val="21"/>
+          <w:lang w:val="en-US" w:eastAsia="it-IT"/>
+          <w14:ligatures w14:val="none"/>
+        </w:rPr>
+      </w:pPr>
+      <w:r>
+        <w:rPr>
+          <w:rFonts w:ascii="Consolas" w:eastAsia="Times New Roman" w:hAnsi="Consolas" w:cs="Times New Roman"/>
+          <w:color w:val="C9D1D9"/>
+          <w:kern w:val="0"/>
+          <w:sz w:val="21"/>
+          <w:szCs w:val="21"/>
+          <w:lang w:val="en-US" w:eastAsia="it-IT"/>
           <w14:ligatures w14:val="none"/>
         </w:rPr>
         <w:t>multiplier</w:t>
       </w:r>
-      <w:proofErr w:type="spellEnd"/>
-      <w:r>
-        <w:rPr>
-          <w:rFonts w:ascii="Consolas" w:eastAsia="Times New Roman" w:hAnsi="Consolas" w:cs="Times New Roman"/>
-          <w:color w:val="C9D1D9"/>
-          <w:kern w:val="0"/>
-          <w:sz w:val="21"/>
-          <w:szCs w:val="21"/>
-          <w:lang w:eastAsia="it-IT"/>
+      <w:r>
+        <w:rPr>
+          <w:rFonts w:ascii="Consolas" w:eastAsia="Times New Roman" w:hAnsi="Consolas" w:cs="Times New Roman"/>
+          <w:color w:val="BBBEBF"/>
+          <w:kern w:val="0"/>
+          <w:sz w:val="21"/>
+          <w:szCs w:val="21"/>
+          <w:lang w:val="en-US" w:eastAsia="it-IT"/>
           <w14:ligatures w14:val="none"/>
         </w:rPr>
         <w:t xml:space="preserve"> </w:t>
@@ -360,7 +674,7 @@
           <w:kern w:val="0"/>
           <w:sz w:val="21"/>
           <w:szCs w:val="21"/>
-          <w:lang w:eastAsia="it-IT"/>
+          <w:lang w:val="en-US" w:eastAsia="it-IT"/>
           <w14:ligatures w14:val="none"/>
         </w:rPr>
         <w:t>=</w:t>
@@ -368,11 +682,11 @@
       <w:r>
         <w:rPr>
           <w:rFonts w:ascii="Consolas" w:eastAsia="Times New Roman" w:hAnsi="Consolas" w:cs="Times New Roman"/>
-          <w:color w:val="C9D1D9"/>
-          <w:kern w:val="0"/>
-          <w:sz w:val="21"/>
-          <w:szCs w:val="21"/>
-          <w:lang w:eastAsia="it-IT"/>
+          <w:color w:val="BBBEBF"/>
+          <w:kern w:val="0"/>
+          <w:sz w:val="21"/>
+          <w:szCs w:val="21"/>
+          <w:lang w:val="en-US" w:eastAsia="it-IT"/>
           <w14:ligatures w14:val="none"/>
         </w:rPr>
         <w:t xml:space="preserve"> </w:t>
@@ -384,7 +698,7 @@
           <w:kern w:val="0"/>
           <w:sz w:val="21"/>
           <w:szCs w:val="21"/>
-          <w:lang w:eastAsia="it-IT"/>
+          <w:lang w:val="en-US" w:eastAsia="it-IT"/>
           <w14:ligatures w14:val="none"/>
         </w:rPr>
         <w:t>1</w:t>
@@ -392,14 +706,65 @@
       <w:r>
         <w:rPr>
           <w:rFonts w:ascii="Consolas" w:eastAsia="Times New Roman" w:hAnsi="Consolas" w:cs="Times New Roman"/>
-          <w:color w:val="C9D1D9"/>
-          <w:kern w:val="0"/>
-          <w:sz w:val="21"/>
-          <w:szCs w:val="21"/>
-          <w:lang w:eastAsia="it-IT"/>
+          <w:color w:val="BBBEBF"/>
+          <w:kern w:val="0"/>
+          <w:sz w:val="21"/>
+          <w:szCs w:val="21"/>
+          <w:lang w:val="en-US" w:eastAsia="it-IT"/>
           <w14:ligatures w14:val="none"/>
         </w:rPr>
         <w:t>;</w:t>
+      </w:r>
+    </w:p>
+    <w:p>
+      <w:pPr>
+        <w:shd w:val="clear" w:color="auto" w:fill="121314"/>
+        <w:spacing w:after="0" w:line="285" w:lineRule="atLeast"/>
+        <w:rPr>
+          <w:rFonts w:ascii="Consolas" w:eastAsia="Times New Roman" w:hAnsi="Consolas" w:cs="Times New Roman"/>
+          <w:color w:val="C9D1D9"/>
+          <w:kern w:val="0"/>
+          <w:sz w:val="21"/>
+          <w:szCs w:val="21"/>
+          <w:lang w:val="en-US" w:eastAsia="it-IT"/>
+          <w14:ligatures w14:val="none"/>
+        </w:rPr>
+      </w:pPr>
+      <w:r>
+        <w:rPr>
+          <w:rFonts w:ascii="Consolas" w:eastAsia="Times New Roman" w:hAnsi="Consolas" w:cs="Times New Roman"/>
+          <w:color w:val="C9D1D9"/>
+          <w:kern w:val="0"/>
+          <w:sz w:val="21"/>
+          <w:szCs w:val="21"/>
+          <w:lang w:val="en-US" w:eastAsia="it-IT"/>
+          <w14:ligatures w14:val="none"/>
+        </w:rPr>
+        <w:t>val</w:t>
+      </w:r>
+      <w:r>
+        <w:rPr>
+          <w:rFonts w:ascii="Consolas" w:eastAsia="Times New Roman" w:hAnsi="Consolas" w:cs="Times New Roman"/>
+          <w:color w:val="C9D1D9"/>
+          <w:kern w:val="0"/>
+          <w:sz w:val="21"/>
+          <w:szCs w:val="21"/>
+          <w:lang w:val="en-US" w:eastAsia="it-IT"/>
+          <w14:ligatures w14:val="none"/>
+        </w:rPr>
+        <w:t xml:space="preserve"> </w:t>
+      </w:r>
+      <w:r>
+        <w:rPr>
+          <w:rFonts w:ascii="Consolas" w:eastAsia="Times New Roman" w:hAnsi="Consolas" w:cs="Times New Roman"/>
+          <w:color w:val="C9D1D9"/>
+          <w:kern w:val="0"/>
+          <w:sz w:val="21"/>
+          <w:szCs w:val="21"/>
+          <w:lang w:val="en-US" w:eastAsia="it-IT"/>
+          <w14:ligatures w14:val="none"/>
+        </w:rPr>
+        <w:t>= 0;</w:t>
       </w:r>
     </w:p>
     <w:p>
@@ -441,13 +806,14 @@
           <w:lang w:val="en-US" w:eastAsia="it-IT"/>
           <w14:ligatures w14:val="none"/>
         </w:rPr>
-        <w:t>…</w:t>
+        <w:t>for p in len(str)</w:t>
       </w:r>
     </w:p>
     <w:p>
       <w:pPr>
         <w:shd w:val="clear" w:color="auto" w:fill="121314"/>
         <w:spacing w:after="0" w:line="285" w:lineRule="atLeast"/>
+        <w:ind w:firstLine="708"/>
         <w:rPr>
           <w:rFonts w:ascii="Consolas" w:eastAsia="Times New Roman" w:hAnsi="Consolas" w:cs="Times New Roman"/>
           <w:color w:val="BBBEBF"/>
@@ -458,20 +824,18 @@
           <w14:ligatures w14:val="none"/>
         </w:rPr>
       </w:pPr>
-      <w:proofErr w:type="spellStart"/>
-      <w:r>
-        <w:rPr>
-          <w:rFonts w:ascii="Consolas" w:eastAsia="Times New Roman" w:hAnsi="Consolas" w:cs="Times New Roman"/>
-          <w:color w:val="C9D1D9"/>
-          <w:kern w:val="0"/>
-          <w:sz w:val="21"/>
-          <w:szCs w:val="21"/>
-          <w:lang w:val="en-US" w:eastAsia="it-IT"/>
-          <w14:ligatures w14:val="none"/>
-        </w:rPr>
-        <w:t>totWords</w:t>
-      </w:r>
-      <w:proofErr w:type="spellEnd"/>
+      <w:r>
+        <w:rPr>
+          <w:rFonts w:ascii="Consolas" w:eastAsia="Times New Roman" w:hAnsi="Consolas" w:cs="Times New Roman"/>
+          <w:color w:val="C9D1D9"/>
+          <w:kern w:val="0"/>
+          <w:sz w:val="21"/>
+          <w:szCs w:val="21"/>
+          <w:lang w:val="en-US" w:eastAsia="it-IT"/>
+          <w14:ligatures w14:val="none"/>
+        </w:rPr>
+        <w:t>val</w:t>
+      </w:r>
       <w:r>
         <w:rPr>
           <w:rFonts w:ascii="Consolas" w:eastAsia="Times New Roman" w:hAnsi="Consolas" w:cs="Times New Roman"/>
@@ -499,7 +863,7 @@
       <w:r>
         <w:rPr>
           <w:rFonts w:ascii="Consolas" w:eastAsia="Times New Roman" w:hAnsi="Consolas" w:cs="Times New Roman"/>
-          <w:color w:val="C9D1D9"/>
+          <w:color w:val="BBBEBF"/>
           <w:kern w:val="0"/>
           <w:sz w:val="21"/>
           <w:szCs w:val="21"/>
@@ -523,7 +887,7 @@
       <w:r>
         <w:rPr>
           <w:rFonts w:ascii="Consolas" w:eastAsia="Times New Roman" w:hAnsi="Consolas" w:cs="Times New Roman"/>
-          <w:color w:val="C9D1D9"/>
+          <w:color w:val="BBBEBF"/>
           <w:kern w:val="0"/>
           <w:sz w:val="21"/>
           <w:szCs w:val="21"/>
@@ -547,7 +911,7 @@
       <w:r>
         <w:rPr>
           <w:rFonts w:ascii="Consolas" w:eastAsia="Times New Roman" w:hAnsi="Consolas" w:cs="Times New Roman"/>
-          <w:color w:val="C9D1D9"/>
+          <w:color w:val="BBBEBF"/>
           <w:kern w:val="0"/>
           <w:sz w:val="21"/>
           <w:szCs w:val="21"/>
@@ -571,7 +935,7 @@
       <w:r>
         <w:rPr>
           <w:rFonts w:ascii="Consolas" w:eastAsia="Times New Roman" w:hAnsi="Consolas" w:cs="Times New Roman"/>
-          <w:color w:val="C9D1D9"/>
+          <w:color w:val="BBBEBF"/>
           <w:kern w:val="0"/>
           <w:sz w:val="21"/>
           <w:szCs w:val="21"/>
@@ -595,7 +959,7 @@
       <w:r>
         <w:rPr>
           <w:rFonts w:ascii="Consolas" w:eastAsia="Times New Roman" w:hAnsi="Consolas" w:cs="Times New Roman"/>
-          <w:color w:val="C9D1D9"/>
+          <w:color w:val="BBBEBF"/>
           <w:kern w:val="0"/>
           <w:sz w:val="21"/>
           <w:szCs w:val="21"/>
@@ -609,6 +973,7 @@
       <w:pPr>
         <w:shd w:val="clear" w:color="auto" w:fill="121314"/>
         <w:spacing w:after="0" w:line="285" w:lineRule="atLeast"/>
+        <w:ind w:firstLine="708"/>
         <w:rPr>
           <w:rFonts w:ascii="Consolas" w:eastAsia="Times New Roman" w:hAnsi="Consolas" w:cs="Times New Roman"/>
           <w:color w:val="BBBEBF"/>
@@ -619,7 +984,6 @@
           <w14:ligatures w14:val="none"/>
         </w:rPr>
       </w:pPr>
-      <w:proofErr w:type="spellStart"/>
       <w:r>
         <w:rPr>
           <w:rFonts w:ascii="Consolas" w:eastAsia="Times New Roman" w:hAnsi="Consolas" w:cs="Times New Roman"/>
@@ -632,11 +996,10 @@
         </w:rPr>
         <w:t>multiplier</w:t>
       </w:r>
-      <w:proofErr w:type="spellEnd"/>
-      <w:r>
-        <w:rPr>
-          <w:rFonts w:ascii="Consolas" w:eastAsia="Times New Roman" w:hAnsi="Consolas" w:cs="Times New Roman"/>
-          <w:color w:val="C9D1D9"/>
+      <w:r>
+        <w:rPr>
+          <w:rFonts w:ascii="Consolas" w:eastAsia="Times New Roman" w:hAnsi="Consolas" w:cs="Times New Roman"/>
+          <w:color w:val="BBBEBF"/>
           <w:kern w:val="0"/>
           <w:sz w:val="21"/>
           <w:szCs w:val="21"/>
@@ -660,7 +1023,7 @@
       <w:r>
         <w:rPr>
           <w:rFonts w:ascii="Consolas" w:eastAsia="Times New Roman" w:hAnsi="Consolas" w:cs="Times New Roman"/>
-          <w:color w:val="C9D1D9"/>
+          <w:color w:val="BBBEBF"/>
           <w:kern w:val="0"/>
           <w:sz w:val="21"/>
           <w:szCs w:val="21"/>
@@ -684,7 +1047,7 @@
       <w:r>
         <w:rPr>
           <w:rFonts w:ascii="Consolas" w:eastAsia="Times New Roman" w:hAnsi="Consolas" w:cs="Times New Roman"/>
-          <w:color w:val="C9D1D9"/>
+          <w:color w:val="BBBEBF"/>
           <w:kern w:val="0"/>
           <w:sz w:val="21"/>
           <w:szCs w:val="21"/>
@@ -697,304 +1060,8 @@
     <w:p>
       <w:pPr>
         <w:rPr>
-          <w:lang w:val="en-US"/>
-        </w:rPr>
-      </w:pPr>
-    </w:p>
-    <w:p>
-      <w:pPr>
-        <w:rPr>
-          <w:b/>
-          <w:bCs/>
-          <w:lang w:val="en-US"/>
-        </w:rPr>
-      </w:pPr>
-      <w:r>
-        <w:rPr>
-          <w:b/>
-          <w:bCs/>
-          <w:color w:val="C00000"/>
-          <w:lang w:val="en-US"/>
-        </w:rPr>
-        <w:t xml:space="preserve">CONVERT STRING INTO INT READING FROM </w:t>
-      </w:r>
-      <w:r>
-        <w:rPr>
-          <w:b/>
-          <w:bCs/>
-          <w:color w:val="C00000"/>
-          <w:lang w:val="en-US"/>
-        </w:rPr>
-        <w:t>RIGHT</w:t>
-      </w:r>
-      <w:r>
-        <w:rPr>
-          <w:b/>
-          <w:bCs/>
-          <w:color w:val="C00000"/>
-          <w:lang w:val="en-US"/>
-        </w:rPr>
-        <w:t xml:space="preserve"> TO </w:t>
-      </w:r>
-      <w:r>
-        <w:rPr>
-          <w:b/>
-          <w:bCs/>
-          <w:color w:val="C00000"/>
-          <w:lang w:val="en-US"/>
-        </w:rPr>
-        <w:t>LEFT</w:t>
-      </w:r>
-      <w:r>
-        <w:rPr>
-          <w:b/>
-          <w:bCs/>
-          <w:color w:val="C00000"/>
-          <w:lang w:val="en-US"/>
-        </w:rPr>
-        <w:t>:</w:t>
-      </w:r>
-    </w:p>
-    <w:p>
-      <w:pPr>
-        <w:shd w:val="clear" w:color="auto" w:fill="121314"/>
-        <w:spacing w:after="0" w:line="285" w:lineRule="atLeast"/>
-        <w:rPr>
-          <w:rFonts w:ascii="Consolas" w:eastAsia="Times New Roman" w:hAnsi="Consolas" w:cs="Times New Roman"/>
-          <w:color w:val="BBBEBF"/>
-          <w:kern w:val="0"/>
-          <w:sz w:val="21"/>
-          <w:szCs w:val="21"/>
-          <w:lang w:eastAsia="it-IT"/>
-          <w14:ligatures w14:val="none"/>
-        </w:rPr>
-      </w:pPr>
-      <w:proofErr w:type="spellStart"/>
-      <w:r>
-        <w:rPr>
-          <w:rFonts w:ascii="Consolas" w:eastAsia="Times New Roman" w:hAnsi="Consolas" w:cs="Times New Roman"/>
-          <w:color w:val="C9D1D9"/>
-          <w:kern w:val="0"/>
-          <w:sz w:val="21"/>
-          <w:szCs w:val="21"/>
-          <w:lang w:eastAsia="it-IT"/>
-          <w14:ligatures w14:val="none"/>
-        </w:rPr>
-        <w:t>curLen</w:t>
-      </w:r>
-      <w:proofErr w:type="spellEnd"/>
-      <w:r>
-        <w:rPr>
-          <w:rFonts w:ascii="Consolas" w:eastAsia="Times New Roman" w:hAnsi="Consolas" w:cs="Times New Roman"/>
-          <w:color w:val="C9D1D9"/>
-          <w:kern w:val="0"/>
-          <w:sz w:val="21"/>
-          <w:szCs w:val="21"/>
-          <w:lang w:eastAsia="it-IT"/>
-          <w14:ligatures w14:val="none"/>
-        </w:rPr>
-        <w:t xml:space="preserve"> </w:t>
-      </w:r>
-      <w:r>
-        <w:rPr>
-          <w:rFonts w:ascii="Consolas" w:eastAsia="Times New Roman" w:hAnsi="Consolas" w:cs="Times New Roman"/>
-          <w:color w:val="D4D4D4"/>
-          <w:kern w:val="0"/>
-          <w:sz w:val="21"/>
-          <w:szCs w:val="21"/>
-          <w:lang w:eastAsia="it-IT"/>
-          <w14:ligatures w14:val="none"/>
-        </w:rPr>
-        <w:t>=</w:t>
-      </w:r>
-      <w:r>
-        <w:rPr>
-          <w:rFonts w:ascii="Consolas" w:eastAsia="Times New Roman" w:hAnsi="Consolas" w:cs="Times New Roman"/>
-          <w:color w:val="C9D1D9"/>
-          <w:kern w:val="0"/>
-          <w:sz w:val="21"/>
-          <w:szCs w:val="21"/>
-          <w:lang w:eastAsia="it-IT"/>
-          <w14:ligatures w14:val="none"/>
-        </w:rPr>
-        <w:t xml:space="preserve"> (</w:t>
-      </w:r>
-      <w:proofErr w:type="spellStart"/>
-      <w:r>
-        <w:rPr>
-          <w:rFonts w:ascii="Consolas" w:eastAsia="Times New Roman" w:hAnsi="Consolas" w:cs="Times New Roman"/>
-          <w:color w:val="C9D1D9"/>
-          <w:kern w:val="0"/>
-          <w:sz w:val="21"/>
-          <w:szCs w:val="21"/>
-          <w:lang w:eastAsia="it-IT"/>
-          <w14:ligatures w14:val="none"/>
-        </w:rPr>
-        <w:t>curLen</w:t>
-      </w:r>
-      <w:proofErr w:type="spellEnd"/>
-      <w:r>
-        <w:rPr>
-          <w:rFonts w:ascii="Consolas" w:eastAsia="Times New Roman" w:hAnsi="Consolas" w:cs="Times New Roman"/>
-          <w:color w:val="C9D1D9"/>
-          <w:kern w:val="0"/>
-          <w:sz w:val="21"/>
-          <w:szCs w:val="21"/>
-          <w:lang w:eastAsia="it-IT"/>
-          <w14:ligatures w14:val="none"/>
-        </w:rPr>
-        <w:t xml:space="preserve"> </w:t>
-      </w:r>
-      <w:r>
-        <w:rPr>
-          <w:rFonts w:ascii="Consolas" w:eastAsia="Times New Roman" w:hAnsi="Consolas" w:cs="Times New Roman"/>
-          <w:color w:val="D4D4D4"/>
-          <w:kern w:val="0"/>
-          <w:sz w:val="21"/>
-          <w:szCs w:val="21"/>
-          <w:lang w:eastAsia="it-IT"/>
-          <w14:ligatures w14:val="none"/>
-        </w:rPr>
-        <w:t>*</w:t>
-      </w:r>
-      <w:r>
-        <w:rPr>
-          <w:rFonts w:ascii="Consolas" w:eastAsia="Times New Roman" w:hAnsi="Consolas" w:cs="Times New Roman"/>
-          <w:color w:val="C9D1D9"/>
-          <w:kern w:val="0"/>
-          <w:sz w:val="21"/>
-          <w:szCs w:val="21"/>
-          <w:lang w:eastAsia="it-IT"/>
-          <w14:ligatures w14:val="none"/>
-        </w:rPr>
-        <w:t xml:space="preserve"> </w:t>
-      </w:r>
-      <w:r>
-        <w:rPr>
-          <w:rFonts w:ascii="Consolas" w:eastAsia="Times New Roman" w:hAnsi="Consolas" w:cs="Times New Roman"/>
-          <w:color w:val="B5CEA8"/>
-          <w:kern w:val="0"/>
-          <w:sz w:val="21"/>
-          <w:szCs w:val="21"/>
-          <w:lang w:eastAsia="it-IT"/>
-          <w14:ligatures w14:val="none"/>
-        </w:rPr>
-        <w:t>10</w:t>
-      </w:r>
-      <w:r>
-        <w:rPr>
-          <w:rFonts w:ascii="Consolas" w:eastAsia="Times New Roman" w:hAnsi="Consolas" w:cs="Times New Roman"/>
-          <w:color w:val="C9D1D9"/>
-          <w:kern w:val="0"/>
-          <w:sz w:val="21"/>
-          <w:szCs w:val="21"/>
-          <w:lang w:eastAsia="it-IT"/>
-          <w14:ligatures w14:val="none"/>
-        </w:rPr>
-        <w:t xml:space="preserve">) </w:t>
-      </w:r>
-      <w:r>
-        <w:rPr>
-          <w:rFonts w:ascii="Consolas" w:eastAsia="Times New Roman" w:hAnsi="Consolas" w:cs="Times New Roman"/>
-          <w:color w:val="D4D4D4"/>
-          <w:kern w:val="0"/>
-          <w:sz w:val="21"/>
-          <w:szCs w:val="21"/>
-          <w:lang w:eastAsia="it-IT"/>
-          <w14:ligatures w14:val="none"/>
-        </w:rPr>
-        <w:t>+</w:t>
-      </w:r>
-      <w:r>
-        <w:rPr>
-          <w:rFonts w:ascii="Consolas" w:eastAsia="Times New Roman" w:hAnsi="Consolas" w:cs="Times New Roman"/>
-          <w:color w:val="C9D1D9"/>
-          <w:kern w:val="0"/>
-          <w:sz w:val="21"/>
-          <w:szCs w:val="21"/>
-          <w:lang w:eastAsia="it-IT"/>
-          <w14:ligatures w14:val="none"/>
-        </w:rPr>
-        <w:t xml:space="preserve"> </w:t>
-      </w:r>
-      <w:proofErr w:type="spellStart"/>
-      <w:r>
-        <w:rPr>
-          <w:rFonts w:ascii="Consolas" w:eastAsia="Times New Roman" w:hAnsi="Consolas" w:cs="Times New Roman"/>
-          <w:color w:val="FFA657"/>
-          <w:kern w:val="0"/>
-          <w:sz w:val="21"/>
-          <w:szCs w:val="21"/>
-          <w:lang w:eastAsia="it-IT"/>
-          <w14:ligatures w14:val="none"/>
-        </w:rPr>
-        <w:t>str</w:t>
-      </w:r>
-      <w:proofErr w:type="spellEnd"/>
-      <w:r>
-        <w:rPr>
-          <w:rFonts w:ascii="Consolas" w:eastAsia="Times New Roman" w:hAnsi="Consolas" w:cs="Times New Roman"/>
-          <w:color w:val="C9D1D9"/>
-          <w:kern w:val="0"/>
-          <w:sz w:val="21"/>
-          <w:szCs w:val="21"/>
-          <w:lang w:eastAsia="it-IT"/>
-          <w14:ligatures w14:val="none"/>
-        </w:rPr>
-        <w:t xml:space="preserve">[i] </w:t>
-      </w:r>
-      <w:r>
-        <w:rPr>
-          <w:rFonts w:ascii="Consolas" w:eastAsia="Times New Roman" w:hAnsi="Consolas" w:cs="Times New Roman"/>
-          <w:color w:val="D4D4D4"/>
-          <w:kern w:val="0"/>
-          <w:sz w:val="21"/>
-          <w:szCs w:val="21"/>
-          <w:lang w:eastAsia="it-IT"/>
-          <w14:ligatures w14:val="none"/>
-        </w:rPr>
-        <w:t>-</w:t>
-      </w:r>
-      <w:r>
-        <w:rPr>
-          <w:rFonts w:ascii="Consolas" w:eastAsia="Times New Roman" w:hAnsi="Consolas" w:cs="Times New Roman"/>
-          <w:color w:val="C9D1D9"/>
-          <w:kern w:val="0"/>
-          <w:sz w:val="21"/>
-          <w:szCs w:val="21"/>
-          <w:lang w:eastAsia="it-IT"/>
-          <w14:ligatures w14:val="none"/>
-        </w:rPr>
-        <w:t xml:space="preserve"> </w:t>
-      </w:r>
-      <w:r>
-        <w:rPr>
-          <w:rFonts w:ascii="Consolas" w:eastAsia="Times New Roman" w:hAnsi="Consolas" w:cs="Times New Roman"/>
-          <w:color w:val="A5D6FF"/>
-          <w:kern w:val="0"/>
-          <w:sz w:val="21"/>
-          <w:szCs w:val="21"/>
-          <w:lang w:eastAsia="it-IT"/>
-          <w14:ligatures w14:val="none"/>
-        </w:rPr>
-        <w:t>'0'</w:t>
-      </w:r>
-      <w:r>
-        <w:rPr>
-          <w:rFonts w:ascii="Consolas" w:eastAsia="Times New Roman" w:hAnsi="Consolas" w:cs="Times New Roman"/>
-          <w:color w:val="C9D1D9"/>
-          <w:kern w:val="0"/>
-          <w:sz w:val="21"/>
-          <w:szCs w:val="21"/>
-          <w:lang w:eastAsia="it-IT"/>
-          <w14:ligatures w14:val="none"/>
-        </w:rPr>
-        <w:t>;</w:t>
-      </w:r>
-    </w:p>
-    <w:p>
-      <w:pPr>
-        <w:rPr>
+          <w:b/>
+          <w:bCs/>
           <w:lang w:val="en-US"/>
         </w:rPr>
       </w:pPr>

</xml_diff>

<commit_message>
Add implementation for LRU Cache using a doubly linked list
</commit_message>
<xml_diff>
--- a/docs/PATTERNS.docx
+++ b/docs/PATTERNS.docx
@@ -55,6 +55,7 @@
           <w:lang w:val="en-US"/>
         </w:rPr>
       </w:pPr>
+      <w:proofErr w:type="gramStart"/>
       <w:r>
         <w:rPr>
           <w:b/>
@@ -62,7 +63,17 @@
           <w:color w:val="C00000"/>
           <w:lang w:val="en-US"/>
         </w:rPr>
-        <w:t xml:space="preserve">TOP-K ITEMS: </w:t>
+        <w:t>TOP-K</w:t>
+      </w:r>
+      <w:proofErr w:type="gramEnd"/>
+      <w:r>
+        <w:rPr>
+          <w:b/>
+          <w:bCs/>
+          <w:color w:val="C00000"/>
+          <w:lang w:val="en-US"/>
+        </w:rPr>
+        <w:t xml:space="preserve"> ITEMS: </w:t>
       </w:r>
       <w:r>
         <w:rPr>
@@ -96,21 +107,37 @@
           <w:iCs/>
           <w:lang w:val="en-US"/>
         </w:rPr>
-        <w:t>1_Arrays&amp;String</w:t>
-      </w:r>
+        <w:t>1_Arrays&amp;</w:t>
+      </w:r>
+      <w:proofErr w:type="gramStart"/>
       <w:r>
         <w:rPr>
           <w:i/>
           <w:iCs/>
           <w:lang w:val="en-US"/>
         </w:rPr>
+        <w:t>String</w:t>
+      </w:r>
+      <w:r>
+        <w:rPr>
+          <w:i/>
+          <w:iCs/>
+          <w:lang w:val="en-US"/>
+        </w:rPr>
         <w:t xml:space="preserve"> </w:t>
       </w:r>
       <w:r>
         <w:rPr>
           <w:lang w:val="en-US"/>
         </w:rPr>
-        <w:t xml:space="preserve"> problem </w:t>
+        <w:t xml:space="preserve"> problem</w:t>
+      </w:r>
+      <w:proofErr w:type="gramEnd"/>
+      <w:r>
+        <w:rPr>
+          <w:lang w:val="en-US"/>
+        </w:rPr>
+        <w:t xml:space="preserve"> </w:t>
       </w:r>
       <w:r>
         <w:rPr>
@@ -327,6 +354,7 @@
           <w14:ligatures w14:val="none"/>
         </w:rPr>
       </w:pPr>
+      <w:proofErr w:type="spellStart"/>
       <w:r>
         <w:rPr>
           <w:rFonts w:ascii="Consolas" w:eastAsia="Times New Roman" w:hAnsi="Consolas" w:cs="Times New Roman"/>
@@ -339,6 +367,7 @@
         </w:rPr>
         <w:t>val</w:t>
       </w:r>
+      <w:proofErr w:type="spellEnd"/>
       <w:r>
         <w:rPr>
           <w:rFonts w:ascii="Consolas" w:eastAsia="Times New Roman" w:hAnsi="Consolas" w:cs="Times New Roman"/>
@@ -388,7 +417,33 @@
           <w:lang w:val="en-US" w:eastAsia="it-IT"/>
           <w14:ligatures w14:val="none"/>
         </w:rPr>
-        <w:t>for p in len(str)</w:t>
+        <w:t xml:space="preserve">for p in </w:t>
+      </w:r>
+      <w:proofErr w:type="spellStart"/>
+      <w:r>
+        <w:rPr>
+          <w:rFonts w:ascii="Consolas" w:eastAsia="Times New Roman" w:hAnsi="Consolas" w:cs="Times New Roman"/>
+          <w:color w:val="C9D1D9"/>
+          <w:kern w:val="0"/>
+          <w:sz w:val="21"/>
+          <w:szCs w:val="21"/>
+          <w:lang w:val="en-US" w:eastAsia="it-IT"/>
+          <w14:ligatures w14:val="none"/>
+        </w:rPr>
+        <w:t>len</w:t>
+      </w:r>
+      <w:proofErr w:type="spellEnd"/>
+      <w:r>
+        <w:rPr>
+          <w:rFonts w:ascii="Consolas" w:eastAsia="Times New Roman" w:hAnsi="Consolas" w:cs="Times New Roman"/>
+          <w:color w:val="C9D1D9"/>
+          <w:kern w:val="0"/>
+          <w:sz w:val="21"/>
+          <w:szCs w:val="21"/>
+          <w:lang w:val="en-US" w:eastAsia="it-IT"/>
+          <w14:ligatures w14:val="none"/>
+        </w:rPr>
+        <w:t>(str)</w:t>
       </w:r>
     </w:p>
     <w:p>
@@ -406,6 +461,7 @@
           <w14:ligatures w14:val="none"/>
         </w:rPr>
       </w:pPr>
+      <w:proofErr w:type="spellStart"/>
       <w:r>
         <w:rPr>
           <w:rFonts w:ascii="Consolas" w:eastAsia="Times New Roman" w:hAnsi="Consolas" w:cs="Times New Roman"/>
@@ -418,6 +474,7 @@
         </w:rPr>
         <w:t>val</w:t>
       </w:r>
+      <w:proofErr w:type="spellEnd"/>
       <w:r>
         <w:rPr>
           <w:rFonts w:ascii="Consolas" w:eastAsia="Times New Roman" w:hAnsi="Consolas" w:cs="Times New Roman"/>
@@ -506,17 +563,31 @@
           <w14:ligatures w14:val="none"/>
         </w:rPr>
       </w:pPr>
-      <w:r>
-        <w:rPr>
-          <w:rFonts w:ascii="Consolas" w:eastAsia="Times New Roman" w:hAnsi="Consolas" w:cs="Times New Roman"/>
-          <w:color w:val="C9D1D9"/>
-          <w:kern w:val="0"/>
-          <w:sz w:val="21"/>
-          <w:szCs w:val="21"/>
-          <w:lang w:val="en-US" w:eastAsia="it-IT"/>
-          <w14:ligatures w14:val="none"/>
-        </w:rPr>
-        <w:t>val += (</w:t>
+      <w:proofErr w:type="spellStart"/>
+      <w:r>
+        <w:rPr>
+          <w:rFonts w:ascii="Consolas" w:eastAsia="Times New Roman" w:hAnsi="Consolas" w:cs="Times New Roman"/>
+          <w:color w:val="C9D1D9"/>
+          <w:kern w:val="0"/>
+          <w:sz w:val="21"/>
+          <w:szCs w:val="21"/>
+          <w:lang w:val="en-US" w:eastAsia="it-IT"/>
+          <w14:ligatures w14:val="none"/>
+        </w:rPr>
+        <w:t>val</w:t>
+      </w:r>
+      <w:proofErr w:type="spellEnd"/>
+      <w:r>
+        <w:rPr>
+          <w:rFonts w:ascii="Consolas" w:eastAsia="Times New Roman" w:hAnsi="Consolas" w:cs="Times New Roman"/>
+          <w:color w:val="C9D1D9"/>
+          <w:kern w:val="0"/>
+          <w:sz w:val="21"/>
+          <w:szCs w:val="21"/>
+          <w:lang w:val="en-US" w:eastAsia="it-IT"/>
+          <w14:ligatures w14:val="none"/>
+        </w:rPr>
+        <w:t xml:space="preserve"> += (</w:t>
       </w:r>
       <w:r>
         <w:rPr>
@@ -730,6 +801,7 @@
           <w14:ligatures w14:val="none"/>
         </w:rPr>
       </w:pPr>
+      <w:proofErr w:type="spellStart"/>
       <w:r>
         <w:rPr>
           <w:rFonts w:ascii="Consolas" w:eastAsia="Times New Roman" w:hAnsi="Consolas" w:cs="Times New Roman"/>
@@ -742,6 +814,7 @@
         </w:rPr>
         <w:t>val</w:t>
       </w:r>
+      <w:proofErr w:type="spellEnd"/>
       <w:r>
         <w:rPr>
           <w:rFonts w:ascii="Consolas" w:eastAsia="Times New Roman" w:hAnsi="Consolas" w:cs="Times New Roman"/>
@@ -806,7 +879,33 @@
           <w:lang w:val="en-US" w:eastAsia="it-IT"/>
           <w14:ligatures w14:val="none"/>
         </w:rPr>
-        <w:t>for p in len(str)</w:t>
+        <w:t xml:space="preserve">for p in </w:t>
+      </w:r>
+      <w:proofErr w:type="spellStart"/>
+      <w:r>
+        <w:rPr>
+          <w:rFonts w:ascii="Consolas" w:eastAsia="Times New Roman" w:hAnsi="Consolas" w:cs="Times New Roman"/>
+          <w:color w:val="C9D1D9"/>
+          <w:kern w:val="0"/>
+          <w:sz w:val="21"/>
+          <w:szCs w:val="21"/>
+          <w:lang w:val="en-US" w:eastAsia="it-IT"/>
+          <w14:ligatures w14:val="none"/>
+        </w:rPr>
+        <w:t>len</w:t>
+      </w:r>
+      <w:proofErr w:type="spellEnd"/>
+      <w:r>
+        <w:rPr>
+          <w:rFonts w:ascii="Consolas" w:eastAsia="Times New Roman" w:hAnsi="Consolas" w:cs="Times New Roman"/>
+          <w:color w:val="C9D1D9"/>
+          <w:kern w:val="0"/>
+          <w:sz w:val="21"/>
+          <w:szCs w:val="21"/>
+          <w:lang w:val="en-US" w:eastAsia="it-IT"/>
+          <w14:ligatures w14:val="none"/>
+        </w:rPr>
+        <w:t>(str)</w:t>
       </w:r>
     </w:p>
     <w:p>
@@ -824,6 +923,7 @@
           <w14:ligatures w14:val="none"/>
         </w:rPr>
       </w:pPr>
+      <w:proofErr w:type="spellStart"/>
       <w:r>
         <w:rPr>
           <w:rFonts w:ascii="Consolas" w:eastAsia="Times New Roman" w:hAnsi="Consolas" w:cs="Times New Roman"/>
@@ -836,6 +936,7 @@
         </w:rPr>
         <w:t>val</w:t>
       </w:r>
+      <w:proofErr w:type="spellEnd"/>
       <w:r>
         <w:rPr>
           <w:rFonts w:ascii="Consolas" w:eastAsia="Times New Roman" w:hAnsi="Consolas" w:cs="Times New Roman"/>
@@ -984,6 +1085,7 @@
           <w14:ligatures w14:val="none"/>
         </w:rPr>
       </w:pPr>
+      <w:proofErr w:type="spellStart"/>
       <w:r>
         <w:rPr>
           <w:rFonts w:ascii="Consolas" w:eastAsia="Times New Roman" w:hAnsi="Consolas" w:cs="Times New Roman"/>
@@ -996,6 +1098,7 @@
         </w:rPr>
         <w:t>multiplier</w:t>
       </w:r>
+      <w:proofErr w:type="spellEnd"/>
       <w:r>
         <w:rPr>
           <w:rFonts w:ascii="Consolas" w:eastAsia="Times New Roman" w:hAnsi="Consolas" w:cs="Times New Roman"/>
@@ -1055,6 +1158,167 @@
           <w14:ligatures w14:val="none"/>
         </w:rPr>
         <w:t>;</w:t>
+      </w:r>
+    </w:p>
+    <w:p>
+      <w:pPr>
+        <w:rPr>
+          <w:b/>
+          <w:bCs/>
+          <w:lang w:val="en-US"/>
+        </w:rPr>
+      </w:pPr>
+    </w:p>
+    <w:p>
+      <w:pPr>
+        <w:rPr>
+          <w:b/>
+          <w:bCs/>
+          <w:lang w:val="en-US"/>
+        </w:rPr>
+      </w:pPr>
+      <w:r>
+        <w:rPr>
+          <w:b/>
+          <w:bCs/>
+          <w:color w:val="C00000"/>
+          <w:lang w:val="en-US"/>
+        </w:rPr>
+        <w:t>FAST &amp; SLOW POINTERS</w:t>
+      </w:r>
+      <w:r>
+        <w:rPr>
+          <w:b/>
+          <w:bCs/>
+          <w:color w:val="C00000"/>
+          <w:lang w:val="en-US"/>
+        </w:rPr>
+        <w:t>:</w:t>
+      </w:r>
+      <w:r>
+        <w:rPr>
+          <w:b/>
+          <w:bCs/>
+          <w:color w:val="C00000"/>
+          <w:lang w:val="en-US"/>
+        </w:rPr>
+        <w:t xml:space="preserve"> </w:t>
+      </w:r>
+      <w:r>
+        <w:rPr>
+          <w:b/>
+          <w:bCs/>
+          <w:lang w:val="en-US"/>
+        </w:rPr>
+        <w:t>FLOYD’S</w:t>
+      </w:r>
+      <w:r>
+        <w:rPr>
+          <w:b/>
+          <w:bCs/>
+          <w:lang w:val="en-US"/>
+        </w:rPr>
+        <w:t xml:space="preserve"> </w:t>
+      </w:r>
+      <w:r>
+        <w:rPr>
+          <w:b/>
+          <w:bCs/>
+          <w:lang w:val="en-US"/>
+        </w:rPr>
+        <w:t xml:space="preserve">TORTOISE AND HARE ALGORITHM </w:t>
+      </w:r>
+      <w:r>
+        <w:rPr>
+          <w:b/>
+          <w:bCs/>
+          <w:lang w:val="en-US"/>
+        </w:rPr>
+        <w:sym w:font="Wingdings" w:char="F0E0"/>
+      </w:r>
+      <w:r>
+        <w:rPr>
+          <w:b/>
+          <w:bCs/>
+          <w:lang w:val="en-US"/>
+        </w:rPr>
+        <w:t xml:space="preserve"> </w:t>
+      </w:r>
+      <w:r>
+        <w:rPr>
+          <w:lang w:val="en-US"/>
+        </w:rPr>
+        <w:t>see</w:t>
+      </w:r>
+      <w:r>
+        <w:rPr>
+          <w:i/>
+          <w:iCs/>
+          <w:lang w:val="en-US"/>
+        </w:rPr>
+        <w:t>6</w:t>
+      </w:r>
+      <w:r>
+        <w:rPr>
+          <w:i/>
+          <w:iCs/>
+          <w:lang w:val="en-US"/>
+        </w:rPr>
+        <w:t>_</w:t>
+      </w:r>
+      <w:r>
+        <w:rPr>
+          <w:i/>
+          <w:iCs/>
+          <w:lang w:val="en-US"/>
+        </w:rPr>
+        <w:t xml:space="preserve">LinkedLists </w:t>
+      </w:r>
+      <w:r>
+        <w:rPr>
+          <w:lang w:val="en-US"/>
+        </w:rPr>
+        <w:t xml:space="preserve">problem </w:t>
+      </w:r>
+      <w:r>
+        <w:rPr>
+          <w:b/>
+          <w:bCs/>
+          <w:highlight w:val="yellow"/>
+          <w:lang w:val="en-US"/>
+        </w:rPr>
+        <w:t>287</w:t>
+      </w:r>
+      <w:r>
+        <w:rPr>
+          <w:b/>
+          <w:bCs/>
+          <w:lang w:val="en-US"/>
+        </w:rPr>
+        <w:t xml:space="preserve"> </w:t>
+      </w:r>
+      <w:r>
+        <w:rPr>
+          <w:lang w:val="en-US"/>
+        </w:rPr>
+        <w:t>e</w:t>
+      </w:r>
+      <w:r>
+        <w:rPr>
+          <w:b/>
+          <w:bCs/>
+          <w:lang w:val="en-US"/>
+        </w:rPr>
+        <w:t xml:space="preserve"> </w:t>
+      </w:r>
+      <w:r>
+        <w:rPr>
+          <w:b/>
+          <w:bCs/>
+          <w:highlight w:val="yellow"/>
+          <w:lang w:val="en-US"/>
+        </w:rPr>
+        <w:t>141</w:t>
       </w:r>
     </w:p>
     <w:p>
@@ -1679,6 +1943,7 @@
   <w:style w:type="character" w:default="1" w:styleId="Carpredefinitoparagrafo">
     <w:name w:val="Default Paragraph Font"/>
     <w:uiPriority w:val="1"/>
+    <w:semiHidden/>
     <w:unhideWhenUsed/>
   </w:style>
   <w:style w:type="table" w:default="1" w:styleId="Tabellanormale">

</xml_diff>

<commit_message>
Add implementation for k-th smallest element in a binary search tree using Morris traversal
</commit_message>
<xml_diff>
--- a/docs/PATTERNS.docx
+++ b/docs/PATTERNS.docx
@@ -318,6 +318,7 @@
           <w14:ligatures w14:val="none"/>
         </w:rPr>
       </w:pPr>
+      <w:proofErr w:type="spellStart"/>
       <w:r>
         <w:rPr>
           <w:rFonts w:ascii="Consolas" w:eastAsia="Times New Roman" w:hAnsi="Consolas" w:cs="Times New Roman"/>
@@ -330,6 +331,7 @@
         </w:rPr>
         <w:t>val</w:t>
       </w:r>
+      <w:proofErr w:type="spellEnd"/>
       <w:r>
         <w:rPr>
           <w:rFonts w:ascii="Consolas" w:eastAsia="Times New Roman" w:hAnsi="Consolas" w:cs="Times New Roman"/>
@@ -379,7 +381,33 @@
           <w:lang w:val="en-US" w:eastAsia="it-IT"/>
           <w14:ligatures w14:val="none"/>
         </w:rPr>
-        <w:t>for p in len(str)</w:t>
+        <w:t xml:space="preserve">for p in </w:t>
+      </w:r>
+      <w:proofErr w:type="spellStart"/>
+      <w:r>
+        <w:rPr>
+          <w:rFonts w:ascii="Consolas" w:eastAsia="Times New Roman" w:hAnsi="Consolas" w:cs="Times New Roman"/>
+          <w:color w:val="C9D1D9"/>
+          <w:kern w:val="0"/>
+          <w:sz w:val="21"/>
+          <w:szCs w:val="21"/>
+          <w:lang w:val="en-US" w:eastAsia="it-IT"/>
+          <w14:ligatures w14:val="none"/>
+        </w:rPr>
+        <w:t>len</w:t>
+      </w:r>
+      <w:proofErr w:type="spellEnd"/>
+      <w:r>
+        <w:rPr>
+          <w:rFonts w:ascii="Consolas" w:eastAsia="Times New Roman" w:hAnsi="Consolas" w:cs="Times New Roman"/>
+          <w:color w:val="C9D1D9"/>
+          <w:kern w:val="0"/>
+          <w:sz w:val="21"/>
+          <w:szCs w:val="21"/>
+          <w:lang w:val="en-US" w:eastAsia="it-IT"/>
+          <w14:ligatures w14:val="none"/>
+        </w:rPr>
+        <w:t>(str)</w:t>
       </w:r>
     </w:p>
     <w:p>
@@ -397,6 +425,7 @@
           <w14:ligatures w14:val="none"/>
         </w:rPr>
       </w:pPr>
+      <w:proofErr w:type="spellStart"/>
       <w:r>
         <w:rPr>
           <w:rFonts w:ascii="Consolas" w:eastAsia="Times New Roman" w:hAnsi="Consolas" w:cs="Times New Roman"/>
@@ -409,6 +438,7 @@
         </w:rPr>
         <w:t>val</w:t>
       </w:r>
+      <w:proofErr w:type="spellEnd"/>
       <w:r>
         <w:rPr>
           <w:rFonts w:ascii="Consolas" w:eastAsia="Times New Roman" w:hAnsi="Consolas" w:cs="Times New Roman"/>
@@ -497,17 +527,31 @@
           <w14:ligatures w14:val="none"/>
         </w:rPr>
       </w:pPr>
-      <w:r>
-        <w:rPr>
-          <w:rFonts w:ascii="Consolas" w:eastAsia="Times New Roman" w:hAnsi="Consolas" w:cs="Times New Roman"/>
-          <w:color w:val="C9D1D9"/>
-          <w:kern w:val="0"/>
-          <w:sz w:val="21"/>
-          <w:szCs w:val="21"/>
-          <w:lang w:val="en-US" w:eastAsia="it-IT"/>
-          <w14:ligatures w14:val="none"/>
-        </w:rPr>
-        <w:t>val += (</w:t>
+      <w:proofErr w:type="spellStart"/>
+      <w:r>
+        <w:rPr>
+          <w:rFonts w:ascii="Consolas" w:eastAsia="Times New Roman" w:hAnsi="Consolas" w:cs="Times New Roman"/>
+          <w:color w:val="C9D1D9"/>
+          <w:kern w:val="0"/>
+          <w:sz w:val="21"/>
+          <w:szCs w:val="21"/>
+          <w:lang w:val="en-US" w:eastAsia="it-IT"/>
+          <w14:ligatures w14:val="none"/>
+        </w:rPr>
+        <w:t>val</w:t>
+      </w:r>
+      <w:proofErr w:type="spellEnd"/>
+      <w:r>
+        <w:rPr>
+          <w:rFonts w:ascii="Consolas" w:eastAsia="Times New Roman" w:hAnsi="Consolas" w:cs="Times New Roman"/>
+          <w:color w:val="C9D1D9"/>
+          <w:kern w:val="0"/>
+          <w:sz w:val="21"/>
+          <w:szCs w:val="21"/>
+          <w:lang w:val="en-US" w:eastAsia="it-IT"/>
+          <w14:ligatures w14:val="none"/>
+        </w:rPr>
+        <w:t xml:space="preserve"> += (</w:t>
       </w:r>
       <w:r>
         <w:rPr>
@@ -721,6 +765,7 @@
           <w14:ligatures w14:val="none"/>
         </w:rPr>
       </w:pPr>
+      <w:proofErr w:type="spellStart"/>
       <w:r>
         <w:rPr>
           <w:rFonts w:ascii="Consolas" w:eastAsia="Times New Roman" w:hAnsi="Consolas" w:cs="Times New Roman"/>
@@ -733,6 +778,7 @@
         </w:rPr>
         <w:t>val</w:t>
       </w:r>
+      <w:proofErr w:type="spellEnd"/>
       <w:r>
         <w:rPr>
           <w:rFonts w:ascii="Consolas" w:eastAsia="Times New Roman" w:hAnsi="Consolas" w:cs="Times New Roman"/>
@@ -797,7 +843,33 @@
           <w:lang w:val="en-US" w:eastAsia="it-IT"/>
           <w14:ligatures w14:val="none"/>
         </w:rPr>
-        <w:t>for p in len(str)</w:t>
+        <w:t xml:space="preserve">for p in </w:t>
+      </w:r>
+      <w:proofErr w:type="spellStart"/>
+      <w:r>
+        <w:rPr>
+          <w:rFonts w:ascii="Consolas" w:eastAsia="Times New Roman" w:hAnsi="Consolas" w:cs="Times New Roman"/>
+          <w:color w:val="C9D1D9"/>
+          <w:kern w:val="0"/>
+          <w:sz w:val="21"/>
+          <w:szCs w:val="21"/>
+          <w:lang w:val="en-US" w:eastAsia="it-IT"/>
+          <w14:ligatures w14:val="none"/>
+        </w:rPr>
+        <w:t>len</w:t>
+      </w:r>
+      <w:proofErr w:type="spellEnd"/>
+      <w:r>
+        <w:rPr>
+          <w:rFonts w:ascii="Consolas" w:eastAsia="Times New Roman" w:hAnsi="Consolas" w:cs="Times New Roman"/>
+          <w:color w:val="C9D1D9"/>
+          <w:kern w:val="0"/>
+          <w:sz w:val="21"/>
+          <w:szCs w:val="21"/>
+          <w:lang w:val="en-US" w:eastAsia="it-IT"/>
+          <w14:ligatures w14:val="none"/>
+        </w:rPr>
+        <w:t>(str)</w:t>
       </w:r>
     </w:p>
     <w:p>
@@ -815,6 +887,7 @@
           <w14:ligatures w14:val="none"/>
         </w:rPr>
       </w:pPr>
+      <w:proofErr w:type="spellStart"/>
       <w:r>
         <w:rPr>
           <w:rFonts w:ascii="Consolas" w:eastAsia="Times New Roman" w:hAnsi="Consolas" w:cs="Times New Roman"/>
@@ -827,6 +900,7 @@
         </w:rPr>
         <w:t>val</w:t>
       </w:r>
+      <w:proofErr w:type="spellEnd"/>
       <w:r>
         <w:rPr>
           <w:rFonts w:ascii="Consolas" w:eastAsia="Times New Roman" w:hAnsi="Consolas" w:cs="Times New Roman"/>
@@ -1222,25 +1296,7 @@
           <w:color w:val="C00000"/>
           <w:lang w:val="en-US"/>
         </w:rPr>
-        <w:t>SERIALIZATION + PATTERN MATCHING</w:t>
-      </w:r>
-      <w:r>
-        <w:rPr>
-          <w:b/>
-          <w:bCs/>
-          <w:color w:val="C00000"/>
-          <w:lang w:val="en-US"/>
-        </w:rPr>
-        <w:t>:</w:t>
-      </w:r>
-      <w:r>
-        <w:rPr>
-          <w:b/>
-          <w:bCs/>
-          <w:color w:val="C00000"/>
-          <w:lang w:val="en-US"/>
-        </w:rPr>
-        <w:t xml:space="preserve"> </w:t>
+        <w:t xml:space="preserve">SERIALIZATION + PATTERN MATCHING: </w:t>
       </w:r>
       <w:r>
         <w:rPr>
@@ -1248,15 +1304,7 @@
           <w:bCs/>
           <w:lang w:val="en-US"/>
         </w:rPr>
-        <w:t>SERIALIZE A TREE &amp; FIND SUBSTRING EFFICIENTLY WITH PATTERN MATCHING</w:t>
-      </w:r>
-      <w:r>
-        <w:rPr>
-          <w:b/>
-          <w:bCs/>
-          <w:lang w:val="en-US"/>
-        </w:rPr>
-        <w:t xml:space="preserve"> </w:t>
+        <w:t xml:space="preserve">SERIALIZE A TREE &amp; FIND SUBSTRING EFFICIENTLY WITH PATTERN MATCHING </w:t>
       </w:r>
       <w:r>
         <w:rPr>
@@ -1566,6 +1614,7 @@
         </w:rPr>
         <w:t>[</w:t>
       </w:r>
+      <w:proofErr w:type="spellStart"/>
       <w:r>
         <w:rPr>
           <w:rFonts w:ascii="Consolas" w:eastAsia="Times New Roman" w:hAnsi="Consolas" w:cs="Times New Roman"/>
@@ -1578,6 +1627,7 @@
         </w:rPr>
         <w:t>TreeNode</w:t>
       </w:r>
+      <w:proofErr w:type="spellEnd"/>
       <w:r>
         <w:rPr>
           <w:rFonts w:ascii="Consolas" w:eastAsia="Times New Roman" w:hAnsi="Consolas" w:cs="Times New Roman"/>
@@ -1923,6 +1973,7 @@
         </w:rPr>
         <w:t>(</w:t>
       </w:r>
+      <w:proofErr w:type="spellStart"/>
       <w:r>
         <w:rPr>
           <w:rFonts w:ascii="Consolas" w:eastAsia="Times New Roman" w:hAnsi="Consolas" w:cs="Times New Roman"/>
@@ -1945,7 +1996,20 @@
           <w:lang w:val="en-US" w:eastAsia="it-IT"/>
           <w14:ligatures w14:val="none"/>
         </w:rPr>
-        <w:t xml:space="preserve">.val) </w:t>
+        <w:t>.val</w:t>
+      </w:r>
+      <w:proofErr w:type="spellEnd"/>
+      <w:r>
+        <w:rPr>
+          <w:rFonts w:ascii="Consolas" w:eastAsia="Times New Roman" w:hAnsi="Consolas" w:cs="Times New Roman"/>
+          <w:color w:val="BBBEBF"/>
+          <w:kern w:val="0"/>
+          <w:sz w:val="21"/>
+          <w:szCs w:val="21"/>
+          <w:lang w:val="en-US" w:eastAsia="it-IT"/>
+          <w14:ligatures w14:val="none"/>
+        </w:rPr>
+        <w:t xml:space="preserve">) </w:t>
       </w:r>
       <w:r>
         <w:rPr>
@@ -1971,6 +2035,7 @@
         </w:rPr>
         <w:t xml:space="preserve"> </w:t>
       </w:r>
+      <w:proofErr w:type="spellStart"/>
       <w:r>
         <w:rPr>
           <w:rFonts w:ascii="Consolas" w:eastAsia="Times New Roman" w:hAnsi="Consolas" w:cs="Times New Roman"/>
@@ -2007,6 +2072,7 @@
         </w:rPr>
         <w:t>serialize</w:t>
       </w:r>
+      <w:proofErr w:type="spellEnd"/>
       <w:r>
         <w:rPr>
           <w:rFonts w:ascii="Consolas" w:eastAsia="Times New Roman" w:hAnsi="Consolas" w:cs="Times New Roman"/>
@@ -2019,6 +2085,7 @@
         </w:rPr>
         <w:t>(</w:t>
       </w:r>
+      <w:proofErr w:type="spellStart"/>
       <w:r>
         <w:rPr>
           <w:rFonts w:ascii="Consolas" w:eastAsia="Times New Roman" w:hAnsi="Consolas" w:cs="Times New Roman"/>
@@ -2041,7 +2108,20 @@
           <w:lang w:val="en-US" w:eastAsia="it-IT"/>
           <w14:ligatures w14:val="none"/>
         </w:rPr>
-        <w:t xml:space="preserve">.left) </w:t>
+        <w:t>.left</w:t>
+      </w:r>
+      <w:proofErr w:type="spellEnd"/>
+      <w:r>
+        <w:rPr>
+          <w:rFonts w:ascii="Consolas" w:eastAsia="Times New Roman" w:hAnsi="Consolas" w:cs="Times New Roman"/>
+          <w:color w:val="BBBEBF"/>
+          <w:kern w:val="0"/>
+          <w:sz w:val="21"/>
+          <w:szCs w:val="21"/>
+          <w:lang w:val="en-US" w:eastAsia="it-IT"/>
+          <w14:ligatures w14:val="none"/>
+        </w:rPr>
+        <w:t xml:space="preserve">) </w:t>
       </w:r>
       <w:r>
         <w:rPr>
@@ -2067,6 +2147,7 @@
         </w:rPr>
         <w:t xml:space="preserve"> </w:t>
       </w:r>
+      <w:proofErr w:type="spellStart"/>
       <w:r>
         <w:rPr>
           <w:rFonts w:ascii="Consolas" w:eastAsia="Times New Roman" w:hAnsi="Consolas" w:cs="Times New Roman"/>
@@ -2103,6 +2184,7 @@
         </w:rPr>
         <w:t>serialize</w:t>
       </w:r>
+      <w:proofErr w:type="spellEnd"/>
       <w:r>
         <w:rPr>
           <w:rFonts w:ascii="Consolas" w:eastAsia="Times New Roman" w:hAnsi="Consolas" w:cs="Times New Roman"/>
@@ -2115,6 +2197,7 @@
         </w:rPr>
         <w:t>(</w:t>
       </w:r>
+      <w:proofErr w:type="spellStart"/>
       <w:r>
         <w:rPr>
           <w:rFonts w:ascii="Consolas" w:eastAsia="Times New Roman" w:hAnsi="Consolas" w:cs="Times New Roman"/>
@@ -2137,7 +2220,20 @@
           <w:lang w:val="en-US" w:eastAsia="it-IT"/>
           <w14:ligatures w14:val="none"/>
         </w:rPr>
-        <w:t>.right))</w:t>
+        <w:t>.right</w:t>
+      </w:r>
+      <w:proofErr w:type="spellEnd"/>
+      <w:r>
+        <w:rPr>
+          <w:rFonts w:ascii="Consolas" w:eastAsia="Times New Roman" w:hAnsi="Consolas" w:cs="Times New Roman"/>
+          <w:color w:val="BBBEBF"/>
+          <w:kern w:val="0"/>
+          <w:sz w:val="21"/>
+          <w:szCs w:val="21"/>
+          <w:lang w:val="en-US" w:eastAsia="it-IT"/>
+          <w14:ligatures w14:val="none"/>
+        </w:rPr>
+        <w:t>))</w:t>
       </w:r>
     </w:p>
     <w:p>
@@ -2205,6 +2301,7 @@
         </w:rPr>
         <w:t xml:space="preserve"> </w:t>
       </w:r>
+      <w:proofErr w:type="spellStart"/>
       <w:r>
         <w:rPr>
           <w:rFonts w:ascii="Consolas" w:eastAsia="Times New Roman" w:hAnsi="Consolas" w:cs="Times New Roman"/>
@@ -2217,6 +2314,7 @@
         </w:rPr>
         <w:t>z_function</w:t>
       </w:r>
+      <w:proofErr w:type="spellEnd"/>
       <w:r>
         <w:rPr>
           <w:rFonts w:ascii="Consolas" w:eastAsia="Times New Roman" w:hAnsi="Consolas" w:cs="Times New Roman"/>
@@ -2448,6 +2546,7 @@
         </w:rPr>
         <w:t xml:space="preserve"> </w:t>
       </w:r>
+      <w:proofErr w:type="spellStart"/>
       <w:r>
         <w:rPr>
           <w:rFonts w:ascii="Consolas" w:eastAsia="Times New Roman" w:hAnsi="Consolas" w:cs="Times New Roman"/>
@@ -2460,6 +2559,7 @@
         </w:rPr>
         <w:t>len</w:t>
       </w:r>
+      <w:proofErr w:type="spellEnd"/>
       <w:r>
         <w:rPr>
           <w:rFonts w:ascii="Consolas" w:eastAsia="Times New Roman" w:hAnsi="Consolas" w:cs="Times New Roman"/>
@@ -2682,6 +2782,7 @@
         </w:rPr>
         <w:t xml:space="preserve">, </w:t>
       </w:r>
+      <w:proofErr w:type="spellStart"/>
       <w:r>
         <w:rPr>
           <w:rFonts w:ascii="Consolas" w:eastAsia="Times New Roman" w:hAnsi="Consolas" w:cs="Times New Roman"/>
@@ -2694,6 +2795,7 @@
         </w:rPr>
         <w:t>len</w:t>
       </w:r>
+      <w:proofErr w:type="spellEnd"/>
       <w:r>
         <w:rPr>
           <w:rFonts w:ascii="Consolas" w:eastAsia="Times New Roman" w:hAnsi="Consolas" w:cs="Times New Roman"/>
@@ -2796,6 +2898,7 @@
         </w:rPr>
         <w:t xml:space="preserve"> </w:t>
       </w:r>
+      <w:proofErr w:type="spellStart"/>
       <w:r>
         <w:rPr>
           <w:rFonts w:ascii="Consolas" w:eastAsia="Times New Roman" w:hAnsi="Consolas" w:cs="Times New Roman"/>
@@ -2808,6 +2911,7 @@
         </w:rPr>
         <w:t>i</w:t>
       </w:r>
+      <w:proofErr w:type="spellEnd"/>
       <w:r>
         <w:rPr>
           <w:rFonts w:ascii="Consolas" w:eastAsia="Times New Roman" w:hAnsi="Consolas" w:cs="Times New Roman"/>
@@ -2967,6 +3071,7 @@
         </w:rPr>
         <w:t xml:space="preserve"> </w:t>
       </w:r>
+      <w:proofErr w:type="spellStart"/>
       <w:r>
         <w:rPr>
           <w:rFonts w:ascii="Consolas" w:eastAsia="Times New Roman" w:hAnsi="Consolas" w:cs="Times New Roman"/>
@@ -2979,6 +3084,7 @@
         </w:rPr>
         <w:t>i</w:t>
       </w:r>
+      <w:proofErr w:type="spellEnd"/>
       <w:r>
         <w:rPr>
           <w:rFonts w:ascii="Consolas" w:eastAsia="Times New Roman" w:hAnsi="Consolas" w:cs="Times New Roman"/>
@@ -3090,6 +3196,7 @@
         </w:rPr>
         <w:t>[</w:t>
       </w:r>
+      <w:proofErr w:type="spellStart"/>
       <w:r>
         <w:rPr>
           <w:rFonts w:ascii="Consolas" w:eastAsia="Times New Roman" w:hAnsi="Consolas" w:cs="Times New Roman"/>
@@ -3102,6 +3209,7 @@
         </w:rPr>
         <w:t>i</w:t>
       </w:r>
+      <w:proofErr w:type="spellEnd"/>
       <w:r>
         <w:rPr>
           <w:rFonts w:ascii="Consolas" w:eastAsia="Times New Roman" w:hAnsi="Consolas" w:cs="Times New Roman"/>
@@ -3210,6 +3318,7 @@
         </w:rPr>
         <w:t xml:space="preserve"> </w:t>
       </w:r>
+      <w:proofErr w:type="spellStart"/>
       <w:r>
         <w:rPr>
           <w:rFonts w:ascii="Consolas" w:eastAsia="Times New Roman" w:hAnsi="Consolas" w:cs="Times New Roman"/>
@@ -3222,6 +3331,7 @@
         </w:rPr>
         <w:t>i</w:t>
       </w:r>
+      <w:proofErr w:type="spellEnd"/>
       <w:r>
         <w:rPr>
           <w:rFonts w:ascii="Consolas" w:eastAsia="Times New Roman" w:hAnsi="Consolas" w:cs="Times New Roman"/>
@@ -3306,6 +3416,7 @@
         </w:rPr>
         <w:t>[</w:t>
       </w:r>
+      <w:proofErr w:type="spellStart"/>
       <w:r>
         <w:rPr>
           <w:rFonts w:ascii="Consolas" w:eastAsia="Times New Roman" w:hAnsi="Consolas" w:cs="Times New Roman"/>
@@ -3318,6 +3429,7 @@
         </w:rPr>
         <w:t>i</w:t>
       </w:r>
+      <w:proofErr w:type="spellEnd"/>
       <w:r>
         <w:rPr>
           <w:rFonts w:ascii="Consolas" w:eastAsia="Times New Roman" w:hAnsi="Consolas" w:cs="Times New Roman"/>
@@ -3456,6 +3568,7 @@
         </w:rPr>
         <w:t xml:space="preserve"> </w:t>
       </w:r>
+      <w:proofErr w:type="spellStart"/>
       <w:r>
         <w:rPr>
           <w:rFonts w:ascii="Consolas" w:eastAsia="Times New Roman" w:hAnsi="Consolas" w:cs="Times New Roman"/>
@@ -3468,6 +3581,7 @@
         </w:rPr>
         <w:t>i</w:t>
       </w:r>
+      <w:proofErr w:type="spellEnd"/>
       <w:r>
         <w:rPr>
           <w:rFonts w:ascii="Consolas" w:eastAsia="Times New Roman" w:hAnsi="Consolas" w:cs="Times New Roman"/>
@@ -3528,6 +3642,7 @@
         </w:rPr>
         <w:t>[</w:t>
       </w:r>
+      <w:proofErr w:type="spellStart"/>
       <w:r>
         <w:rPr>
           <w:rFonts w:ascii="Consolas" w:eastAsia="Times New Roman" w:hAnsi="Consolas" w:cs="Times New Roman"/>
@@ -3540,6 +3655,7 @@
         </w:rPr>
         <w:t>i</w:t>
       </w:r>
+      <w:proofErr w:type="spellEnd"/>
       <w:r>
         <w:rPr>
           <w:rFonts w:ascii="Consolas" w:eastAsia="Times New Roman" w:hAnsi="Consolas" w:cs="Times New Roman"/>
@@ -3672,6 +3788,7 @@
         </w:rPr>
         <w:t>[</w:t>
       </w:r>
+      <w:proofErr w:type="spellStart"/>
       <w:r>
         <w:rPr>
           <w:rFonts w:ascii="Consolas" w:eastAsia="Times New Roman" w:hAnsi="Consolas" w:cs="Times New Roman"/>
@@ -3684,6 +3801,7 @@
         </w:rPr>
         <w:t>i</w:t>
       </w:r>
+      <w:proofErr w:type="spellEnd"/>
       <w:r>
         <w:rPr>
           <w:rFonts w:ascii="Consolas" w:eastAsia="Times New Roman" w:hAnsi="Consolas" w:cs="Times New Roman"/>
@@ -3744,6 +3862,7 @@
         </w:rPr>
         <w:t>[</w:t>
       </w:r>
+      <w:proofErr w:type="spellStart"/>
       <w:r>
         <w:rPr>
           <w:rFonts w:ascii="Consolas" w:eastAsia="Times New Roman" w:hAnsi="Consolas" w:cs="Times New Roman"/>
@@ -3756,6 +3875,7 @@
         </w:rPr>
         <w:t>i</w:t>
       </w:r>
+      <w:proofErr w:type="spellEnd"/>
       <w:r>
         <w:rPr>
           <w:rFonts w:ascii="Consolas" w:eastAsia="Times New Roman" w:hAnsi="Consolas" w:cs="Times New Roman"/>
@@ -3816,6 +3936,7 @@
         </w:rPr>
         <w:t>[</w:t>
       </w:r>
+      <w:proofErr w:type="spellStart"/>
       <w:r>
         <w:rPr>
           <w:rFonts w:ascii="Consolas" w:eastAsia="Times New Roman" w:hAnsi="Consolas" w:cs="Times New Roman"/>
@@ -3828,6 +3949,7 @@
         </w:rPr>
         <w:t>i</w:t>
       </w:r>
+      <w:proofErr w:type="spellEnd"/>
       <w:r>
         <w:rPr>
           <w:rFonts w:ascii="Consolas" w:eastAsia="Times New Roman" w:hAnsi="Consolas" w:cs="Times New Roman"/>
@@ -4006,6 +4128,7 @@
         </w:rPr>
         <w:t xml:space="preserve">            </w:t>
       </w:r>
+      <w:proofErr w:type="spellStart"/>
       <w:r>
         <w:rPr>
           <w:rFonts w:ascii="Consolas" w:eastAsia="Times New Roman" w:hAnsi="Consolas" w:cs="Times New Roman"/>
@@ -4018,6 +4141,7 @@
         </w:rPr>
         <w:t>if</w:t>
       </w:r>
+      <w:proofErr w:type="spellEnd"/>
       <w:r>
         <w:rPr>
           <w:rFonts w:ascii="Consolas" w:eastAsia="Times New Roman" w:hAnsi="Consolas" w:cs="Times New Roman"/>
@@ -4633,6 +4757,7 @@
         </w:rPr>
         <w:t xml:space="preserve"> </w:t>
       </w:r>
+      <w:proofErr w:type="spellStart"/>
       <w:r>
         <w:rPr>
           <w:rFonts w:ascii="Consolas" w:eastAsia="Times New Roman" w:hAnsi="Consolas" w:cs="Times New Roman"/>
@@ -4645,6 +4770,7 @@
         </w:rPr>
         <w:t>isSubtree</w:t>
       </w:r>
+      <w:proofErr w:type="spellEnd"/>
       <w:r>
         <w:rPr>
           <w:rFonts w:ascii="Consolas" w:eastAsia="Times New Roman" w:hAnsi="Consolas" w:cs="Times New Roman"/>
@@ -4729,6 +4855,7 @@
         </w:rPr>
         <w:t>[</w:t>
       </w:r>
+      <w:proofErr w:type="spellStart"/>
       <w:r>
         <w:rPr>
           <w:rFonts w:ascii="Consolas" w:eastAsia="Times New Roman" w:hAnsi="Consolas" w:cs="Times New Roman"/>
@@ -4741,6 +4868,7 @@
         </w:rPr>
         <w:t>TreeNode</w:t>
       </w:r>
+      <w:proofErr w:type="spellEnd"/>
       <w:r>
         <w:rPr>
           <w:rFonts w:ascii="Consolas" w:eastAsia="Times New Roman" w:hAnsi="Consolas" w:cs="Times New Roman"/>
@@ -4753,6 +4881,7 @@
         </w:rPr>
         <w:t xml:space="preserve">], </w:t>
       </w:r>
+      <w:proofErr w:type="spellStart"/>
       <w:r>
         <w:rPr>
           <w:rFonts w:ascii="Consolas" w:eastAsia="Times New Roman" w:hAnsi="Consolas" w:cs="Times New Roman"/>
@@ -4765,6 +4894,7 @@
         </w:rPr>
         <w:t>subRoot</w:t>
       </w:r>
+      <w:proofErr w:type="spellEnd"/>
       <w:r>
         <w:rPr>
           <w:rFonts w:ascii="Consolas" w:eastAsia="Times New Roman" w:hAnsi="Consolas" w:cs="Times New Roman"/>
@@ -4801,6 +4931,7 @@
         </w:rPr>
         <w:t>[</w:t>
       </w:r>
+      <w:proofErr w:type="spellStart"/>
       <w:r>
         <w:rPr>
           <w:rFonts w:ascii="Consolas" w:eastAsia="Times New Roman" w:hAnsi="Consolas" w:cs="Times New Roman"/>
@@ -4813,6 +4944,7 @@
         </w:rPr>
         <w:t>TreeNode</w:t>
       </w:r>
+      <w:proofErr w:type="spellEnd"/>
       <w:r>
         <w:rPr>
           <w:rFonts w:ascii="Consolas" w:eastAsia="Times New Roman" w:hAnsi="Consolas" w:cs="Times New Roman"/>
@@ -4876,6 +5008,7 @@
         </w:rPr>
         <w:t xml:space="preserve">        </w:t>
       </w:r>
+      <w:proofErr w:type="spellStart"/>
       <w:r>
         <w:rPr>
           <w:rFonts w:ascii="Consolas" w:eastAsia="Times New Roman" w:hAnsi="Consolas" w:cs="Times New Roman"/>
@@ -4888,6 +5021,7 @@
         </w:rPr>
         <w:t>root_s</w:t>
       </w:r>
+      <w:proofErr w:type="spellEnd"/>
       <w:r>
         <w:rPr>
           <w:rFonts w:ascii="Consolas" w:eastAsia="Times New Roman" w:hAnsi="Consolas" w:cs="Times New Roman"/>
@@ -4924,6 +5058,7 @@
         </w:rPr>
         <w:t xml:space="preserve"> </w:t>
       </w:r>
+      <w:proofErr w:type="spellStart"/>
       <w:r>
         <w:rPr>
           <w:rFonts w:ascii="Consolas" w:eastAsia="Times New Roman" w:hAnsi="Consolas" w:cs="Times New Roman"/>
@@ -4960,6 +5095,7 @@
         </w:rPr>
         <w:t>serialize</w:t>
       </w:r>
+      <w:proofErr w:type="spellEnd"/>
       <w:r>
         <w:rPr>
           <w:rFonts w:ascii="Consolas" w:eastAsia="Times New Roman" w:hAnsi="Consolas" w:cs="Times New Roman"/>
@@ -5023,6 +5159,7 @@
         </w:rPr>
         <w:t xml:space="preserve">        </w:t>
       </w:r>
+      <w:proofErr w:type="spellStart"/>
       <w:r>
         <w:rPr>
           <w:rFonts w:ascii="Consolas" w:eastAsia="Times New Roman" w:hAnsi="Consolas" w:cs="Times New Roman"/>
@@ -5035,6 +5172,7 @@
         </w:rPr>
         <w:t>subRoot_s</w:t>
       </w:r>
+      <w:proofErr w:type="spellEnd"/>
       <w:r>
         <w:rPr>
           <w:rFonts w:ascii="Consolas" w:eastAsia="Times New Roman" w:hAnsi="Consolas" w:cs="Times New Roman"/>
@@ -5071,6 +5209,7 @@
         </w:rPr>
         <w:t xml:space="preserve"> </w:t>
       </w:r>
+      <w:proofErr w:type="spellStart"/>
       <w:r>
         <w:rPr>
           <w:rFonts w:ascii="Consolas" w:eastAsia="Times New Roman" w:hAnsi="Consolas" w:cs="Times New Roman"/>
@@ -5107,6 +5246,7 @@
         </w:rPr>
         <w:t>serialize</w:t>
       </w:r>
+      <w:proofErr w:type="spellEnd"/>
       <w:r>
         <w:rPr>
           <w:rFonts w:ascii="Consolas" w:eastAsia="Times New Roman" w:hAnsi="Consolas" w:cs="Times New Roman"/>
@@ -5119,6 +5259,7 @@
         </w:rPr>
         <w:t>(</w:t>
       </w:r>
+      <w:proofErr w:type="spellStart"/>
       <w:r>
         <w:rPr>
           <w:rFonts w:ascii="Consolas" w:eastAsia="Times New Roman" w:hAnsi="Consolas" w:cs="Times New Roman"/>
@@ -5131,6 +5272,7 @@
         </w:rPr>
         <w:t>subRoot</w:t>
       </w:r>
+      <w:proofErr w:type="spellEnd"/>
       <w:r>
         <w:rPr>
           <w:rFonts w:ascii="Consolas" w:eastAsia="Times New Roman" w:hAnsi="Consolas" w:cs="Times New Roman"/>
@@ -5218,6 +5360,7 @@
         </w:rPr>
         <w:t xml:space="preserve"> </w:t>
       </w:r>
+      <w:proofErr w:type="spellStart"/>
       <w:r>
         <w:rPr>
           <w:rFonts w:ascii="Consolas" w:eastAsia="Times New Roman" w:hAnsi="Consolas" w:cs="Times New Roman"/>
@@ -5230,6 +5373,7 @@
         </w:rPr>
         <w:t>subRoot_s</w:t>
       </w:r>
+      <w:proofErr w:type="spellEnd"/>
       <w:r>
         <w:rPr>
           <w:rFonts w:ascii="Consolas" w:eastAsia="Times New Roman" w:hAnsi="Consolas" w:cs="Times New Roman"/>
@@ -5314,6 +5458,7 @@
         </w:rPr>
         <w:t xml:space="preserve"> </w:t>
       </w:r>
+      <w:proofErr w:type="spellStart"/>
       <w:r>
         <w:rPr>
           <w:rFonts w:ascii="Consolas" w:eastAsia="Times New Roman" w:hAnsi="Consolas" w:cs="Times New Roman"/>
@@ -5326,6 +5471,7 @@
         </w:rPr>
         <w:t>root_s</w:t>
       </w:r>
+      <w:proofErr w:type="spellEnd"/>
     </w:p>
     <w:p>
       <w:pPr>
@@ -5368,6 +5514,7 @@
         </w:rPr>
         <w:t xml:space="preserve">        </w:t>
       </w:r>
+      <w:proofErr w:type="spellStart"/>
       <w:r>
         <w:rPr>
           <w:rFonts w:ascii="Consolas" w:eastAsia="Times New Roman" w:hAnsi="Consolas" w:cs="Times New Roman"/>
@@ -5380,6 +5527,7 @@
         </w:rPr>
         <w:t>z_values</w:t>
       </w:r>
+      <w:proofErr w:type="spellEnd"/>
       <w:r>
         <w:rPr>
           <w:rFonts w:ascii="Consolas" w:eastAsia="Times New Roman" w:hAnsi="Consolas" w:cs="Times New Roman"/>
@@ -5416,6 +5564,7 @@
         </w:rPr>
         <w:t xml:space="preserve"> </w:t>
       </w:r>
+      <w:proofErr w:type="spellStart"/>
       <w:r>
         <w:rPr>
           <w:rFonts w:ascii="Consolas" w:eastAsia="Times New Roman" w:hAnsi="Consolas" w:cs="Times New Roman"/>
@@ -5452,6 +5601,7 @@
         </w:rPr>
         <w:t>z_function</w:t>
       </w:r>
+      <w:proofErr w:type="spellEnd"/>
       <w:r>
         <w:rPr>
           <w:rFonts w:ascii="Consolas" w:eastAsia="Times New Roman" w:hAnsi="Consolas" w:cs="Times New Roman"/>
@@ -5515,6 +5665,7 @@
         </w:rPr>
         <w:t xml:space="preserve">        </w:t>
       </w:r>
+      <w:proofErr w:type="spellStart"/>
       <w:r>
         <w:rPr>
           <w:rFonts w:ascii="Consolas" w:eastAsia="Times New Roman" w:hAnsi="Consolas" w:cs="Times New Roman"/>
@@ -5527,6 +5678,7 @@
         </w:rPr>
         <w:t>len_sub</w:t>
       </w:r>
+      <w:proofErr w:type="spellEnd"/>
       <w:r>
         <w:rPr>
           <w:rFonts w:ascii="Consolas" w:eastAsia="Times New Roman" w:hAnsi="Consolas" w:cs="Times New Roman"/>
@@ -5563,6 +5715,7 @@
         </w:rPr>
         <w:t xml:space="preserve"> </w:t>
       </w:r>
+      <w:proofErr w:type="spellStart"/>
       <w:r>
         <w:rPr>
           <w:rFonts w:ascii="Consolas" w:eastAsia="Times New Roman" w:hAnsi="Consolas" w:cs="Times New Roman"/>
@@ -5575,6 +5728,7 @@
         </w:rPr>
         <w:t>len</w:t>
       </w:r>
+      <w:proofErr w:type="spellEnd"/>
       <w:r>
         <w:rPr>
           <w:rFonts w:ascii="Consolas" w:eastAsia="Times New Roman" w:hAnsi="Consolas" w:cs="Times New Roman"/>
@@ -5587,6 +5741,7 @@
         </w:rPr>
         <w:t>(</w:t>
       </w:r>
+      <w:proofErr w:type="spellStart"/>
       <w:r>
         <w:rPr>
           <w:rFonts w:ascii="Consolas" w:eastAsia="Times New Roman" w:hAnsi="Consolas" w:cs="Times New Roman"/>
@@ -5599,6 +5754,7 @@
         </w:rPr>
         <w:t>subRoot_s</w:t>
       </w:r>
+      <w:proofErr w:type="spellEnd"/>
       <w:r>
         <w:rPr>
           <w:rFonts w:ascii="Consolas" w:eastAsia="Times New Roman" w:hAnsi="Consolas" w:cs="Times New Roman"/>
@@ -5662,6 +5818,7 @@
         </w:rPr>
         <w:t xml:space="preserve"> </w:t>
       </w:r>
+      <w:proofErr w:type="spellStart"/>
       <w:r>
         <w:rPr>
           <w:rFonts w:ascii="Consolas" w:eastAsia="Times New Roman" w:hAnsi="Consolas" w:cs="Times New Roman"/>
@@ -5674,6 +5831,7 @@
         </w:rPr>
         <w:t>i</w:t>
       </w:r>
+      <w:proofErr w:type="spellEnd"/>
       <w:r>
         <w:rPr>
           <w:rFonts w:ascii="Consolas" w:eastAsia="Times New Roman" w:hAnsi="Consolas" w:cs="Times New Roman"/>
@@ -5734,6 +5892,7 @@
         </w:rPr>
         <w:t>(</w:t>
       </w:r>
+      <w:proofErr w:type="spellStart"/>
       <w:r>
         <w:rPr>
           <w:rFonts w:ascii="Consolas" w:eastAsia="Times New Roman" w:hAnsi="Consolas" w:cs="Times New Roman"/>
@@ -5746,6 +5905,7 @@
         </w:rPr>
         <w:t>len_sub</w:t>
       </w:r>
+      <w:proofErr w:type="spellEnd"/>
       <w:r>
         <w:rPr>
           <w:rFonts w:ascii="Consolas" w:eastAsia="Times New Roman" w:hAnsi="Consolas" w:cs="Times New Roman"/>
@@ -5806,6 +5966,7 @@
         </w:rPr>
         <w:t xml:space="preserve">, </w:t>
       </w:r>
+      <w:proofErr w:type="spellStart"/>
       <w:r>
         <w:rPr>
           <w:rFonts w:ascii="Consolas" w:eastAsia="Times New Roman" w:hAnsi="Consolas" w:cs="Times New Roman"/>
@@ -5818,6 +5979,7 @@
         </w:rPr>
         <w:t>len</w:t>
       </w:r>
+      <w:proofErr w:type="spellEnd"/>
       <w:r>
         <w:rPr>
           <w:rFonts w:ascii="Consolas" w:eastAsia="Times New Roman" w:hAnsi="Consolas" w:cs="Times New Roman"/>
@@ -5905,6 +6067,7 @@
         </w:rPr>
         <w:t xml:space="preserve"> </w:t>
       </w:r>
+      <w:proofErr w:type="spellStart"/>
       <w:r>
         <w:rPr>
           <w:rFonts w:ascii="Consolas" w:eastAsia="Times New Roman" w:hAnsi="Consolas" w:cs="Times New Roman"/>
@@ -5917,6 +6080,7 @@
         </w:rPr>
         <w:t>z_values</w:t>
       </w:r>
+      <w:proofErr w:type="spellEnd"/>
       <w:r>
         <w:rPr>
           <w:rFonts w:ascii="Consolas" w:eastAsia="Times New Roman" w:hAnsi="Consolas" w:cs="Times New Roman"/>
@@ -5929,6 +6093,7 @@
         </w:rPr>
         <w:t>[</w:t>
       </w:r>
+      <w:proofErr w:type="spellStart"/>
       <w:r>
         <w:rPr>
           <w:rFonts w:ascii="Consolas" w:eastAsia="Times New Roman" w:hAnsi="Consolas" w:cs="Times New Roman"/>
@@ -5941,6 +6106,7 @@
         </w:rPr>
         <w:t>i</w:t>
       </w:r>
+      <w:proofErr w:type="spellEnd"/>
       <w:r>
         <w:rPr>
           <w:rFonts w:ascii="Consolas" w:eastAsia="Times New Roman" w:hAnsi="Consolas" w:cs="Times New Roman"/>
@@ -5977,6 +6143,7 @@
         </w:rPr>
         <w:t xml:space="preserve"> </w:t>
       </w:r>
+      <w:proofErr w:type="spellStart"/>
       <w:r>
         <w:rPr>
           <w:rFonts w:ascii="Consolas" w:eastAsia="Times New Roman" w:hAnsi="Consolas" w:cs="Times New Roman"/>
@@ -5989,6 +6156,7 @@
         </w:rPr>
         <w:t>len_sub</w:t>
       </w:r>
+      <w:proofErr w:type="spellEnd"/>
       <w:r>
         <w:rPr>
           <w:rFonts w:ascii="Consolas" w:eastAsia="Times New Roman" w:hAnsi="Consolas" w:cs="Times New Roman"/>
@@ -6012,7 +6180,7 @@
           <w:kern w:val="0"/>
           <w:sz w:val="21"/>
           <w:szCs w:val="21"/>
-          <w:lang w:eastAsia="it-IT"/>
+          <w:lang w:val="en-US" w:eastAsia="it-IT"/>
           <w14:ligatures w14:val="none"/>
         </w:rPr>
       </w:pPr>
@@ -6035,7 +6203,7 @@
           <w:kern w:val="0"/>
           <w:sz w:val="21"/>
           <w:szCs w:val="21"/>
-          <w:lang w:eastAsia="it-IT"/>
+          <w:lang w:val="en-US" w:eastAsia="it-IT"/>
           <w14:ligatures w14:val="none"/>
         </w:rPr>
         <w:t>return</w:t>
@@ -6047,7 +6215,7 @@
           <w:kern w:val="0"/>
           <w:sz w:val="21"/>
           <w:szCs w:val="21"/>
-          <w:lang w:eastAsia="it-IT"/>
+          <w:lang w:val="en-US" w:eastAsia="it-IT"/>
           <w14:ligatures w14:val="none"/>
         </w:rPr>
         <w:t xml:space="preserve"> </w:t>
@@ -6059,7 +6227,7 @@
           <w:kern w:val="0"/>
           <w:sz w:val="21"/>
           <w:szCs w:val="21"/>
-          <w:lang w:eastAsia="it-IT"/>
+          <w:lang w:val="en-US" w:eastAsia="it-IT"/>
           <w14:ligatures w14:val="none"/>
         </w:rPr>
         <w:t>True</w:t>
@@ -6075,7 +6243,7 @@
           <w:kern w:val="0"/>
           <w:sz w:val="21"/>
           <w:szCs w:val="21"/>
-          <w:lang w:eastAsia="it-IT"/>
+          <w:lang w:val="en-US" w:eastAsia="it-IT"/>
           <w14:ligatures w14:val="none"/>
         </w:rPr>
       </w:pPr>
@@ -6086,7 +6254,7 @@
           <w:kern w:val="0"/>
           <w:sz w:val="21"/>
           <w:szCs w:val="21"/>
-          <w:lang w:eastAsia="it-IT"/>
+          <w:lang w:val="en-US" w:eastAsia="it-IT"/>
           <w14:ligatures w14:val="none"/>
         </w:rPr>
         <w:t xml:space="preserve">        </w:t>
@@ -6102,6 +6270,1077 @@
           <w:kern w:val="0"/>
           <w:sz w:val="21"/>
           <w:szCs w:val="21"/>
+          <w:lang w:val="en-US" w:eastAsia="it-IT"/>
+          <w14:ligatures w14:val="none"/>
+        </w:rPr>
+      </w:pPr>
+      <w:r>
+        <w:rPr>
+          <w:rFonts w:ascii="Consolas" w:eastAsia="Times New Roman" w:hAnsi="Consolas" w:cs="Times New Roman"/>
+          <w:color w:val="BBBEBF"/>
+          <w:kern w:val="0"/>
+          <w:sz w:val="21"/>
+          <w:szCs w:val="21"/>
+          <w:lang w:val="en-US" w:eastAsia="it-IT"/>
+          <w14:ligatures w14:val="none"/>
+        </w:rPr>
+        <w:t xml:space="preserve">        </w:t>
+      </w:r>
+      <w:r>
+        <w:rPr>
+          <w:rFonts w:ascii="Consolas" w:eastAsia="Times New Roman" w:hAnsi="Consolas" w:cs="Times New Roman"/>
+          <w:color w:val="C586C0"/>
+          <w:kern w:val="0"/>
+          <w:sz w:val="21"/>
+          <w:szCs w:val="21"/>
+          <w:lang w:val="en-US" w:eastAsia="it-IT"/>
+          <w14:ligatures w14:val="none"/>
+        </w:rPr>
+        <w:t>return</w:t>
+      </w:r>
+      <w:r>
+        <w:rPr>
+          <w:rFonts w:ascii="Consolas" w:eastAsia="Times New Roman" w:hAnsi="Consolas" w:cs="Times New Roman"/>
+          <w:color w:val="BBBEBF"/>
+          <w:kern w:val="0"/>
+          <w:sz w:val="21"/>
+          <w:szCs w:val="21"/>
+          <w:lang w:val="en-US" w:eastAsia="it-IT"/>
+          <w14:ligatures w14:val="none"/>
+        </w:rPr>
+        <w:t xml:space="preserve"> </w:t>
+      </w:r>
+      <w:r>
+        <w:rPr>
+          <w:rFonts w:ascii="Consolas" w:eastAsia="Times New Roman" w:hAnsi="Consolas" w:cs="Times New Roman"/>
+          <w:color w:val="569CD6"/>
+          <w:kern w:val="0"/>
+          <w:sz w:val="21"/>
+          <w:szCs w:val="21"/>
+          <w:lang w:val="en-US" w:eastAsia="it-IT"/>
+          <w14:ligatures w14:val="none"/>
+        </w:rPr>
+        <w:t>False</w:t>
+      </w:r>
+    </w:p>
+    <w:p>
+      <w:pPr>
+        <w:rPr>
+          <w:b/>
+          <w:bCs/>
+          <w:color w:val="C00000"/>
+          <w:lang w:val="en-US"/>
+        </w:rPr>
+      </w:pPr>
+    </w:p>
+    <w:p>
+      <w:pPr>
+        <w:rPr>
+          <w:b/>
+          <w:bCs/>
+          <w:lang w:val="en-US"/>
+        </w:rPr>
+      </w:pPr>
+      <w:r>
+        <w:rPr>
+          <w:b/>
+          <w:bCs/>
+          <w:color w:val="C00000"/>
+          <w:lang w:val="en-US"/>
+        </w:rPr>
+        <w:t xml:space="preserve">MORRIS TRAVERSAL: </w:t>
+      </w:r>
+      <w:r>
+        <w:rPr>
+          <w:b/>
+          <w:bCs/>
+          <w:lang w:val="en-US"/>
+        </w:rPr>
+        <w:t xml:space="preserve">BST </w:t>
+      </w:r>
+      <w:proofErr w:type="spellStart"/>
+      <w:r>
+        <w:rPr>
+          <w:b/>
+          <w:bCs/>
+          <w:lang w:val="en-US"/>
+        </w:rPr>
+        <w:t>inorder</w:t>
+      </w:r>
+      <w:proofErr w:type="spellEnd"/>
+      <w:r>
+        <w:rPr>
+          <w:b/>
+          <w:bCs/>
+          <w:lang w:val="en-US"/>
+        </w:rPr>
+        <w:t xml:space="preserve"> visit with O(1) space</w:t>
+      </w:r>
+      <w:r>
+        <w:rPr>
+          <w:b/>
+          <w:bCs/>
+          <w:lang w:val="en-US"/>
+        </w:rPr>
+        <w:t xml:space="preserve"> </w:t>
+      </w:r>
+      <w:r>
+        <w:rPr>
+          <w:b/>
+          <w:bCs/>
+          <w:lang w:val="en-US"/>
+        </w:rPr>
+        <w:sym w:font="Wingdings" w:char="F0E0"/>
+      </w:r>
+      <w:r>
+        <w:rPr>
+          <w:b/>
+          <w:bCs/>
+          <w:lang w:val="en-US"/>
+        </w:rPr>
+        <w:t xml:space="preserve"> </w:t>
+      </w:r>
+      <w:r>
+        <w:rPr>
+          <w:lang w:val="en-US"/>
+        </w:rPr>
+        <w:t>see</w:t>
+      </w:r>
+      <w:r>
+        <w:rPr>
+          <w:lang w:val="en-US"/>
+        </w:rPr>
+        <w:t xml:space="preserve"> </w:t>
+      </w:r>
+      <w:r>
+        <w:rPr>
+          <w:i/>
+          <w:iCs/>
+          <w:lang w:val="en-US"/>
+        </w:rPr>
+        <w:t>7</w:t>
+      </w:r>
+      <w:r>
+        <w:rPr>
+          <w:i/>
+          <w:iCs/>
+          <w:lang w:val="en-US"/>
+        </w:rPr>
+        <w:t>_</w:t>
+      </w:r>
+      <w:r>
+        <w:rPr>
+          <w:i/>
+          <w:iCs/>
+          <w:lang w:val="en-US"/>
+        </w:rPr>
+        <w:t xml:space="preserve">trees </w:t>
+      </w:r>
+      <w:r>
+        <w:rPr>
+          <w:lang w:val="en-US"/>
+        </w:rPr>
+        <w:t xml:space="preserve">problem </w:t>
+      </w:r>
+      <w:r>
+        <w:rPr>
+          <w:b/>
+          <w:bCs/>
+          <w:highlight w:val="yellow"/>
+          <w:lang w:val="en-US"/>
+        </w:rPr>
+        <w:t>230</w:t>
+      </w:r>
+    </w:p>
+    <w:p>
+      <w:pPr>
+        <w:shd w:val="clear" w:color="auto" w:fill="121314"/>
+        <w:spacing w:after="0" w:line="285" w:lineRule="atLeast"/>
+        <w:rPr>
+          <w:rFonts w:ascii="Consolas" w:eastAsia="Times New Roman" w:hAnsi="Consolas" w:cs="Times New Roman"/>
+          <w:color w:val="BBBEBF"/>
+          <w:kern w:val="0"/>
+          <w:sz w:val="21"/>
+          <w:szCs w:val="21"/>
+          <w:lang w:val="en-US" w:eastAsia="it-IT"/>
+          <w14:ligatures w14:val="none"/>
+        </w:rPr>
+      </w:pPr>
+      <w:r>
+        <w:rPr>
+          <w:rFonts w:ascii="Consolas" w:eastAsia="Times New Roman" w:hAnsi="Consolas" w:cs="Times New Roman"/>
+          <w:color w:val="FF7B72"/>
+          <w:kern w:val="0"/>
+          <w:sz w:val="21"/>
+          <w:szCs w:val="21"/>
+          <w:lang w:val="en-US" w:eastAsia="it-IT"/>
+          <w14:ligatures w14:val="none"/>
+        </w:rPr>
+        <w:t>class</w:t>
+      </w:r>
+      <w:r>
+        <w:rPr>
+          <w:rFonts w:ascii="Consolas" w:eastAsia="Times New Roman" w:hAnsi="Consolas" w:cs="Times New Roman"/>
+          <w:color w:val="BBBEBF"/>
+          <w:kern w:val="0"/>
+          <w:sz w:val="21"/>
+          <w:szCs w:val="21"/>
+          <w:lang w:val="en-US" w:eastAsia="it-IT"/>
+          <w14:ligatures w14:val="none"/>
+        </w:rPr>
+        <w:t xml:space="preserve"> </w:t>
+      </w:r>
+      <w:r>
+        <w:rPr>
+          <w:rFonts w:ascii="Consolas" w:eastAsia="Times New Roman" w:hAnsi="Consolas" w:cs="Times New Roman"/>
+          <w:color w:val="4EC9B0"/>
+          <w:kern w:val="0"/>
+          <w:sz w:val="21"/>
+          <w:szCs w:val="21"/>
+          <w:lang w:val="en-US" w:eastAsia="it-IT"/>
+          <w14:ligatures w14:val="none"/>
+        </w:rPr>
+        <w:t>Solution</w:t>
+      </w:r>
+      <w:r>
+        <w:rPr>
+          <w:rFonts w:ascii="Consolas" w:eastAsia="Times New Roman" w:hAnsi="Consolas" w:cs="Times New Roman"/>
+          <w:color w:val="BBBEBF"/>
+          <w:kern w:val="0"/>
+          <w:sz w:val="21"/>
+          <w:szCs w:val="21"/>
+          <w:lang w:val="en-US" w:eastAsia="it-IT"/>
+          <w14:ligatures w14:val="none"/>
+        </w:rPr>
+        <w:t>:</w:t>
+      </w:r>
+    </w:p>
+    <w:p>
+      <w:pPr>
+        <w:shd w:val="clear" w:color="auto" w:fill="121314"/>
+        <w:spacing w:after="0" w:line="285" w:lineRule="atLeast"/>
+        <w:rPr>
+          <w:rFonts w:ascii="Consolas" w:eastAsia="Times New Roman" w:hAnsi="Consolas" w:cs="Times New Roman"/>
+          <w:color w:val="BBBEBF"/>
+          <w:kern w:val="0"/>
+          <w:sz w:val="21"/>
+          <w:szCs w:val="21"/>
+          <w:lang w:val="en-US" w:eastAsia="it-IT"/>
+          <w14:ligatures w14:val="none"/>
+        </w:rPr>
+      </w:pPr>
+      <w:r>
+        <w:rPr>
+          <w:rFonts w:ascii="Consolas" w:eastAsia="Times New Roman" w:hAnsi="Consolas" w:cs="Times New Roman"/>
+          <w:color w:val="BBBEBF"/>
+          <w:kern w:val="0"/>
+          <w:sz w:val="21"/>
+          <w:szCs w:val="21"/>
+          <w:lang w:val="en-US" w:eastAsia="it-IT"/>
+          <w14:ligatures w14:val="none"/>
+        </w:rPr>
+        <w:t xml:space="preserve">    </w:t>
+      </w:r>
+      <w:r>
+        <w:rPr>
+          <w:rFonts w:ascii="Consolas" w:eastAsia="Times New Roman" w:hAnsi="Consolas" w:cs="Times New Roman"/>
+          <w:color w:val="FF7B72"/>
+          <w:kern w:val="0"/>
+          <w:sz w:val="21"/>
+          <w:szCs w:val="21"/>
+          <w:lang w:val="en-US" w:eastAsia="it-IT"/>
+          <w14:ligatures w14:val="none"/>
+        </w:rPr>
+        <w:t>def</w:t>
+      </w:r>
+      <w:r>
+        <w:rPr>
+          <w:rFonts w:ascii="Consolas" w:eastAsia="Times New Roman" w:hAnsi="Consolas" w:cs="Times New Roman"/>
+          <w:color w:val="BBBEBF"/>
+          <w:kern w:val="0"/>
+          <w:sz w:val="21"/>
+          <w:szCs w:val="21"/>
+          <w:lang w:val="en-US" w:eastAsia="it-IT"/>
+          <w14:ligatures w14:val="none"/>
+        </w:rPr>
+        <w:t xml:space="preserve"> </w:t>
+      </w:r>
+      <w:r>
+        <w:rPr>
+          <w:rFonts w:ascii="Consolas" w:eastAsia="Times New Roman" w:hAnsi="Consolas" w:cs="Times New Roman"/>
+          <w:color w:val="D2A8FF"/>
+          <w:kern w:val="0"/>
+          <w:sz w:val="21"/>
+          <w:szCs w:val="21"/>
+          <w:lang w:val="en-US" w:eastAsia="it-IT"/>
+          <w14:ligatures w14:val="none"/>
+        </w:rPr>
+        <w:t>kthSmallest</w:t>
+      </w:r>
+      <w:r>
+        <w:rPr>
+          <w:rFonts w:ascii="Consolas" w:eastAsia="Times New Roman" w:hAnsi="Consolas" w:cs="Times New Roman"/>
+          <w:color w:val="BBBEBF"/>
+          <w:kern w:val="0"/>
+          <w:sz w:val="21"/>
+          <w:szCs w:val="21"/>
+          <w:lang w:val="en-US" w:eastAsia="it-IT"/>
+          <w14:ligatures w14:val="none"/>
+        </w:rPr>
+        <w:t>(</w:t>
+      </w:r>
+      <w:r>
+        <w:rPr>
+          <w:rFonts w:ascii="Consolas" w:eastAsia="Times New Roman" w:hAnsi="Consolas" w:cs="Times New Roman"/>
+          <w:color w:val="C9D1D9"/>
+          <w:kern w:val="0"/>
+          <w:sz w:val="21"/>
+          <w:szCs w:val="21"/>
+          <w:lang w:val="en-US" w:eastAsia="it-IT"/>
+          <w14:ligatures w14:val="none"/>
+        </w:rPr>
+        <w:t>self</w:t>
+      </w:r>
+      <w:r>
+        <w:rPr>
+          <w:rFonts w:ascii="Consolas" w:eastAsia="Times New Roman" w:hAnsi="Consolas" w:cs="Times New Roman"/>
+          <w:color w:val="BBBEBF"/>
+          <w:kern w:val="0"/>
+          <w:sz w:val="21"/>
+          <w:szCs w:val="21"/>
+          <w:lang w:val="en-US" w:eastAsia="it-IT"/>
+          <w14:ligatures w14:val="none"/>
+        </w:rPr>
+        <w:t xml:space="preserve">, </w:t>
+      </w:r>
+      <w:r>
+        <w:rPr>
+          <w:rFonts w:ascii="Consolas" w:eastAsia="Times New Roman" w:hAnsi="Consolas" w:cs="Times New Roman"/>
+          <w:color w:val="FFA657"/>
+          <w:kern w:val="0"/>
+          <w:sz w:val="21"/>
+          <w:szCs w:val="21"/>
+          <w:lang w:val="en-US" w:eastAsia="it-IT"/>
+          <w14:ligatures w14:val="none"/>
+        </w:rPr>
+        <w:t>root</w:t>
+      </w:r>
+      <w:r>
+        <w:rPr>
+          <w:rFonts w:ascii="Consolas" w:eastAsia="Times New Roman" w:hAnsi="Consolas" w:cs="Times New Roman"/>
+          <w:color w:val="BBBEBF"/>
+          <w:kern w:val="0"/>
+          <w:sz w:val="21"/>
+          <w:szCs w:val="21"/>
+          <w:lang w:val="en-US" w:eastAsia="it-IT"/>
+          <w14:ligatures w14:val="none"/>
+        </w:rPr>
+        <w:t xml:space="preserve">: </w:t>
+      </w:r>
+      <w:r>
+        <w:rPr>
+          <w:rFonts w:ascii="Consolas" w:eastAsia="Times New Roman" w:hAnsi="Consolas" w:cs="Times New Roman"/>
+          <w:color w:val="4EC9B0"/>
+          <w:kern w:val="0"/>
+          <w:sz w:val="21"/>
+          <w:szCs w:val="21"/>
+          <w:lang w:val="en-US" w:eastAsia="it-IT"/>
+          <w14:ligatures w14:val="none"/>
+        </w:rPr>
+        <w:t>Optional</w:t>
+      </w:r>
+      <w:r>
+        <w:rPr>
+          <w:rFonts w:ascii="Consolas" w:eastAsia="Times New Roman" w:hAnsi="Consolas" w:cs="Times New Roman"/>
+          <w:color w:val="BBBEBF"/>
+          <w:kern w:val="0"/>
+          <w:sz w:val="21"/>
+          <w:szCs w:val="21"/>
+          <w:lang w:val="en-US" w:eastAsia="it-IT"/>
+          <w14:ligatures w14:val="none"/>
+        </w:rPr>
+        <w:t>[</w:t>
+      </w:r>
+      <w:r>
+        <w:rPr>
+          <w:rFonts w:ascii="Consolas" w:eastAsia="Times New Roman" w:hAnsi="Consolas" w:cs="Times New Roman"/>
+          <w:color w:val="4EC9B0"/>
+          <w:kern w:val="0"/>
+          <w:sz w:val="21"/>
+          <w:szCs w:val="21"/>
+          <w:lang w:val="en-US" w:eastAsia="it-IT"/>
+          <w14:ligatures w14:val="none"/>
+        </w:rPr>
+        <w:t>TreeNode</w:t>
+      </w:r>
+      <w:r>
+        <w:rPr>
+          <w:rFonts w:ascii="Consolas" w:eastAsia="Times New Roman" w:hAnsi="Consolas" w:cs="Times New Roman"/>
+          <w:color w:val="BBBEBF"/>
+          <w:kern w:val="0"/>
+          <w:sz w:val="21"/>
+          <w:szCs w:val="21"/>
+          <w:lang w:val="en-US" w:eastAsia="it-IT"/>
+          <w14:ligatures w14:val="none"/>
+        </w:rPr>
+        <w:t xml:space="preserve">], </w:t>
+      </w:r>
+      <w:r>
+        <w:rPr>
+          <w:rFonts w:ascii="Consolas" w:eastAsia="Times New Roman" w:hAnsi="Consolas" w:cs="Times New Roman"/>
+          <w:color w:val="FFA657"/>
+          <w:kern w:val="0"/>
+          <w:sz w:val="21"/>
+          <w:szCs w:val="21"/>
+          <w:lang w:val="en-US" w:eastAsia="it-IT"/>
+          <w14:ligatures w14:val="none"/>
+        </w:rPr>
+        <w:t>k</w:t>
+      </w:r>
+      <w:r>
+        <w:rPr>
+          <w:rFonts w:ascii="Consolas" w:eastAsia="Times New Roman" w:hAnsi="Consolas" w:cs="Times New Roman"/>
+          <w:color w:val="BBBEBF"/>
+          <w:kern w:val="0"/>
+          <w:sz w:val="21"/>
+          <w:szCs w:val="21"/>
+          <w:lang w:val="en-US" w:eastAsia="it-IT"/>
+          <w14:ligatures w14:val="none"/>
+        </w:rPr>
+        <w:t xml:space="preserve">: </w:t>
+      </w:r>
+      <w:r>
+        <w:rPr>
+          <w:rFonts w:ascii="Consolas" w:eastAsia="Times New Roman" w:hAnsi="Consolas" w:cs="Times New Roman"/>
+          <w:color w:val="4EC9B0"/>
+          <w:kern w:val="0"/>
+          <w:sz w:val="21"/>
+          <w:szCs w:val="21"/>
+          <w:lang w:val="en-US" w:eastAsia="it-IT"/>
+          <w14:ligatures w14:val="none"/>
+        </w:rPr>
+        <w:t>int</w:t>
+      </w:r>
+      <w:r>
+        <w:rPr>
+          <w:rFonts w:ascii="Consolas" w:eastAsia="Times New Roman" w:hAnsi="Consolas" w:cs="Times New Roman"/>
+          <w:color w:val="BBBEBF"/>
+          <w:kern w:val="0"/>
+          <w:sz w:val="21"/>
+          <w:szCs w:val="21"/>
+          <w:lang w:val="en-US" w:eastAsia="it-IT"/>
+          <w14:ligatures w14:val="none"/>
+        </w:rPr>
+        <w:t xml:space="preserve">) -&gt; </w:t>
+      </w:r>
+      <w:r>
+        <w:rPr>
+          <w:rFonts w:ascii="Consolas" w:eastAsia="Times New Roman" w:hAnsi="Consolas" w:cs="Times New Roman"/>
+          <w:color w:val="4EC9B0"/>
+          <w:kern w:val="0"/>
+          <w:sz w:val="21"/>
+          <w:szCs w:val="21"/>
+          <w:lang w:val="en-US" w:eastAsia="it-IT"/>
+          <w14:ligatures w14:val="none"/>
+        </w:rPr>
+        <w:t>int</w:t>
+      </w:r>
+      <w:r>
+        <w:rPr>
+          <w:rFonts w:ascii="Consolas" w:eastAsia="Times New Roman" w:hAnsi="Consolas" w:cs="Times New Roman"/>
+          <w:color w:val="BBBEBF"/>
+          <w:kern w:val="0"/>
+          <w:sz w:val="21"/>
+          <w:szCs w:val="21"/>
+          <w:lang w:val="en-US" w:eastAsia="it-IT"/>
+          <w14:ligatures w14:val="none"/>
+        </w:rPr>
+        <w:t>:</w:t>
+      </w:r>
+    </w:p>
+    <w:p>
+      <w:pPr>
+        <w:shd w:val="clear" w:color="auto" w:fill="121314"/>
+        <w:spacing w:after="0" w:line="285" w:lineRule="atLeast"/>
+        <w:rPr>
+          <w:rFonts w:ascii="Consolas" w:eastAsia="Times New Roman" w:hAnsi="Consolas" w:cs="Times New Roman"/>
+          <w:color w:val="BBBEBF"/>
+          <w:kern w:val="0"/>
+          <w:sz w:val="21"/>
+          <w:szCs w:val="21"/>
+          <w:lang w:val="en-US" w:eastAsia="it-IT"/>
+          <w14:ligatures w14:val="none"/>
+        </w:rPr>
+      </w:pPr>
+      <w:r>
+        <w:rPr>
+          <w:rFonts w:ascii="Consolas" w:eastAsia="Times New Roman" w:hAnsi="Consolas" w:cs="Times New Roman"/>
+          <w:color w:val="BBBEBF"/>
+          <w:kern w:val="0"/>
+          <w:sz w:val="21"/>
+          <w:szCs w:val="21"/>
+          <w:lang w:val="en-US" w:eastAsia="it-IT"/>
+          <w14:ligatures w14:val="none"/>
+        </w:rPr>
+        <w:t xml:space="preserve">        </w:t>
+      </w:r>
+      <w:r>
+        <w:rPr>
+          <w:rFonts w:ascii="Consolas" w:eastAsia="Times New Roman" w:hAnsi="Consolas" w:cs="Times New Roman"/>
+          <w:color w:val="C9D1D9"/>
+          <w:kern w:val="0"/>
+          <w:sz w:val="21"/>
+          <w:szCs w:val="21"/>
+          <w:lang w:val="en-US" w:eastAsia="it-IT"/>
+          <w14:ligatures w14:val="none"/>
+        </w:rPr>
+        <w:t>curr</w:t>
+      </w:r>
+      <w:r>
+        <w:rPr>
+          <w:rFonts w:ascii="Consolas" w:eastAsia="Times New Roman" w:hAnsi="Consolas" w:cs="Times New Roman"/>
+          <w:color w:val="BBBEBF"/>
+          <w:kern w:val="0"/>
+          <w:sz w:val="21"/>
+          <w:szCs w:val="21"/>
+          <w:lang w:val="en-US" w:eastAsia="it-IT"/>
+          <w14:ligatures w14:val="none"/>
+        </w:rPr>
+        <w:t xml:space="preserve"> </w:t>
+      </w:r>
+      <w:r>
+        <w:rPr>
+          <w:rFonts w:ascii="Consolas" w:eastAsia="Times New Roman" w:hAnsi="Consolas" w:cs="Times New Roman"/>
+          <w:color w:val="D4D4D4"/>
+          <w:kern w:val="0"/>
+          <w:sz w:val="21"/>
+          <w:szCs w:val="21"/>
+          <w:lang w:val="en-US" w:eastAsia="it-IT"/>
+          <w14:ligatures w14:val="none"/>
+        </w:rPr>
+        <w:t>=</w:t>
+      </w:r>
+      <w:r>
+        <w:rPr>
+          <w:rFonts w:ascii="Consolas" w:eastAsia="Times New Roman" w:hAnsi="Consolas" w:cs="Times New Roman"/>
+          <w:color w:val="BBBEBF"/>
+          <w:kern w:val="0"/>
+          <w:sz w:val="21"/>
+          <w:szCs w:val="21"/>
+          <w:lang w:val="en-US" w:eastAsia="it-IT"/>
+          <w14:ligatures w14:val="none"/>
+        </w:rPr>
+        <w:t xml:space="preserve"> </w:t>
+      </w:r>
+      <w:r>
+        <w:rPr>
+          <w:rFonts w:ascii="Consolas" w:eastAsia="Times New Roman" w:hAnsi="Consolas" w:cs="Times New Roman"/>
+          <w:color w:val="FFA657"/>
+          <w:kern w:val="0"/>
+          <w:sz w:val="21"/>
+          <w:szCs w:val="21"/>
+          <w:lang w:val="en-US" w:eastAsia="it-IT"/>
+          <w14:ligatures w14:val="none"/>
+        </w:rPr>
+        <w:t>root</w:t>
+      </w:r>
+    </w:p>
+    <w:p>
+      <w:pPr>
+        <w:shd w:val="clear" w:color="auto" w:fill="121314"/>
+        <w:spacing w:after="0" w:line="285" w:lineRule="atLeast"/>
+        <w:rPr>
+          <w:rFonts w:ascii="Consolas" w:eastAsia="Times New Roman" w:hAnsi="Consolas" w:cs="Times New Roman"/>
+          <w:color w:val="BBBEBF"/>
+          <w:kern w:val="0"/>
+          <w:sz w:val="21"/>
+          <w:szCs w:val="21"/>
+          <w:lang w:val="en-US" w:eastAsia="it-IT"/>
+          <w14:ligatures w14:val="none"/>
+        </w:rPr>
+      </w:pPr>
+    </w:p>
+    <w:p>
+      <w:pPr>
+        <w:shd w:val="clear" w:color="auto" w:fill="121314"/>
+        <w:spacing w:after="0" w:line="285" w:lineRule="atLeast"/>
+        <w:rPr>
+          <w:rFonts w:ascii="Consolas" w:eastAsia="Times New Roman" w:hAnsi="Consolas" w:cs="Times New Roman"/>
+          <w:color w:val="BBBEBF"/>
+          <w:kern w:val="0"/>
+          <w:sz w:val="21"/>
+          <w:szCs w:val="21"/>
+          <w:lang w:val="en-US" w:eastAsia="it-IT"/>
+          <w14:ligatures w14:val="none"/>
+        </w:rPr>
+      </w:pPr>
+      <w:r>
+        <w:rPr>
+          <w:rFonts w:ascii="Consolas" w:eastAsia="Times New Roman" w:hAnsi="Consolas" w:cs="Times New Roman"/>
+          <w:color w:val="BBBEBF"/>
+          <w:kern w:val="0"/>
+          <w:sz w:val="21"/>
+          <w:szCs w:val="21"/>
+          <w:lang w:val="en-US" w:eastAsia="it-IT"/>
+          <w14:ligatures w14:val="none"/>
+        </w:rPr>
+        <w:t xml:space="preserve">        </w:t>
+      </w:r>
+      <w:r>
+        <w:rPr>
+          <w:rFonts w:ascii="Consolas" w:eastAsia="Times New Roman" w:hAnsi="Consolas" w:cs="Times New Roman"/>
+          <w:color w:val="C586C0"/>
+          <w:kern w:val="0"/>
+          <w:sz w:val="21"/>
+          <w:szCs w:val="21"/>
+          <w:lang w:val="en-US" w:eastAsia="it-IT"/>
+          <w14:ligatures w14:val="none"/>
+        </w:rPr>
+        <w:t>while</w:t>
+      </w:r>
+      <w:r>
+        <w:rPr>
+          <w:rFonts w:ascii="Consolas" w:eastAsia="Times New Roman" w:hAnsi="Consolas" w:cs="Times New Roman"/>
+          <w:color w:val="BBBEBF"/>
+          <w:kern w:val="0"/>
+          <w:sz w:val="21"/>
+          <w:szCs w:val="21"/>
+          <w:lang w:val="en-US" w:eastAsia="it-IT"/>
+          <w14:ligatures w14:val="none"/>
+        </w:rPr>
+        <w:t xml:space="preserve"> </w:t>
+      </w:r>
+      <w:r>
+        <w:rPr>
+          <w:rFonts w:ascii="Consolas" w:eastAsia="Times New Roman" w:hAnsi="Consolas" w:cs="Times New Roman"/>
+          <w:color w:val="C9D1D9"/>
+          <w:kern w:val="0"/>
+          <w:sz w:val="21"/>
+          <w:szCs w:val="21"/>
+          <w:lang w:val="en-US" w:eastAsia="it-IT"/>
+          <w14:ligatures w14:val="none"/>
+        </w:rPr>
+        <w:t>curr</w:t>
+      </w:r>
+      <w:r>
+        <w:rPr>
+          <w:rFonts w:ascii="Consolas" w:eastAsia="Times New Roman" w:hAnsi="Consolas" w:cs="Times New Roman"/>
+          <w:color w:val="BBBEBF"/>
+          <w:kern w:val="0"/>
+          <w:sz w:val="21"/>
+          <w:szCs w:val="21"/>
+          <w:lang w:val="en-US" w:eastAsia="it-IT"/>
+          <w14:ligatures w14:val="none"/>
+        </w:rPr>
+        <w:t>:</w:t>
+      </w:r>
+    </w:p>
+    <w:p>
+      <w:pPr>
+        <w:shd w:val="clear" w:color="auto" w:fill="121314"/>
+        <w:spacing w:after="0" w:line="285" w:lineRule="atLeast"/>
+        <w:rPr>
+          <w:rFonts w:ascii="Consolas" w:eastAsia="Times New Roman" w:hAnsi="Consolas" w:cs="Times New Roman"/>
+          <w:color w:val="BBBEBF"/>
+          <w:kern w:val="0"/>
+          <w:sz w:val="21"/>
+          <w:szCs w:val="21"/>
+          <w:lang w:val="en-US" w:eastAsia="it-IT"/>
+          <w14:ligatures w14:val="none"/>
+        </w:rPr>
+      </w:pPr>
+      <w:r>
+        <w:rPr>
+          <w:rFonts w:ascii="Consolas" w:eastAsia="Times New Roman" w:hAnsi="Consolas" w:cs="Times New Roman"/>
+          <w:color w:val="BBBEBF"/>
+          <w:kern w:val="0"/>
+          <w:sz w:val="21"/>
+          <w:szCs w:val="21"/>
+          <w:lang w:val="en-US" w:eastAsia="it-IT"/>
+          <w14:ligatures w14:val="none"/>
+        </w:rPr>
+        <w:t xml:space="preserve">            </w:t>
+      </w:r>
+      <w:r>
+        <w:rPr>
+          <w:rFonts w:ascii="Consolas" w:eastAsia="Times New Roman" w:hAnsi="Consolas" w:cs="Times New Roman"/>
+          <w:color w:val="C586C0"/>
+          <w:kern w:val="0"/>
+          <w:sz w:val="21"/>
+          <w:szCs w:val="21"/>
+          <w:lang w:val="en-US" w:eastAsia="it-IT"/>
+          <w14:ligatures w14:val="none"/>
+        </w:rPr>
+        <w:t>if</w:t>
+      </w:r>
+      <w:r>
+        <w:rPr>
+          <w:rFonts w:ascii="Consolas" w:eastAsia="Times New Roman" w:hAnsi="Consolas" w:cs="Times New Roman"/>
+          <w:color w:val="BBBEBF"/>
+          <w:kern w:val="0"/>
+          <w:sz w:val="21"/>
+          <w:szCs w:val="21"/>
+          <w:lang w:val="en-US" w:eastAsia="it-IT"/>
+          <w14:ligatures w14:val="none"/>
+        </w:rPr>
+        <w:t xml:space="preserve"> </w:t>
+      </w:r>
+      <w:r>
+        <w:rPr>
+          <w:rFonts w:ascii="Consolas" w:eastAsia="Times New Roman" w:hAnsi="Consolas" w:cs="Times New Roman"/>
+          <w:color w:val="569CD6"/>
+          <w:kern w:val="0"/>
+          <w:sz w:val="21"/>
+          <w:szCs w:val="21"/>
+          <w:lang w:val="en-US" w:eastAsia="it-IT"/>
+          <w14:ligatures w14:val="none"/>
+        </w:rPr>
+        <w:t>not</w:t>
+      </w:r>
+      <w:r>
+        <w:rPr>
+          <w:rFonts w:ascii="Consolas" w:eastAsia="Times New Roman" w:hAnsi="Consolas" w:cs="Times New Roman"/>
+          <w:color w:val="BBBEBF"/>
+          <w:kern w:val="0"/>
+          <w:sz w:val="21"/>
+          <w:szCs w:val="21"/>
+          <w:lang w:val="en-US" w:eastAsia="it-IT"/>
+          <w14:ligatures w14:val="none"/>
+        </w:rPr>
+        <w:t xml:space="preserve"> </w:t>
+      </w:r>
+      <w:r>
+        <w:rPr>
+          <w:rFonts w:ascii="Consolas" w:eastAsia="Times New Roman" w:hAnsi="Consolas" w:cs="Times New Roman"/>
+          <w:color w:val="C9D1D9"/>
+          <w:kern w:val="0"/>
+          <w:sz w:val="21"/>
+          <w:szCs w:val="21"/>
+          <w:lang w:val="en-US" w:eastAsia="it-IT"/>
+          <w14:ligatures w14:val="none"/>
+        </w:rPr>
+        <w:t>curr</w:t>
+      </w:r>
+      <w:r>
+        <w:rPr>
+          <w:rFonts w:ascii="Consolas" w:eastAsia="Times New Roman" w:hAnsi="Consolas" w:cs="Times New Roman"/>
+          <w:color w:val="BBBEBF"/>
+          <w:kern w:val="0"/>
+          <w:sz w:val="21"/>
+          <w:szCs w:val="21"/>
+          <w:lang w:val="en-US" w:eastAsia="it-IT"/>
+          <w14:ligatures w14:val="none"/>
+        </w:rPr>
+        <w:t xml:space="preserve">.left: </w:t>
+      </w:r>
+      <w:r>
+        <w:rPr>
+          <w:rFonts w:ascii="Consolas" w:eastAsia="Times New Roman" w:hAnsi="Consolas" w:cs="Times New Roman"/>
+          <w:color w:val="8B949E"/>
+          <w:kern w:val="0"/>
+          <w:sz w:val="21"/>
+          <w:szCs w:val="21"/>
+          <w:lang w:val="en-US" w:eastAsia="it-IT"/>
+          <w14:ligatures w14:val="none"/>
+        </w:rPr>
+        <w:t>#smallest --&gt; valuto</w:t>
+      </w:r>
+    </w:p>
+    <w:p>
+      <w:pPr>
+        <w:shd w:val="clear" w:color="auto" w:fill="121314"/>
+        <w:spacing w:after="0" w:line="285" w:lineRule="atLeast"/>
+        <w:rPr>
+          <w:rFonts w:ascii="Consolas" w:eastAsia="Times New Roman" w:hAnsi="Consolas" w:cs="Times New Roman"/>
+          <w:color w:val="BBBEBF"/>
+          <w:kern w:val="0"/>
+          <w:sz w:val="21"/>
+          <w:szCs w:val="21"/>
+          <w:lang w:val="en-US" w:eastAsia="it-IT"/>
+          <w14:ligatures w14:val="none"/>
+        </w:rPr>
+      </w:pPr>
+      <w:r>
+        <w:rPr>
+          <w:rFonts w:ascii="Consolas" w:eastAsia="Times New Roman" w:hAnsi="Consolas" w:cs="Times New Roman"/>
+          <w:color w:val="BBBEBF"/>
+          <w:kern w:val="0"/>
+          <w:sz w:val="21"/>
+          <w:szCs w:val="21"/>
+          <w:lang w:val="en-US" w:eastAsia="it-IT"/>
+          <w14:ligatures w14:val="none"/>
+        </w:rPr>
+        <w:t xml:space="preserve">                </w:t>
+      </w:r>
+      <w:r>
+        <w:rPr>
+          <w:rFonts w:ascii="Consolas" w:eastAsia="Times New Roman" w:hAnsi="Consolas" w:cs="Times New Roman"/>
+          <w:color w:val="FFA657"/>
+          <w:kern w:val="0"/>
+          <w:sz w:val="21"/>
+          <w:szCs w:val="21"/>
+          <w:lang w:val="en-US" w:eastAsia="it-IT"/>
+          <w14:ligatures w14:val="none"/>
+        </w:rPr>
+        <w:t>k</w:t>
+      </w:r>
+      <w:r>
+        <w:rPr>
+          <w:rFonts w:ascii="Consolas" w:eastAsia="Times New Roman" w:hAnsi="Consolas" w:cs="Times New Roman"/>
+          <w:color w:val="BBBEBF"/>
+          <w:kern w:val="0"/>
+          <w:sz w:val="21"/>
+          <w:szCs w:val="21"/>
+          <w:lang w:val="en-US" w:eastAsia="it-IT"/>
+          <w14:ligatures w14:val="none"/>
+        </w:rPr>
+        <w:t xml:space="preserve"> </w:t>
+      </w:r>
+      <w:r>
+        <w:rPr>
+          <w:rFonts w:ascii="Consolas" w:eastAsia="Times New Roman" w:hAnsi="Consolas" w:cs="Times New Roman"/>
+          <w:color w:val="D4D4D4"/>
+          <w:kern w:val="0"/>
+          <w:sz w:val="21"/>
+          <w:szCs w:val="21"/>
+          <w:lang w:val="en-US" w:eastAsia="it-IT"/>
+          <w14:ligatures w14:val="none"/>
+        </w:rPr>
+        <w:t>-=</w:t>
+      </w:r>
+      <w:r>
+        <w:rPr>
+          <w:rFonts w:ascii="Consolas" w:eastAsia="Times New Roman" w:hAnsi="Consolas" w:cs="Times New Roman"/>
+          <w:color w:val="BBBEBF"/>
+          <w:kern w:val="0"/>
+          <w:sz w:val="21"/>
+          <w:szCs w:val="21"/>
+          <w:lang w:val="en-US" w:eastAsia="it-IT"/>
+          <w14:ligatures w14:val="none"/>
+        </w:rPr>
+        <w:t xml:space="preserve"> </w:t>
+      </w:r>
+      <w:r>
+        <w:rPr>
+          <w:rFonts w:ascii="Consolas" w:eastAsia="Times New Roman" w:hAnsi="Consolas" w:cs="Times New Roman"/>
+          <w:color w:val="B5CEA8"/>
+          <w:kern w:val="0"/>
+          <w:sz w:val="21"/>
+          <w:szCs w:val="21"/>
+          <w:lang w:val="en-US" w:eastAsia="it-IT"/>
+          <w14:ligatures w14:val="none"/>
+        </w:rPr>
+        <w:t>1</w:t>
+      </w:r>
+    </w:p>
+    <w:p>
+      <w:pPr>
+        <w:shd w:val="clear" w:color="auto" w:fill="121314"/>
+        <w:spacing w:after="0" w:line="285" w:lineRule="atLeast"/>
+        <w:rPr>
+          <w:rFonts w:ascii="Consolas" w:eastAsia="Times New Roman" w:hAnsi="Consolas" w:cs="Times New Roman"/>
+          <w:color w:val="BBBEBF"/>
+          <w:kern w:val="0"/>
+          <w:sz w:val="21"/>
+          <w:szCs w:val="21"/>
+          <w:lang w:val="en-US" w:eastAsia="it-IT"/>
+          <w14:ligatures w14:val="none"/>
+        </w:rPr>
+      </w:pPr>
+      <w:r>
+        <w:rPr>
+          <w:rFonts w:ascii="Consolas" w:eastAsia="Times New Roman" w:hAnsi="Consolas" w:cs="Times New Roman"/>
+          <w:color w:val="BBBEBF"/>
+          <w:kern w:val="0"/>
+          <w:sz w:val="21"/>
+          <w:szCs w:val="21"/>
+          <w:lang w:val="en-US" w:eastAsia="it-IT"/>
+          <w14:ligatures w14:val="none"/>
+        </w:rPr>
+        <w:t xml:space="preserve">                </w:t>
+      </w:r>
+      <w:r>
+        <w:rPr>
+          <w:rFonts w:ascii="Consolas" w:eastAsia="Times New Roman" w:hAnsi="Consolas" w:cs="Times New Roman"/>
+          <w:color w:val="C586C0"/>
+          <w:kern w:val="0"/>
+          <w:sz w:val="21"/>
+          <w:szCs w:val="21"/>
+          <w:lang w:val="en-US" w:eastAsia="it-IT"/>
+          <w14:ligatures w14:val="none"/>
+        </w:rPr>
+        <w:t>if</w:t>
+      </w:r>
+      <w:r>
+        <w:rPr>
+          <w:rFonts w:ascii="Consolas" w:eastAsia="Times New Roman" w:hAnsi="Consolas" w:cs="Times New Roman"/>
+          <w:color w:val="BBBEBF"/>
+          <w:kern w:val="0"/>
+          <w:sz w:val="21"/>
+          <w:szCs w:val="21"/>
+          <w:lang w:val="en-US" w:eastAsia="it-IT"/>
+          <w14:ligatures w14:val="none"/>
+        </w:rPr>
+        <w:t xml:space="preserve"> </w:t>
+      </w:r>
+      <w:r>
+        <w:rPr>
+          <w:rFonts w:ascii="Consolas" w:eastAsia="Times New Roman" w:hAnsi="Consolas" w:cs="Times New Roman"/>
+          <w:color w:val="FFA657"/>
+          <w:kern w:val="0"/>
+          <w:sz w:val="21"/>
+          <w:szCs w:val="21"/>
+          <w:lang w:val="en-US" w:eastAsia="it-IT"/>
+          <w14:ligatures w14:val="none"/>
+        </w:rPr>
+        <w:t>k</w:t>
+      </w:r>
+      <w:r>
+        <w:rPr>
+          <w:rFonts w:ascii="Consolas" w:eastAsia="Times New Roman" w:hAnsi="Consolas" w:cs="Times New Roman"/>
+          <w:color w:val="BBBEBF"/>
+          <w:kern w:val="0"/>
+          <w:sz w:val="21"/>
+          <w:szCs w:val="21"/>
+          <w:lang w:val="en-US" w:eastAsia="it-IT"/>
+          <w14:ligatures w14:val="none"/>
+        </w:rPr>
+        <w:t xml:space="preserve"> </w:t>
+      </w:r>
+      <w:r>
+        <w:rPr>
+          <w:rFonts w:ascii="Consolas" w:eastAsia="Times New Roman" w:hAnsi="Consolas" w:cs="Times New Roman"/>
+          <w:color w:val="D4D4D4"/>
+          <w:kern w:val="0"/>
+          <w:sz w:val="21"/>
+          <w:szCs w:val="21"/>
+          <w:lang w:val="en-US" w:eastAsia="it-IT"/>
+          <w14:ligatures w14:val="none"/>
+        </w:rPr>
+        <w:t>==</w:t>
+      </w:r>
+      <w:r>
+        <w:rPr>
+          <w:rFonts w:ascii="Consolas" w:eastAsia="Times New Roman" w:hAnsi="Consolas" w:cs="Times New Roman"/>
+          <w:color w:val="BBBEBF"/>
+          <w:kern w:val="0"/>
+          <w:sz w:val="21"/>
+          <w:szCs w:val="21"/>
+          <w:lang w:val="en-US" w:eastAsia="it-IT"/>
+          <w14:ligatures w14:val="none"/>
+        </w:rPr>
+        <w:t xml:space="preserve"> </w:t>
+      </w:r>
+      <w:r>
+        <w:rPr>
+          <w:rFonts w:ascii="Consolas" w:eastAsia="Times New Roman" w:hAnsi="Consolas" w:cs="Times New Roman"/>
+          <w:color w:val="B5CEA8"/>
+          <w:kern w:val="0"/>
+          <w:sz w:val="21"/>
+          <w:szCs w:val="21"/>
+          <w:lang w:val="en-US" w:eastAsia="it-IT"/>
+          <w14:ligatures w14:val="none"/>
+        </w:rPr>
+        <w:t>0</w:t>
+      </w:r>
+      <w:r>
+        <w:rPr>
+          <w:rFonts w:ascii="Consolas" w:eastAsia="Times New Roman" w:hAnsi="Consolas" w:cs="Times New Roman"/>
+          <w:color w:val="BBBEBF"/>
+          <w:kern w:val="0"/>
+          <w:sz w:val="21"/>
+          <w:szCs w:val="21"/>
+          <w:lang w:val="en-US" w:eastAsia="it-IT"/>
+          <w14:ligatures w14:val="none"/>
+        </w:rPr>
+        <w:t>:</w:t>
+      </w:r>
+    </w:p>
+    <w:p>
+      <w:pPr>
+        <w:shd w:val="clear" w:color="auto" w:fill="121314"/>
+        <w:spacing w:after="0" w:line="285" w:lineRule="atLeast"/>
+        <w:rPr>
+          <w:rFonts w:ascii="Consolas" w:eastAsia="Times New Roman" w:hAnsi="Consolas" w:cs="Times New Roman"/>
+          <w:color w:val="BBBEBF"/>
+          <w:kern w:val="0"/>
+          <w:sz w:val="21"/>
+          <w:szCs w:val="21"/>
+          <w:lang w:val="en-US" w:eastAsia="it-IT"/>
+          <w14:ligatures w14:val="none"/>
+        </w:rPr>
+      </w:pPr>
+      <w:r>
+        <w:rPr>
+          <w:rFonts w:ascii="Consolas" w:eastAsia="Times New Roman" w:hAnsi="Consolas" w:cs="Times New Roman"/>
+          <w:color w:val="BBBEBF"/>
+          <w:kern w:val="0"/>
+          <w:sz w:val="21"/>
+          <w:szCs w:val="21"/>
+          <w:lang w:val="en-US" w:eastAsia="it-IT"/>
+          <w14:ligatures w14:val="none"/>
+        </w:rPr>
+        <w:t xml:space="preserve">                    </w:t>
+      </w:r>
+      <w:r>
+        <w:rPr>
+          <w:rFonts w:ascii="Consolas" w:eastAsia="Times New Roman" w:hAnsi="Consolas" w:cs="Times New Roman"/>
+          <w:color w:val="C586C0"/>
+          <w:kern w:val="0"/>
+          <w:sz w:val="21"/>
+          <w:szCs w:val="21"/>
+          <w:lang w:val="en-US" w:eastAsia="it-IT"/>
+          <w14:ligatures w14:val="none"/>
+        </w:rPr>
+        <w:t>return</w:t>
+      </w:r>
+      <w:r>
+        <w:rPr>
+          <w:rFonts w:ascii="Consolas" w:eastAsia="Times New Roman" w:hAnsi="Consolas" w:cs="Times New Roman"/>
+          <w:color w:val="BBBEBF"/>
+          <w:kern w:val="0"/>
+          <w:sz w:val="21"/>
+          <w:szCs w:val="21"/>
+          <w:lang w:val="en-US" w:eastAsia="it-IT"/>
+          <w14:ligatures w14:val="none"/>
+        </w:rPr>
+        <w:t xml:space="preserve"> </w:t>
+      </w:r>
+      <w:r>
+        <w:rPr>
+          <w:rFonts w:ascii="Consolas" w:eastAsia="Times New Roman" w:hAnsi="Consolas" w:cs="Times New Roman"/>
+          <w:color w:val="C9D1D9"/>
+          <w:kern w:val="0"/>
+          <w:sz w:val="21"/>
+          <w:szCs w:val="21"/>
+          <w:lang w:val="en-US" w:eastAsia="it-IT"/>
+          <w14:ligatures w14:val="none"/>
+        </w:rPr>
+        <w:t>curr</w:t>
+      </w:r>
+      <w:r>
+        <w:rPr>
+          <w:rFonts w:ascii="Consolas" w:eastAsia="Times New Roman" w:hAnsi="Consolas" w:cs="Times New Roman"/>
+          <w:color w:val="BBBEBF"/>
+          <w:kern w:val="0"/>
+          <w:sz w:val="21"/>
+          <w:szCs w:val="21"/>
+          <w:lang w:val="en-US" w:eastAsia="it-IT"/>
+          <w14:ligatures w14:val="none"/>
+        </w:rPr>
+        <w:t>.val</w:t>
+      </w:r>
+    </w:p>
+    <w:p>
+      <w:pPr>
+        <w:shd w:val="clear" w:color="auto" w:fill="121314"/>
+        <w:spacing w:after="0" w:line="285" w:lineRule="atLeast"/>
+        <w:rPr>
+          <w:rFonts w:ascii="Consolas" w:eastAsia="Times New Roman" w:hAnsi="Consolas" w:cs="Times New Roman"/>
+          <w:color w:val="BBBEBF"/>
+          <w:kern w:val="0"/>
+          <w:sz w:val="21"/>
+          <w:szCs w:val="21"/>
           <w:lang w:eastAsia="it-IT"/>
           <w14:ligatures w14:val="none"/>
         </w:rPr>
@@ -6113,11 +7352,1421 @@
           <w:kern w:val="0"/>
           <w:sz w:val="21"/>
           <w:szCs w:val="21"/>
+          <w:lang w:val="en-US" w:eastAsia="it-IT"/>
+          <w14:ligatures w14:val="none"/>
+        </w:rPr>
+        <w:t xml:space="preserve">                </w:t>
+      </w:r>
+      <w:proofErr w:type="spellStart"/>
+      <w:r>
+        <w:rPr>
+          <w:rFonts w:ascii="Consolas" w:eastAsia="Times New Roman" w:hAnsi="Consolas" w:cs="Times New Roman"/>
+          <w:color w:val="C9D1D9"/>
+          <w:kern w:val="0"/>
+          <w:sz w:val="21"/>
+          <w:szCs w:val="21"/>
           <w:lang w:eastAsia="it-IT"/>
           <w14:ligatures w14:val="none"/>
         </w:rPr>
+        <w:t>curr</w:t>
+      </w:r>
+      <w:proofErr w:type="spellEnd"/>
+      <w:r>
+        <w:rPr>
+          <w:rFonts w:ascii="Consolas" w:eastAsia="Times New Roman" w:hAnsi="Consolas" w:cs="Times New Roman"/>
+          <w:color w:val="BBBEBF"/>
+          <w:kern w:val="0"/>
+          <w:sz w:val="21"/>
+          <w:szCs w:val="21"/>
+          <w:lang w:eastAsia="it-IT"/>
+          <w14:ligatures w14:val="none"/>
+        </w:rPr>
+        <w:t xml:space="preserve"> </w:t>
+      </w:r>
+      <w:r>
+        <w:rPr>
+          <w:rFonts w:ascii="Consolas" w:eastAsia="Times New Roman" w:hAnsi="Consolas" w:cs="Times New Roman"/>
+          <w:color w:val="D4D4D4"/>
+          <w:kern w:val="0"/>
+          <w:sz w:val="21"/>
+          <w:szCs w:val="21"/>
+          <w:lang w:eastAsia="it-IT"/>
+          <w14:ligatures w14:val="none"/>
+        </w:rPr>
+        <w:t>=</w:t>
+      </w:r>
+      <w:r>
+        <w:rPr>
+          <w:rFonts w:ascii="Consolas" w:eastAsia="Times New Roman" w:hAnsi="Consolas" w:cs="Times New Roman"/>
+          <w:color w:val="BBBEBF"/>
+          <w:kern w:val="0"/>
+          <w:sz w:val="21"/>
+          <w:szCs w:val="21"/>
+          <w:lang w:eastAsia="it-IT"/>
+          <w14:ligatures w14:val="none"/>
+        </w:rPr>
+        <w:t xml:space="preserve"> </w:t>
+      </w:r>
+      <w:proofErr w:type="spellStart"/>
+      <w:r>
+        <w:rPr>
+          <w:rFonts w:ascii="Consolas" w:eastAsia="Times New Roman" w:hAnsi="Consolas" w:cs="Times New Roman"/>
+          <w:color w:val="C9D1D9"/>
+          <w:kern w:val="0"/>
+          <w:sz w:val="21"/>
+          <w:szCs w:val="21"/>
+          <w:lang w:eastAsia="it-IT"/>
+          <w14:ligatures w14:val="none"/>
+        </w:rPr>
+        <w:t>curr</w:t>
+      </w:r>
+      <w:r>
+        <w:rPr>
+          <w:rFonts w:ascii="Consolas" w:eastAsia="Times New Roman" w:hAnsi="Consolas" w:cs="Times New Roman"/>
+          <w:color w:val="BBBEBF"/>
+          <w:kern w:val="0"/>
+          <w:sz w:val="21"/>
+          <w:szCs w:val="21"/>
+          <w:lang w:eastAsia="it-IT"/>
+          <w14:ligatures w14:val="none"/>
+        </w:rPr>
+        <w:t>.right</w:t>
+      </w:r>
+      <w:proofErr w:type="spellEnd"/>
+      <w:r>
+        <w:rPr>
+          <w:rFonts w:ascii="Consolas" w:eastAsia="Times New Roman" w:hAnsi="Consolas" w:cs="Times New Roman"/>
+          <w:color w:val="BBBEBF"/>
+          <w:kern w:val="0"/>
+          <w:sz w:val="21"/>
+          <w:szCs w:val="21"/>
+          <w:lang w:eastAsia="it-IT"/>
+          <w14:ligatures w14:val="none"/>
+        </w:rPr>
+        <w:t xml:space="preserve"> </w:t>
+      </w:r>
+      <w:r>
+        <w:rPr>
+          <w:rFonts w:ascii="Consolas" w:eastAsia="Times New Roman" w:hAnsi="Consolas" w:cs="Times New Roman"/>
+          <w:color w:val="8B949E"/>
+          <w:kern w:val="0"/>
+          <w:sz w:val="21"/>
+          <w:szCs w:val="21"/>
+          <w:lang w:eastAsia="it-IT"/>
+          <w14:ligatures w14:val="none"/>
+        </w:rPr>
+        <w:t>#continuo ricerca a destra (vero destro o SUCCESSORE)</w:t>
+      </w:r>
+    </w:p>
+    <w:p>
+      <w:pPr>
+        <w:shd w:val="clear" w:color="auto" w:fill="121314"/>
+        <w:spacing w:after="0" w:line="285" w:lineRule="atLeast"/>
+        <w:rPr>
+          <w:rFonts w:ascii="Consolas" w:eastAsia="Times New Roman" w:hAnsi="Consolas" w:cs="Times New Roman"/>
+          <w:color w:val="BBBEBF"/>
+          <w:kern w:val="0"/>
+          <w:sz w:val="21"/>
+          <w:szCs w:val="21"/>
+          <w:lang w:val="en-US" w:eastAsia="it-IT"/>
+          <w14:ligatures w14:val="none"/>
+        </w:rPr>
+      </w:pPr>
+      <w:r>
+        <w:rPr>
+          <w:rFonts w:ascii="Consolas" w:eastAsia="Times New Roman" w:hAnsi="Consolas" w:cs="Times New Roman"/>
+          <w:color w:val="BBBEBF"/>
+          <w:kern w:val="0"/>
+          <w:sz w:val="21"/>
+          <w:szCs w:val="21"/>
+          <w:lang w:eastAsia="it-IT"/>
+          <w14:ligatures w14:val="none"/>
+        </w:rPr>
+        <w:t xml:space="preserve">            </w:t>
+      </w:r>
+      <w:r>
+        <w:rPr>
+          <w:rFonts w:ascii="Consolas" w:eastAsia="Times New Roman" w:hAnsi="Consolas" w:cs="Times New Roman"/>
+          <w:color w:val="C586C0"/>
+          <w:kern w:val="0"/>
+          <w:sz w:val="21"/>
+          <w:szCs w:val="21"/>
+          <w:lang w:val="en-US" w:eastAsia="it-IT"/>
+          <w14:ligatures w14:val="none"/>
+        </w:rPr>
+        <w:t>else</w:t>
+      </w:r>
+      <w:r>
+        <w:rPr>
+          <w:rFonts w:ascii="Consolas" w:eastAsia="Times New Roman" w:hAnsi="Consolas" w:cs="Times New Roman"/>
+          <w:color w:val="BBBEBF"/>
+          <w:kern w:val="0"/>
+          <w:sz w:val="21"/>
+          <w:szCs w:val="21"/>
+          <w:lang w:val="en-US" w:eastAsia="it-IT"/>
+          <w14:ligatures w14:val="none"/>
+        </w:rPr>
+        <w:t>:</w:t>
+      </w:r>
+    </w:p>
+    <w:p>
+      <w:pPr>
+        <w:shd w:val="clear" w:color="auto" w:fill="121314"/>
+        <w:spacing w:after="0" w:line="285" w:lineRule="atLeast"/>
+        <w:rPr>
+          <w:rFonts w:ascii="Consolas" w:eastAsia="Times New Roman" w:hAnsi="Consolas" w:cs="Times New Roman"/>
+          <w:color w:val="BBBEBF"/>
+          <w:kern w:val="0"/>
+          <w:sz w:val="21"/>
+          <w:szCs w:val="21"/>
+          <w:lang w:val="en-US" w:eastAsia="it-IT"/>
+          <w14:ligatures w14:val="none"/>
+        </w:rPr>
+      </w:pPr>
+      <w:r>
+        <w:rPr>
+          <w:rFonts w:ascii="Consolas" w:eastAsia="Times New Roman" w:hAnsi="Consolas" w:cs="Times New Roman"/>
+          <w:color w:val="BBBEBF"/>
+          <w:kern w:val="0"/>
+          <w:sz w:val="21"/>
+          <w:szCs w:val="21"/>
+          <w:lang w:val="en-US" w:eastAsia="it-IT"/>
+          <w14:ligatures w14:val="none"/>
+        </w:rPr>
+        <w:t xml:space="preserve">                </w:t>
+      </w:r>
+      <w:r>
+        <w:rPr>
+          <w:rFonts w:ascii="Consolas" w:eastAsia="Times New Roman" w:hAnsi="Consolas" w:cs="Times New Roman"/>
+          <w:color w:val="C9D1D9"/>
+          <w:kern w:val="0"/>
+          <w:sz w:val="21"/>
+          <w:szCs w:val="21"/>
+          <w:lang w:val="en-US" w:eastAsia="it-IT"/>
+          <w14:ligatures w14:val="none"/>
+        </w:rPr>
+        <w:t>pred</w:t>
+      </w:r>
+      <w:r>
+        <w:rPr>
+          <w:rFonts w:ascii="Consolas" w:eastAsia="Times New Roman" w:hAnsi="Consolas" w:cs="Times New Roman"/>
+          <w:color w:val="BBBEBF"/>
+          <w:kern w:val="0"/>
+          <w:sz w:val="21"/>
+          <w:szCs w:val="21"/>
+          <w:lang w:val="en-US" w:eastAsia="it-IT"/>
+          <w14:ligatures w14:val="none"/>
+        </w:rPr>
+        <w:t xml:space="preserve"> </w:t>
+      </w:r>
+      <w:r>
+        <w:rPr>
+          <w:rFonts w:ascii="Consolas" w:eastAsia="Times New Roman" w:hAnsi="Consolas" w:cs="Times New Roman"/>
+          <w:color w:val="D4D4D4"/>
+          <w:kern w:val="0"/>
+          <w:sz w:val="21"/>
+          <w:szCs w:val="21"/>
+          <w:lang w:val="en-US" w:eastAsia="it-IT"/>
+          <w14:ligatures w14:val="none"/>
+        </w:rPr>
+        <w:t>=</w:t>
+      </w:r>
+      <w:r>
+        <w:rPr>
+          <w:rFonts w:ascii="Consolas" w:eastAsia="Times New Roman" w:hAnsi="Consolas" w:cs="Times New Roman"/>
+          <w:color w:val="BBBEBF"/>
+          <w:kern w:val="0"/>
+          <w:sz w:val="21"/>
+          <w:szCs w:val="21"/>
+          <w:lang w:val="en-US" w:eastAsia="it-IT"/>
+          <w14:ligatures w14:val="none"/>
+        </w:rPr>
+        <w:t xml:space="preserve"> </w:t>
+      </w:r>
+      <w:r>
+        <w:rPr>
+          <w:rFonts w:ascii="Consolas" w:eastAsia="Times New Roman" w:hAnsi="Consolas" w:cs="Times New Roman"/>
+          <w:color w:val="C9D1D9"/>
+          <w:kern w:val="0"/>
+          <w:sz w:val="21"/>
+          <w:szCs w:val="21"/>
+          <w:lang w:val="en-US" w:eastAsia="it-IT"/>
+          <w14:ligatures w14:val="none"/>
+        </w:rPr>
+        <w:t>curr</w:t>
+      </w:r>
+      <w:r>
+        <w:rPr>
+          <w:rFonts w:ascii="Consolas" w:eastAsia="Times New Roman" w:hAnsi="Consolas" w:cs="Times New Roman"/>
+          <w:color w:val="BBBEBF"/>
+          <w:kern w:val="0"/>
+          <w:sz w:val="21"/>
+          <w:szCs w:val="21"/>
+          <w:lang w:val="en-US" w:eastAsia="it-IT"/>
+          <w14:ligatures w14:val="none"/>
+        </w:rPr>
+        <w:t>.left</w:t>
+      </w:r>
+    </w:p>
+    <w:p>
+      <w:pPr>
+        <w:shd w:val="clear" w:color="auto" w:fill="121314"/>
+        <w:spacing w:after="0" w:line="285" w:lineRule="atLeast"/>
+        <w:rPr>
+          <w:rFonts w:ascii="Consolas" w:eastAsia="Times New Roman" w:hAnsi="Consolas" w:cs="Times New Roman"/>
+          <w:color w:val="BBBEBF"/>
+          <w:kern w:val="0"/>
+          <w:sz w:val="21"/>
+          <w:szCs w:val="21"/>
+          <w:lang w:val="en-US" w:eastAsia="it-IT"/>
+          <w14:ligatures w14:val="none"/>
+        </w:rPr>
+      </w:pPr>
+      <w:r>
+        <w:rPr>
+          <w:rFonts w:ascii="Consolas" w:eastAsia="Times New Roman" w:hAnsi="Consolas" w:cs="Times New Roman"/>
+          <w:color w:val="BBBEBF"/>
+          <w:kern w:val="0"/>
+          <w:sz w:val="21"/>
+          <w:szCs w:val="21"/>
+          <w:lang w:val="en-US" w:eastAsia="it-IT"/>
+          <w14:ligatures w14:val="none"/>
+        </w:rPr>
+        <w:t xml:space="preserve">                </w:t>
+      </w:r>
+      <w:r>
+        <w:rPr>
+          <w:rFonts w:ascii="Consolas" w:eastAsia="Times New Roman" w:hAnsi="Consolas" w:cs="Times New Roman"/>
+          <w:color w:val="C586C0"/>
+          <w:kern w:val="0"/>
+          <w:sz w:val="21"/>
+          <w:szCs w:val="21"/>
+          <w:lang w:val="en-US" w:eastAsia="it-IT"/>
+          <w14:ligatures w14:val="none"/>
+        </w:rPr>
+        <w:t>while</w:t>
+      </w:r>
+      <w:r>
+        <w:rPr>
+          <w:rFonts w:ascii="Consolas" w:eastAsia="Times New Roman" w:hAnsi="Consolas" w:cs="Times New Roman"/>
+          <w:color w:val="BBBEBF"/>
+          <w:kern w:val="0"/>
+          <w:sz w:val="21"/>
+          <w:szCs w:val="21"/>
+          <w:lang w:val="en-US" w:eastAsia="it-IT"/>
+          <w14:ligatures w14:val="none"/>
+        </w:rPr>
+        <w:t xml:space="preserve"> </w:t>
+      </w:r>
+      <w:r>
+        <w:rPr>
+          <w:rFonts w:ascii="Consolas" w:eastAsia="Times New Roman" w:hAnsi="Consolas" w:cs="Times New Roman"/>
+          <w:color w:val="C9D1D9"/>
+          <w:kern w:val="0"/>
+          <w:sz w:val="21"/>
+          <w:szCs w:val="21"/>
+          <w:lang w:val="en-US" w:eastAsia="it-IT"/>
+          <w14:ligatures w14:val="none"/>
+        </w:rPr>
+        <w:t>pred</w:t>
+      </w:r>
+      <w:r>
+        <w:rPr>
+          <w:rFonts w:ascii="Consolas" w:eastAsia="Times New Roman" w:hAnsi="Consolas" w:cs="Times New Roman"/>
+          <w:color w:val="BBBEBF"/>
+          <w:kern w:val="0"/>
+          <w:sz w:val="21"/>
+          <w:szCs w:val="21"/>
+          <w:lang w:val="en-US" w:eastAsia="it-IT"/>
+          <w14:ligatures w14:val="none"/>
+        </w:rPr>
+        <w:t xml:space="preserve">.right </w:t>
+      </w:r>
+      <w:r>
+        <w:rPr>
+          <w:rFonts w:ascii="Consolas" w:eastAsia="Times New Roman" w:hAnsi="Consolas" w:cs="Times New Roman"/>
+          <w:color w:val="569CD6"/>
+          <w:kern w:val="0"/>
+          <w:sz w:val="21"/>
+          <w:szCs w:val="21"/>
+          <w:lang w:val="en-US" w:eastAsia="it-IT"/>
+          <w14:ligatures w14:val="none"/>
+        </w:rPr>
+        <w:t>and</w:t>
+      </w:r>
+      <w:r>
+        <w:rPr>
+          <w:rFonts w:ascii="Consolas" w:eastAsia="Times New Roman" w:hAnsi="Consolas" w:cs="Times New Roman"/>
+          <w:color w:val="BBBEBF"/>
+          <w:kern w:val="0"/>
+          <w:sz w:val="21"/>
+          <w:szCs w:val="21"/>
+          <w:lang w:val="en-US" w:eastAsia="it-IT"/>
+          <w14:ligatures w14:val="none"/>
+        </w:rPr>
+        <w:t xml:space="preserve"> </w:t>
+      </w:r>
+      <w:r>
+        <w:rPr>
+          <w:rFonts w:ascii="Consolas" w:eastAsia="Times New Roman" w:hAnsi="Consolas" w:cs="Times New Roman"/>
+          <w:color w:val="C9D1D9"/>
+          <w:kern w:val="0"/>
+          <w:sz w:val="21"/>
+          <w:szCs w:val="21"/>
+          <w:lang w:val="en-US" w:eastAsia="it-IT"/>
+          <w14:ligatures w14:val="none"/>
+        </w:rPr>
+        <w:t>pred</w:t>
+      </w:r>
+      <w:r>
+        <w:rPr>
+          <w:rFonts w:ascii="Consolas" w:eastAsia="Times New Roman" w:hAnsi="Consolas" w:cs="Times New Roman"/>
+          <w:color w:val="BBBEBF"/>
+          <w:kern w:val="0"/>
+          <w:sz w:val="21"/>
+          <w:szCs w:val="21"/>
+          <w:lang w:val="en-US" w:eastAsia="it-IT"/>
+          <w14:ligatures w14:val="none"/>
+        </w:rPr>
+        <w:t xml:space="preserve">.right </w:t>
+      </w:r>
+      <w:r>
+        <w:rPr>
+          <w:rFonts w:ascii="Consolas" w:eastAsia="Times New Roman" w:hAnsi="Consolas" w:cs="Times New Roman"/>
+          <w:color w:val="D4D4D4"/>
+          <w:kern w:val="0"/>
+          <w:sz w:val="21"/>
+          <w:szCs w:val="21"/>
+          <w:lang w:val="en-US" w:eastAsia="it-IT"/>
+          <w14:ligatures w14:val="none"/>
+        </w:rPr>
+        <w:t>!=</w:t>
+      </w:r>
+      <w:r>
+        <w:rPr>
+          <w:rFonts w:ascii="Consolas" w:eastAsia="Times New Roman" w:hAnsi="Consolas" w:cs="Times New Roman"/>
+          <w:color w:val="BBBEBF"/>
+          <w:kern w:val="0"/>
+          <w:sz w:val="21"/>
+          <w:szCs w:val="21"/>
+          <w:lang w:val="en-US" w:eastAsia="it-IT"/>
+          <w14:ligatures w14:val="none"/>
+        </w:rPr>
+        <w:t xml:space="preserve"> </w:t>
+      </w:r>
+      <w:r>
+        <w:rPr>
+          <w:rFonts w:ascii="Consolas" w:eastAsia="Times New Roman" w:hAnsi="Consolas" w:cs="Times New Roman"/>
+          <w:color w:val="C9D1D9"/>
+          <w:kern w:val="0"/>
+          <w:sz w:val="21"/>
+          <w:szCs w:val="21"/>
+          <w:lang w:val="en-US" w:eastAsia="it-IT"/>
+          <w14:ligatures w14:val="none"/>
+        </w:rPr>
+        <w:t>curr</w:t>
+      </w:r>
+      <w:r>
+        <w:rPr>
+          <w:rFonts w:ascii="Consolas" w:eastAsia="Times New Roman" w:hAnsi="Consolas" w:cs="Times New Roman"/>
+          <w:color w:val="BBBEBF"/>
+          <w:kern w:val="0"/>
+          <w:sz w:val="21"/>
+          <w:szCs w:val="21"/>
+          <w:lang w:val="en-US" w:eastAsia="it-IT"/>
+          <w14:ligatures w14:val="none"/>
+        </w:rPr>
+        <w:t xml:space="preserve">: </w:t>
+      </w:r>
+      <w:r>
+        <w:rPr>
+          <w:rFonts w:ascii="Consolas" w:eastAsia="Times New Roman" w:hAnsi="Consolas" w:cs="Times New Roman"/>
+          <w:color w:val="8B949E"/>
+          <w:kern w:val="0"/>
+          <w:sz w:val="21"/>
+          <w:szCs w:val="21"/>
+          <w:lang w:val="en-US" w:eastAsia="it-IT"/>
+          <w14:ligatures w14:val="none"/>
+        </w:rPr>
+        <w:t>#trovo PREDECESSORE</w:t>
+      </w:r>
+    </w:p>
+    <w:p>
+      <w:pPr>
+        <w:shd w:val="clear" w:color="auto" w:fill="121314"/>
+        <w:spacing w:after="0" w:line="285" w:lineRule="atLeast"/>
+        <w:rPr>
+          <w:rFonts w:ascii="Consolas" w:eastAsia="Times New Roman" w:hAnsi="Consolas" w:cs="Times New Roman"/>
+          <w:color w:val="BBBEBF"/>
+          <w:kern w:val="0"/>
+          <w:sz w:val="21"/>
+          <w:szCs w:val="21"/>
+          <w:lang w:val="en-US" w:eastAsia="it-IT"/>
+          <w14:ligatures w14:val="none"/>
+        </w:rPr>
+      </w:pPr>
+      <w:r>
+        <w:rPr>
+          <w:rFonts w:ascii="Consolas" w:eastAsia="Times New Roman" w:hAnsi="Consolas" w:cs="Times New Roman"/>
+          <w:color w:val="BBBEBF"/>
+          <w:kern w:val="0"/>
+          <w:sz w:val="21"/>
+          <w:szCs w:val="21"/>
+          <w:lang w:val="en-US" w:eastAsia="it-IT"/>
+          <w14:ligatures w14:val="none"/>
+        </w:rPr>
+        <w:t xml:space="preserve">                    </w:t>
+      </w:r>
+      <w:r>
+        <w:rPr>
+          <w:rFonts w:ascii="Consolas" w:eastAsia="Times New Roman" w:hAnsi="Consolas" w:cs="Times New Roman"/>
+          <w:color w:val="C9D1D9"/>
+          <w:kern w:val="0"/>
+          <w:sz w:val="21"/>
+          <w:szCs w:val="21"/>
+          <w:lang w:val="en-US" w:eastAsia="it-IT"/>
+          <w14:ligatures w14:val="none"/>
+        </w:rPr>
+        <w:t>pred</w:t>
+      </w:r>
+      <w:r>
+        <w:rPr>
+          <w:rFonts w:ascii="Consolas" w:eastAsia="Times New Roman" w:hAnsi="Consolas" w:cs="Times New Roman"/>
+          <w:color w:val="BBBEBF"/>
+          <w:kern w:val="0"/>
+          <w:sz w:val="21"/>
+          <w:szCs w:val="21"/>
+          <w:lang w:val="en-US" w:eastAsia="it-IT"/>
+          <w14:ligatures w14:val="none"/>
+        </w:rPr>
+        <w:t xml:space="preserve"> </w:t>
+      </w:r>
+      <w:r>
+        <w:rPr>
+          <w:rFonts w:ascii="Consolas" w:eastAsia="Times New Roman" w:hAnsi="Consolas" w:cs="Times New Roman"/>
+          <w:color w:val="D4D4D4"/>
+          <w:kern w:val="0"/>
+          <w:sz w:val="21"/>
+          <w:szCs w:val="21"/>
+          <w:lang w:val="en-US" w:eastAsia="it-IT"/>
+          <w14:ligatures w14:val="none"/>
+        </w:rPr>
+        <w:t>=</w:t>
+      </w:r>
+      <w:r>
+        <w:rPr>
+          <w:rFonts w:ascii="Consolas" w:eastAsia="Times New Roman" w:hAnsi="Consolas" w:cs="Times New Roman"/>
+          <w:color w:val="BBBEBF"/>
+          <w:kern w:val="0"/>
+          <w:sz w:val="21"/>
+          <w:szCs w:val="21"/>
+          <w:lang w:val="en-US" w:eastAsia="it-IT"/>
+          <w14:ligatures w14:val="none"/>
+        </w:rPr>
+        <w:t xml:space="preserve"> </w:t>
+      </w:r>
+      <w:r>
+        <w:rPr>
+          <w:rFonts w:ascii="Consolas" w:eastAsia="Times New Roman" w:hAnsi="Consolas" w:cs="Times New Roman"/>
+          <w:color w:val="C9D1D9"/>
+          <w:kern w:val="0"/>
+          <w:sz w:val="21"/>
+          <w:szCs w:val="21"/>
+          <w:lang w:val="en-US" w:eastAsia="it-IT"/>
+          <w14:ligatures w14:val="none"/>
+        </w:rPr>
+        <w:t>pred</w:t>
+      </w:r>
+      <w:r>
+        <w:rPr>
+          <w:rFonts w:ascii="Consolas" w:eastAsia="Times New Roman" w:hAnsi="Consolas" w:cs="Times New Roman"/>
+          <w:color w:val="BBBEBF"/>
+          <w:kern w:val="0"/>
+          <w:sz w:val="21"/>
+          <w:szCs w:val="21"/>
+          <w:lang w:val="en-US" w:eastAsia="it-IT"/>
+          <w14:ligatures w14:val="none"/>
+        </w:rPr>
+        <w:t>.right</w:t>
+      </w:r>
+    </w:p>
+    <w:p>
+      <w:pPr>
+        <w:shd w:val="clear" w:color="auto" w:fill="121314"/>
+        <w:spacing w:after="0" w:line="285" w:lineRule="atLeast"/>
+        <w:rPr>
+          <w:rFonts w:ascii="Consolas" w:eastAsia="Times New Roman" w:hAnsi="Consolas" w:cs="Times New Roman"/>
+          <w:color w:val="BBBEBF"/>
+          <w:kern w:val="0"/>
+          <w:sz w:val="21"/>
+          <w:szCs w:val="21"/>
+          <w:lang w:val="en-US" w:eastAsia="it-IT"/>
+          <w14:ligatures w14:val="none"/>
+        </w:rPr>
+      </w:pPr>
+    </w:p>
+    <w:p>
+      <w:pPr>
+        <w:shd w:val="clear" w:color="auto" w:fill="121314"/>
+        <w:spacing w:after="0" w:line="285" w:lineRule="atLeast"/>
+        <w:rPr>
+          <w:rFonts w:ascii="Consolas" w:eastAsia="Times New Roman" w:hAnsi="Consolas" w:cs="Times New Roman"/>
+          <w:color w:val="BBBEBF"/>
+          <w:kern w:val="0"/>
+          <w:sz w:val="21"/>
+          <w:szCs w:val="21"/>
+          <w:lang w:val="en-US" w:eastAsia="it-IT"/>
+          <w14:ligatures w14:val="none"/>
+        </w:rPr>
+      </w:pPr>
+      <w:r>
+        <w:rPr>
+          <w:rFonts w:ascii="Consolas" w:eastAsia="Times New Roman" w:hAnsi="Consolas" w:cs="Times New Roman"/>
+          <w:color w:val="BBBEBF"/>
+          <w:kern w:val="0"/>
+          <w:sz w:val="21"/>
+          <w:szCs w:val="21"/>
+          <w:lang w:val="en-US" w:eastAsia="it-IT"/>
+          <w14:ligatures w14:val="none"/>
+        </w:rPr>
+        <w:t xml:space="preserve">                </w:t>
+      </w:r>
+      <w:r>
+        <w:rPr>
+          <w:rFonts w:ascii="Consolas" w:eastAsia="Times New Roman" w:hAnsi="Consolas" w:cs="Times New Roman"/>
+          <w:color w:val="C586C0"/>
+          <w:kern w:val="0"/>
+          <w:sz w:val="21"/>
+          <w:szCs w:val="21"/>
+          <w:lang w:val="en-US" w:eastAsia="it-IT"/>
+          <w14:ligatures w14:val="none"/>
+        </w:rPr>
+        <w:t>if</w:t>
+      </w:r>
+      <w:r>
+        <w:rPr>
+          <w:rFonts w:ascii="Consolas" w:eastAsia="Times New Roman" w:hAnsi="Consolas" w:cs="Times New Roman"/>
+          <w:color w:val="BBBEBF"/>
+          <w:kern w:val="0"/>
+          <w:sz w:val="21"/>
+          <w:szCs w:val="21"/>
+          <w:lang w:val="en-US" w:eastAsia="it-IT"/>
+          <w14:ligatures w14:val="none"/>
+        </w:rPr>
+        <w:t xml:space="preserve"> </w:t>
+      </w:r>
+      <w:r>
+        <w:rPr>
+          <w:rFonts w:ascii="Consolas" w:eastAsia="Times New Roman" w:hAnsi="Consolas" w:cs="Times New Roman"/>
+          <w:color w:val="569CD6"/>
+          <w:kern w:val="0"/>
+          <w:sz w:val="21"/>
+          <w:szCs w:val="21"/>
+          <w:lang w:val="en-US" w:eastAsia="it-IT"/>
+          <w14:ligatures w14:val="none"/>
+        </w:rPr>
+        <w:t>not</w:t>
+      </w:r>
+      <w:r>
+        <w:rPr>
+          <w:rFonts w:ascii="Consolas" w:eastAsia="Times New Roman" w:hAnsi="Consolas" w:cs="Times New Roman"/>
+          <w:color w:val="BBBEBF"/>
+          <w:kern w:val="0"/>
+          <w:sz w:val="21"/>
+          <w:szCs w:val="21"/>
+          <w:lang w:val="en-US" w:eastAsia="it-IT"/>
+          <w14:ligatures w14:val="none"/>
+        </w:rPr>
+        <w:t xml:space="preserve"> </w:t>
+      </w:r>
+      <w:r>
+        <w:rPr>
+          <w:rFonts w:ascii="Consolas" w:eastAsia="Times New Roman" w:hAnsi="Consolas" w:cs="Times New Roman"/>
+          <w:color w:val="C9D1D9"/>
+          <w:kern w:val="0"/>
+          <w:sz w:val="21"/>
+          <w:szCs w:val="21"/>
+          <w:lang w:val="en-US" w:eastAsia="it-IT"/>
+          <w14:ligatures w14:val="none"/>
+        </w:rPr>
+        <w:t>pred</w:t>
+      </w:r>
+      <w:r>
+        <w:rPr>
+          <w:rFonts w:ascii="Consolas" w:eastAsia="Times New Roman" w:hAnsi="Consolas" w:cs="Times New Roman"/>
+          <w:color w:val="BBBEBF"/>
+          <w:kern w:val="0"/>
+          <w:sz w:val="21"/>
+          <w:szCs w:val="21"/>
+          <w:lang w:val="en-US" w:eastAsia="it-IT"/>
+          <w14:ligatures w14:val="none"/>
+        </w:rPr>
+        <w:t>.right:</w:t>
+      </w:r>
+    </w:p>
+    <w:p>
+      <w:pPr>
+        <w:shd w:val="clear" w:color="auto" w:fill="121314"/>
+        <w:spacing w:after="0" w:line="285" w:lineRule="atLeast"/>
+        <w:rPr>
+          <w:rFonts w:ascii="Consolas" w:eastAsia="Times New Roman" w:hAnsi="Consolas" w:cs="Times New Roman"/>
+          <w:color w:val="BBBEBF"/>
+          <w:kern w:val="0"/>
+          <w:sz w:val="21"/>
+          <w:szCs w:val="21"/>
+          <w:lang w:val="en-US" w:eastAsia="it-IT"/>
+          <w14:ligatures w14:val="none"/>
+        </w:rPr>
+      </w:pPr>
+      <w:r>
+        <w:rPr>
+          <w:rFonts w:ascii="Consolas" w:eastAsia="Times New Roman" w:hAnsi="Consolas" w:cs="Times New Roman"/>
+          <w:color w:val="BBBEBF"/>
+          <w:kern w:val="0"/>
+          <w:sz w:val="21"/>
+          <w:szCs w:val="21"/>
+          <w:lang w:val="en-US" w:eastAsia="it-IT"/>
+          <w14:ligatures w14:val="none"/>
+        </w:rPr>
+        <w:t xml:space="preserve">                    </w:t>
+      </w:r>
+      <w:r>
+        <w:rPr>
+          <w:rFonts w:ascii="Consolas" w:eastAsia="Times New Roman" w:hAnsi="Consolas" w:cs="Times New Roman"/>
+          <w:color w:val="C9D1D9"/>
+          <w:kern w:val="0"/>
+          <w:sz w:val="21"/>
+          <w:szCs w:val="21"/>
+          <w:lang w:val="en-US" w:eastAsia="it-IT"/>
+          <w14:ligatures w14:val="none"/>
+        </w:rPr>
+        <w:t>pred</w:t>
+      </w:r>
+      <w:r>
+        <w:rPr>
+          <w:rFonts w:ascii="Consolas" w:eastAsia="Times New Roman" w:hAnsi="Consolas" w:cs="Times New Roman"/>
+          <w:color w:val="BBBEBF"/>
+          <w:kern w:val="0"/>
+          <w:sz w:val="21"/>
+          <w:szCs w:val="21"/>
+          <w:lang w:val="en-US" w:eastAsia="it-IT"/>
+          <w14:ligatures w14:val="none"/>
+        </w:rPr>
+        <w:t xml:space="preserve">.right </w:t>
+      </w:r>
+      <w:r>
+        <w:rPr>
+          <w:rFonts w:ascii="Consolas" w:eastAsia="Times New Roman" w:hAnsi="Consolas" w:cs="Times New Roman"/>
+          <w:color w:val="D4D4D4"/>
+          <w:kern w:val="0"/>
+          <w:sz w:val="21"/>
+          <w:szCs w:val="21"/>
+          <w:lang w:val="en-US" w:eastAsia="it-IT"/>
+          <w14:ligatures w14:val="none"/>
+        </w:rPr>
+        <w:t>=</w:t>
+      </w:r>
+      <w:r>
+        <w:rPr>
+          <w:rFonts w:ascii="Consolas" w:eastAsia="Times New Roman" w:hAnsi="Consolas" w:cs="Times New Roman"/>
+          <w:color w:val="BBBEBF"/>
+          <w:kern w:val="0"/>
+          <w:sz w:val="21"/>
+          <w:szCs w:val="21"/>
+          <w:lang w:val="en-US" w:eastAsia="it-IT"/>
+          <w14:ligatures w14:val="none"/>
+        </w:rPr>
+        <w:t xml:space="preserve"> </w:t>
+      </w:r>
+      <w:r>
+        <w:rPr>
+          <w:rFonts w:ascii="Consolas" w:eastAsia="Times New Roman" w:hAnsi="Consolas" w:cs="Times New Roman"/>
+          <w:color w:val="C9D1D9"/>
+          <w:kern w:val="0"/>
+          <w:sz w:val="21"/>
+          <w:szCs w:val="21"/>
+          <w:lang w:val="en-US" w:eastAsia="it-IT"/>
+          <w14:ligatures w14:val="none"/>
+        </w:rPr>
+        <w:t>curr</w:t>
+      </w:r>
+    </w:p>
+    <w:p>
+      <w:pPr>
+        <w:shd w:val="clear" w:color="auto" w:fill="121314"/>
+        <w:spacing w:after="0" w:line="285" w:lineRule="atLeast"/>
+        <w:rPr>
+          <w:rFonts w:ascii="Consolas" w:eastAsia="Times New Roman" w:hAnsi="Consolas" w:cs="Times New Roman"/>
+          <w:color w:val="BBBEBF"/>
+          <w:kern w:val="0"/>
+          <w:sz w:val="21"/>
+          <w:szCs w:val="21"/>
+          <w:lang w:val="en-US" w:eastAsia="it-IT"/>
+          <w14:ligatures w14:val="none"/>
+        </w:rPr>
+      </w:pPr>
+      <w:r>
+        <w:rPr>
+          <w:rFonts w:ascii="Consolas" w:eastAsia="Times New Roman" w:hAnsi="Consolas" w:cs="Times New Roman"/>
+          <w:color w:val="BBBEBF"/>
+          <w:kern w:val="0"/>
+          <w:sz w:val="21"/>
+          <w:szCs w:val="21"/>
+          <w:lang w:val="en-US" w:eastAsia="it-IT"/>
+          <w14:ligatures w14:val="none"/>
+        </w:rPr>
+        <w:t xml:space="preserve">                    </w:t>
+      </w:r>
+      <w:r>
+        <w:rPr>
+          <w:rFonts w:ascii="Consolas" w:eastAsia="Times New Roman" w:hAnsi="Consolas" w:cs="Times New Roman"/>
+          <w:color w:val="C9D1D9"/>
+          <w:kern w:val="0"/>
+          <w:sz w:val="21"/>
+          <w:szCs w:val="21"/>
+          <w:lang w:val="en-US" w:eastAsia="it-IT"/>
+          <w14:ligatures w14:val="none"/>
+        </w:rPr>
+        <w:t>curr</w:t>
+      </w:r>
+      <w:r>
+        <w:rPr>
+          <w:rFonts w:ascii="Consolas" w:eastAsia="Times New Roman" w:hAnsi="Consolas" w:cs="Times New Roman"/>
+          <w:color w:val="BBBEBF"/>
+          <w:kern w:val="0"/>
+          <w:sz w:val="21"/>
+          <w:szCs w:val="21"/>
+          <w:lang w:val="en-US" w:eastAsia="it-IT"/>
+          <w14:ligatures w14:val="none"/>
+        </w:rPr>
+        <w:t xml:space="preserve"> </w:t>
+      </w:r>
+      <w:r>
+        <w:rPr>
+          <w:rFonts w:ascii="Consolas" w:eastAsia="Times New Roman" w:hAnsi="Consolas" w:cs="Times New Roman"/>
+          <w:color w:val="D4D4D4"/>
+          <w:kern w:val="0"/>
+          <w:sz w:val="21"/>
+          <w:szCs w:val="21"/>
+          <w:lang w:val="en-US" w:eastAsia="it-IT"/>
+          <w14:ligatures w14:val="none"/>
+        </w:rPr>
+        <w:t>=</w:t>
+      </w:r>
+      <w:r>
+        <w:rPr>
+          <w:rFonts w:ascii="Consolas" w:eastAsia="Times New Roman" w:hAnsi="Consolas" w:cs="Times New Roman"/>
+          <w:color w:val="BBBEBF"/>
+          <w:kern w:val="0"/>
+          <w:sz w:val="21"/>
+          <w:szCs w:val="21"/>
+          <w:lang w:val="en-US" w:eastAsia="it-IT"/>
+          <w14:ligatures w14:val="none"/>
+        </w:rPr>
+        <w:t xml:space="preserve"> </w:t>
+      </w:r>
+      <w:r>
+        <w:rPr>
+          <w:rFonts w:ascii="Consolas" w:eastAsia="Times New Roman" w:hAnsi="Consolas" w:cs="Times New Roman"/>
+          <w:color w:val="C9D1D9"/>
+          <w:kern w:val="0"/>
+          <w:sz w:val="21"/>
+          <w:szCs w:val="21"/>
+          <w:lang w:val="en-US" w:eastAsia="it-IT"/>
+          <w14:ligatures w14:val="none"/>
+        </w:rPr>
+        <w:t>curr</w:t>
+      </w:r>
+      <w:r>
+        <w:rPr>
+          <w:rFonts w:ascii="Consolas" w:eastAsia="Times New Roman" w:hAnsi="Consolas" w:cs="Times New Roman"/>
+          <w:color w:val="BBBEBF"/>
+          <w:kern w:val="0"/>
+          <w:sz w:val="21"/>
+          <w:szCs w:val="21"/>
+          <w:lang w:val="en-US" w:eastAsia="it-IT"/>
+          <w14:ligatures w14:val="none"/>
+        </w:rPr>
+        <w:t>.left</w:t>
+      </w:r>
+    </w:p>
+    <w:p>
+      <w:pPr>
+        <w:shd w:val="clear" w:color="auto" w:fill="121314"/>
+        <w:spacing w:after="0" w:line="285" w:lineRule="atLeast"/>
+        <w:rPr>
+          <w:rFonts w:ascii="Consolas" w:eastAsia="Times New Roman" w:hAnsi="Consolas" w:cs="Times New Roman"/>
+          <w:color w:val="BBBEBF"/>
+          <w:kern w:val="0"/>
+          <w:sz w:val="21"/>
+          <w:szCs w:val="21"/>
+          <w:lang w:eastAsia="it-IT"/>
+          <w14:ligatures w14:val="none"/>
+        </w:rPr>
+      </w:pPr>
+      <w:r>
+        <w:rPr>
+          <w:rFonts w:ascii="Consolas" w:eastAsia="Times New Roman" w:hAnsi="Consolas" w:cs="Times New Roman"/>
+          <w:color w:val="BBBEBF"/>
+          <w:kern w:val="0"/>
+          <w:sz w:val="21"/>
+          <w:szCs w:val="21"/>
+          <w:lang w:val="en-US" w:eastAsia="it-IT"/>
+          <w14:ligatures w14:val="none"/>
+        </w:rPr>
+        <w:t xml:space="preserve">                </w:t>
+      </w:r>
+      <w:r>
+        <w:rPr>
+          <w:rFonts w:ascii="Consolas" w:eastAsia="Times New Roman" w:hAnsi="Consolas" w:cs="Times New Roman"/>
+          <w:color w:val="C586C0"/>
+          <w:kern w:val="0"/>
+          <w:sz w:val="21"/>
+          <w:szCs w:val="21"/>
+          <w:lang w:eastAsia="it-IT"/>
+          <w14:ligatures w14:val="none"/>
+        </w:rPr>
+        <w:t>else</w:t>
+      </w:r>
+      <w:r>
+        <w:rPr>
+          <w:rFonts w:ascii="Consolas" w:eastAsia="Times New Roman" w:hAnsi="Consolas" w:cs="Times New Roman"/>
+          <w:color w:val="BBBEBF"/>
+          <w:kern w:val="0"/>
+          <w:sz w:val="21"/>
+          <w:szCs w:val="21"/>
+          <w:lang w:eastAsia="it-IT"/>
+          <w14:ligatures w14:val="none"/>
+        </w:rPr>
+        <w:t xml:space="preserve">: </w:t>
+      </w:r>
+      <w:r>
+        <w:rPr>
+          <w:rFonts w:ascii="Consolas" w:eastAsia="Times New Roman" w:hAnsi="Consolas" w:cs="Times New Roman"/>
+          <w:color w:val="8B949E"/>
+          <w:kern w:val="0"/>
+          <w:sz w:val="21"/>
+          <w:szCs w:val="21"/>
+          <w:lang w:eastAsia="it-IT"/>
+          <w14:ligatures w14:val="none"/>
+        </w:rPr>
+        <w:t>#qui entro quando sto risalendo --&gt; valuto in risalita ogni nodo CURR</w:t>
+      </w:r>
+    </w:p>
+    <w:p>
+      <w:pPr>
+        <w:shd w:val="clear" w:color="auto" w:fill="121314"/>
+        <w:spacing w:after="0" w:line="285" w:lineRule="atLeast"/>
+        <w:rPr>
+          <w:rFonts w:ascii="Consolas" w:eastAsia="Times New Roman" w:hAnsi="Consolas" w:cs="Times New Roman"/>
+          <w:color w:val="BBBEBF"/>
+          <w:kern w:val="0"/>
+          <w:sz w:val="21"/>
+          <w:szCs w:val="21"/>
+          <w:lang w:val="en-US" w:eastAsia="it-IT"/>
+          <w14:ligatures w14:val="none"/>
+        </w:rPr>
+      </w:pPr>
+      <w:r>
+        <w:rPr>
+          <w:rFonts w:ascii="Consolas" w:eastAsia="Times New Roman" w:hAnsi="Consolas" w:cs="Times New Roman"/>
+          <w:color w:val="BBBEBF"/>
+          <w:kern w:val="0"/>
+          <w:sz w:val="21"/>
+          <w:szCs w:val="21"/>
+          <w:lang w:eastAsia="it-IT"/>
+          <w14:ligatures w14:val="none"/>
+        </w:rPr>
+        <w:t xml:space="preserve">                    </w:t>
+      </w:r>
+      <w:r>
+        <w:rPr>
+          <w:rFonts w:ascii="Consolas" w:eastAsia="Times New Roman" w:hAnsi="Consolas" w:cs="Times New Roman"/>
+          <w:color w:val="C9D1D9"/>
+          <w:kern w:val="0"/>
+          <w:sz w:val="21"/>
+          <w:szCs w:val="21"/>
+          <w:lang w:val="en-US" w:eastAsia="it-IT"/>
+          <w14:ligatures w14:val="none"/>
+        </w:rPr>
+        <w:t>pred</w:t>
+      </w:r>
+      <w:r>
+        <w:rPr>
+          <w:rFonts w:ascii="Consolas" w:eastAsia="Times New Roman" w:hAnsi="Consolas" w:cs="Times New Roman"/>
+          <w:color w:val="BBBEBF"/>
+          <w:kern w:val="0"/>
+          <w:sz w:val="21"/>
+          <w:szCs w:val="21"/>
+          <w:lang w:val="en-US" w:eastAsia="it-IT"/>
+          <w14:ligatures w14:val="none"/>
+        </w:rPr>
+        <w:t xml:space="preserve">.right </w:t>
+      </w:r>
+      <w:r>
+        <w:rPr>
+          <w:rFonts w:ascii="Consolas" w:eastAsia="Times New Roman" w:hAnsi="Consolas" w:cs="Times New Roman"/>
+          <w:color w:val="D4D4D4"/>
+          <w:kern w:val="0"/>
+          <w:sz w:val="21"/>
+          <w:szCs w:val="21"/>
+          <w:lang w:val="en-US" w:eastAsia="it-IT"/>
+          <w14:ligatures w14:val="none"/>
+        </w:rPr>
+        <w:t>=</w:t>
+      </w:r>
+      <w:r>
+        <w:rPr>
+          <w:rFonts w:ascii="Consolas" w:eastAsia="Times New Roman" w:hAnsi="Consolas" w:cs="Times New Roman"/>
+          <w:color w:val="BBBEBF"/>
+          <w:kern w:val="0"/>
+          <w:sz w:val="21"/>
+          <w:szCs w:val="21"/>
+          <w:lang w:val="en-US" w:eastAsia="it-IT"/>
+          <w14:ligatures w14:val="none"/>
+        </w:rPr>
+        <w:t xml:space="preserve"> </w:t>
+      </w:r>
+      <w:r>
+        <w:rPr>
+          <w:rFonts w:ascii="Consolas" w:eastAsia="Times New Roman" w:hAnsi="Consolas" w:cs="Times New Roman"/>
+          <w:color w:val="569CD6"/>
+          <w:kern w:val="0"/>
+          <w:sz w:val="21"/>
+          <w:szCs w:val="21"/>
+          <w:lang w:val="en-US" w:eastAsia="it-IT"/>
+          <w14:ligatures w14:val="none"/>
+        </w:rPr>
+        <w:t>None</w:t>
+      </w:r>
+    </w:p>
+    <w:p>
+      <w:pPr>
+        <w:shd w:val="clear" w:color="auto" w:fill="121314"/>
+        <w:spacing w:after="0" w:line="285" w:lineRule="atLeast"/>
+        <w:rPr>
+          <w:rFonts w:ascii="Consolas" w:eastAsia="Times New Roman" w:hAnsi="Consolas" w:cs="Times New Roman"/>
+          <w:color w:val="BBBEBF"/>
+          <w:kern w:val="0"/>
+          <w:sz w:val="21"/>
+          <w:szCs w:val="21"/>
+          <w:lang w:val="en-US" w:eastAsia="it-IT"/>
+          <w14:ligatures w14:val="none"/>
+        </w:rPr>
+      </w:pPr>
+      <w:r>
+        <w:rPr>
+          <w:rFonts w:ascii="Consolas" w:eastAsia="Times New Roman" w:hAnsi="Consolas" w:cs="Times New Roman"/>
+          <w:color w:val="BBBEBF"/>
+          <w:kern w:val="0"/>
+          <w:sz w:val="21"/>
+          <w:szCs w:val="21"/>
+          <w:lang w:val="en-US" w:eastAsia="it-IT"/>
+          <w14:ligatures w14:val="none"/>
+        </w:rPr>
+        <w:t xml:space="preserve">                    </w:t>
+      </w:r>
+      <w:r>
+        <w:rPr>
+          <w:rFonts w:ascii="Consolas" w:eastAsia="Times New Roman" w:hAnsi="Consolas" w:cs="Times New Roman"/>
+          <w:color w:val="FFA657"/>
+          <w:kern w:val="0"/>
+          <w:sz w:val="21"/>
+          <w:szCs w:val="21"/>
+          <w:lang w:val="en-US" w:eastAsia="it-IT"/>
+          <w14:ligatures w14:val="none"/>
+        </w:rPr>
+        <w:t>k</w:t>
+      </w:r>
+      <w:r>
+        <w:rPr>
+          <w:rFonts w:ascii="Consolas" w:eastAsia="Times New Roman" w:hAnsi="Consolas" w:cs="Times New Roman"/>
+          <w:color w:val="BBBEBF"/>
+          <w:kern w:val="0"/>
+          <w:sz w:val="21"/>
+          <w:szCs w:val="21"/>
+          <w:lang w:val="en-US" w:eastAsia="it-IT"/>
+          <w14:ligatures w14:val="none"/>
+        </w:rPr>
+        <w:t xml:space="preserve"> </w:t>
+      </w:r>
+      <w:r>
+        <w:rPr>
+          <w:rFonts w:ascii="Consolas" w:eastAsia="Times New Roman" w:hAnsi="Consolas" w:cs="Times New Roman"/>
+          <w:color w:val="D4D4D4"/>
+          <w:kern w:val="0"/>
+          <w:sz w:val="21"/>
+          <w:szCs w:val="21"/>
+          <w:lang w:val="en-US" w:eastAsia="it-IT"/>
+          <w14:ligatures w14:val="none"/>
+        </w:rPr>
+        <w:t>-=</w:t>
+      </w:r>
+      <w:r>
+        <w:rPr>
+          <w:rFonts w:ascii="Consolas" w:eastAsia="Times New Roman" w:hAnsi="Consolas" w:cs="Times New Roman"/>
+          <w:color w:val="BBBEBF"/>
+          <w:kern w:val="0"/>
+          <w:sz w:val="21"/>
+          <w:szCs w:val="21"/>
+          <w:lang w:val="en-US" w:eastAsia="it-IT"/>
+          <w14:ligatures w14:val="none"/>
+        </w:rPr>
+        <w:t xml:space="preserve"> </w:t>
+      </w:r>
+      <w:r>
+        <w:rPr>
+          <w:rFonts w:ascii="Consolas" w:eastAsia="Times New Roman" w:hAnsi="Consolas" w:cs="Times New Roman"/>
+          <w:color w:val="B5CEA8"/>
+          <w:kern w:val="0"/>
+          <w:sz w:val="21"/>
+          <w:szCs w:val="21"/>
+          <w:lang w:val="en-US" w:eastAsia="it-IT"/>
+          <w14:ligatures w14:val="none"/>
+        </w:rPr>
+        <w:t>1</w:t>
+      </w:r>
+    </w:p>
+    <w:p>
+      <w:pPr>
+        <w:shd w:val="clear" w:color="auto" w:fill="121314"/>
+        <w:spacing w:after="0" w:line="285" w:lineRule="atLeast"/>
+        <w:rPr>
+          <w:rFonts w:ascii="Consolas" w:eastAsia="Times New Roman" w:hAnsi="Consolas" w:cs="Times New Roman"/>
+          <w:color w:val="BBBEBF"/>
+          <w:kern w:val="0"/>
+          <w:sz w:val="21"/>
+          <w:szCs w:val="21"/>
+          <w:lang w:val="en-US" w:eastAsia="it-IT"/>
+          <w14:ligatures w14:val="none"/>
+        </w:rPr>
+      </w:pPr>
+      <w:r>
+        <w:rPr>
+          <w:rFonts w:ascii="Consolas" w:eastAsia="Times New Roman" w:hAnsi="Consolas" w:cs="Times New Roman"/>
+          <w:color w:val="BBBEBF"/>
+          <w:kern w:val="0"/>
+          <w:sz w:val="21"/>
+          <w:szCs w:val="21"/>
+          <w:lang w:val="en-US" w:eastAsia="it-IT"/>
+          <w14:ligatures w14:val="none"/>
+        </w:rPr>
+        <w:t xml:space="preserve">                    </w:t>
+      </w:r>
+      <w:r>
+        <w:rPr>
+          <w:rFonts w:ascii="Consolas" w:eastAsia="Times New Roman" w:hAnsi="Consolas" w:cs="Times New Roman"/>
+          <w:color w:val="C586C0"/>
+          <w:kern w:val="0"/>
+          <w:sz w:val="21"/>
+          <w:szCs w:val="21"/>
+          <w:lang w:val="en-US" w:eastAsia="it-IT"/>
+          <w14:ligatures w14:val="none"/>
+        </w:rPr>
+        <w:t>if</w:t>
+      </w:r>
+      <w:r>
+        <w:rPr>
+          <w:rFonts w:ascii="Consolas" w:eastAsia="Times New Roman" w:hAnsi="Consolas" w:cs="Times New Roman"/>
+          <w:color w:val="BBBEBF"/>
+          <w:kern w:val="0"/>
+          <w:sz w:val="21"/>
+          <w:szCs w:val="21"/>
+          <w:lang w:val="en-US" w:eastAsia="it-IT"/>
+          <w14:ligatures w14:val="none"/>
+        </w:rPr>
+        <w:t xml:space="preserve"> </w:t>
+      </w:r>
+      <w:r>
+        <w:rPr>
+          <w:rFonts w:ascii="Consolas" w:eastAsia="Times New Roman" w:hAnsi="Consolas" w:cs="Times New Roman"/>
+          <w:color w:val="FFA657"/>
+          <w:kern w:val="0"/>
+          <w:sz w:val="21"/>
+          <w:szCs w:val="21"/>
+          <w:lang w:val="en-US" w:eastAsia="it-IT"/>
+          <w14:ligatures w14:val="none"/>
+        </w:rPr>
+        <w:t>k</w:t>
+      </w:r>
+      <w:r>
+        <w:rPr>
+          <w:rFonts w:ascii="Consolas" w:eastAsia="Times New Roman" w:hAnsi="Consolas" w:cs="Times New Roman"/>
+          <w:color w:val="BBBEBF"/>
+          <w:kern w:val="0"/>
+          <w:sz w:val="21"/>
+          <w:szCs w:val="21"/>
+          <w:lang w:val="en-US" w:eastAsia="it-IT"/>
+          <w14:ligatures w14:val="none"/>
+        </w:rPr>
+        <w:t xml:space="preserve"> </w:t>
+      </w:r>
+      <w:r>
+        <w:rPr>
+          <w:rFonts w:ascii="Consolas" w:eastAsia="Times New Roman" w:hAnsi="Consolas" w:cs="Times New Roman"/>
+          <w:color w:val="D4D4D4"/>
+          <w:kern w:val="0"/>
+          <w:sz w:val="21"/>
+          <w:szCs w:val="21"/>
+          <w:lang w:val="en-US" w:eastAsia="it-IT"/>
+          <w14:ligatures w14:val="none"/>
+        </w:rPr>
+        <w:t>==</w:t>
+      </w:r>
+      <w:r>
+        <w:rPr>
+          <w:rFonts w:ascii="Consolas" w:eastAsia="Times New Roman" w:hAnsi="Consolas" w:cs="Times New Roman"/>
+          <w:color w:val="BBBEBF"/>
+          <w:kern w:val="0"/>
+          <w:sz w:val="21"/>
+          <w:szCs w:val="21"/>
+          <w:lang w:val="en-US" w:eastAsia="it-IT"/>
+          <w14:ligatures w14:val="none"/>
+        </w:rPr>
+        <w:t xml:space="preserve"> </w:t>
+      </w:r>
+      <w:r>
+        <w:rPr>
+          <w:rFonts w:ascii="Consolas" w:eastAsia="Times New Roman" w:hAnsi="Consolas" w:cs="Times New Roman"/>
+          <w:color w:val="B5CEA8"/>
+          <w:kern w:val="0"/>
+          <w:sz w:val="21"/>
+          <w:szCs w:val="21"/>
+          <w:lang w:val="en-US" w:eastAsia="it-IT"/>
+          <w14:ligatures w14:val="none"/>
+        </w:rPr>
+        <w:t>0</w:t>
+      </w:r>
+      <w:r>
+        <w:rPr>
+          <w:rFonts w:ascii="Consolas" w:eastAsia="Times New Roman" w:hAnsi="Consolas" w:cs="Times New Roman"/>
+          <w:color w:val="BBBEBF"/>
+          <w:kern w:val="0"/>
+          <w:sz w:val="21"/>
+          <w:szCs w:val="21"/>
+          <w:lang w:val="en-US" w:eastAsia="it-IT"/>
+          <w14:ligatures w14:val="none"/>
+        </w:rPr>
+        <w:t>:</w:t>
+      </w:r>
+    </w:p>
+    <w:p>
+      <w:pPr>
+        <w:shd w:val="clear" w:color="auto" w:fill="121314"/>
+        <w:spacing w:after="0" w:line="285" w:lineRule="atLeast"/>
+        <w:rPr>
+          <w:rFonts w:ascii="Consolas" w:eastAsia="Times New Roman" w:hAnsi="Consolas" w:cs="Times New Roman"/>
+          <w:color w:val="BBBEBF"/>
+          <w:kern w:val="0"/>
+          <w:sz w:val="21"/>
+          <w:szCs w:val="21"/>
+          <w:lang w:val="en-US" w:eastAsia="it-IT"/>
+          <w14:ligatures w14:val="none"/>
+        </w:rPr>
+      </w:pPr>
+      <w:r>
+        <w:rPr>
+          <w:rFonts w:ascii="Consolas" w:eastAsia="Times New Roman" w:hAnsi="Consolas" w:cs="Times New Roman"/>
+          <w:color w:val="BBBEBF"/>
+          <w:kern w:val="0"/>
+          <w:sz w:val="21"/>
+          <w:szCs w:val="21"/>
+          <w:lang w:val="en-US" w:eastAsia="it-IT"/>
+          <w14:ligatures w14:val="none"/>
+        </w:rPr>
+        <w:t xml:space="preserve">                        </w:t>
+      </w:r>
+      <w:r>
+        <w:rPr>
+          <w:rFonts w:ascii="Consolas" w:eastAsia="Times New Roman" w:hAnsi="Consolas" w:cs="Times New Roman"/>
+          <w:color w:val="C586C0"/>
+          <w:kern w:val="0"/>
+          <w:sz w:val="21"/>
+          <w:szCs w:val="21"/>
+          <w:lang w:val="en-US" w:eastAsia="it-IT"/>
+          <w14:ligatures w14:val="none"/>
+        </w:rPr>
+        <w:t>return</w:t>
+      </w:r>
+      <w:r>
+        <w:rPr>
+          <w:rFonts w:ascii="Consolas" w:eastAsia="Times New Roman" w:hAnsi="Consolas" w:cs="Times New Roman"/>
+          <w:color w:val="BBBEBF"/>
+          <w:kern w:val="0"/>
+          <w:sz w:val="21"/>
+          <w:szCs w:val="21"/>
+          <w:lang w:val="en-US" w:eastAsia="it-IT"/>
+          <w14:ligatures w14:val="none"/>
+        </w:rPr>
+        <w:t xml:space="preserve"> </w:t>
+      </w:r>
+      <w:r>
+        <w:rPr>
+          <w:rFonts w:ascii="Consolas" w:eastAsia="Times New Roman" w:hAnsi="Consolas" w:cs="Times New Roman"/>
+          <w:color w:val="C9D1D9"/>
+          <w:kern w:val="0"/>
+          <w:sz w:val="21"/>
+          <w:szCs w:val="21"/>
+          <w:lang w:val="en-US" w:eastAsia="it-IT"/>
+          <w14:ligatures w14:val="none"/>
+        </w:rPr>
+        <w:t>curr</w:t>
+      </w:r>
+      <w:r>
+        <w:rPr>
+          <w:rFonts w:ascii="Consolas" w:eastAsia="Times New Roman" w:hAnsi="Consolas" w:cs="Times New Roman"/>
+          <w:color w:val="BBBEBF"/>
+          <w:kern w:val="0"/>
+          <w:sz w:val="21"/>
+          <w:szCs w:val="21"/>
+          <w:lang w:val="en-US" w:eastAsia="it-IT"/>
+          <w14:ligatures w14:val="none"/>
+        </w:rPr>
+        <w:t>.val</w:t>
+      </w:r>
+    </w:p>
+    <w:p>
+      <w:pPr>
+        <w:shd w:val="clear" w:color="auto" w:fill="121314"/>
+        <w:spacing w:after="0" w:line="285" w:lineRule="atLeast"/>
+        <w:rPr>
+          <w:rFonts w:ascii="Consolas" w:eastAsia="Times New Roman" w:hAnsi="Consolas" w:cs="Times New Roman"/>
+          <w:color w:val="BBBEBF"/>
+          <w:kern w:val="0"/>
+          <w:sz w:val="21"/>
+          <w:szCs w:val="21"/>
+          <w:lang w:val="en-US" w:eastAsia="it-IT"/>
+          <w14:ligatures w14:val="none"/>
+        </w:rPr>
+      </w:pPr>
+      <w:r>
+        <w:rPr>
+          <w:rFonts w:ascii="Consolas" w:eastAsia="Times New Roman" w:hAnsi="Consolas" w:cs="Times New Roman"/>
+          <w:color w:val="BBBEBF"/>
+          <w:kern w:val="0"/>
+          <w:sz w:val="21"/>
+          <w:szCs w:val="21"/>
+          <w:lang w:val="en-US" w:eastAsia="it-IT"/>
+          <w14:ligatures w14:val="none"/>
+        </w:rPr>
+        <w:t xml:space="preserve">                    </w:t>
+      </w:r>
+      <w:r>
+        <w:rPr>
+          <w:rFonts w:ascii="Consolas" w:eastAsia="Times New Roman" w:hAnsi="Consolas" w:cs="Times New Roman"/>
+          <w:color w:val="C9D1D9"/>
+          <w:kern w:val="0"/>
+          <w:sz w:val="21"/>
+          <w:szCs w:val="21"/>
+          <w:lang w:val="en-US" w:eastAsia="it-IT"/>
+          <w14:ligatures w14:val="none"/>
+        </w:rPr>
+        <w:t>curr</w:t>
+      </w:r>
+      <w:r>
+        <w:rPr>
+          <w:rFonts w:ascii="Consolas" w:eastAsia="Times New Roman" w:hAnsi="Consolas" w:cs="Times New Roman"/>
+          <w:color w:val="BBBEBF"/>
+          <w:kern w:val="0"/>
+          <w:sz w:val="21"/>
+          <w:szCs w:val="21"/>
+          <w:lang w:val="en-US" w:eastAsia="it-IT"/>
+          <w14:ligatures w14:val="none"/>
+        </w:rPr>
+        <w:t xml:space="preserve"> </w:t>
+      </w:r>
+      <w:r>
+        <w:rPr>
+          <w:rFonts w:ascii="Consolas" w:eastAsia="Times New Roman" w:hAnsi="Consolas" w:cs="Times New Roman"/>
+          <w:color w:val="D4D4D4"/>
+          <w:kern w:val="0"/>
+          <w:sz w:val="21"/>
+          <w:szCs w:val="21"/>
+          <w:lang w:val="en-US" w:eastAsia="it-IT"/>
+          <w14:ligatures w14:val="none"/>
+        </w:rPr>
+        <w:t>=</w:t>
+      </w:r>
+      <w:r>
+        <w:rPr>
+          <w:rFonts w:ascii="Consolas" w:eastAsia="Times New Roman" w:hAnsi="Consolas" w:cs="Times New Roman"/>
+          <w:color w:val="BBBEBF"/>
+          <w:kern w:val="0"/>
+          <w:sz w:val="21"/>
+          <w:szCs w:val="21"/>
+          <w:lang w:val="en-US" w:eastAsia="it-IT"/>
+          <w14:ligatures w14:val="none"/>
+        </w:rPr>
+        <w:t xml:space="preserve"> </w:t>
+      </w:r>
+      <w:r>
+        <w:rPr>
+          <w:rFonts w:ascii="Consolas" w:eastAsia="Times New Roman" w:hAnsi="Consolas" w:cs="Times New Roman"/>
+          <w:color w:val="C9D1D9"/>
+          <w:kern w:val="0"/>
+          <w:sz w:val="21"/>
+          <w:szCs w:val="21"/>
+          <w:lang w:val="en-US" w:eastAsia="it-IT"/>
+          <w14:ligatures w14:val="none"/>
+        </w:rPr>
+        <w:t>curr</w:t>
+      </w:r>
+      <w:r>
+        <w:rPr>
+          <w:rFonts w:ascii="Consolas" w:eastAsia="Times New Roman" w:hAnsi="Consolas" w:cs="Times New Roman"/>
+          <w:color w:val="BBBEBF"/>
+          <w:kern w:val="0"/>
+          <w:sz w:val="21"/>
+          <w:szCs w:val="21"/>
+          <w:lang w:val="en-US" w:eastAsia="it-IT"/>
+          <w14:ligatures w14:val="none"/>
+        </w:rPr>
+        <w:t>.right</w:t>
+      </w:r>
+    </w:p>
+    <w:p>
+      <w:pPr>
+        <w:shd w:val="clear" w:color="auto" w:fill="121314"/>
+        <w:spacing w:after="0" w:line="285" w:lineRule="atLeast"/>
+        <w:rPr>
+          <w:rFonts w:ascii="Consolas" w:eastAsia="Times New Roman" w:hAnsi="Consolas" w:cs="Times New Roman"/>
+          <w:color w:val="BBBEBF"/>
+          <w:kern w:val="0"/>
+          <w:sz w:val="21"/>
+          <w:szCs w:val="21"/>
+          <w:lang w:val="en-US" w:eastAsia="it-IT"/>
+          <w14:ligatures w14:val="none"/>
+        </w:rPr>
+      </w:pPr>
+    </w:p>
+    <w:p>
+      <w:pPr>
+        <w:shd w:val="clear" w:color="auto" w:fill="121314"/>
+        <w:spacing w:after="0" w:line="285" w:lineRule="atLeast"/>
+        <w:rPr>
+          <w:rFonts w:ascii="Consolas" w:eastAsia="Times New Roman" w:hAnsi="Consolas" w:cs="Times New Roman"/>
+          <w:color w:val="BBBEBF"/>
+          <w:kern w:val="0"/>
+          <w:sz w:val="21"/>
+          <w:szCs w:val="21"/>
+          <w:lang w:eastAsia="it-IT"/>
+          <w14:ligatures w14:val="none"/>
+        </w:rPr>
+      </w:pPr>
+      <w:r>
+        <w:rPr>
+          <w:rFonts w:ascii="Consolas" w:eastAsia="Times New Roman" w:hAnsi="Consolas" w:cs="Times New Roman"/>
+          <w:color w:val="BBBEBF"/>
+          <w:kern w:val="0"/>
+          <w:sz w:val="21"/>
+          <w:szCs w:val="21"/>
+          <w:lang w:val="en-US" w:eastAsia="it-IT"/>
+          <w14:ligatures w14:val="none"/>
+        </w:rPr>
+        <w:lastRenderedPageBreak/>
         <w:t xml:space="preserve">        </w:t>
       </w:r>
+      <w:proofErr w:type="spellStart"/>
       <w:r>
         <w:rPr>
           <w:rFonts w:ascii="Consolas" w:eastAsia="Times New Roman" w:hAnsi="Consolas" w:cs="Times New Roman"/>
@@ -6130,6 +8779,7 @@
         </w:rPr>
         <w:t>return</w:t>
       </w:r>
+      <w:proofErr w:type="spellEnd"/>
       <w:r>
         <w:rPr>
           <w:rFonts w:ascii="Consolas" w:eastAsia="Times New Roman" w:hAnsi="Consolas" w:cs="Times New Roman"/>
@@ -6145,15 +8795,43 @@
       <w:r>
         <w:rPr>
           <w:rFonts w:ascii="Consolas" w:eastAsia="Times New Roman" w:hAnsi="Consolas" w:cs="Times New Roman"/>
-          <w:color w:val="569CD6"/>
+          <w:color w:val="D4D4D4"/>
           <w:kern w:val="0"/>
           <w:sz w:val="21"/>
           <w:szCs w:val="21"/>
           <w:lang w:eastAsia="it-IT"/>
           <w14:ligatures w14:val="none"/>
         </w:rPr>
-        <w:t>False</w:t>
-      </w:r>
+        <w:t>-</w:t>
+      </w:r>
+      <w:r>
+        <w:rPr>
+          <w:rFonts w:ascii="Consolas" w:eastAsia="Times New Roman" w:hAnsi="Consolas" w:cs="Times New Roman"/>
+          <w:color w:val="B5CEA8"/>
+          <w:kern w:val="0"/>
+          <w:sz w:val="21"/>
+          <w:szCs w:val="21"/>
+          <w:lang w:eastAsia="it-IT"/>
+          <w14:ligatures w14:val="none"/>
+        </w:rPr>
+        <w:t>1</w:t>
+      </w:r>
+    </w:p>
+    <w:p>
+      <w:pPr>
+        <w:shd w:val="clear" w:color="auto" w:fill="202020"/>
+        <w:spacing w:after="0" w:line="330" w:lineRule="atLeast"/>
+        <w:ind w:firstLine="708"/>
+        <w:rPr>
+          <w:rFonts w:ascii="Consolas" w:eastAsia="Times New Roman" w:hAnsi="Consolas" w:cs="Times New Roman"/>
+          <w:color w:val="D4D4D4"/>
+          <w:kern w:val="0"/>
+          <w:sz w:val="24"/>
+          <w:szCs w:val="24"/>
+          <w:lang w:val="en-US" w:eastAsia="it-IT"/>
+          <w14:ligatures w14:val="none"/>
+        </w:rPr>
+      </w:pPr>
     </w:p>
     <w:p>
       <w:pPr>

</xml_diff>

<commit_message>
Add implementation for canFinish function using Kahn's algorithm for course scheduling
</commit_message>
<xml_diff>
--- a/docs/PATTERNS.docx
+++ b/docs/PATTERNS.docx
@@ -3379,7 +3379,7 @@
           <w:kern w:val="0"/>
           <w:sz w:val="21"/>
           <w:szCs w:val="21"/>
-          <w:lang w:val="en-US" w:eastAsia="it-IT"/>
+          <w:lang w:eastAsia="it-IT"/>
           <w14:ligatures w14:val="none"/>
         </w:rPr>
       </w:pPr>
@@ -3402,7 +3402,7 @@
           <w:kern w:val="0"/>
           <w:sz w:val="21"/>
           <w:szCs w:val="21"/>
-          <w:lang w:val="en-US" w:eastAsia="it-IT"/>
+          <w:lang w:eastAsia="it-IT"/>
           <w14:ligatures w14:val="none"/>
         </w:rPr>
         <w:t>z</w:t>
@@ -3414,12 +3414,11 @@
           <w:kern w:val="0"/>
           <w:sz w:val="21"/>
           <w:szCs w:val="21"/>
-          <w:lang w:val="en-US" w:eastAsia="it-IT"/>
+          <w:lang w:eastAsia="it-IT"/>
           <w14:ligatures w14:val="none"/>
         </w:rPr>
         <w:t>[</w:t>
       </w:r>
-      <w:proofErr w:type="spellStart"/>
       <w:r>
         <w:rPr>
           <w:rFonts w:ascii="Consolas" w:eastAsia="Times New Roman" w:hAnsi="Consolas" w:cs="Times New Roman"/>
@@ -3427,20 +3426,19 @@
           <w:kern w:val="0"/>
           <w:sz w:val="21"/>
           <w:szCs w:val="21"/>
-          <w:lang w:val="en-US" w:eastAsia="it-IT"/>
+          <w:lang w:eastAsia="it-IT"/>
           <w14:ligatures w14:val="none"/>
         </w:rPr>
         <w:t>i</w:t>
       </w:r>
-      <w:proofErr w:type="spellEnd"/>
-      <w:r>
-        <w:rPr>
-          <w:rFonts w:ascii="Consolas" w:eastAsia="Times New Roman" w:hAnsi="Consolas" w:cs="Times New Roman"/>
-          <w:color w:val="BBBEBF"/>
-          <w:kern w:val="0"/>
-          <w:sz w:val="21"/>
-          <w:szCs w:val="21"/>
-          <w:lang w:val="en-US" w:eastAsia="it-IT"/>
+      <w:r>
+        <w:rPr>
+          <w:rFonts w:ascii="Consolas" w:eastAsia="Times New Roman" w:hAnsi="Consolas" w:cs="Times New Roman"/>
+          <w:color w:val="BBBEBF"/>
+          <w:kern w:val="0"/>
+          <w:sz w:val="21"/>
+          <w:szCs w:val="21"/>
+          <w:lang w:eastAsia="it-IT"/>
           <w14:ligatures w14:val="none"/>
         </w:rPr>
         <w:t xml:space="preserve">] </w:t>
@@ -3452,7 +3450,7 @@
           <w:kern w:val="0"/>
           <w:sz w:val="21"/>
           <w:szCs w:val="21"/>
-          <w:lang w:val="en-US" w:eastAsia="it-IT"/>
+          <w:lang w:eastAsia="it-IT"/>
           <w14:ligatures w14:val="none"/>
         </w:rPr>
         <w:t>=</w:t>
@@ -3464,7 +3462,7 @@
           <w:kern w:val="0"/>
           <w:sz w:val="21"/>
           <w:szCs w:val="21"/>
-          <w:lang w:val="en-US" w:eastAsia="it-IT"/>
+          <w:lang w:eastAsia="it-IT"/>
           <w14:ligatures w14:val="none"/>
         </w:rPr>
         <w:t xml:space="preserve"> </w:t>
@@ -3477,7 +3475,7 @@
           <w:kern w:val="0"/>
           <w:sz w:val="21"/>
           <w:szCs w:val="21"/>
-          <w:lang w:val="en-US" w:eastAsia="it-IT"/>
+          <w:lang w:eastAsia="it-IT"/>
           <w14:ligatures w14:val="none"/>
         </w:rPr>
         <w:t>min</w:t>
@@ -3489,7 +3487,7 @@
           <w:kern w:val="0"/>
           <w:sz w:val="21"/>
           <w:szCs w:val="21"/>
-          <w:lang w:val="en-US" w:eastAsia="it-IT"/>
+          <w:lang w:eastAsia="it-IT"/>
           <w14:ligatures w14:val="none"/>
         </w:rPr>
         <w:t>(</w:t>
@@ -3502,7 +3500,7 @@
           <w:kern w:val="0"/>
           <w:sz w:val="21"/>
           <w:szCs w:val="21"/>
-          <w:lang w:val="en-US" w:eastAsia="it-IT"/>
+          <w:lang w:eastAsia="it-IT"/>
           <w14:ligatures w14:val="none"/>
         </w:rPr>
         <w:t>r</w:t>
@@ -3514,7 +3512,7 @@
           <w:kern w:val="0"/>
           <w:sz w:val="21"/>
           <w:szCs w:val="21"/>
-          <w:lang w:val="en-US" w:eastAsia="it-IT"/>
+          <w:lang w:eastAsia="it-IT"/>
           <w14:ligatures w14:val="none"/>
         </w:rPr>
         <w:t xml:space="preserve"> </w:t>
@@ -3526,7 +3524,7 @@
           <w:kern w:val="0"/>
           <w:sz w:val="21"/>
           <w:szCs w:val="21"/>
-          <w:lang w:val="en-US" w:eastAsia="it-IT"/>
+          <w:lang w:eastAsia="it-IT"/>
           <w14:ligatures w14:val="none"/>
         </w:rPr>
         <w:t>-</w:t>
@@ -3538,12 +3536,11 @@
           <w:kern w:val="0"/>
           <w:sz w:val="21"/>
           <w:szCs w:val="21"/>
-          <w:lang w:val="en-US" w:eastAsia="it-IT"/>
-          <w14:ligatures w14:val="none"/>
-        </w:rPr>
-        <w:t xml:space="preserve"> </w:t>
-      </w:r>
-      <w:proofErr w:type="spellStart"/>
+          <w:lang w:eastAsia="it-IT"/>
+          <w14:ligatures w14:val="none"/>
+        </w:rPr>
+        <w:t xml:space="preserve"> </w:t>
+      </w:r>
       <w:r>
         <w:rPr>
           <w:rFonts w:ascii="Consolas" w:eastAsia="Times New Roman" w:hAnsi="Consolas" w:cs="Times New Roman"/>
@@ -3551,20 +3548,19 @@
           <w:kern w:val="0"/>
           <w:sz w:val="21"/>
           <w:szCs w:val="21"/>
-          <w:lang w:val="en-US" w:eastAsia="it-IT"/>
+          <w:lang w:eastAsia="it-IT"/>
           <w14:ligatures w14:val="none"/>
         </w:rPr>
         <w:t>i</w:t>
       </w:r>
-      <w:proofErr w:type="spellEnd"/>
-      <w:r>
-        <w:rPr>
-          <w:rFonts w:ascii="Consolas" w:eastAsia="Times New Roman" w:hAnsi="Consolas" w:cs="Times New Roman"/>
-          <w:color w:val="BBBEBF"/>
-          <w:kern w:val="0"/>
-          <w:sz w:val="21"/>
-          <w:szCs w:val="21"/>
-          <w:lang w:val="en-US" w:eastAsia="it-IT"/>
+      <w:r>
+        <w:rPr>
+          <w:rFonts w:ascii="Consolas" w:eastAsia="Times New Roman" w:hAnsi="Consolas" w:cs="Times New Roman"/>
+          <w:color w:val="BBBEBF"/>
+          <w:kern w:val="0"/>
+          <w:sz w:val="21"/>
+          <w:szCs w:val="21"/>
+          <w:lang w:eastAsia="it-IT"/>
           <w14:ligatures w14:val="none"/>
         </w:rPr>
         <w:t xml:space="preserve"> </w:t>
@@ -3576,7 +3572,7 @@
           <w:kern w:val="0"/>
           <w:sz w:val="21"/>
           <w:szCs w:val="21"/>
-          <w:lang w:val="en-US" w:eastAsia="it-IT"/>
+          <w:lang w:eastAsia="it-IT"/>
           <w14:ligatures w14:val="none"/>
         </w:rPr>
         <w:t>+</w:t>
@@ -3588,7 +3584,7 @@
           <w:kern w:val="0"/>
           <w:sz w:val="21"/>
           <w:szCs w:val="21"/>
-          <w:lang w:val="en-US" w:eastAsia="it-IT"/>
+          <w:lang w:eastAsia="it-IT"/>
           <w14:ligatures w14:val="none"/>
         </w:rPr>
         <w:t xml:space="preserve"> </w:t>
@@ -3600,7 +3596,7 @@
           <w:kern w:val="0"/>
           <w:sz w:val="21"/>
           <w:szCs w:val="21"/>
-          <w:lang w:val="en-US" w:eastAsia="it-IT"/>
+          <w:lang w:eastAsia="it-IT"/>
           <w14:ligatures w14:val="none"/>
         </w:rPr>
         <w:t>1</w:t>
@@ -3612,7 +3608,7 @@
           <w:kern w:val="0"/>
           <w:sz w:val="21"/>
           <w:szCs w:val="21"/>
-          <w:lang w:val="en-US" w:eastAsia="it-IT"/>
+          <w:lang w:eastAsia="it-IT"/>
           <w14:ligatures w14:val="none"/>
         </w:rPr>
         <w:t xml:space="preserve">, </w:t>
@@ -3625,7 +3621,7 @@
           <w:kern w:val="0"/>
           <w:sz w:val="21"/>
           <w:szCs w:val="21"/>
-          <w:lang w:val="en-US" w:eastAsia="it-IT"/>
+          <w:lang w:eastAsia="it-IT"/>
           <w14:ligatures w14:val="none"/>
         </w:rPr>
         <w:t>z</w:t>
@@ -3637,12 +3633,11 @@
           <w:kern w:val="0"/>
           <w:sz w:val="21"/>
           <w:szCs w:val="21"/>
-          <w:lang w:val="en-US" w:eastAsia="it-IT"/>
+          <w:lang w:eastAsia="it-IT"/>
           <w14:ligatures w14:val="none"/>
         </w:rPr>
         <w:t>[</w:t>
       </w:r>
-      <w:proofErr w:type="spellStart"/>
       <w:proofErr w:type="gramEnd"/>
       <w:r>
         <w:rPr>
@@ -3651,20 +3646,19 @@
           <w:kern w:val="0"/>
           <w:sz w:val="21"/>
           <w:szCs w:val="21"/>
-          <w:lang w:val="en-US" w:eastAsia="it-IT"/>
+          <w:lang w:eastAsia="it-IT"/>
           <w14:ligatures w14:val="none"/>
         </w:rPr>
         <w:t>i</w:t>
       </w:r>
-      <w:proofErr w:type="spellEnd"/>
-      <w:r>
-        <w:rPr>
-          <w:rFonts w:ascii="Consolas" w:eastAsia="Times New Roman" w:hAnsi="Consolas" w:cs="Times New Roman"/>
-          <w:color w:val="BBBEBF"/>
-          <w:kern w:val="0"/>
-          <w:sz w:val="21"/>
-          <w:szCs w:val="21"/>
-          <w:lang w:val="en-US" w:eastAsia="it-IT"/>
+      <w:r>
+        <w:rPr>
+          <w:rFonts w:ascii="Consolas" w:eastAsia="Times New Roman" w:hAnsi="Consolas" w:cs="Times New Roman"/>
+          <w:color w:val="BBBEBF"/>
+          <w:kern w:val="0"/>
+          <w:sz w:val="21"/>
+          <w:szCs w:val="21"/>
+          <w:lang w:eastAsia="it-IT"/>
           <w14:ligatures w14:val="none"/>
         </w:rPr>
         <w:t xml:space="preserve"> </w:t>
@@ -3676,7 +3670,7 @@
           <w:kern w:val="0"/>
           <w:sz w:val="21"/>
           <w:szCs w:val="21"/>
-          <w:lang w:val="en-US" w:eastAsia="it-IT"/>
+          <w:lang w:eastAsia="it-IT"/>
           <w14:ligatures w14:val="none"/>
         </w:rPr>
         <w:t>-</w:t>
@@ -3688,7 +3682,7 @@
           <w:kern w:val="0"/>
           <w:sz w:val="21"/>
           <w:szCs w:val="21"/>
-          <w:lang w:val="en-US" w:eastAsia="it-IT"/>
+          <w:lang w:eastAsia="it-IT"/>
           <w14:ligatures w14:val="none"/>
         </w:rPr>
         <w:t xml:space="preserve"> </w:t>
@@ -3700,7 +3694,7 @@
           <w:kern w:val="0"/>
           <w:sz w:val="21"/>
           <w:szCs w:val="21"/>
-          <w:lang w:val="en-US" w:eastAsia="it-IT"/>
+          <w:lang w:eastAsia="it-IT"/>
           <w14:ligatures w14:val="none"/>
         </w:rPr>
         <w:t>l</w:t>
@@ -3712,7 +3706,7 @@
           <w:kern w:val="0"/>
           <w:sz w:val="21"/>
           <w:szCs w:val="21"/>
-          <w:lang w:val="en-US" w:eastAsia="it-IT"/>
+          <w:lang w:eastAsia="it-IT"/>
           <w14:ligatures w14:val="none"/>
         </w:rPr>
         <w:t>])</w:t>
@@ -3728,18 +3722,18 @@
           <w:kern w:val="0"/>
           <w:sz w:val="21"/>
           <w:szCs w:val="21"/>
-          <w:lang w:val="en-US" w:eastAsia="it-IT"/>
-          <w14:ligatures w14:val="none"/>
-        </w:rPr>
-      </w:pPr>
-      <w:r>
-        <w:rPr>
-          <w:rFonts w:ascii="Consolas" w:eastAsia="Times New Roman" w:hAnsi="Consolas" w:cs="Times New Roman"/>
-          <w:color w:val="BBBEBF"/>
-          <w:kern w:val="0"/>
-          <w:sz w:val="21"/>
-          <w:szCs w:val="21"/>
-          <w:lang w:val="en-US" w:eastAsia="it-IT"/>
+          <w:lang w:eastAsia="it-IT"/>
+          <w14:ligatures w14:val="none"/>
+        </w:rPr>
+      </w:pPr>
+      <w:r>
+        <w:rPr>
+          <w:rFonts w:ascii="Consolas" w:eastAsia="Times New Roman" w:hAnsi="Consolas" w:cs="Times New Roman"/>
+          <w:color w:val="BBBEBF"/>
+          <w:kern w:val="0"/>
+          <w:sz w:val="21"/>
+          <w:szCs w:val="21"/>
+          <w:lang w:eastAsia="it-IT"/>
           <w14:ligatures w14:val="none"/>
         </w:rPr>
         <w:t xml:space="preserve">            </w:t>
@@ -3766,7 +3760,7 @@
           <w:kern w:val="0"/>
           <w:sz w:val="21"/>
           <w:szCs w:val="21"/>
-          <w:lang w:val="en-US" w:eastAsia="it-IT"/>
+          <w:lang w:eastAsia="it-IT"/>
           <w14:ligatures w14:val="none"/>
         </w:rPr>
         <w:t xml:space="preserve">            </w:t>
@@ -8428,7 +8422,7 @@
           <w:kern w:val="0"/>
           <w:sz w:val="21"/>
           <w:szCs w:val="21"/>
-          <w:lang w:val="en-US" w:eastAsia="it-IT"/>
+          <w:lang w:eastAsia="it-IT"/>
           <w14:ligatures w14:val="none"/>
         </w:rPr>
       </w:pPr>
@@ -8453,7 +8447,7 @@
           <w:kern w:val="0"/>
           <w:sz w:val="21"/>
           <w:szCs w:val="21"/>
-          <w:lang w:val="en-US" w:eastAsia="it-IT"/>
+          <w:lang w:eastAsia="it-IT"/>
           <w14:ligatures w14:val="none"/>
         </w:rPr>
         <w:t>pred</w:t>
@@ -8465,7 +8459,7 @@
           <w:kern w:val="0"/>
           <w:sz w:val="21"/>
           <w:szCs w:val="21"/>
-          <w:lang w:val="en-US" w:eastAsia="it-IT"/>
+          <w:lang w:eastAsia="it-IT"/>
           <w14:ligatures w14:val="none"/>
         </w:rPr>
         <w:t>.right</w:t>
@@ -8479,7 +8473,7 @@
           <w:kern w:val="0"/>
           <w:sz w:val="21"/>
           <w:szCs w:val="21"/>
-          <w:lang w:val="en-US" w:eastAsia="it-IT"/>
+          <w:lang w:eastAsia="it-IT"/>
           <w14:ligatures w14:val="none"/>
         </w:rPr>
         <w:t xml:space="preserve"> </w:t>
@@ -8491,7 +8485,7 @@
           <w:kern w:val="0"/>
           <w:sz w:val="21"/>
           <w:szCs w:val="21"/>
-          <w:lang w:val="en-US" w:eastAsia="it-IT"/>
+          <w:lang w:eastAsia="it-IT"/>
           <w14:ligatures w14:val="none"/>
         </w:rPr>
         <w:t>=</w:t>
@@ -8503,7 +8497,7 @@
           <w:kern w:val="0"/>
           <w:sz w:val="21"/>
           <w:szCs w:val="21"/>
-          <w:lang w:val="en-US" w:eastAsia="it-IT"/>
+          <w:lang w:eastAsia="it-IT"/>
           <w14:ligatures w14:val="none"/>
         </w:rPr>
         <w:t xml:space="preserve"> </w:t>
@@ -8516,7 +8510,7 @@
           <w:kern w:val="0"/>
           <w:sz w:val="21"/>
           <w:szCs w:val="21"/>
-          <w:lang w:val="en-US" w:eastAsia="it-IT"/>
+          <w:lang w:eastAsia="it-IT"/>
           <w14:ligatures w14:val="none"/>
         </w:rPr>
         <w:t>curr</w:t>
@@ -8533,18 +8527,18 @@
           <w:kern w:val="0"/>
           <w:sz w:val="21"/>
           <w:szCs w:val="21"/>
-          <w:lang w:val="en-US" w:eastAsia="it-IT"/>
-          <w14:ligatures w14:val="none"/>
-        </w:rPr>
-      </w:pPr>
-      <w:r>
-        <w:rPr>
-          <w:rFonts w:ascii="Consolas" w:eastAsia="Times New Roman" w:hAnsi="Consolas" w:cs="Times New Roman"/>
-          <w:color w:val="BBBEBF"/>
-          <w:kern w:val="0"/>
-          <w:sz w:val="21"/>
-          <w:szCs w:val="21"/>
-          <w:lang w:val="en-US" w:eastAsia="it-IT"/>
+          <w:lang w:eastAsia="it-IT"/>
+          <w14:ligatures w14:val="none"/>
+        </w:rPr>
+      </w:pPr>
+      <w:r>
+        <w:rPr>
+          <w:rFonts w:ascii="Consolas" w:eastAsia="Times New Roman" w:hAnsi="Consolas" w:cs="Times New Roman"/>
+          <w:color w:val="BBBEBF"/>
+          <w:kern w:val="0"/>
+          <w:sz w:val="21"/>
+          <w:szCs w:val="21"/>
+          <w:lang w:eastAsia="it-IT"/>
           <w14:ligatures w14:val="none"/>
         </w:rPr>
         <w:lastRenderedPageBreak/>
@@ -8558,7 +8552,7 @@
           <w:kern w:val="0"/>
           <w:sz w:val="21"/>
           <w:szCs w:val="21"/>
-          <w:lang w:val="en-US" w:eastAsia="it-IT"/>
+          <w:lang w:eastAsia="it-IT"/>
           <w14:ligatures w14:val="none"/>
         </w:rPr>
         <w:t>curr</w:t>
@@ -8571,7 +8565,7 @@
           <w:kern w:val="0"/>
           <w:sz w:val="21"/>
           <w:szCs w:val="21"/>
-          <w:lang w:val="en-US" w:eastAsia="it-IT"/>
+          <w:lang w:eastAsia="it-IT"/>
           <w14:ligatures w14:val="none"/>
         </w:rPr>
         <w:t xml:space="preserve"> </w:t>
@@ -8583,7 +8577,7 @@
           <w:kern w:val="0"/>
           <w:sz w:val="21"/>
           <w:szCs w:val="21"/>
-          <w:lang w:val="en-US" w:eastAsia="it-IT"/>
+          <w:lang w:eastAsia="it-IT"/>
           <w14:ligatures w14:val="none"/>
         </w:rPr>
         <w:t>=</w:t>
@@ -8595,13 +8589,12 @@
           <w:kern w:val="0"/>
           <w:sz w:val="21"/>
           <w:szCs w:val="21"/>
-          <w:lang w:val="en-US" w:eastAsia="it-IT"/>
+          <w:lang w:eastAsia="it-IT"/>
           <w14:ligatures w14:val="none"/>
         </w:rPr>
         <w:t xml:space="preserve"> </w:t>
       </w:r>
       <w:proofErr w:type="spellStart"/>
-      <w:proofErr w:type="gramStart"/>
       <w:r>
         <w:rPr>
           <w:rFonts w:ascii="Consolas" w:eastAsia="Times New Roman" w:hAnsi="Consolas" w:cs="Times New Roman"/>
@@ -8609,7 +8602,7 @@
           <w:kern w:val="0"/>
           <w:sz w:val="21"/>
           <w:szCs w:val="21"/>
-          <w:lang w:val="en-US" w:eastAsia="it-IT"/>
+          <w:lang w:eastAsia="it-IT"/>
           <w14:ligatures w14:val="none"/>
         </w:rPr>
         <w:t>curr</w:t>
@@ -8621,13 +8614,12 @@
           <w:kern w:val="0"/>
           <w:sz w:val="21"/>
           <w:szCs w:val="21"/>
-          <w:lang w:val="en-US" w:eastAsia="it-IT"/>
+          <w:lang w:eastAsia="it-IT"/>
           <w14:ligatures w14:val="none"/>
         </w:rPr>
         <w:t>.left</w:t>
       </w:r>
       <w:proofErr w:type="spellEnd"/>
-      <w:proofErr w:type="gramEnd"/>
     </w:p>
     <w:p>
       <w:pPr>
@@ -8650,7 +8642,7 @@
           <w:kern w:val="0"/>
           <w:sz w:val="21"/>
           <w:szCs w:val="21"/>
-          <w:lang w:val="en-US" w:eastAsia="it-IT"/>
+          <w:lang w:eastAsia="it-IT"/>
           <w14:ligatures w14:val="none"/>
         </w:rPr>
         <w:t xml:space="preserve">                </w:t>
@@ -9627,7 +9619,6 @@
           <w:color w:val="4EA72E" w:themeColor="accent6"/>
           <w:sz w:val="40"/>
           <w:szCs w:val="40"/>
-          <w:lang w:val="en-US"/>
         </w:rPr>
       </w:pPr>
       <w:r>
@@ -9637,11 +9628,426 @@
           <w:color w:val="4EA72E" w:themeColor="accent6"/>
           <w:sz w:val="40"/>
           <w:szCs w:val="40"/>
-          <w:lang w:val="en-US"/>
-        </w:rPr>
-        <w:t>TRIES</w:t>
-      </w:r>
-      <w:r>
+        </w:rPr>
+        <w:t>TRIES:</w:t>
+      </w:r>
+    </w:p>
+    <w:p>
+      <w:r>
+        <w:t xml:space="preserve">Un </w:t>
+      </w:r>
+      <w:r>
+        <w:rPr>
+          <w:b/>
+          <w:bCs/>
+          <w:highlight w:val="yellow"/>
+        </w:rPr>
+        <w:t>TRIE</w:t>
+      </w:r>
+      <w:r>
+        <w:t xml:space="preserve"> e una struttura dati utile a memorizzare i </w:t>
+      </w:r>
+      <w:r>
+        <w:rPr>
+          <w:b/>
+          <w:bCs/>
+        </w:rPr>
+        <w:t>CARATTERI</w:t>
+      </w:r>
+      <w:r>
+        <w:t xml:space="preserve"> delle varie parole </w:t>
+      </w:r>
+      <w:r>
+        <w:rPr>
+          <w:b/>
+          <w:bCs/>
+        </w:rPr>
+        <w:t>INSERTED</w:t>
+      </w:r>
+      <w:r>
+        <w:t xml:space="preserve"> e </w:t>
+      </w:r>
+      <w:r>
+        <w:rPr>
+          <w:b/>
+          <w:bCs/>
+        </w:rPr>
+        <w:t>RICERCARLE</w:t>
+      </w:r>
+      <w:r>
+        <w:t xml:space="preserve"> dopo con complessità </w:t>
+      </w:r>
+      <w:r>
+        <w:rPr>
+          <w:b/>
+          <w:bCs/>
+        </w:rPr>
+        <w:t xml:space="preserve">O(N) time </w:t>
+      </w:r>
+      <w:r>
+        <w:t xml:space="preserve">(N = </w:t>
+      </w:r>
+      <w:proofErr w:type="spellStart"/>
+      <w:r>
+        <w:t>length</w:t>
+      </w:r>
+      <w:proofErr w:type="spellEnd"/>
+      <w:r>
+        <w:t xml:space="preserve"> of </w:t>
+      </w:r>
+      <w:proofErr w:type="spellStart"/>
+      <w:r>
+        <w:t>string</w:t>
+      </w:r>
+      <w:proofErr w:type="spellEnd"/>
+      <w:r>
+        <w:t xml:space="preserve">) e </w:t>
+      </w:r>
+      <w:r>
+        <w:rPr>
+          <w:b/>
+          <w:bCs/>
+        </w:rPr>
+        <w:t xml:space="preserve">O(T) </w:t>
+      </w:r>
+      <w:proofErr w:type="spellStart"/>
+      <w:r>
+        <w:rPr>
+          <w:b/>
+          <w:bCs/>
+        </w:rPr>
+        <w:t>space</w:t>
+      </w:r>
+      <w:proofErr w:type="spellEnd"/>
+      <w:r>
+        <w:t xml:space="preserve"> (T = </w:t>
+      </w:r>
+      <w:proofErr w:type="spellStart"/>
+      <w:r>
+        <w:t>number</w:t>
+      </w:r>
+      <w:proofErr w:type="spellEnd"/>
+      <w:r>
+        <w:t xml:space="preserve"> of </w:t>
+      </w:r>
+      <w:proofErr w:type="spellStart"/>
+      <w:r>
+        <w:t>different</w:t>
+      </w:r>
+      <w:proofErr w:type="spellEnd"/>
+      <w:r>
+        <w:t xml:space="preserve"> </w:t>
+      </w:r>
+      <w:proofErr w:type="spellStart"/>
+      <w:r>
+        <w:t>paths</w:t>
+      </w:r>
+      <w:proofErr w:type="spellEnd"/>
+      <w:r>
+        <w:t xml:space="preserve"> </w:t>
+      </w:r>
+      <w:proofErr w:type="spellStart"/>
+      <w:r>
+        <w:t>stored</w:t>
+      </w:r>
+      <w:proofErr w:type="spellEnd"/>
+      <w:r>
+        <w:t xml:space="preserve">) facendo si che </w:t>
+      </w:r>
+      <w:r>
+        <w:rPr>
+          <w:i/>
+          <w:iCs/>
+        </w:rPr>
+        <w:t>CARATTERI</w:t>
+      </w:r>
+      <w:r>
+        <w:t xml:space="preserve"> </w:t>
+      </w:r>
+      <w:r>
+        <w:rPr>
+          <w:i/>
+          <w:iCs/>
+        </w:rPr>
+        <w:t>COMUNI</w:t>
+      </w:r>
+      <w:r>
+        <w:t xml:space="preserve"> vengano </w:t>
+      </w:r>
+      <w:r>
+        <w:rPr>
+          <w:b/>
+          <w:bCs/>
+        </w:rPr>
+        <w:t>CONDIVISI</w:t>
+      </w:r>
+      <w:r>
+        <w:t xml:space="preserve"> tra le varie parole.</w:t>
+      </w:r>
+    </w:p>
+    <w:p/>
+    <w:p>
+      <w:pPr>
+        <w:rPr>
+          <w:lang w:val="en-US"/>
+        </w:rPr>
+      </w:pPr>
+      <w:r>
+        <w:rPr>
+          <w:lang w:val="en-US"/>
+        </w:rPr>
+        <w:t>Each node represents a character, and paths from the root represent words.</w:t>
+      </w:r>
+    </w:p>
+    <w:p>
+      <w:pPr>
+        <w:numPr>
+          <w:ilvl w:val="0"/>
+          <w:numId w:val="2"/>
+        </w:numPr>
+        <w:rPr>
+          <w:lang w:val="en-US"/>
+        </w:rPr>
+      </w:pPr>
+      <w:r>
+        <w:rPr>
+          <w:lang w:val="en-US"/>
+        </w:rPr>
+        <w:t>Common prefixes are </w:t>
+      </w:r>
+      <w:r>
+        <w:rPr>
+          <w:b/>
+          <w:bCs/>
+          <w:lang w:val="en-US"/>
+        </w:rPr>
+        <w:t>shared</w:t>
+      </w:r>
+      <w:r>
+        <w:rPr>
+          <w:lang w:val="en-US"/>
+        </w:rPr>
+        <w:t>, which saves space.</w:t>
+      </w:r>
+    </w:p>
+    <w:p>
+      <w:pPr>
+        <w:numPr>
+          <w:ilvl w:val="0"/>
+          <w:numId w:val="2"/>
+        </w:numPr>
+        <w:rPr>
+          <w:lang w:val="en-US"/>
+        </w:rPr>
+      </w:pPr>
+      <w:r>
+        <w:rPr>
+          <w:lang w:val="en-US"/>
+        </w:rPr>
+        <w:t>Each node has </w:t>
+      </w:r>
+      <w:r>
+        <w:rPr>
+          <w:b/>
+          <w:bCs/>
+          <w:lang w:val="en-US"/>
+        </w:rPr>
+        <w:t>26 children</w:t>
+      </w:r>
+      <w:r>
+        <w:rPr>
+          <w:lang w:val="en-US"/>
+        </w:rPr>
+        <w:t> (for letters a-z), indexed directly using character positions.</w:t>
+      </w:r>
+    </w:p>
+    <w:p>
+      <w:pPr>
+        <w:numPr>
+          <w:ilvl w:val="0"/>
+          <w:numId w:val="2"/>
+        </w:numPr>
+        <w:rPr>
+          <w:lang w:val="en-US"/>
+        </w:rPr>
+      </w:pPr>
+      <w:r>
+        <w:rPr>
+          <w:lang w:val="en-US"/>
+        </w:rPr>
+        <w:t xml:space="preserve">A </w:t>
+      </w:r>
+      <w:proofErr w:type="spellStart"/>
+      <w:r>
+        <w:rPr>
+          <w:lang w:val="en-US"/>
+        </w:rPr>
+        <w:t>boolean</w:t>
+      </w:r>
+      <w:proofErr w:type="spellEnd"/>
+      <w:r>
+        <w:rPr>
+          <w:lang w:val="en-US"/>
+        </w:rPr>
+        <w:t xml:space="preserve"> flag </w:t>
+      </w:r>
+      <w:proofErr w:type="spellStart"/>
+      <w:r>
+        <w:rPr>
+          <w:b/>
+          <w:bCs/>
+          <w:lang w:val="en-US"/>
+        </w:rPr>
+        <w:t>endOfWord</w:t>
+      </w:r>
+      <w:proofErr w:type="spellEnd"/>
+      <w:r>
+        <w:rPr>
+          <w:lang w:val="en-US"/>
+        </w:rPr>
+        <w:t> tells us whether a complete word ends at that node.</w:t>
+      </w:r>
+    </w:p>
+    <w:p>
+      <w:r>
+        <w:t xml:space="preserve">Why </w:t>
+      </w:r>
+      <w:r>
+        <w:rPr>
+          <w:b/>
+          <w:bCs/>
+        </w:rPr>
+        <w:t>Trie</w:t>
+      </w:r>
+      <w:r>
+        <w:t xml:space="preserve"> </w:t>
+      </w:r>
+      <w:proofErr w:type="spellStart"/>
+      <w:r>
+        <w:t>is</w:t>
+      </w:r>
+      <w:proofErr w:type="spellEnd"/>
+      <w:r>
+        <w:t xml:space="preserve"> </w:t>
+      </w:r>
+      <w:proofErr w:type="spellStart"/>
+      <w:r>
+        <w:t>useful</w:t>
+      </w:r>
+      <w:proofErr w:type="spellEnd"/>
+      <w:r>
+        <w:t>:</w:t>
+      </w:r>
+    </w:p>
+    <w:p>
+      <w:pPr>
+        <w:numPr>
+          <w:ilvl w:val="0"/>
+          <w:numId w:val="3"/>
+        </w:numPr>
+        <w:rPr>
+          <w:lang w:val="en-US"/>
+        </w:rPr>
+      </w:pPr>
+      <w:r>
+        <w:rPr>
+          <w:lang w:val="en-US"/>
+        </w:rPr>
+        <w:t>Searching words and prefixes is </w:t>
+      </w:r>
+      <w:proofErr w:type="gramStart"/>
+      <w:r>
+        <w:rPr>
+          <w:b/>
+          <w:bCs/>
+          <w:lang w:val="en-US"/>
+        </w:rPr>
+        <w:t>O(</w:t>
+      </w:r>
+      <w:proofErr w:type="gramEnd"/>
+      <w:r>
+        <w:rPr>
+          <w:b/>
+          <w:bCs/>
+          <w:lang w:val="en-US"/>
+        </w:rPr>
+        <w:t>length of word)</w:t>
+      </w:r>
+      <w:r>
+        <w:rPr>
+          <w:lang w:val="en-US"/>
+        </w:rPr>
+        <w:t>, not dependent on how many words exist.</w:t>
+      </w:r>
+    </w:p>
+    <w:p>
+      <w:pPr>
+        <w:numPr>
+          <w:ilvl w:val="0"/>
+          <w:numId w:val="3"/>
+        </w:numPr>
+        <w:rPr>
+          <w:lang w:val="en-US"/>
+        </w:rPr>
+      </w:pPr>
+      <w:r>
+        <w:rPr>
+          <w:lang w:val="en-US"/>
+        </w:rPr>
+        <w:t>Ideal for problems involving </w:t>
+      </w:r>
+      <w:r>
+        <w:rPr>
+          <w:b/>
+          <w:bCs/>
+          <w:lang w:val="en-US"/>
+        </w:rPr>
+        <w:t>dictionary lookups</w:t>
+      </w:r>
+      <w:r>
+        <w:rPr>
+          <w:lang w:val="en-US"/>
+        </w:rPr>
+        <w:t>, </w:t>
+      </w:r>
+      <w:r>
+        <w:rPr>
+          <w:b/>
+          <w:bCs/>
+          <w:lang w:val="en-US"/>
+        </w:rPr>
+        <w:t>autocomplete</w:t>
+      </w:r>
+      <w:r>
+        <w:rPr>
+          <w:lang w:val="en-US"/>
+        </w:rPr>
+        <w:t>, and </w:t>
+      </w:r>
+      <w:r>
+        <w:rPr>
+          <w:b/>
+          <w:bCs/>
+          <w:lang w:val="en-US"/>
+        </w:rPr>
+        <w:t>prefix checks</w:t>
+      </w:r>
+      <w:r>
+        <w:rPr>
+          <w:lang w:val="en-US"/>
+        </w:rPr>
+        <w:t>.</w:t>
+      </w:r>
+    </w:p>
+    <w:p>
+      <w:pPr>
+        <w:rPr>
+          <w:lang w:val="en-US"/>
+        </w:rPr>
+      </w:pPr>
+    </w:p>
+    <w:p>
+      <w:pPr>
         <w:rPr>
           <w:b/>
           <w:bCs/>
@@ -9650,415 +10056,201 @@
           <w:szCs w:val="40"/>
           <w:lang w:val="en-US"/>
         </w:rPr>
+      </w:pPr>
+      <w:r>
+        <w:rPr>
+          <w:b/>
+          <w:bCs/>
+          <w:color w:val="4EA72E" w:themeColor="accent6"/>
+          <w:sz w:val="40"/>
+          <w:szCs w:val="40"/>
+          <w:lang w:val="en-US"/>
+        </w:rPr>
+        <w:lastRenderedPageBreak/>
+        <w:t>GRAPHS</w:t>
+      </w:r>
+      <w:r>
+        <w:rPr>
+          <w:b/>
+          <w:bCs/>
+          <w:color w:val="4EA72E" w:themeColor="accent6"/>
+          <w:sz w:val="40"/>
+          <w:szCs w:val="40"/>
+          <w:lang w:val="en-US"/>
+        </w:rPr>
         <w:t>:</w:t>
       </w:r>
     </w:p>
     <w:p>
-      <w:r>
-        <w:t xml:space="preserve">Un </w:t>
+      <w:pPr>
+        <w:rPr>
+          <w:b/>
+          <w:bCs/>
+          <w:lang w:val="en-US"/>
+        </w:rPr>
+      </w:pPr>
+      <w:r>
+        <w:rPr>
+          <w:b/>
+          <w:bCs/>
+          <w:color w:val="C00000"/>
+          <w:lang w:val="en-US"/>
+        </w:rPr>
+        <w:t>KAHN’S ALGORITHM</w:t>
+      </w:r>
+      <w:r>
+        <w:rPr>
+          <w:b/>
+          <w:bCs/>
+          <w:color w:val="C00000"/>
+          <w:lang w:val="en-US"/>
+        </w:rPr>
+        <w:t xml:space="preserve">: </w:t>
+      </w:r>
+      <w:r>
+        <w:rPr>
+          <w:lang w:val="en-US"/>
+        </w:rPr>
+        <w:t>see</w:t>
+      </w:r>
+      <w:r>
+        <w:rPr>
+          <w:lang w:val="en-US"/>
+        </w:rPr>
+        <w:t xml:space="preserve"> </w:t>
+      </w:r>
+      <w:r>
+        <w:rPr>
+          <w:i/>
+          <w:iCs/>
+          <w:lang w:val="en-US"/>
+        </w:rPr>
+        <w:t>11</w:t>
+      </w:r>
+      <w:r>
+        <w:rPr>
+          <w:i/>
+          <w:iCs/>
+          <w:lang w:val="en-US"/>
+        </w:rPr>
+        <w:t>_</w:t>
+      </w:r>
+      <w:r>
+        <w:rPr>
+          <w:i/>
+          <w:iCs/>
+          <w:lang w:val="en-US"/>
+        </w:rPr>
+        <w:t>graphs</w:t>
+      </w:r>
+      <w:r>
+        <w:rPr>
+          <w:i/>
+          <w:iCs/>
+          <w:lang w:val="en-US"/>
+        </w:rPr>
+        <w:t xml:space="preserve"> </w:t>
+      </w:r>
+      <w:r>
+        <w:rPr>
+          <w:lang w:val="en-US"/>
+        </w:rPr>
+        <w:t xml:space="preserve">problem </w:t>
       </w:r>
       <w:r>
         <w:rPr>
           <w:b/>
           <w:bCs/>
           <w:highlight w:val="yellow"/>
-        </w:rPr>
-        <w:t>TRIE</w:t>
-      </w:r>
-      <w:r>
-        <w:t xml:space="preserve"> e una struttura dati utile a memorizzare i </w:t>
+          <w:lang w:val="en-US"/>
+        </w:rPr>
+        <w:t>207</w:t>
       </w:r>
       <w:r>
         <w:rPr>
           <w:b/>
           <w:bCs/>
-        </w:rPr>
-        <w:t>CARATTERI</w:t>
-      </w:r>
-      <w:r>
-        <w:t xml:space="preserve"> delle varie parole </w:t>
+          <w:lang w:val="en-US"/>
+        </w:rPr>
+        <w:t xml:space="preserve"> COURSE SCHEDULE</w:t>
+      </w:r>
+    </w:p>
+    <w:p>
+      <w:pPr>
+        <w:rPr>
+          <w:lang w:val="en-US"/>
+        </w:rPr>
+      </w:pPr>
+      <w:r>
+        <w:rPr>
+          <w:lang w:val="en-US"/>
+        </w:rPr>
+        <w:t xml:space="preserve">It is used to travers a </w:t>
       </w:r>
       <w:r>
         <w:rPr>
           <w:b/>
           <w:bCs/>
-        </w:rPr>
-        <w:t>INSERTED</w:t>
-      </w:r>
-      <w:r>
-        <w:t xml:space="preserve"> e </w:t>
+          <w:lang w:val="en-US"/>
+        </w:rPr>
+        <w:t>DAG</w:t>
+      </w:r>
+      <w:r>
+        <w:rPr>
+          <w:lang w:val="en-US"/>
+        </w:rPr>
+        <w:t xml:space="preserve"> with </w:t>
       </w:r>
       <w:r>
         <w:rPr>
           <w:b/>
           <w:bCs/>
-        </w:rPr>
-        <w:t>RICERCARLE</w:t>
-      </w:r>
-      <w:r>
-        <w:t xml:space="preserve"> dopo con complessità </w:t>
+          <w:lang w:val="en-US"/>
+        </w:rPr>
+        <w:t>BFS</w:t>
+      </w:r>
+      <w:r>
+        <w:rPr>
+          <w:lang w:val="en-US"/>
+        </w:rPr>
+        <w:t xml:space="preserve"> </w:t>
+      </w:r>
+      <w:r>
+        <w:rPr>
+          <w:i/>
+          <w:iCs/>
+          <w:u w:val="single"/>
+          <w:lang w:val="en-US"/>
+        </w:rPr>
+        <w:t>without</w:t>
+      </w:r>
+      <w:r>
+        <w:rPr>
+          <w:lang w:val="en-US"/>
+        </w:rPr>
+        <w:t xml:space="preserve"> VISITED ARRAY and </w:t>
       </w:r>
       <w:r>
         <w:rPr>
           <w:b/>
           <w:bCs/>
-        </w:rPr>
-        <w:t xml:space="preserve">O(N) time </w:t>
-      </w:r>
-      <w:r>
-        <w:t xml:space="preserve">(N = </w:t>
-      </w:r>
-      <w:proofErr w:type="spellStart"/>
-      <w:r>
-        <w:t>length</w:t>
-      </w:r>
-      <w:proofErr w:type="spellEnd"/>
-      <w:r>
-        <w:t xml:space="preserve"> of </w:t>
-      </w:r>
-      <w:proofErr w:type="spellStart"/>
-      <w:r>
-        <w:t>string</w:t>
-      </w:r>
-      <w:proofErr w:type="spellEnd"/>
-      <w:r>
-        <w:t xml:space="preserve">) e </w:t>
-      </w:r>
-      <w:r>
-        <w:rPr>
-          <w:b/>
-          <w:bCs/>
-        </w:rPr>
-        <w:t xml:space="preserve">O(T) </w:t>
-      </w:r>
-      <w:proofErr w:type="spellStart"/>
-      <w:r>
-        <w:rPr>
-          <w:b/>
-          <w:bCs/>
-        </w:rPr>
-        <w:t>space</w:t>
-      </w:r>
-      <w:proofErr w:type="spellEnd"/>
-      <w:r>
-        <w:t xml:space="preserve"> (T = </w:t>
-      </w:r>
-      <w:proofErr w:type="spellStart"/>
-      <w:r>
-        <w:t>number</w:t>
-      </w:r>
-      <w:proofErr w:type="spellEnd"/>
-      <w:r>
-        <w:t xml:space="preserve"> of </w:t>
-      </w:r>
-      <w:proofErr w:type="spellStart"/>
-      <w:r>
-        <w:t>different</w:t>
-      </w:r>
-      <w:proofErr w:type="spellEnd"/>
-      <w:r>
-        <w:t xml:space="preserve"> </w:t>
-      </w:r>
-      <w:proofErr w:type="spellStart"/>
-      <w:r>
-        <w:t>paths</w:t>
-      </w:r>
-      <w:proofErr w:type="spellEnd"/>
-      <w:r>
-        <w:t xml:space="preserve"> </w:t>
-      </w:r>
-      <w:proofErr w:type="spellStart"/>
-      <w:r>
-        <w:t>stored</w:t>
-      </w:r>
-      <w:proofErr w:type="spellEnd"/>
-      <w:r>
-        <w:t xml:space="preserve">) facendo si che </w:t>
-      </w:r>
-      <w:r>
-        <w:rPr>
-          <w:i/>
-          <w:iCs/>
-        </w:rPr>
-        <w:t>CARATTERI</w:t>
-      </w:r>
-      <w:r>
-        <w:t xml:space="preserve"> </w:t>
-      </w:r>
-      <w:r>
-        <w:rPr>
-          <w:i/>
-          <w:iCs/>
-        </w:rPr>
-        <w:t>COMUNI</w:t>
-      </w:r>
-      <w:r>
-        <w:t xml:space="preserve"> vengano </w:t>
-      </w:r>
-      <w:r>
-        <w:rPr>
-          <w:b/>
-          <w:bCs/>
-        </w:rPr>
-        <w:t>CONDIVISI</w:t>
-      </w:r>
-      <w:r>
-        <w:t xml:space="preserve"> tra le varie parole.</w:t>
-      </w:r>
-    </w:p>
-    <w:p/>
-    <w:p>
-      <w:pPr>
-        <w:rPr>
-          <w:lang w:val="en-US"/>
-        </w:rPr>
-      </w:pPr>
-      <w:r>
-        <w:rPr>
-          <w:lang w:val="en-US"/>
-        </w:rPr>
-        <w:t>Each node represents a character, and paths from the root represent words.</w:t>
+          <w:lang w:val="en-US"/>
+        </w:rPr>
+        <w:t>WITH IN_DEGREE</w:t>
+      </w:r>
+      <w:r>
+        <w:rPr>
+          <w:lang w:val="en-US"/>
+        </w:rPr>
+        <w:t xml:space="preserve"> array</w:t>
       </w:r>
     </w:p>
     <w:p>
       <w:pPr>
-        <w:numPr>
-          <w:ilvl w:val="0"/>
-          <w:numId w:val="2"/>
-        </w:numPr>
-        <w:rPr>
-          <w:lang w:val="en-US"/>
-        </w:rPr>
-      </w:pPr>
-      <w:r>
-        <w:rPr>
-          <w:lang w:val="en-US"/>
-        </w:rPr>
-        <w:t>Common prefixes are </w:t>
-      </w:r>
-      <w:r>
-        <w:rPr>
-          <w:b/>
-          <w:bCs/>
-          <w:lang w:val="en-US"/>
-        </w:rPr>
-        <w:t>shared</w:t>
-      </w:r>
-      <w:r>
-        <w:rPr>
-          <w:lang w:val="en-US"/>
-        </w:rPr>
-        <w:t>, which saves space.</w:t>
-      </w:r>
-    </w:p>
-    <w:p>
-      <w:pPr>
-        <w:numPr>
-          <w:ilvl w:val="0"/>
-          <w:numId w:val="2"/>
-        </w:numPr>
-        <w:rPr>
-          <w:lang w:val="en-US"/>
-        </w:rPr>
-      </w:pPr>
-      <w:r>
-        <w:rPr>
-          <w:lang w:val="en-US"/>
-        </w:rPr>
-        <w:t>Each node has </w:t>
-      </w:r>
-      <w:r>
-        <w:rPr>
-          <w:b/>
-          <w:bCs/>
-          <w:lang w:val="en-US"/>
-        </w:rPr>
-        <w:t>26 children</w:t>
-      </w:r>
-      <w:r>
-        <w:rPr>
-          <w:lang w:val="en-US"/>
-        </w:rPr>
-        <w:t> (for letters a-z), indexed directly using character positions.</w:t>
-      </w:r>
-    </w:p>
-    <w:p>
-      <w:pPr>
-        <w:numPr>
-          <w:ilvl w:val="0"/>
-          <w:numId w:val="2"/>
-        </w:numPr>
-        <w:rPr>
-          <w:lang w:val="en-US"/>
-        </w:rPr>
-      </w:pPr>
-      <w:r>
-        <w:rPr>
-          <w:lang w:val="en-US"/>
-        </w:rPr>
-        <w:t xml:space="preserve">A </w:t>
-      </w:r>
-      <w:proofErr w:type="spellStart"/>
-      <w:r>
-        <w:rPr>
-          <w:lang w:val="en-US"/>
-        </w:rPr>
-        <w:t>boolean</w:t>
-      </w:r>
-      <w:proofErr w:type="spellEnd"/>
-      <w:r>
-        <w:rPr>
-          <w:lang w:val="en-US"/>
-        </w:rPr>
-        <w:t xml:space="preserve"> flag </w:t>
-      </w:r>
-      <w:proofErr w:type="spellStart"/>
-      <w:r>
-        <w:rPr>
-          <w:b/>
-          <w:bCs/>
-          <w:lang w:val="en-US"/>
-        </w:rPr>
-        <w:t>endOfWord</w:t>
-      </w:r>
-      <w:proofErr w:type="spellEnd"/>
-      <w:r>
-        <w:rPr>
-          <w:lang w:val="en-US"/>
-        </w:rPr>
-        <w:t> tells us whether a complete word ends at that node.</w:t>
-      </w:r>
-    </w:p>
-    <w:p>
-      <w:r>
-        <w:t xml:space="preserve">Why </w:t>
-      </w:r>
-      <w:r>
-        <w:rPr>
-          <w:b/>
-          <w:bCs/>
-        </w:rPr>
-        <w:t>Trie</w:t>
-      </w:r>
-      <w:r>
-        <w:t xml:space="preserve"> </w:t>
-      </w:r>
-      <w:proofErr w:type="spellStart"/>
-      <w:r>
-        <w:t>is</w:t>
-      </w:r>
-      <w:proofErr w:type="spellEnd"/>
-      <w:r>
-        <w:t xml:space="preserve"> </w:t>
-      </w:r>
-      <w:proofErr w:type="spellStart"/>
-      <w:r>
-        <w:t>useful</w:t>
-      </w:r>
-      <w:proofErr w:type="spellEnd"/>
-      <w:r>
-        <w:t>:</w:t>
-      </w:r>
-    </w:p>
-    <w:p>
-      <w:pPr>
-        <w:numPr>
-          <w:ilvl w:val="0"/>
-          <w:numId w:val="3"/>
-        </w:numPr>
-        <w:rPr>
-          <w:lang w:val="en-US"/>
-        </w:rPr>
-      </w:pPr>
-      <w:r>
-        <w:rPr>
-          <w:lang w:val="en-US"/>
-        </w:rPr>
-        <w:t>Searching words and prefixes is </w:t>
-      </w:r>
-      <w:proofErr w:type="gramStart"/>
-      <w:r>
-        <w:rPr>
-          <w:b/>
-          <w:bCs/>
-          <w:lang w:val="en-US"/>
-        </w:rPr>
-        <w:t>O(</w:t>
-      </w:r>
-      <w:proofErr w:type="gramEnd"/>
-      <w:r>
-        <w:rPr>
-          <w:b/>
-          <w:bCs/>
-          <w:lang w:val="en-US"/>
-        </w:rPr>
-        <w:t>length of word)</w:t>
-      </w:r>
-      <w:r>
-        <w:rPr>
-          <w:lang w:val="en-US"/>
-        </w:rPr>
-        <w:t>, not dependent on how many words exist.</w:t>
-      </w:r>
-    </w:p>
-    <w:p>
-      <w:pPr>
-        <w:numPr>
-          <w:ilvl w:val="0"/>
-          <w:numId w:val="3"/>
-        </w:numPr>
-        <w:rPr>
-          <w:lang w:val="en-US"/>
-        </w:rPr>
-      </w:pPr>
-      <w:r>
-        <w:rPr>
-          <w:lang w:val="en-US"/>
-        </w:rPr>
-        <w:t>Ideal for problems involving </w:t>
-      </w:r>
-      <w:r>
-        <w:rPr>
-          <w:b/>
-          <w:bCs/>
-          <w:lang w:val="en-US"/>
-        </w:rPr>
-        <w:t>dictionary lookups</w:t>
-      </w:r>
-      <w:r>
-        <w:rPr>
-          <w:lang w:val="en-US"/>
-        </w:rPr>
-        <w:t>, </w:t>
-      </w:r>
-      <w:r>
-        <w:rPr>
-          <w:b/>
-          <w:bCs/>
-          <w:lang w:val="en-US"/>
-        </w:rPr>
-        <w:t>autocomplete</w:t>
-      </w:r>
-      <w:r>
-        <w:rPr>
-          <w:lang w:val="en-US"/>
-        </w:rPr>
-        <w:t>, and </w:t>
-      </w:r>
-      <w:r>
-        <w:rPr>
-          <w:b/>
-          <w:bCs/>
-          <w:lang w:val="en-US"/>
-        </w:rPr>
-        <w:t>prefix checks</w:t>
-      </w:r>
-      <w:r>
-        <w:rPr>
-          <w:lang w:val="en-US"/>
-        </w:rPr>
-        <w:t>.</w:t>
-      </w:r>
+        <w:rPr>
+          <w:lang w:val="en-US"/>
+        </w:rPr>
+      </w:pPr>
     </w:p>
     <w:p>
       <w:pPr>
@@ -11105,6 +11297,7 @@
   <w:style w:type="character" w:default="1" w:styleId="Carpredefinitoparagrafo">
     <w:name w:val="Default Paragraph Font"/>
     <w:uiPriority w:val="1"/>
+    <w:semiHidden/>
     <w:unhideWhenUsed/>
   </w:style>
   <w:style w:type="table" w:default="1" w:styleId="Tabellanormale">

</xml_diff>

<commit_message>
Add implementation for canFinish function using DFS for cycle detection and findOrder function using Kahn's algorithm for topological sorting
</commit_message>
<xml_diff>
--- a/docs/PATTERNS.docx
+++ b/docs/PATTERNS.docx
@@ -78,7 +78,6 @@
           <w:lang w:val="en-US"/>
         </w:rPr>
       </w:pPr>
-      <w:proofErr w:type="gramStart"/>
       <w:r>
         <w:rPr>
           <w:b/>
@@ -86,9 +85,74 @@
           <w:color w:val="C00000"/>
           <w:lang w:val="en-US"/>
         </w:rPr>
-        <w:t>TOP-K</w:t>
-      </w:r>
-      <w:proofErr w:type="gramEnd"/>
+        <w:t xml:space="preserve">TOP-K ITEMS: </w:t>
+      </w:r>
+      <w:r>
+        <w:rPr>
+          <w:b/>
+          <w:bCs/>
+          <w:lang w:val="en-US"/>
+        </w:rPr>
+        <w:t>BUCKET SORT</w:t>
+      </w:r>
+      <w:r>
+        <w:rPr>
+          <w:lang w:val="en-US"/>
+        </w:rPr>
+        <w:t xml:space="preserve"> </w:t>
+      </w:r>
+      <w:r>
+        <w:rPr>
+          <w:lang w:val="en-US"/>
+        </w:rPr>
+        <w:sym w:font="Wingdings" w:char="F0E0"/>
+      </w:r>
+      <w:r>
+        <w:rPr>
+          <w:lang w:val="en-US"/>
+        </w:rPr>
+        <w:t xml:space="preserve"> see </w:t>
+      </w:r>
+      <w:r>
+        <w:rPr>
+          <w:i/>
+          <w:iCs/>
+          <w:lang w:val="en-US"/>
+        </w:rPr>
+        <w:t>1_Arrays&amp;String</w:t>
+      </w:r>
+      <w:r>
+        <w:rPr>
+          <w:i/>
+          <w:iCs/>
+          <w:lang w:val="en-US"/>
+        </w:rPr>
+        <w:t xml:space="preserve"> </w:t>
+      </w:r>
+      <w:r>
+        <w:rPr>
+          <w:lang w:val="en-US"/>
+        </w:rPr>
+        <w:t xml:space="preserve"> problem </w:t>
+      </w:r>
+      <w:r>
+        <w:rPr>
+          <w:b/>
+          <w:bCs/>
+          <w:highlight w:val="yellow"/>
+          <w:lang w:val="en-US"/>
+        </w:rPr>
+        <w:t>347</w:t>
+      </w:r>
+    </w:p>
+    <w:p>
+      <w:pPr>
+        <w:rPr>
+          <w:b/>
+          <w:bCs/>
+          <w:lang w:val="en-US"/>
+        </w:rPr>
+      </w:pPr>
       <w:r>
         <w:rPr>
           <w:b/>
@@ -96,27 +160,14 @@
           <w:color w:val="C00000"/>
           <w:lang w:val="en-US"/>
         </w:rPr>
-        <w:t xml:space="preserve"> ITEMS: </w:t>
-      </w:r>
-      <w:r>
-        <w:rPr>
-          <w:b/>
-          <w:bCs/>
-          <w:lang w:val="en-US"/>
-        </w:rPr>
-        <w:t>BUCKET SORT</w:t>
-      </w:r>
-      <w:r>
-        <w:rPr>
-          <w:lang w:val="en-US"/>
-        </w:rPr>
-        <w:t xml:space="preserve"> </w:t>
-      </w:r>
-      <w:r>
-        <w:rPr>
-          <w:lang w:val="en-US"/>
-        </w:rPr>
-        <w:sym w:font="Wingdings" w:char="F0E0"/>
+        <w:t>PREFIX &amp; SUFFIX SUM</w:t>
+      </w:r>
+      <w:r>
+        <w:rPr>
+          <w:color w:val="C00000"/>
+          <w:lang w:val="en-US"/>
+        </w:rPr>
+        <w:t>:</w:t>
       </w:r>
       <w:r>
         <w:rPr>
@@ -130,37 +181,13 @@
           <w:iCs/>
           <w:lang w:val="en-US"/>
         </w:rPr>
-        <w:t>1_Arrays&amp;</w:t>
-      </w:r>
-      <w:proofErr w:type="gramStart"/>
-      <w:r>
-        <w:rPr>
-          <w:i/>
-          <w:iCs/>
-          <w:lang w:val="en-US"/>
-        </w:rPr>
-        <w:t>String</w:t>
-      </w:r>
-      <w:r>
-        <w:rPr>
-          <w:i/>
-          <w:iCs/>
-          <w:lang w:val="en-US"/>
-        </w:rPr>
-        <w:t xml:space="preserve"> </w:t>
-      </w:r>
-      <w:r>
-        <w:rPr>
-          <w:lang w:val="en-US"/>
-        </w:rPr>
-        <w:t xml:space="preserve"> problem</w:t>
-      </w:r>
-      <w:proofErr w:type="gramEnd"/>
-      <w:r>
-        <w:rPr>
-          <w:lang w:val="en-US"/>
-        </w:rPr>
-        <w:t xml:space="preserve"> </w:t>
+        <w:t>1_Arrays&amp;String</w:t>
+      </w:r>
+      <w:r>
+        <w:rPr>
+          <w:lang w:val="en-US"/>
+        </w:rPr>
+        <w:t xml:space="preserve"> problem </w:t>
       </w:r>
       <w:r>
         <w:rPr>
@@ -169,7 +196,7 @@
           <w:highlight w:val="yellow"/>
           <w:lang w:val="en-US"/>
         </w:rPr>
-        <w:t>347</w:t>
+        <w:t>238</w:t>
       </w:r>
     </w:p>
     <w:p>
@@ -187,20 +214,67 @@
           <w:color w:val="C00000"/>
           <w:lang w:val="en-US"/>
         </w:rPr>
-        <w:t>PREFIX &amp; SUFFIX SUM</w:t>
-      </w:r>
-      <w:r>
-        <w:rPr>
-          <w:color w:val="C00000"/>
-          <w:lang w:val="en-US"/>
-        </w:rPr>
-        <w:t>:</w:t>
-      </w:r>
-      <w:r>
-        <w:rPr>
-          <w:lang w:val="en-US"/>
-        </w:rPr>
-        <w:t xml:space="preserve"> see </w:t>
+        <w:t xml:space="preserve">LONGEST CONSECUTIVE SEQUENCE: </w:t>
+      </w:r>
+      <w:r>
+        <w:rPr>
+          <w:b/>
+          <w:bCs/>
+          <w:lang w:val="en-US"/>
+        </w:rPr>
+        <w:t>HASH MAP</w:t>
+      </w:r>
+      <w:r>
+        <w:rPr>
+          <w:lang w:val="en-US"/>
+        </w:rPr>
+        <w:t xml:space="preserve"> </w:t>
+      </w:r>
+      <w:r>
+        <w:rPr>
+          <w:b/>
+          <w:bCs/>
+          <w:lang w:val="en-US"/>
+        </w:rPr>
+        <w:t>+ RUNNING STREAK</w:t>
+      </w:r>
+      <w:r>
+        <w:rPr>
+          <w:lang w:val="en-US"/>
+        </w:rPr>
+        <w:t xml:space="preserve"> + </w:t>
+      </w:r>
+      <w:r>
+        <w:rPr>
+          <w:b/>
+          <w:bCs/>
+          <w:lang w:val="en-US"/>
+        </w:rPr>
+        <w:t>UPDATE BOUNDARIES</w:t>
+      </w:r>
+      <w:r>
+        <w:rPr>
+          <w:lang w:val="en-US"/>
+        </w:rPr>
+        <w:t xml:space="preserve"> </w:t>
+      </w:r>
+      <w:r>
+        <w:rPr>
+          <w:lang w:val="en-US"/>
+        </w:rPr>
+        <w:sym w:font="Wingdings" w:char="F0E0"/>
+      </w:r>
+      <w:r>
+        <w:rPr>
+          <w:lang w:val="en-US"/>
+        </w:rPr>
+        <w:t xml:space="preserve"> </w:t>
+      </w:r>
+      <w:r>
+        <w:rPr>
+          <w:lang w:val="en-US"/>
+        </w:rPr>
+        <w:t xml:space="preserve">see </w:t>
       </w:r>
       <w:r>
         <w:rPr>
@@ -223,7 +297,16 @@
           <w:highlight w:val="yellow"/>
           <w:lang w:val="en-US"/>
         </w:rPr>
-        <w:t>238</w:t>
+        <w:t>12</w:t>
+      </w:r>
+      <w:r>
+        <w:rPr>
+          <w:b/>
+          <w:bCs/>
+          <w:highlight w:val="yellow"/>
+          <w:lang w:val="en-US"/>
+        </w:rPr>
+        <w:t>8</w:t>
       </w:r>
     </w:p>
     <w:p>
@@ -241,117 +324,323 @@
           <w:color w:val="C00000"/>
           <w:lang w:val="en-US"/>
         </w:rPr>
-        <w:t xml:space="preserve">LONGEST CONSECUTIVE SEQUENCE: </w:t>
-      </w:r>
-      <w:r>
-        <w:rPr>
-          <w:b/>
-          <w:bCs/>
-          <w:lang w:val="en-US"/>
-        </w:rPr>
-        <w:t>HASH MAP</w:t>
-      </w:r>
-      <w:r>
-        <w:rPr>
-          <w:lang w:val="en-US"/>
-        </w:rPr>
-        <w:t xml:space="preserve"> </w:t>
-      </w:r>
-      <w:r>
-        <w:rPr>
-          <w:b/>
-          <w:bCs/>
-          <w:lang w:val="en-US"/>
-        </w:rPr>
-        <w:t>+ RUNNING STREAK</w:t>
-      </w:r>
-      <w:r>
-        <w:rPr>
-          <w:lang w:val="en-US"/>
-        </w:rPr>
-        <w:t xml:space="preserve"> + </w:t>
-      </w:r>
-      <w:r>
-        <w:rPr>
-          <w:b/>
-          <w:bCs/>
-          <w:lang w:val="en-US"/>
-        </w:rPr>
-        <w:t>UPDATE BOUNDARIES</w:t>
-      </w:r>
-      <w:r>
-        <w:rPr>
-          <w:lang w:val="en-US"/>
-        </w:rPr>
-        <w:t xml:space="preserve"> </w:t>
-      </w:r>
-      <w:r>
-        <w:rPr>
-          <w:lang w:val="en-US"/>
-        </w:rPr>
-        <w:sym w:font="Wingdings" w:char="F0E0"/>
-      </w:r>
-      <w:r>
-        <w:rPr>
-          <w:lang w:val="en-US"/>
-        </w:rPr>
-        <w:t xml:space="preserve"> </w:t>
-      </w:r>
-      <w:r>
-        <w:rPr>
-          <w:lang w:val="en-US"/>
-        </w:rPr>
-        <w:t xml:space="preserve">see </w:t>
-      </w:r>
-      <w:r>
-        <w:rPr>
-          <w:i/>
-          <w:iCs/>
-          <w:lang w:val="en-US"/>
-        </w:rPr>
-        <w:t>1_Arrays&amp;String</w:t>
-      </w:r>
-      <w:r>
-        <w:rPr>
-          <w:lang w:val="en-US"/>
-        </w:rPr>
-        <w:t xml:space="preserve"> problem </w:t>
-      </w:r>
-      <w:r>
-        <w:rPr>
-          <w:b/>
-          <w:bCs/>
-          <w:highlight w:val="yellow"/>
-          <w:lang w:val="en-US"/>
-        </w:rPr>
-        <w:t>12</w:t>
-      </w:r>
-      <w:r>
-        <w:rPr>
-          <w:b/>
-          <w:bCs/>
-          <w:highlight w:val="yellow"/>
-          <w:lang w:val="en-US"/>
-        </w:rPr>
-        <w:t>8</w:t>
-      </w:r>
-    </w:p>
-    <w:p>
-      <w:pPr>
-        <w:rPr>
-          <w:b/>
-          <w:bCs/>
-          <w:lang w:val="en-US"/>
-        </w:rPr>
-      </w:pPr>
-      <w:r>
+        <w:t>CONVERT STRING INTO INT READING FROM LEFT TO RIGHT:</w:t>
+      </w:r>
+    </w:p>
+    <w:p>
+      <w:pPr>
+        <w:shd w:val="clear" w:color="auto" w:fill="121314"/>
+        <w:spacing w:after="0" w:line="285" w:lineRule="atLeast"/>
+        <w:rPr>
+          <w:rFonts w:ascii="Consolas" w:eastAsia="Times New Roman" w:hAnsi="Consolas" w:cs="Times New Roman"/>
+          <w:color w:val="C9D1D9"/>
+          <w:kern w:val="0"/>
+          <w:sz w:val="21"/>
+          <w:szCs w:val="21"/>
+          <w:lang w:val="en-US" w:eastAsia="it-IT"/>
+          <w14:ligatures w14:val="none"/>
+        </w:rPr>
+      </w:pPr>
+      <w:r>
+        <w:rPr>
+          <w:rFonts w:ascii="Consolas" w:eastAsia="Times New Roman" w:hAnsi="Consolas" w:cs="Times New Roman"/>
+          <w:color w:val="C9D1D9"/>
+          <w:kern w:val="0"/>
+          <w:sz w:val="21"/>
+          <w:szCs w:val="21"/>
+          <w:lang w:val="en-US" w:eastAsia="it-IT"/>
+          <w14:ligatures w14:val="none"/>
+        </w:rPr>
+        <w:t>val</w:t>
+      </w:r>
+      <w:r>
+        <w:rPr>
+          <w:rFonts w:ascii="Consolas" w:eastAsia="Times New Roman" w:hAnsi="Consolas" w:cs="Times New Roman"/>
+          <w:color w:val="C9D1D9"/>
+          <w:kern w:val="0"/>
+          <w:sz w:val="21"/>
+          <w:szCs w:val="21"/>
+          <w:lang w:val="en-US" w:eastAsia="it-IT"/>
+          <w14:ligatures w14:val="none"/>
+        </w:rPr>
+        <w:t xml:space="preserve"> </w:t>
+      </w:r>
+      <w:r>
+        <w:rPr>
+          <w:rFonts w:ascii="Consolas" w:eastAsia="Times New Roman" w:hAnsi="Consolas" w:cs="Times New Roman"/>
+          <w:color w:val="C9D1D9"/>
+          <w:kern w:val="0"/>
+          <w:sz w:val="21"/>
+          <w:szCs w:val="21"/>
+          <w:lang w:val="en-US" w:eastAsia="it-IT"/>
+          <w14:ligatures w14:val="none"/>
+        </w:rPr>
+        <w:t>= 0;</w:t>
+      </w:r>
+    </w:p>
+    <w:p>
+      <w:pPr>
+        <w:shd w:val="clear" w:color="auto" w:fill="121314"/>
+        <w:spacing w:after="0" w:line="285" w:lineRule="atLeast"/>
+        <w:rPr>
+          <w:rFonts w:ascii="Consolas" w:eastAsia="Times New Roman" w:hAnsi="Consolas" w:cs="Times New Roman"/>
+          <w:color w:val="C9D1D9"/>
+          <w:kern w:val="0"/>
+          <w:sz w:val="21"/>
+          <w:szCs w:val="21"/>
+          <w:lang w:val="en-US" w:eastAsia="it-IT"/>
+          <w14:ligatures w14:val="none"/>
+        </w:rPr>
+      </w:pPr>
+      <w:r>
+        <w:rPr>
+          <w:rFonts w:ascii="Consolas" w:eastAsia="Times New Roman" w:hAnsi="Consolas" w:cs="Times New Roman"/>
+          <w:color w:val="C9D1D9"/>
+          <w:kern w:val="0"/>
+          <w:sz w:val="21"/>
+          <w:szCs w:val="21"/>
+          <w:lang w:val="en-US" w:eastAsia="it-IT"/>
+          <w14:ligatures w14:val="none"/>
+        </w:rPr>
+        <w:t>for p in len(str)</w:t>
+      </w:r>
+    </w:p>
+    <w:p>
+      <w:pPr>
+        <w:shd w:val="clear" w:color="auto" w:fill="121314"/>
+        <w:spacing w:after="0" w:line="285" w:lineRule="atLeast"/>
+        <w:ind w:firstLine="708"/>
+        <w:rPr>
+          <w:rFonts w:ascii="Consolas" w:eastAsia="Times New Roman" w:hAnsi="Consolas" w:cs="Times New Roman"/>
+          <w:color w:val="C9D1D9"/>
+          <w:kern w:val="0"/>
+          <w:sz w:val="21"/>
+          <w:szCs w:val="21"/>
+          <w:lang w:val="en-US" w:eastAsia="it-IT"/>
+          <w14:ligatures w14:val="none"/>
+        </w:rPr>
+      </w:pPr>
+      <w:r>
+        <w:rPr>
+          <w:rFonts w:ascii="Consolas" w:eastAsia="Times New Roman" w:hAnsi="Consolas" w:cs="Times New Roman"/>
+          <w:color w:val="C9D1D9"/>
+          <w:kern w:val="0"/>
+          <w:sz w:val="21"/>
+          <w:szCs w:val="21"/>
+          <w:lang w:val="en-US" w:eastAsia="it-IT"/>
+          <w14:ligatures w14:val="none"/>
+        </w:rPr>
+        <w:t>val</w:t>
+      </w:r>
+      <w:r>
+        <w:rPr>
+          <w:rFonts w:ascii="Consolas" w:eastAsia="Times New Roman" w:hAnsi="Consolas" w:cs="Times New Roman"/>
+          <w:color w:val="C9D1D9"/>
+          <w:kern w:val="0"/>
+          <w:sz w:val="21"/>
+          <w:szCs w:val="21"/>
+          <w:lang w:val="en-US" w:eastAsia="it-IT"/>
+          <w14:ligatures w14:val="none"/>
+        </w:rPr>
+        <w:t xml:space="preserve"> </w:t>
+      </w:r>
+      <w:r>
+        <w:rPr>
+          <w:rFonts w:ascii="Consolas" w:eastAsia="Times New Roman" w:hAnsi="Consolas" w:cs="Times New Roman"/>
+          <w:color w:val="D4D4D4"/>
+          <w:kern w:val="0"/>
+          <w:sz w:val="21"/>
+          <w:szCs w:val="21"/>
+          <w:lang w:val="en-US" w:eastAsia="it-IT"/>
+          <w14:ligatures w14:val="none"/>
+        </w:rPr>
+        <w:t>*</w:t>
+      </w:r>
+      <w:r>
+        <w:rPr>
+          <w:rFonts w:ascii="Consolas" w:eastAsia="Times New Roman" w:hAnsi="Consolas" w:cs="Times New Roman"/>
+          <w:color w:val="D4D4D4"/>
+          <w:kern w:val="0"/>
+          <w:sz w:val="21"/>
+          <w:szCs w:val="21"/>
+          <w:lang w:val="en-US" w:eastAsia="it-IT"/>
+          <w14:ligatures w14:val="none"/>
+        </w:rPr>
+        <w:t>=</w:t>
+      </w:r>
+      <w:r>
+        <w:rPr>
+          <w:rFonts w:ascii="Consolas" w:eastAsia="Times New Roman" w:hAnsi="Consolas" w:cs="Times New Roman"/>
+          <w:color w:val="C9D1D9"/>
+          <w:kern w:val="0"/>
+          <w:sz w:val="21"/>
+          <w:szCs w:val="21"/>
+          <w:lang w:val="en-US" w:eastAsia="it-IT"/>
+          <w14:ligatures w14:val="none"/>
+        </w:rPr>
+        <w:t xml:space="preserve"> </w:t>
+      </w:r>
+      <w:r>
+        <w:rPr>
+          <w:rFonts w:ascii="Consolas" w:eastAsia="Times New Roman" w:hAnsi="Consolas" w:cs="Times New Roman"/>
+          <w:color w:val="C9D1D9"/>
+          <w:kern w:val="0"/>
+          <w:sz w:val="21"/>
+          <w:szCs w:val="21"/>
+          <w:lang w:val="en-US" w:eastAsia="it-IT"/>
+          <w14:ligatures w14:val="none"/>
+        </w:rPr>
+        <w:t>10</w:t>
+      </w:r>
+      <w:r>
+        <w:rPr>
+          <w:rFonts w:ascii="Consolas" w:eastAsia="Times New Roman" w:hAnsi="Consolas" w:cs="Times New Roman"/>
+          <w:color w:val="C9D1D9"/>
+          <w:kern w:val="0"/>
+          <w:sz w:val="21"/>
+          <w:szCs w:val="21"/>
+          <w:lang w:val="en-US" w:eastAsia="it-IT"/>
+          <w14:ligatures w14:val="none"/>
+        </w:rPr>
+        <w:t>;</w:t>
+      </w:r>
+    </w:p>
+    <w:p>
+      <w:pPr>
+        <w:shd w:val="clear" w:color="auto" w:fill="121314"/>
+        <w:spacing w:after="0" w:line="285" w:lineRule="atLeast"/>
+        <w:ind w:firstLine="708"/>
+        <w:rPr>
+          <w:rFonts w:ascii="Consolas" w:eastAsia="Times New Roman" w:hAnsi="Consolas" w:cs="Times New Roman"/>
+          <w:color w:val="BBBEBF"/>
+          <w:kern w:val="0"/>
+          <w:sz w:val="21"/>
+          <w:szCs w:val="21"/>
+          <w:lang w:val="en-US" w:eastAsia="it-IT"/>
+          <w14:ligatures w14:val="none"/>
+        </w:rPr>
+      </w:pPr>
+      <w:r>
+        <w:rPr>
+          <w:rFonts w:ascii="Consolas" w:eastAsia="Times New Roman" w:hAnsi="Consolas" w:cs="Times New Roman"/>
+          <w:color w:val="C9D1D9"/>
+          <w:kern w:val="0"/>
+          <w:sz w:val="21"/>
+          <w:szCs w:val="21"/>
+          <w:lang w:val="en-US" w:eastAsia="it-IT"/>
+          <w14:ligatures w14:val="none"/>
+        </w:rPr>
+        <w:t>val += (</w:t>
+      </w:r>
+      <w:r>
+        <w:rPr>
+          <w:rFonts w:ascii="Consolas" w:eastAsia="Times New Roman" w:hAnsi="Consolas" w:cs="Times New Roman"/>
+          <w:color w:val="FFA657"/>
+          <w:kern w:val="0"/>
+          <w:sz w:val="21"/>
+          <w:szCs w:val="21"/>
+          <w:lang w:val="en-US" w:eastAsia="it-IT"/>
+          <w14:ligatures w14:val="none"/>
+        </w:rPr>
+        <w:t>str</w:t>
+      </w:r>
+      <w:r>
+        <w:rPr>
+          <w:rFonts w:ascii="Consolas" w:eastAsia="Times New Roman" w:hAnsi="Consolas" w:cs="Times New Roman"/>
+          <w:color w:val="C9D1D9"/>
+          <w:kern w:val="0"/>
+          <w:sz w:val="21"/>
+          <w:szCs w:val="21"/>
+          <w:lang w:val="en-US" w:eastAsia="it-IT"/>
+          <w14:ligatures w14:val="none"/>
+        </w:rPr>
+        <w:t xml:space="preserve">[p] </w:t>
+      </w:r>
+      <w:r>
+        <w:rPr>
+          <w:rFonts w:ascii="Consolas" w:eastAsia="Times New Roman" w:hAnsi="Consolas" w:cs="Times New Roman"/>
+          <w:color w:val="D4D4D4"/>
+          <w:kern w:val="0"/>
+          <w:sz w:val="21"/>
+          <w:szCs w:val="21"/>
+          <w:lang w:val="en-US" w:eastAsia="it-IT"/>
+          <w14:ligatures w14:val="none"/>
+        </w:rPr>
+        <w:t>-</w:t>
+      </w:r>
+      <w:r>
+        <w:rPr>
+          <w:rFonts w:ascii="Consolas" w:eastAsia="Times New Roman" w:hAnsi="Consolas" w:cs="Times New Roman"/>
+          <w:color w:val="C9D1D9"/>
+          <w:kern w:val="0"/>
+          <w:sz w:val="21"/>
+          <w:szCs w:val="21"/>
+          <w:lang w:val="en-US" w:eastAsia="it-IT"/>
+          <w14:ligatures w14:val="none"/>
+        </w:rPr>
+        <w:t xml:space="preserve"> </w:t>
+      </w:r>
+      <w:r>
+        <w:rPr>
+          <w:rFonts w:ascii="Consolas" w:eastAsia="Times New Roman" w:hAnsi="Consolas" w:cs="Times New Roman"/>
+          <w:color w:val="A5D6FF"/>
+          <w:kern w:val="0"/>
+          <w:sz w:val="21"/>
+          <w:szCs w:val="21"/>
+          <w:lang w:val="en-US" w:eastAsia="it-IT"/>
+          <w14:ligatures w14:val="none"/>
+        </w:rPr>
+        <w:t>'0'</w:t>
+      </w:r>
+      <w:r>
+        <w:rPr>
+          <w:rFonts w:ascii="Consolas" w:eastAsia="Times New Roman" w:hAnsi="Consolas" w:cs="Times New Roman"/>
+          <w:color w:val="C9D1D9"/>
+          <w:kern w:val="0"/>
+          <w:sz w:val="21"/>
+          <w:szCs w:val="21"/>
+          <w:lang w:val="en-US" w:eastAsia="it-IT"/>
+          <w14:ligatures w14:val="none"/>
+        </w:rPr>
+        <w:t>)</w:t>
+      </w:r>
+      <w:r>
+        <w:rPr>
+          <w:rFonts w:ascii="Consolas" w:eastAsia="Times New Roman" w:hAnsi="Consolas" w:cs="Times New Roman"/>
+          <w:color w:val="C9D1D9"/>
+          <w:kern w:val="0"/>
+          <w:sz w:val="21"/>
+          <w:szCs w:val="21"/>
+          <w:lang w:val="en-US" w:eastAsia="it-IT"/>
+          <w14:ligatures w14:val="none"/>
+        </w:rPr>
+        <w:t>;</w:t>
+      </w:r>
+    </w:p>
+    <w:p>
+      <w:pPr>
+        <w:rPr>
+          <w:lang w:val="en-US"/>
+        </w:rPr>
+      </w:pPr>
+    </w:p>
+    <w:p>
+      <w:pPr>
         <w:rPr>
           <w:b/>
           <w:bCs/>
           <w:color w:val="C00000"/>
           <w:lang w:val="en-US"/>
         </w:rPr>
-        <w:t>CONVERT STRING INTO INT READING FROM LEFT TO RIGHT:</w:t>
+      </w:pPr>
+      <w:r>
+        <w:rPr>
+          <w:b/>
+          <w:bCs/>
+          <w:color w:val="C00000"/>
+          <w:lang w:val="en-US"/>
+        </w:rPr>
+        <w:t>CONVERT STRING INTO INT READING FROM RIGHT TO LEFT:</w:t>
       </w:r>
     </w:p>
     <w:p>
@@ -360,6 +649,17 @@
         <w:spacing w:after="0" w:line="285" w:lineRule="atLeast"/>
         <w:rPr>
           <w:rFonts w:ascii="Consolas" w:eastAsia="Times New Roman" w:hAnsi="Consolas" w:cs="Times New Roman"/>
+          <w:color w:val="BBBEBF"/>
+          <w:kern w:val="0"/>
+          <w:sz w:val="21"/>
+          <w:szCs w:val="21"/>
+          <w:lang w:val="en-US" w:eastAsia="it-IT"/>
+          <w14:ligatures w14:val="none"/>
+        </w:rPr>
+      </w:pPr>
+      <w:r>
+        <w:rPr>
+          <w:rFonts w:ascii="Consolas" w:eastAsia="Times New Roman" w:hAnsi="Consolas" w:cs="Times New Roman"/>
           <w:color w:val="C9D1D9"/>
           <w:kern w:val="0"/>
           <w:sz w:val="21"/>
@@ -367,44 +667,67 @@
           <w:lang w:val="en-US" w:eastAsia="it-IT"/>
           <w14:ligatures w14:val="none"/>
         </w:rPr>
-      </w:pPr>
-      <w:proofErr w:type="spellStart"/>
-      <w:r>
-        <w:rPr>
-          <w:rFonts w:ascii="Consolas" w:eastAsia="Times New Roman" w:hAnsi="Consolas" w:cs="Times New Roman"/>
-          <w:color w:val="C9D1D9"/>
-          <w:kern w:val="0"/>
-          <w:sz w:val="21"/>
-          <w:szCs w:val="21"/>
-          <w:lang w:val="en-US" w:eastAsia="it-IT"/>
-          <w14:ligatures w14:val="none"/>
-        </w:rPr>
-        <w:t>val</w:t>
-      </w:r>
-      <w:proofErr w:type="spellEnd"/>
-      <w:r>
-        <w:rPr>
-          <w:rFonts w:ascii="Consolas" w:eastAsia="Times New Roman" w:hAnsi="Consolas" w:cs="Times New Roman"/>
-          <w:color w:val="C9D1D9"/>
-          <w:kern w:val="0"/>
-          <w:sz w:val="21"/>
-          <w:szCs w:val="21"/>
-          <w:lang w:val="en-US" w:eastAsia="it-IT"/>
-          <w14:ligatures w14:val="none"/>
-        </w:rPr>
-        <w:t xml:space="preserve"> </w:t>
-      </w:r>
-      <w:r>
-        <w:rPr>
-          <w:rFonts w:ascii="Consolas" w:eastAsia="Times New Roman" w:hAnsi="Consolas" w:cs="Times New Roman"/>
-          <w:color w:val="C9D1D9"/>
-          <w:kern w:val="0"/>
-          <w:sz w:val="21"/>
-          <w:szCs w:val="21"/>
-          <w:lang w:val="en-US" w:eastAsia="it-IT"/>
-          <w14:ligatures w14:val="none"/>
-        </w:rPr>
-        <w:t>= 0;</w:t>
+        <w:t>multiplier</w:t>
+      </w:r>
+      <w:r>
+        <w:rPr>
+          <w:rFonts w:ascii="Consolas" w:eastAsia="Times New Roman" w:hAnsi="Consolas" w:cs="Times New Roman"/>
+          <w:color w:val="BBBEBF"/>
+          <w:kern w:val="0"/>
+          <w:sz w:val="21"/>
+          <w:szCs w:val="21"/>
+          <w:lang w:val="en-US" w:eastAsia="it-IT"/>
+          <w14:ligatures w14:val="none"/>
+        </w:rPr>
+        <w:t xml:space="preserve"> </w:t>
+      </w:r>
+      <w:r>
+        <w:rPr>
+          <w:rFonts w:ascii="Consolas" w:eastAsia="Times New Roman" w:hAnsi="Consolas" w:cs="Times New Roman"/>
+          <w:color w:val="D4D4D4"/>
+          <w:kern w:val="0"/>
+          <w:sz w:val="21"/>
+          <w:szCs w:val="21"/>
+          <w:lang w:val="en-US" w:eastAsia="it-IT"/>
+          <w14:ligatures w14:val="none"/>
+        </w:rPr>
+        <w:t>=</w:t>
+      </w:r>
+      <w:r>
+        <w:rPr>
+          <w:rFonts w:ascii="Consolas" w:eastAsia="Times New Roman" w:hAnsi="Consolas" w:cs="Times New Roman"/>
+          <w:color w:val="BBBEBF"/>
+          <w:kern w:val="0"/>
+          <w:sz w:val="21"/>
+          <w:szCs w:val="21"/>
+          <w:lang w:val="en-US" w:eastAsia="it-IT"/>
+          <w14:ligatures w14:val="none"/>
+        </w:rPr>
+        <w:t xml:space="preserve"> </w:t>
+      </w:r>
+      <w:r>
+        <w:rPr>
+          <w:rFonts w:ascii="Consolas" w:eastAsia="Times New Roman" w:hAnsi="Consolas" w:cs="Times New Roman"/>
+          <w:color w:val="B5CEA8"/>
+          <w:kern w:val="0"/>
+          <w:sz w:val="21"/>
+          <w:szCs w:val="21"/>
+          <w:lang w:val="en-US" w:eastAsia="it-IT"/>
+          <w14:ligatures w14:val="none"/>
+        </w:rPr>
+        <w:t>1</w:t>
+      </w:r>
+      <w:r>
+        <w:rPr>
+          <w:rFonts w:ascii="Consolas" w:eastAsia="Times New Roman" w:hAnsi="Consolas" w:cs="Times New Roman"/>
+          <w:color w:val="BBBEBF"/>
+          <w:kern w:val="0"/>
+          <w:sz w:val="21"/>
+          <w:szCs w:val="21"/>
+          <w:lang w:val="en-US" w:eastAsia="it-IT"/>
+          <w14:ligatures w14:val="none"/>
+        </w:rPr>
+        <w:t>;</w:t>
       </w:r>
     </w:p>
     <w:p>
@@ -431,9 +754,8 @@
           <w:lang w:val="en-US" w:eastAsia="it-IT"/>
           <w14:ligatures w14:val="none"/>
         </w:rPr>
-        <w:t xml:space="preserve">for p in </w:t>
-      </w:r>
-      <w:proofErr w:type="spellStart"/>
+        <w:t>val</w:t>
+      </w:r>
       <w:r>
         <w:rPr>
           <w:rFonts w:ascii="Consolas" w:eastAsia="Times New Roman" w:hAnsi="Consolas" w:cs="Times New Roman"/>
@@ -444,9 +766,8 @@
           <w:lang w:val="en-US" w:eastAsia="it-IT"/>
           <w14:ligatures w14:val="none"/>
         </w:rPr>
-        <w:t>len</w:t>
-      </w:r>
-      <w:proofErr w:type="spellEnd"/>
+        <w:t xml:space="preserve"> </w:t>
+      </w:r>
       <w:r>
         <w:rPr>
           <w:rFonts w:ascii="Consolas" w:eastAsia="Times New Roman" w:hAnsi="Consolas" w:cs="Times New Roman"/>
@@ -457,7 +778,49 @@
           <w:lang w:val="en-US" w:eastAsia="it-IT"/>
           <w14:ligatures w14:val="none"/>
         </w:rPr>
-        <w:t>(str)</w:t>
+        <w:t>= 0;</w:t>
+      </w:r>
+    </w:p>
+    <w:p>
+      <w:pPr>
+        <w:shd w:val="clear" w:color="auto" w:fill="121314"/>
+        <w:spacing w:after="0" w:line="285" w:lineRule="atLeast"/>
+        <w:rPr>
+          <w:rFonts w:ascii="Consolas" w:eastAsia="Times New Roman" w:hAnsi="Consolas" w:cs="Times New Roman"/>
+          <w:color w:val="C9D1D9"/>
+          <w:kern w:val="0"/>
+          <w:sz w:val="21"/>
+          <w:szCs w:val="21"/>
+          <w:lang w:val="en-US" w:eastAsia="it-IT"/>
+          <w14:ligatures w14:val="none"/>
+        </w:rPr>
+      </w:pPr>
+    </w:p>
+    <w:p>
+      <w:pPr>
+        <w:shd w:val="clear" w:color="auto" w:fill="121314"/>
+        <w:spacing w:after="0" w:line="285" w:lineRule="atLeast"/>
+        <w:rPr>
+          <w:rFonts w:ascii="Consolas" w:eastAsia="Times New Roman" w:hAnsi="Consolas" w:cs="Times New Roman"/>
+          <w:color w:val="C9D1D9"/>
+          <w:kern w:val="0"/>
+          <w:sz w:val="21"/>
+          <w:szCs w:val="21"/>
+          <w:lang w:val="en-US" w:eastAsia="it-IT"/>
+          <w14:ligatures w14:val="none"/>
+        </w:rPr>
+      </w:pPr>
+      <w:r>
+        <w:rPr>
+          <w:rFonts w:ascii="Consolas" w:eastAsia="Times New Roman" w:hAnsi="Consolas" w:cs="Times New Roman"/>
+          <w:color w:val="C9D1D9"/>
+          <w:kern w:val="0"/>
+          <w:sz w:val="21"/>
+          <w:szCs w:val="21"/>
+          <w:lang w:val="en-US" w:eastAsia="it-IT"/>
+          <w14:ligatures w14:val="none"/>
+        </w:rPr>
+        <w:t>for p in len(str)</w:t>
       </w:r>
     </w:p>
     <w:p>
@@ -467,6 +830,17 @@
         <w:ind w:firstLine="708"/>
         <w:rPr>
           <w:rFonts w:ascii="Consolas" w:eastAsia="Times New Roman" w:hAnsi="Consolas" w:cs="Times New Roman"/>
+          <w:color w:val="BBBEBF"/>
+          <w:kern w:val="0"/>
+          <w:sz w:val="21"/>
+          <w:szCs w:val="21"/>
+          <w:lang w:val="en-US" w:eastAsia="it-IT"/>
+          <w14:ligatures w14:val="none"/>
+        </w:rPr>
+      </w:pPr>
+      <w:r>
+        <w:rPr>
+          <w:rFonts w:ascii="Consolas" w:eastAsia="Times New Roman" w:hAnsi="Consolas" w:cs="Times New Roman"/>
           <w:color w:val="C9D1D9"/>
           <w:kern w:val="0"/>
           <w:sz w:val="21"/>
@@ -474,483 +848,8 @@
           <w:lang w:val="en-US" w:eastAsia="it-IT"/>
           <w14:ligatures w14:val="none"/>
         </w:rPr>
-      </w:pPr>
-      <w:proofErr w:type="spellStart"/>
-      <w:r>
-        <w:rPr>
-          <w:rFonts w:ascii="Consolas" w:eastAsia="Times New Roman" w:hAnsi="Consolas" w:cs="Times New Roman"/>
-          <w:color w:val="C9D1D9"/>
-          <w:kern w:val="0"/>
-          <w:sz w:val="21"/>
-          <w:szCs w:val="21"/>
-          <w:lang w:val="en-US" w:eastAsia="it-IT"/>
-          <w14:ligatures w14:val="none"/>
-        </w:rPr>
         <w:t>val</w:t>
       </w:r>
-      <w:proofErr w:type="spellEnd"/>
-      <w:r>
-        <w:rPr>
-          <w:rFonts w:ascii="Consolas" w:eastAsia="Times New Roman" w:hAnsi="Consolas" w:cs="Times New Roman"/>
-          <w:color w:val="C9D1D9"/>
-          <w:kern w:val="0"/>
-          <w:sz w:val="21"/>
-          <w:szCs w:val="21"/>
-          <w:lang w:val="en-US" w:eastAsia="it-IT"/>
-          <w14:ligatures w14:val="none"/>
-        </w:rPr>
-        <w:t xml:space="preserve"> </w:t>
-      </w:r>
-      <w:r>
-        <w:rPr>
-          <w:rFonts w:ascii="Consolas" w:eastAsia="Times New Roman" w:hAnsi="Consolas" w:cs="Times New Roman"/>
-          <w:color w:val="D4D4D4"/>
-          <w:kern w:val="0"/>
-          <w:sz w:val="21"/>
-          <w:szCs w:val="21"/>
-          <w:lang w:val="en-US" w:eastAsia="it-IT"/>
-          <w14:ligatures w14:val="none"/>
-        </w:rPr>
-        <w:t>*</w:t>
-      </w:r>
-      <w:r>
-        <w:rPr>
-          <w:rFonts w:ascii="Consolas" w:eastAsia="Times New Roman" w:hAnsi="Consolas" w:cs="Times New Roman"/>
-          <w:color w:val="D4D4D4"/>
-          <w:kern w:val="0"/>
-          <w:sz w:val="21"/>
-          <w:szCs w:val="21"/>
-          <w:lang w:val="en-US" w:eastAsia="it-IT"/>
-          <w14:ligatures w14:val="none"/>
-        </w:rPr>
-        <w:t>=</w:t>
-      </w:r>
-      <w:r>
-        <w:rPr>
-          <w:rFonts w:ascii="Consolas" w:eastAsia="Times New Roman" w:hAnsi="Consolas" w:cs="Times New Roman"/>
-          <w:color w:val="C9D1D9"/>
-          <w:kern w:val="0"/>
-          <w:sz w:val="21"/>
-          <w:szCs w:val="21"/>
-          <w:lang w:val="en-US" w:eastAsia="it-IT"/>
-          <w14:ligatures w14:val="none"/>
-        </w:rPr>
-        <w:t xml:space="preserve"> </w:t>
-      </w:r>
-      <w:r>
-        <w:rPr>
-          <w:rFonts w:ascii="Consolas" w:eastAsia="Times New Roman" w:hAnsi="Consolas" w:cs="Times New Roman"/>
-          <w:color w:val="C9D1D9"/>
-          <w:kern w:val="0"/>
-          <w:sz w:val="21"/>
-          <w:szCs w:val="21"/>
-          <w:lang w:val="en-US" w:eastAsia="it-IT"/>
-          <w14:ligatures w14:val="none"/>
-        </w:rPr>
-        <w:t>10</w:t>
-      </w:r>
-      <w:r>
-        <w:rPr>
-          <w:rFonts w:ascii="Consolas" w:eastAsia="Times New Roman" w:hAnsi="Consolas" w:cs="Times New Roman"/>
-          <w:color w:val="C9D1D9"/>
-          <w:kern w:val="0"/>
-          <w:sz w:val="21"/>
-          <w:szCs w:val="21"/>
-          <w:lang w:val="en-US" w:eastAsia="it-IT"/>
-          <w14:ligatures w14:val="none"/>
-        </w:rPr>
-        <w:t>;</w:t>
-      </w:r>
-    </w:p>
-    <w:p>
-      <w:pPr>
-        <w:shd w:val="clear" w:color="auto" w:fill="121314"/>
-        <w:spacing w:after="0" w:line="285" w:lineRule="atLeast"/>
-        <w:ind w:firstLine="708"/>
-        <w:rPr>
-          <w:rFonts w:ascii="Consolas" w:eastAsia="Times New Roman" w:hAnsi="Consolas" w:cs="Times New Roman"/>
-          <w:color w:val="BBBEBF"/>
-          <w:kern w:val="0"/>
-          <w:sz w:val="21"/>
-          <w:szCs w:val="21"/>
-          <w:lang w:val="en-US" w:eastAsia="it-IT"/>
-          <w14:ligatures w14:val="none"/>
-        </w:rPr>
-      </w:pPr>
-      <w:proofErr w:type="spellStart"/>
-      <w:r>
-        <w:rPr>
-          <w:rFonts w:ascii="Consolas" w:eastAsia="Times New Roman" w:hAnsi="Consolas" w:cs="Times New Roman"/>
-          <w:color w:val="C9D1D9"/>
-          <w:kern w:val="0"/>
-          <w:sz w:val="21"/>
-          <w:szCs w:val="21"/>
-          <w:lang w:val="en-US" w:eastAsia="it-IT"/>
-          <w14:ligatures w14:val="none"/>
-        </w:rPr>
-        <w:t>val</w:t>
-      </w:r>
-      <w:proofErr w:type="spellEnd"/>
-      <w:r>
-        <w:rPr>
-          <w:rFonts w:ascii="Consolas" w:eastAsia="Times New Roman" w:hAnsi="Consolas" w:cs="Times New Roman"/>
-          <w:color w:val="C9D1D9"/>
-          <w:kern w:val="0"/>
-          <w:sz w:val="21"/>
-          <w:szCs w:val="21"/>
-          <w:lang w:val="en-US" w:eastAsia="it-IT"/>
-          <w14:ligatures w14:val="none"/>
-        </w:rPr>
-        <w:t xml:space="preserve"> += (</w:t>
-      </w:r>
-      <w:r>
-        <w:rPr>
-          <w:rFonts w:ascii="Consolas" w:eastAsia="Times New Roman" w:hAnsi="Consolas" w:cs="Times New Roman"/>
-          <w:color w:val="FFA657"/>
-          <w:kern w:val="0"/>
-          <w:sz w:val="21"/>
-          <w:szCs w:val="21"/>
-          <w:lang w:val="en-US" w:eastAsia="it-IT"/>
-          <w14:ligatures w14:val="none"/>
-        </w:rPr>
-        <w:t>str</w:t>
-      </w:r>
-      <w:r>
-        <w:rPr>
-          <w:rFonts w:ascii="Consolas" w:eastAsia="Times New Roman" w:hAnsi="Consolas" w:cs="Times New Roman"/>
-          <w:color w:val="C9D1D9"/>
-          <w:kern w:val="0"/>
-          <w:sz w:val="21"/>
-          <w:szCs w:val="21"/>
-          <w:lang w:val="en-US" w:eastAsia="it-IT"/>
-          <w14:ligatures w14:val="none"/>
-        </w:rPr>
-        <w:t xml:space="preserve">[p] </w:t>
-      </w:r>
-      <w:r>
-        <w:rPr>
-          <w:rFonts w:ascii="Consolas" w:eastAsia="Times New Roman" w:hAnsi="Consolas" w:cs="Times New Roman"/>
-          <w:color w:val="D4D4D4"/>
-          <w:kern w:val="0"/>
-          <w:sz w:val="21"/>
-          <w:szCs w:val="21"/>
-          <w:lang w:val="en-US" w:eastAsia="it-IT"/>
-          <w14:ligatures w14:val="none"/>
-        </w:rPr>
-        <w:t>-</w:t>
-      </w:r>
-      <w:r>
-        <w:rPr>
-          <w:rFonts w:ascii="Consolas" w:eastAsia="Times New Roman" w:hAnsi="Consolas" w:cs="Times New Roman"/>
-          <w:color w:val="C9D1D9"/>
-          <w:kern w:val="0"/>
-          <w:sz w:val="21"/>
-          <w:szCs w:val="21"/>
-          <w:lang w:val="en-US" w:eastAsia="it-IT"/>
-          <w14:ligatures w14:val="none"/>
-        </w:rPr>
-        <w:t xml:space="preserve"> </w:t>
-      </w:r>
-      <w:r>
-        <w:rPr>
-          <w:rFonts w:ascii="Consolas" w:eastAsia="Times New Roman" w:hAnsi="Consolas" w:cs="Times New Roman"/>
-          <w:color w:val="A5D6FF"/>
-          <w:kern w:val="0"/>
-          <w:sz w:val="21"/>
-          <w:szCs w:val="21"/>
-          <w:lang w:val="en-US" w:eastAsia="it-IT"/>
-          <w14:ligatures w14:val="none"/>
-        </w:rPr>
-        <w:t>'0'</w:t>
-      </w:r>
-      <w:r>
-        <w:rPr>
-          <w:rFonts w:ascii="Consolas" w:eastAsia="Times New Roman" w:hAnsi="Consolas" w:cs="Times New Roman"/>
-          <w:color w:val="C9D1D9"/>
-          <w:kern w:val="0"/>
-          <w:sz w:val="21"/>
-          <w:szCs w:val="21"/>
-          <w:lang w:val="en-US" w:eastAsia="it-IT"/>
-          <w14:ligatures w14:val="none"/>
-        </w:rPr>
-        <w:t>)</w:t>
-      </w:r>
-      <w:r>
-        <w:rPr>
-          <w:rFonts w:ascii="Consolas" w:eastAsia="Times New Roman" w:hAnsi="Consolas" w:cs="Times New Roman"/>
-          <w:color w:val="C9D1D9"/>
-          <w:kern w:val="0"/>
-          <w:sz w:val="21"/>
-          <w:szCs w:val="21"/>
-          <w:lang w:val="en-US" w:eastAsia="it-IT"/>
-          <w14:ligatures w14:val="none"/>
-        </w:rPr>
-        <w:t>;</w:t>
-      </w:r>
-    </w:p>
-    <w:p>
-      <w:pPr>
-        <w:rPr>
-          <w:lang w:val="en-US"/>
-        </w:rPr>
-      </w:pPr>
-    </w:p>
-    <w:p>
-      <w:pPr>
-        <w:rPr>
-          <w:b/>
-          <w:bCs/>
-          <w:color w:val="C00000"/>
-          <w:lang w:val="en-US"/>
-        </w:rPr>
-      </w:pPr>
-      <w:r>
-        <w:rPr>
-          <w:b/>
-          <w:bCs/>
-          <w:color w:val="C00000"/>
-          <w:lang w:val="en-US"/>
-        </w:rPr>
-        <w:t>CONVERT STRING INTO INT READING FROM RIGHT TO LEFT:</w:t>
-      </w:r>
-    </w:p>
-    <w:p>
-      <w:pPr>
-        <w:shd w:val="clear" w:color="auto" w:fill="121314"/>
-        <w:spacing w:after="0" w:line="285" w:lineRule="atLeast"/>
-        <w:rPr>
-          <w:rFonts w:ascii="Consolas" w:eastAsia="Times New Roman" w:hAnsi="Consolas" w:cs="Times New Roman"/>
-          <w:color w:val="BBBEBF"/>
-          <w:kern w:val="0"/>
-          <w:sz w:val="21"/>
-          <w:szCs w:val="21"/>
-          <w:lang w:val="en-US" w:eastAsia="it-IT"/>
-          <w14:ligatures w14:val="none"/>
-        </w:rPr>
-      </w:pPr>
-      <w:r>
-        <w:rPr>
-          <w:rFonts w:ascii="Consolas" w:eastAsia="Times New Roman" w:hAnsi="Consolas" w:cs="Times New Roman"/>
-          <w:color w:val="C9D1D9"/>
-          <w:kern w:val="0"/>
-          <w:sz w:val="21"/>
-          <w:szCs w:val="21"/>
-          <w:lang w:val="en-US" w:eastAsia="it-IT"/>
-          <w14:ligatures w14:val="none"/>
-        </w:rPr>
-        <w:t>multiplier</w:t>
-      </w:r>
-      <w:r>
-        <w:rPr>
-          <w:rFonts w:ascii="Consolas" w:eastAsia="Times New Roman" w:hAnsi="Consolas" w:cs="Times New Roman"/>
-          <w:color w:val="BBBEBF"/>
-          <w:kern w:val="0"/>
-          <w:sz w:val="21"/>
-          <w:szCs w:val="21"/>
-          <w:lang w:val="en-US" w:eastAsia="it-IT"/>
-          <w14:ligatures w14:val="none"/>
-        </w:rPr>
-        <w:t xml:space="preserve"> </w:t>
-      </w:r>
-      <w:r>
-        <w:rPr>
-          <w:rFonts w:ascii="Consolas" w:eastAsia="Times New Roman" w:hAnsi="Consolas" w:cs="Times New Roman"/>
-          <w:color w:val="D4D4D4"/>
-          <w:kern w:val="0"/>
-          <w:sz w:val="21"/>
-          <w:szCs w:val="21"/>
-          <w:lang w:val="en-US" w:eastAsia="it-IT"/>
-          <w14:ligatures w14:val="none"/>
-        </w:rPr>
-        <w:t>=</w:t>
-      </w:r>
-      <w:r>
-        <w:rPr>
-          <w:rFonts w:ascii="Consolas" w:eastAsia="Times New Roman" w:hAnsi="Consolas" w:cs="Times New Roman"/>
-          <w:color w:val="BBBEBF"/>
-          <w:kern w:val="0"/>
-          <w:sz w:val="21"/>
-          <w:szCs w:val="21"/>
-          <w:lang w:val="en-US" w:eastAsia="it-IT"/>
-          <w14:ligatures w14:val="none"/>
-        </w:rPr>
-        <w:t xml:space="preserve"> </w:t>
-      </w:r>
-      <w:r>
-        <w:rPr>
-          <w:rFonts w:ascii="Consolas" w:eastAsia="Times New Roman" w:hAnsi="Consolas" w:cs="Times New Roman"/>
-          <w:color w:val="B5CEA8"/>
-          <w:kern w:val="0"/>
-          <w:sz w:val="21"/>
-          <w:szCs w:val="21"/>
-          <w:lang w:val="en-US" w:eastAsia="it-IT"/>
-          <w14:ligatures w14:val="none"/>
-        </w:rPr>
-        <w:t>1</w:t>
-      </w:r>
-      <w:r>
-        <w:rPr>
-          <w:rFonts w:ascii="Consolas" w:eastAsia="Times New Roman" w:hAnsi="Consolas" w:cs="Times New Roman"/>
-          <w:color w:val="BBBEBF"/>
-          <w:kern w:val="0"/>
-          <w:sz w:val="21"/>
-          <w:szCs w:val="21"/>
-          <w:lang w:val="en-US" w:eastAsia="it-IT"/>
-          <w14:ligatures w14:val="none"/>
-        </w:rPr>
-        <w:t>;</w:t>
-      </w:r>
-    </w:p>
-    <w:p>
-      <w:pPr>
-        <w:shd w:val="clear" w:color="auto" w:fill="121314"/>
-        <w:spacing w:after="0" w:line="285" w:lineRule="atLeast"/>
-        <w:rPr>
-          <w:rFonts w:ascii="Consolas" w:eastAsia="Times New Roman" w:hAnsi="Consolas" w:cs="Times New Roman"/>
-          <w:color w:val="C9D1D9"/>
-          <w:kern w:val="0"/>
-          <w:sz w:val="21"/>
-          <w:szCs w:val="21"/>
-          <w:lang w:val="en-US" w:eastAsia="it-IT"/>
-          <w14:ligatures w14:val="none"/>
-        </w:rPr>
-      </w:pPr>
-      <w:proofErr w:type="spellStart"/>
-      <w:r>
-        <w:rPr>
-          <w:rFonts w:ascii="Consolas" w:eastAsia="Times New Roman" w:hAnsi="Consolas" w:cs="Times New Roman"/>
-          <w:color w:val="C9D1D9"/>
-          <w:kern w:val="0"/>
-          <w:sz w:val="21"/>
-          <w:szCs w:val="21"/>
-          <w:lang w:val="en-US" w:eastAsia="it-IT"/>
-          <w14:ligatures w14:val="none"/>
-        </w:rPr>
-        <w:t>val</w:t>
-      </w:r>
-      <w:proofErr w:type="spellEnd"/>
-      <w:r>
-        <w:rPr>
-          <w:rFonts w:ascii="Consolas" w:eastAsia="Times New Roman" w:hAnsi="Consolas" w:cs="Times New Roman"/>
-          <w:color w:val="C9D1D9"/>
-          <w:kern w:val="0"/>
-          <w:sz w:val="21"/>
-          <w:szCs w:val="21"/>
-          <w:lang w:val="en-US" w:eastAsia="it-IT"/>
-          <w14:ligatures w14:val="none"/>
-        </w:rPr>
-        <w:t xml:space="preserve"> </w:t>
-      </w:r>
-      <w:r>
-        <w:rPr>
-          <w:rFonts w:ascii="Consolas" w:eastAsia="Times New Roman" w:hAnsi="Consolas" w:cs="Times New Roman"/>
-          <w:color w:val="C9D1D9"/>
-          <w:kern w:val="0"/>
-          <w:sz w:val="21"/>
-          <w:szCs w:val="21"/>
-          <w:lang w:val="en-US" w:eastAsia="it-IT"/>
-          <w14:ligatures w14:val="none"/>
-        </w:rPr>
-        <w:t>= 0;</w:t>
-      </w:r>
-    </w:p>
-    <w:p>
-      <w:pPr>
-        <w:shd w:val="clear" w:color="auto" w:fill="121314"/>
-        <w:spacing w:after="0" w:line="285" w:lineRule="atLeast"/>
-        <w:rPr>
-          <w:rFonts w:ascii="Consolas" w:eastAsia="Times New Roman" w:hAnsi="Consolas" w:cs="Times New Roman"/>
-          <w:color w:val="C9D1D9"/>
-          <w:kern w:val="0"/>
-          <w:sz w:val="21"/>
-          <w:szCs w:val="21"/>
-          <w:lang w:val="en-US" w:eastAsia="it-IT"/>
-          <w14:ligatures w14:val="none"/>
-        </w:rPr>
-      </w:pPr>
-    </w:p>
-    <w:p>
-      <w:pPr>
-        <w:shd w:val="clear" w:color="auto" w:fill="121314"/>
-        <w:spacing w:after="0" w:line="285" w:lineRule="atLeast"/>
-        <w:rPr>
-          <w:rFonts w:ascii="Consolas" w:eastAsia="Times New Roman" w:hAnsi="Consolas" w:cs="Times New Roman"/>
-          <w:color w:val="C9D1D9"/>
-          <w:kern w:val="0"/>
-          <w:sz w:val="21"/>
-          <w:szCs w:val="21"/>
-          <w:lang w:val="en-US" w:eastAsia="it-IT"/>
-          <w14:ligatures w14:val="none"/>
-        </w:rPr>
-      </w:pPr>
-      <w:r>
-        <w:rPr>
-          <w:rFonts w:ascii="Consolas" w:eastAsia="Times New Roman" w:hAnsi="Consolas" w:cs="Times New Roman"/>
-          <w:color w:val="C9D1D9"/>
-          <w:kern w:val="0"/>
-          <w:sz w:val="21"/>
-          <w:szCs w:val="21"/>
-          <w:lang w:val="en-US" w:eastAsia="it-IT"/>
-          <w14:ligatures w14:val="none"/>
-        </w:rPr>
-        <w:t xml:space="preserve">for p in </w:t>
-      </w:r>
-      <w:proofErr w:type="spellStart"/>
-      <w:r>
-        <w:rPr>
-          <w:rFonts w:ascii="Consolas" w:eastAsia="Times New Roman" w:hAnsi="Consolas" w:cs="Times New Roman"/>
-          <w:color w:val="C9D1D9"/>
-          <w:kern w:val="0"/>
-          <w:sz w:val="21"/>
-          <w:szCs w:val="21"/>
-          <w:lang w:val="en-US" w:eastAsia="it-IT"/>
-          <w14:ligatures w14:val="none"/>
-        </w:rPr>
-        <w:t>len</w:t>
-      </w:r>
-      <w:proofErr w:type="spellEnd"/>
-      <w:r>
-        <w:rPr>
-          <w:rFonts w:ascii="Consolas" w:eastAsia="Times New Roman" w:hAnsi="Consolas" w:cs="Times New Roman"/>
-          <w:color w:val="C9D1D9"/>
-          <w:kern w:val="0"/>
-          <w:sz w:val="21"/>
-          <w:szCs w:val="21"/>
-          <w:lang w:val="en-US" w:eastAsia="it-IT"/>
-          <w14:ligatures w14:val="none"/>
-        </w:rPr>
-        <w:t>(str)</w:t>
-      </w:r>
-    </w:p>
-    <w:p>
-      <w:pPr>
-        <w:shd w:val="clear" w:color="auto" w:fill="121314"/>
-        <w:spacing w:after="0" w:line="285" w:lineRule="atLeast"/>
-        <w:ind w:firstLine="708"/>
-        <w:rPr>
-          <w:rFonts w:ascii="Consolas" w:eastAsia="Times New Roman" w:hAnsi="Consolas" w:cs="Times New Roman"/>
-          <w:color w:val="BBBEBF"/>
-          <w:kern w:val="0"/>
-          <w:sz w:val="21"/>
-          <w:szCs w:val="21"/>
-          <w:lang w:val="en-US" w:eastAsia="it-IT"/>
-          <w14:ligatures w14:val="none"/>
-        </w:rPr>
-      </w:pPr>
-      <w:proofErr w:type="spellStart"/>
-      <w:r>
-        <w:rPr>
-          <w:rFonts w:ascii="Consolas" w:eastAsia="Times New Roman" w:hAnsi="Consolas" w:cs="Times New Roman"/>
-          <w:color w:val="C9D1D9"/>
-          <w:kern w:val="0"/>
-          <w:sz w:val="21"/>
-          <w:szCs w:val="21"/>
-          <w:lang w:val="en-US" w:eastAsia="it-IT"/>
-          <w14:ligatures w14:val="none"/>
-        </w:rPr>
-        <w:t>val</w:t>
-      </w:r>
-      <w:proofErr w:type="spellEnd"/>
       <w:r>
         <w:rPr>
           <w:rFonts w:ascii="Consolas" w:eastAsia="Times New Roman" w:hAnsi="Consolas" w:cs="Times New Roman"/>
@@ -1495,7 +1394,6 @@
           <w14:ligatures w14:val="none"/>
         </w:rPr>
       </w:pPr>
-      <w:proofErr w:type="gramStart"/>
       <w:r>
         <w:rPr>
           <w:rFonts w:ascii="Consolas" w:eastAsia="Times New Roman" w:hAnsi="Consolas" w:cs="Times New Roman"/>
@@ -1508,82 +1406,7 @@
           <w:lang w:val="en-US" w:eastAsia="it-IT"/>
           <w14:ligatures w14:val="none"/>
         </w:rPr>
-        <w:t>#!SERIALIZATION</w:t>
-      </w:r>
-      <w:proofErr w:type="gramEnd"/>
-      <w:r>
-        <w:rPr>
-          <w:rFonts w:ascii="Consolas" w:eastAsia="Times New Roman" w:hAnsi="Consolas" w:cs="Times New Roman"/>
-          <w:b/>
-          <w:bCs/>
-          <w:color w:val="EE0000"/>
-          <w:kern w:val="0"/>
-          <w:sz w:val="21"/>
-          <w:szCs w:val="21"/>
-          <w:lang w:val="en-US" w:eastAsia="it-IT"/>
-          <w14:ligatures w14:val="none"/>
-        </w:rPr>
-        <w:t xml:space="preserve"> + PATTERN MATCHING --&gt; </w:t>
-      </w:r>
-      <w:proofErr w:type="gramStart"/>
-      <w:r>
-        <w:rPr>
-          <w:rFonts w:ascii="Consolas" w:eastAsia="Times New Roman" w:hAnsi="Consolas" w:cs="Times New Roman"/>
-          <w:b/>
-          <w:bCs/>
-          <w:color w:val="EE0000"/>
-          <w:kern w:val="0"/>
-          <w:sz w:val="21"/>
-          <w:szCs w:val="21"/>
-          <w:lang w:val="en-US" w:eastAsia="it-IT"/>
-          <w14:ligatures w14:val="none"/>
-        </w:rPr>
-        <w:t>O(</w:t>
-      </w:r>
-      <w:proofErr w:type="gramEnd"/>
-      <w:r>
-        <w:rPr>
-          <w:rFonts w:ascii="Consolas" w:eastAsia="Times New Roman" w:hAnsi="Consolas" w:cs="Times New Roman"/>
-          <w:b/>
-          <w:bCs/>
-          <w:color w:val="EE0000"/>
-          <w:kern w:val="0"/>
-          <w:sz w:val="21"/>
-          <w:szCs w:val="21"/>
-          <w:lang w:val="en-US" w:eastAsia="it-IT"/>
-          <w14:ligatures w14:val="none"/>
-        </w:rPr>
-        <w:t xml:space="preserve">N + M) time and </w:t>
-      </w:r>
-      <w:proofErr w:type="gramStart"/>
-      <w:r>
-        <w:rPr>
-          <w:rFonts w:ascii="Consolas" w:eastAsia="Times New Roman" w:hAnsi="Consolas" w:cs="Times New Roman"/>
-          <w:b/>
-          <w:bCs/>
-          <w:color w:val="EE0000"/>
-          <w:kern w:val="0"/>
-          <w:sz w:val="21"/>
-          <w:szCs w:val="21"/>
-          <w:lang w:val="en-US" w:eastAsia="it-IT"/>
-          <w14:ligatures w14:val="none"/>
-        </w:rPr>
-        <w:t>O(</w:t>
-      </w:r>
-      <w:proofErr w:type="gramEnd"/>
-      <w:r>
-        <w:rPr>
-          <w:rFonts w:ascii="Consolas" w:eastAsia="Times New Roman" w:hAnsi="Consolas" w:cs="Times New Roman"/>
-          <w:b/>
-          <w:bCs/>
-          <w:color w:val="EE0000"/>
-          <w:kern w:val="0"/>
-          <w:sz w:val="21"/>
-          <w:szCs w:val="21"/>
-          <w:lang w:val="en-US" w:eastAsia="it-IT"/>
-          <w14:ligatures w14:val="none"/>
-        </w:rPr>
-        <w:t>N + M) space</w:t>
+        <w:t>#!SERIALIZATION + PATTERN MATCHING --&gt; O(N + M) time and O(N + M) space</w:t>
       </w:r>
     </w:p>
     <w:p>
@@ -1699,7 +1522,6 @@
         </w:rPr>
         <w:t xml:space="preserve"> </w:t>
       </w:r>
-      <w:proofErr w:type="gramStart"/>
       <w:r>
         <w:rPr>
           <w:rFonts w:ascii="Consolas" w:eastAsia="Times New Roman" w:hAnsi="Consolas" w:cs="Times New Roman"/>
@@ -1724,7 +1546,6 @@
         </w:rPr>
         <w:t>(</w:t>
       </w:r>
-      <w:proofErr w:type="gramEnd"/>
       <w:r>
         <w:rPr>
           <w:rFonts w:ascii="Consolas" w:eastAsia="Times New Roman" w:hAnsi="Consolas" w:cs="Times New Roman"/>
@@ -1773,7 +1594,6 @@
         </w:rPr>
         <w:t xml:space="preserve">: </w:t>
       </w:r>
-      <w:proofErr w:type="gramStart"/>
       <w:r>
         <w:rPr>
           <w:rFonts w:ascii="Consolas" w:eastAsia="Times New Roman" w:hAnsi="Consolas" w:cs="Times New Roman"/>
@@ -1798,8 +1618,6 @@
         </w:rPr>
         <w:t>[</w:t>
       </w:r>
-      <w:proofErr w:type="spellStart"/>
-      <w:proofErr w:type="gramEnd"/>
       <w:r>
         <w:rPr>
           <w:rFonts w:ascii="Consolas" w:eastAsia="Times New Roman" w:hAnsi="Consolas" w:cs="Times New Roman"/>
@@ -1812,7 +1630,6 @@
         </w:rPr>
         <w:t>TreeNode</w:t>
       </w:r>
-      <w:proofErr w:type="spellEnd"/>
       <w:r>
         <w:rPr>
           <w:rFonts w:ascii="Consolas" w:eastAsia="Times New Roman" w:hAnsi="Consolas" w:cs="Times New Roman"/>
@@ -2033,22 +1850,8 @@
           <w:lang w:val="en-US" w:eastAsia="it-IT"/>
           <w14:ligatures w14:val="none"/>
         </w:rPr>
-        <w:t>"</w:t>
-      </w:r>
-      <w:proofErr w:type="gramStart"/>
-      <w:r>
-        <w:rPr>
-          <w:rFonts w:ascii="Consolas" w:eastAsia="Times New Roman" w:hAnsi="Consolas" w:cs="Times New Roman"/>
-          <w:color w:val="A5D6FF"/>
-          <w:kern w:val="0"/>
-          <w:sz w:val="21"/>
-          <w:szCs w:val="21"/>
-          <w:lang w:val="en-US" w:eastAsia="it-IT"/>
-          <w14:ligatures w14:val="none"/>
-        </w:rPr>
-        <w:t>$#"</w:t>
-      </w:r>
-      <w:proofErr w:type="gramEnd"/>
+        <w:t>"$#"</w:t>
+      </w:r>
     </w:p>
     <w:p>
       <w:pPr>
@@ -2172,7 +1975,6 @@
         </w:rPr>
         <w:t>(</w:t>
       </w:r>
-      <w:proofErr w:type="spellStart"/>
       <w:r>
         <w:rPr>
           <w:rFonts w:ascii="Consolas" w:eastAsia="Times New Roman" w:hAnsi="Consolas" w:cs="Times New Roman"/>
@@ -2195,20 +1997,7 @@
           <w:lang w:val="en-US" w:eastAsia="it-IT"/>
           <w14:ligatures w14:val="none"/>
         </w:rPr>
-        <w:t>.val</w:t>
-      </w:r>
-      <w:proofErr w:type="spellEnd"/>
-      <w:r>
-        <w:rPr>
-          <w:rFonts w:ascii="Consolas" w:eastAsia="Times New Roman" w:hAnsi="Consolas" w:cs="Times New Roman"/>
-          <w:color w:val="BBBEBF"/>
-          <w:kern w:val="0"/>
-          <w:sz w:val="21"/>
-          <w:szCs w:val="21"/>
-          <w:lang w:val="en-US" w:eastAsia="it-IT"/>
-          <w14:ligatures w14:val="none"/>
-        </w:rPr>
-        <w:t xml:space="preserve">) </w:t>
+        <w:t xml:space="preserve">.val) </w:t>
       </w:r>
       <w:r>
         <w:rPr>
@@ -2234,8 +2023,6 @@
         </w:rPr>
         <w:t xml:space="preserve"> </w:t>
       </w:r>
-      <w:proofErr w:type="spellStart"/>
-      <w:proofErr w:type="gramStart"/>
       <w:r>
         <w:rPr>
           <w:rFonts w:ascii="Consolas" w:eastAsia="Times New Roman" w:hAnsi="Consolas" w:cs="Times New Roman"/>
@@ -2272,8 +2059,6 @@
         </w:rPr>
         <w:t>serialize</w:t>
       </w:r>
-      <w:proofErr w:type="spellEnd"/>
-      <w:proofErr w:type="gramEnd"/>
       <w:r>
         <w:rPr>
           <w:rFonts w:ascii="Consolas" w:eastAsia="Times New Roman" w:hAnsi="Consolas" w:cs="Times New Roman"/>
@@ -2286,8 +2071,6 @@
         </w:rPr>
         <w:t>(</w:t>
       </w:r>
-      <w:proofErr w:type="spellStart"/>
-      <w:proofErr w:type="gramStart"/>
       <w:r>
         <w:rPr>
           <w:rFonts w:ascii="Consolas" w:eastAsia="Times New Roman" w:hAnsi="Consolas" w:cs="Times New Roman"/>
@@ -2310,21 +2093,7 @@
           <w:lang w:val="en-US" w:eastAsia="it-IT"/>
           <w14:ligatures w14:val="none"/>
         </w:rPr>
-        <w:t>.left</w:t>
-      </w:r>
-      <w:proofErr w:type="spellEnd"/>
-      <w:proofErr w:type="gramEnd"/>
-      <w:r>
-        <w:rPr>
-          <w:rFonts w:ascii="Consolas" w:eastAsia="Times New Roman" w:hAnsi="Consolas" w:cs="Times New Roman"/>
-          <w:color w:val="BBBEBF"/>
-          <w:kern w:val="0"/>
-          <w:sz w:val="21"/>
-          <w:szCs w:val="21"/>
-          <w:lang w:val="en-US" w:eastAsia="it-IT"/>
-          <w14:ligatures w14:val="none"/>
-        </w:rPr>
-        <w:t xml:space="preserve">) </w:t>
+        <w:t xml:space="preserve">.left) </w:t>
       </w:r>
       <w:r>
         <w:rPr>
@@ -2350,8 +2119,6 @@
         </w:rPr>
         <w:t xml:space="preserve"> </w:t>
       </w:r>
-      <w:proofErr w:type="spellStart"/>
-      <w:proofErr w:type="gramStart"/>
       <w:r>
         <w:rPr>
           <w:rFonts w:ascii="Consolas" w:eastAsia="Times New Roman" w:hAnsi="Consolas" w:cs="Times New Roman"/>
@@ -2388,8 +2155,6 @@
         </w:rPr>
         <w:t>serialize</w:t>
       </w:r>
-      <w:proofErr w:type="spellEnd"/>
-      <w:proofErr w:type="gramEnd"/>
       <w:r>
         <w:rPr>
           <w:rFonts w:ascii="Consolas" w:eastAsia="Times New Roman" w:hAnsi="Consolas" w:cs="Times New Roman"/>
@@ -2402,8 +2167,6 @@
         </w:rPr>
         <w:t>(</w:t>
       </w:r>
-      <w:proofErr w:type="spellStart"/>
-      <w:proofErr w:type="gramStart"/>
       <w:r>
         <w:rPr>
           <w:rFonts w:ascii="Consolas" w:eastAsia="Times New Roman" w:hAnsi="Consolas" w:cs="Times New Roman"/>
@@ -2426,21 +2189,7 @@
           <w:lang w:val="en-US" w:eastAsia="it-IT"/>
           <w14:ligatures w14:val="none"/>
         </w:rPr>
-        <w:t>.right</w:t>
-      </w:r>
-      <w:proofErr w:type="spellEnd"/>
-      <w:proofErr w:type="gramEnd"/>
-      <w:r>
-        <w:rPr>
-          <w:rFonts w:ascii="Consolas" w:eastAsia="Times New Roman" w:hAnsi="Consolas" w:cs="Times New Roman"/>
-          <w:color w:val="BBBEBF"/>
-          <w:kern w:val="0"/>
-          <w:sz w:val="21"/>
-          <w:szCs w:val="21"/>
-          <w:lang w:val="en-US" w:eastAsia="it-IT"/>
-          <w14:ligatures w14:val="none"/>
-        </w:rPr>
-        <w:t>))</w:t>
+        <w:t>.right))</w:t>
       </w:r>
     </w:p>
     <w:p>
@@ -2508,7 +2257,6 @@
         </w:rPr>
         <w:t xml:space="preserve"> </w:t>
       </w:r>
-      <w:proofErr w:type="spellStart"/>
       <w:r>
         <w:rPr>
           <w:rFonts w:ascii="Consolas" w:eastAsia="Times New Roman" w:hAnsi="Consolas" w:cs="Times New Roman"/>
@@ -2519,22 +2267,8 @@
           <w:lang w:val="en-US" w:eastAsia="it-IT"/>
           <w14:ligatures w14:val="none"/>
         </w:rPr>
-        <w:t>z_</w:t>
-      </w:r>
-      <w:proofErr w:type="gramStart"/>
-      <w:r>
-        <w:rPr>
-          <w:rFonts w:ascii="Consolas" w:eastAsia="Times New Roman" w:hAnsi="Consolas" w:cs="Times New Roman"/>
-          <w:color w:val="D2A8FF"/>
-          <w:kern w:val="0"/>
-          <w:sz w:val="21"/>
-          <w:szCs w:val="21"/>
-          <w:lang w:val="en-US" w:eastAsia="it-IT"/>
-          <w14:ligatures w14:val="none"/>
-        </w:rPr>
-        <w:t>function</w:t>
-      </w:r>
-      <w:proofErr w:type="spellEnd"/>
+        <w:t>z_function</w:t>
+      </w:r>
       <w:r>
         <w:rPr>
           <w:rFonts w:ascii="Consolas" w:eastAsia="Times New Roman" w:hAnsi="Consolas" w:cs="Times New Roman"/>
@@ -2547,7 +2281,6 @@
         </w:rPr>
         <w:t>(</w:t>
       </w:r>
-      <w:proofErr w:type="gramEnd"/>
       <w:r>
         <w:rPr>
           <w:rFonts w:ascii="Consolas" w:eastAsia="Times New Roman" w:hAnsi="Consolas" w:cs="Times New Roman"/>
@@ -2767,7 +2500,6 @@
         </w:rPr>
         <w:t xml:space="preserve"> </w:t>
       </w:r>
-      <w:proofErr w:type="spellStart"/>
       <w:r>
         <w:rPr>
           <w:rFonts w:ascii="Consolas" w:eastAsia="Times New Roman" w:hAnsi="Consolas" w:cs="Times New Roman"/>
@@ -2780,7 +2512,6 @@
         </w:rPr>
         <w:t>len</w:t>
       </w:r>
-      <w:proofErr w:type="spellEnd"/>
       <w:r>
         <w:rPr>
           <w:rFonts w:ascii="Consolas" w:eastAsia="Times New Roman" w:hAnsi="Consolas" w:cs="Times New Roman"/>
@@ -3003,7 +2734,6 @@
         </w:rPr>
         <w:t xml:space="preserve">, </w:t>
       </w:r>
-      <w:proofErr w:type="spellStart"/>
       <w:r>
         <w:rPr>
           <w:rFonts w:ascii="Consolas" w:eastAsia="Times New Roman" w:hAnsi="Consolas" w:cs="Times New Roman"/>
@@ -3016,7 +2746,6 @@
         </w:rPr>
         <w:t>len</w:t>
       </w:r>
-      <w:proofErr w:type="spellEnd"/>
       <w:r>
         <w:rPr>
           <w:rFonts w:ascii="Consolas" w:eastAsia="Times New Roman" w:hAnsi="Consolas" w:cs="Times New Roman"/>
@@ -3119,7 +2848,6 @@
         </w:rPr>
         <w:t xml:space="preserve"> </w:t>
       </w:r>
-      <w:proofErr w:type="spellStart"/>
       <w:r>
         <w:rPr>
           <w:rFonts w:ascii="Consolas" w:eastAsia="Times New Roman" w:hAnsi="Consolas" w:cs="Times New Roman"/>
@@ -3132,7 +2860,6 @@
         </w:rPr>
         <w:t>i</w:t>
       </w:r>
-      <w:proofErr w:type="spellEnd"/>
       <w:r>
         <w:rPr>
           <w:rFonts w:ascii="Consolas" w:eastAsia="Times New Roman" w:hAnsi="Consolas" w:cs="Times New Roman"/>
@@ -3169,7 +2896,6 @@
         </w:rPr>
         <w:t xml:space="preserve"> </w:t>
       </w:r>
-      <w:proofErr w:type="gramStart"/>
       <w:r>
         <w:rPr>
           <w:rFonts w:ascii="Consolas" w:eastAsia="Times New Roman" w:hAnsi="Consolas" w:cs="Times New Roman"/>
@@ -3194,7 +2920,6 @@
         </w:rPr>
         <w:t>(</w:t>
       </w:r>
-      <w:proofErr w:type="gramEnd"/>
       <w:r>
         <w:rPr>
           <w:rFonts w:ascii="Consolas" w:eastAsia="Times New Roman" w:hAnsi="Consolas" w:cs="Times New Roman"/>
@@ -3294,7 +3019,6 @@
         </w:rPr>
         <w:t xml:space="preserve"> </w:t>
       </w:r>
-      <w:proofErr w:type="spellStart"/>
       <w:r>
         <w:rPr>
           <w:rFonts w:ascii="Consolas" w:eastAsia="Times New Roman" w:hAnsi="Consolas" w:cs="Times New Roman"/>
@@ -3307,7 +3031,6 @@
         </w:rPr>
         <w:t>i</w:t>
       </w:r>
-      <w:proofErr w:type="spellEnd"/>
       <w:r>
         <w:rPr>
           <w:rFonts w:ascii="Consolas" w:eastAsia="Times New Roman" w:hAnsi="Consolas" w:cs="Times New Roman"/>
@@ -3467,7 +3190,6 @@
         </w:rPr>
         <w:t xml:space="preserve"> </w:t>
       </w:r>
-      <w:proofErr w:type="gramStart"/>
       <w:r>
         <w:rPr>
           <w:rFonts w:ascii="Consolas" w:eastAsia="Times New Roman" w:hAnsi="Consolas" w:cs="Times New Roman"/>
@@ -3492,7 +3214,6 @@
         </w:rPr>
         <w:t>(</w:t>
       </w:r>
-      <w:proofErr w:type="gramEnd"/>
       <w:r>
         <w:rPr>
           <w:rFonts w:ascii="Consolas" w:eastAsia="Times New Roman" w:hAnsi="Consolas" w:cs="Times New Roman"/>
@@ -3613,7 +3334,6 @@
         </w:rPr>
         <w:t xml:space="preserve">, </w:t>
       </w:r>
-      <w:proofErr w:type="gramStart"/>
       <w:r>
         <w:rPr>
           <w:rFonts w:ascii="Consolas" w:eastAsia="Times New Roman" w:hAnsi="Consolas" w:cs="Times New Roman"/>
@@ -3638,7 +3358,6 @@
         </w:rPr>
         <w:t>[</w:t>
       </w:r>
-      <w:proofErr w:type="gramEnd"/>
       <w:r>
         <w:rPr>
           <w:rFonts w:ascii="Consolas" w:eastAsia="Times New Roman" w:hAnsi="Consolas" w:cs="Times New Roman"/>
@@ -3789,7 +3508,6 @@
         </w:rPr>
         <w:t xml:space="preserve"> </w:t>
       </w:r>
-      <w:proofErr w:type="spellStart"/>
       <w:r>
         <w:rPr>
           <w:rFonts w:ascii="Consolas" w:eastAsia="Times New Roman" w:hAnsi="Consolas" w:cs="Times New Roman"/>
@@ -3802,7 +3520,6 @@
         </w:rPr>
         <w:t>i</w:t>
       </w:r>
-      <w:proofErr w:type="spellEnd"/>
       <w:r>
         <w:rPr>
           <w:rFonts w:ascii="Consolas" w:eastAsia="Times New Roman" w:hAnsi="Consolas" w:cs="Times New Roman"/>
@@ -3863,7 +3580,6 @@
         </w:rPr>
         <w:t>[</w:t>
       </w:r>
-      <w:proofErr w:type="spellStart"/>
       <w:r>
         <w:rPr>
           <w:rFonts w:ascii="Consolas" w:eastAsia="Times New Roman" w:hAnsi="Consolas" w:cs="Times New Roman"/>
@@ -3876,7 +3592,6 @@
         </w:rPr>
         <w:t>i</w:t>
       </w:r>
-      <w:proofErr w:type="spellEnd"/>
       <w:r>
         <w:rPr>
           <w:rFonts w:ascii="Consolas" w:eastAsia="Times New Roman" w:hAnsi="Consolas" w:cs="Times New Roman"/>
@@ -4009,7 +3724,6 @@
         </w:rPr>
         <w:t>[</w:t>
       </w:r>
-      <w:proofErr w:type="spellStart"/>
       <w:r>
         <w:rPr>
           <w:rFonts w:ascii="Consolas" w:eastAsia="Times New Roman" w:hAnsi="Consolas" w:cs="Times New Roman"/>
@@ -4022,7 +3736,6 @@
         </w:rPr>
         <w:t>i</w:t>
       </w:r>
-      <w:proofErr w:type="spellEnd"/>
       <w:r>
         <w:rPr>
           <w:rFonts w:ascii="Consolas" w:eastAsia="Times New Roman" w:hAnsi="Consolas" w:cs="Times New Roman"/>
@@ -4059,7 +3772,6 @@
         </w:rPr>
         <w:t xml:space="preserve"> </w:t>
       </w:r>
-      <w:proofErr w:type="gramStart"/>
       <w:r>
         <w:rPr>
           <w:rFonts w:ascii="Consolas" w:eastAsia="Times New Roman" w:hAnsi="Consolas" w:cs="Times New Roman"/>
@@ -4084,8 +3796,6 @@
         </w:rPr>
         <w:t>[</w:t>
       </w:r>
-      <w:proofErr w:type="spellStart"/>
-      <w:proofErr w:type="gramEnd"/>
       <w:r>
         <w:rPr>
           <w:rFonts w:ascii="Consolas" w:eastAsia="Times New Roman" w:hAnsi="Consolas" w:cs="Times New Roman"/>
@@ -4098,7 +3808,6 @@
         </w:rPr>
         <w:t>i</w:t>
       </w:r>
-      <w:proofErr w:type="spellEnd"/>
       <w:r>
         <w:rPr>
           <w:rFonts w:ascii="Consolas" w:eastAsia="Times New Roman" w:hAnsi="Consolas" w:cs="Times New Roman"/>
@@ -4159,7 +3868,6 @@
         </w:rPr>
         <w:t>[</w:t>
       </w:r>
-      <w:proofErr w:type="spellStart"/>
       <w:r>
         <w:rPr>
           <w:rFonts w:ascii="Consolas" w:eastAsia="Times New Roman" w:hAnsi="Consolas" w:cs="Times New Roman"/>
@@ -4172,7 +3880,6 @@
         </w:rPr>
         <w:t>i</w:t>
       </w:r>
-      <w:proofErr w:type="spellEnd"/>
       <w:r>
         <w:rPr>
           <w:rFonts w:ascii="Consolas" w:eastAsia="Times New Roman" w:hAnsi="Consolas" w:cs="Times New Roman"/>
@@ -4350,7 +4057,6 @@
         </w:rPr>
         <w:t xml:space="preserve">            </w:t>
       </w:r>
-      <w:proofErr w:type="spellStart"/>
       <w:r>
         <w:rPr>
           <w:rFonts w:ascii="Consolas" w:eastAsia="Times New Roman" w:hAnsi="Consolas" w:cs="Times New Roman"/>
@@ -4363,7 +4069,6 @@
         </w:rPr>
         <w:t>if</w:t>
       </w:r>
-      <w:proofErr w:type="spellEnd"/>
       <w:r>
         <w:rPr>
           <w:rFonts w:ascii="Consolas" w:eastAsia="Times New Roman" w:hAnsi="Consolas" w:cs="Times New Roman"/>
@@ -4979,8 +4684,6 @@
         </w:rPr>
         <w:t xml:space="preserve"> </w:t>
       </w:r>
-      <w:proofErr w:type="spellStart"/>
-      <w:proofErr w:type="gramStart"/>
       <w:r>
         <w:rPr>
           <w:rFonts w:ascii="Consolas" w:eastAsia="Times New Roman" w:hAnsi="Consolas" w:cs="Times New Roman"/>
@@ -4993,7 +4696,6 @@
         </w:rPr>
         <w:t>isSubtree</w:t>
       </w:r>
-      <w:proofErr w:type="spellEnd"/>
       <w:r>
         <w:rPr>
           <w:rFonts w:ascii="Consolas" w:eastAsia="Times New Roman" w:hAnsi="Consolas" w:cs="Times New Roman"/>
@@ -5006,7 +4708,6 @@
         </w:rPr>
         <w:t>(</w:t>
       </w:r>
-      <w:proofErr w:type="gramEnd"/>
       <w:r>
         <w:rPr>
           <w:rFonts w:ascii="Consolas" w:eastAsia="Times New Roman" w:hAnsi="Consolas" w:cs="Times New Roman"/>
@@ -5055,7 +4756,6 @@
         </w:rPr>
         <w:t xml:space="preserve">: </w:t>
       </w:r>
-      <w:proofErr w:type="gramStart"/>
       <w:r>
         <w:rPr>
           <w:rFonts w:ascii="Consolas" w:eastAsia="Times New Roman" w:hAnsi="Consolas" w:cs="Times New Roman"/>
@@ -5080,8 +4780,6 @@
         </w:rPr>
         <w:t>[</w:t>
       </w:r>
-      <w:proofErr w:type="spellStart"/>
-      <w:proofErr w:type="gramEnd"/>
       <w:r>
         <w:rPr>
           <w:rFonts w:ascii="Consolas" w:eastAsia="Times New Roman" w:hAnsi="Consolas" w:cs="Times New Roman"/>
@@ -5094,7 +4792,6 @@
         </w:rPr>
         <w:t>TreeNode</w:t>
       </w:r>
-      <w:proofErr w:type="spellEnd"/>
       <w:r>
         <w:rPr>
           <w:rFonts w:ascii="Consolas" w:eastAsia="Times New Roman" w:hAnsi="Consolas" w:cs="Times New Roman"/>
@@ -5107,7 +4804,6 @@
         </w:rPr>
         <w:t xml:space="preserve">], </w:t>
       </w:r>
-      <w:proofErr w:type="spellStart"/>
       <w:r>
         <w:rPr>
           <w:rFonts w:ascii="Consolas" w:eastAsia="Times New Roman" w:hAnsi="Consolas" w:cs="Times New Roman"/>
@@ -5120,7 +4816,6 @@
         </w:rPr>
         <w:t>subRoot</w:t>
       </w:r>
-      <w:proofErr w:type="spellEnd"/>
       <w:r>
         <w:rPr>
           <w:rFonts w:ascii="Consolas" w:eastAsia="Times New Roman" w:hAnsi="Consolas" w:cs="Times New Roman"/>
@@ -5133,7 +4828,6 @@
         </w:rPr>
         <w:t xml:space="preserve">: </w:t>
       </w:r>
-      <w:proofErr w:type="gramStart"/>
       <w:r>
         <w:rPr>
           <w:rFonts w:ascii="Consolas" w:eastAsia="Times New Roman" w:hAnsi="Consolas" w:cs="Times New Roman"/>
@@ -5158,8 +4852,6 @@
         </w:rPr>
         <w:t>[</w:t>
       </w:r>
-      <w:proofErr w:type="spellStart"/>
-      <w:proofErr w:type="gramEnd"/>
       <w:r>
         <w:rPr>
           <w:rFonts w:ascii="Consolas" w:eastAsia="Times New Roman" w:hAnsi="Consolas" w:cs="Times New Roman"/>
@@ -5172,7 +4864,6 @@
         </w:rPr>
         <w:t>TreeNode</w:t>
       </w:r>
-      <w:proofErr w:type="spellEnd"/>
       <w:r>
         <w:rPr>
           <w:rFonts w:ascii="Consolas" w:eastAsia="Times New Roman" w:hAnsi="Consolas" w:cs="Times New Roman"/>
@@ -5236,7 +4927,6 @@
         </w:rPr>
         <w:t xml:space="preserve">        </w:t>
       </w:r>
-      <w:proofErr w:type="spellStart"/>
       <w:r>
         <w:rPr>
           <w:rFonts w:ascii="Consolas" w:eastAsia="Times New Roman" w:hAnsi="Consolas" w:cs="Times New Roman"/>
@@ -5249,7 +4939,6 @@
         </w:rPr>
         <w:t>root_s</w:t>
       </w:r>
-      <w:proofErr w:type="spellEnd"/>
       <w:r>
         <w:rPr>
           <w:rFonts w:ascii="Consolas" w:eastAsia="Times New Roman" w:hAnsi="Consolas" w:cs="Times New Roman"/>
@@ -5286,8 +4975,6 @@
         </w:rPr>
         <w:t xml:space="preserve"> </w:t>
       </w:r>
-      <w:proofErr w:type="spellStart"/>
-      <w:proofErr w:type="gramStart"/>
       <w:r>
         <w:rPr>
           <w:rFonts w:ascii="Consolas" w:eastAsia="Times New Roman" w:hAnsi="Consolas" w:cs="Times New Roman"/>
@@ -5324,8 +5011,6 @@
         </w:rPr>
         <w:t>serialize</w:t>
       </w:r>
-      <w:proofErr w:type="spellEnd"/>
-      <w:proofErr w:type="gramEnd"/>
       <w:r>
         <w:rPr>
           <w:rFonts w:ascii="Consolas" w:eastAsia="Times New Roman" w:hAnsi="Consolas" w:cs="Times New Roman"/>
@@ -5389,7 +5074,6 @@
         </w:rPr>
         <w:t xml:space="preserve">        </w:t>
       </w:r>
-      <w:proofErr w:type="spellStart"/>
       <w:r>
         <w:rPr>
           <w:rFonts w:ascii="Consolas" w:eastAsia="Times New Roman" w:hAnsi="Consolas" w:cs="Times New Roman"/>
@@ -5402,7 +5086,6 @@
         </w:rPr>
         <w:t>subRoot_s</w:t>
       </w:r>
-      <w:proofErr w:type="spellEnd"/>
       <w:r>
         <w:rPr>
           <w:rFonts w:ascii="Consolas" w:eastAsia="Times New Roman" w:hAnsi="Consolas" w:cs="Times New Roman"/>
@@ -5439,8 +5122,6 @@
         </w:rPr>
         <w:t xml:space="preserve"> </w:t>
       </w:r>
-      <w:proofErr w:type="spellStart"/>
-      <w:proofErr w:type="gramStart"/>
       <w:r>
         <w:rPr>
           <w:rFonts w:ascii="Consolas" w:eastAsia="Times New Roman" w:hAnsi="Consolas" w:cs="Times New Roman"/>
@@ -5477,8 +5158,6 @@
         </w:rPr>
         <w:t>serialize</w:t>
       </w:r>
-      <w:proofErr w:type="spellEnd"/>
-      <w:proofErr w:type="gramEnd"/>
       <w:r>
         <w:rPr>
           <w:rFonts w:ascii="Consolas" w:eastAsia="Times New Roman" w:hAnsi="Consolas" w:cs="Times New Roman"/>
@@ -5491,7 +5170,6 @@
         </w:rPr>
         <w:t>(</w:t>
       </w:r>
-      <w:proofErr w:type="spellStart"/>
       <w:r>
         <w:rPr>
           <w:rFonts w:ascii="Consolas" w:eastAsia="Times New Roman" w:hAnsi="Consolas" w:cs="Times New Roman"/>
@@ -5504,7 +5182,6 @@
         </w:rPr>
         <w:t>subRoot</w:t>
       </w:r>
-      <w:proofErr w:type="spellEnd"/>
       <w:r>
         <w:rPr>
           <w:rFonts w:ascii="Consolas" w:eastAsia="Times New Roman" w:hAnsi="Consolas" w:cs="Times New Roman"/>
@@ -5592,7 +5269,6 @@
         </w:rPr>
         <w:t xml:space="preserve"> </w:t>
       </w:r>
-      <w:proofErr w:type="spellStart"/>
       <w:r>
         <w:rPr>
           <w:rFonts w:ascii="Consolas" w:eastAsia="Times New Roman" w:hAnsi="Consolas" w:cs="Times New Roman"/>
@@ -5605,7 +5281,6 @@
         </w:rPr>
         <w:t>subRoot_s</w:t>
       </w:r>
-      <w:proofErr w:type="spellEnd"/>
       <w:r>
         <w:rPr>
           <w:rFonts w:ascii="Consolas" w:eastAsia="Times New Roman" w:hAnsi="Consolas" w:cs="Times New Roman"/>
@@ -5690,7 +5365,6 @@
         </w:rPr>
         <w:t xml:space="preserve"> </w:t>
       </w:r>
-      <w:proofErr w:type="spellStart"/>
       <w:r>
         <w:rPr>
           <w:rFonts w:ascii="Consolas" w:eastAsia="Times New Roman" w:hAnsi="Consolas" w:cs="Times New Roman"/>
@@ -5703,7 +5377,6 @@
         </w:rPr>
         <w:t>root_s</w:t>
       </w:r>
-      <w:proofErr w:type="spellEnd"/>
     </w:p>
     <w:p>
       <w:pPr>
@@ -5746,7 +5419,6 @@
         </w:rPr>
         <w:t xml:space="preserve">        </w:t>
       </w:r>
-      <w:proofErr w:type="spellStart"/>
       <w:r>
         <w:rPr>
           <w:rFonts w:ascii="Consolas" w:eastAsia="Times New Roman" w:hAnsi="Consolas" w:cs="Times New Roman"/>
@@ -5759,7 +5431,6 @@
         </w:rPr>
         <w:t>z_values</w:t>
       </w:r>
-      <w:proofErr w:type="spellEnd"/>
       <w:r>
         <w:rPr>
           <w:rFonts w:ascii="Consolas" w:eastAsia="Times New Roman" w:hAnsi="Consolas" w:cs="Times New Roman"/>
@@ -5796,8 +5467,6 @@
         </w:rPr>
         <w:t xml:space="preserve"> </w:t>
       </w:r>
-      <w:proofErr w:type="spellStart"/>
-      <w:proofErr w:type="gramStart"/>
       <w:r>
         <w:rPr>
           <w:rFonts w:ascii="Consolas" w:eastAsia="Times New Roman" w:hAnsi="Consolas" w:cs="Times New Roman"/>
@@ -5832,22 +5501,8 @@
           <w:lang w:val="en-US" w:eastAsia="it-IT"/>
           <w14:ligatures w14:val="none"/>
         </w:rPr>
-        <w:t>z</w:t>
-      </w:r>
-      <w:proofErr w:type="gramEnd"/>
-      <w:r>
-        <w:rPr>
-          <w:rFonts w:ascii="Consolas" w:eastAsia="Times New Roman" w:hAnsi="Consolas" w:cs="Times New Roman"/>
-          <w:color w:val="D2A8FF"/>
-          <w:kern w:val="0"/>
-          <w:sz w:val="21"/>
-          <w:szCs w:val="21"/>
-          <w:lang w:val="en-US" w:eastAsia="it-IT"/>
-          <w14:ligatures w14:val="none"/>
-        </w:rPr>
-        <w:t>_function</w:t>
-      </w:r>
-      <w:proofErr w:type="spellEnd"/>
+        <w:t>z_function</w:t>
+      </w:r>
       <w:r>
         <w:rPr>
           <w:rFonts w:ascii="Consolas" w:eastAsia="Times New Roman" w:hAnsi="Consolas" w:cs="Times New Roman"/>
@@ -5911,7 +5566,6 @@
         </w:rPr>
         <w:t xml:space="preserve">        </w:t>
       </w:r>
-      <w:proofErr w:type="spellStart"/>
       <w:r>
         <w:rPr>
           <w:rFonts w:ascii="Consolas" w:eastAsia="Times New Roman" w:hAnsi="Consolas" w:cs="Times New Roman"/>
@@ -5924,7 +5578,6 @@
         </w:rPr>
         <w:t>len_sub</w:t>
       </w:r>
-      <w:proofErr w:type="spellEnd"/>
       <w:r>
         <w:rPr>
           <w:rFonts w:ascii="Consolas" w:eastAsia="Times New Roman" w:hAnsi="Consolas" w:cs="Times New Roman"/>
@@ -5961,7 +5614,6 @@
         </w:rPr>
         <w:t xml:space="preserve"> </w:t>
       </w:r>
-      <w:proofErr w:type="spellStart"/>
       <w:r>
         <w:rPr>
           <w:rFonts w:ascii="Consolas" w:eastAsia="Times New Roman" w:hAnsi="Consolas" w:cs="Times New Roman"/>
@@ -5974,7 +5626,6 @@
         </w:rPr>
         <w:t>len</w:t>
       </w:r>
-      <w:proofErr w:type="spellEnd"/>
       <w:r>
         <w:rPr>
           <w:rFonts w:ascii="Consolas" w:eastAsia="Times New Roman" w:hAnsi="Consolas" w:cs="Times New Roman"/>
@@ -5987,7 +5638,6 @@
         </w:rPr>
         <w:t>(</w:t>
       </w:r>
-      <w:proofErr w:type="spellStart"/>
       <w:r>
         <w:rPr>
           <w:rFonts w:ascii="Consolas" w:eastAsia="Times New Roman" w:hAnsi="Consolas" w:cs="Times New Roman"/>
@@ -6000,7 +5650,6 @@
         </w:rPr>
         <w:t>subRoot_s</w:t>
       </w:r>
-      <w:proofErr w:type="spellEnd"/>
       <w:r>
         <w:rPr>
           <w:rFonts w:ascii="Consolas" w:eastAsia="Times New Roman" w:hAnsi="Consolas" w:cs="Times New Roman"/>
@@ -6064,7 +5713,6 @@
         </w:rPr>
         <w:t xml:space="preserve"> </w:t>
       </w:r>
-      <w:proofErr w:type="spellStart"/>
       <w:r>
         <w:rPr>
           <w:rFonts w:ascii="Consolas" w:eastAsia="Times New Roman" w:hAnsi="Consolas" w:cs="Times New Roman"/>
@@ -6077,7 +5725,6 @@
         </w:rPr>
         <w:t>i</w:t>
       </w:r>
-      <w:proofErr w:type="spellEnd"/>
       <w:r>
         <w:rPr>
           <w:rFonts w:ascii="Consolas" w:eastAsia="Times New Roman" w:hAnsi="Consolas" w:cs="Times New Roman"/>
@@ -6114,7 +5761,6 @@
         </w:rPr>
         <w:t xml:space="preserve"> </w:t>
       </w:r>
-      <w:proofErr w:type="gramStart"/>
       <w:r>
         <w:rPr>
           <w:rFonts w:ascii="Consolas" w:eastAsia="Times New Roman" w:hAnsi="Consolas" w:cs="Times New Roman"/>
@@ -6139,8 +5785,6 @@
         </w:rPr>
         <w:t>(</w:t>
       </w:r>
-      <w:proofErr w:type="spellStart"/>
-      <w:proofErr w:type="gramEnd"/>
       <w:r>
         <w:rPr>
           <w:rFonts w:ascii="Consolas" w:eastAsia="Times New Roman" w:hAnsi="Consolas" w:cs="Times New Roman"/>
@@ -6153,7 +5797,6 @@
         </w:rPr>
         <w:t>len_sub</w:t>
       </w:r>
-      <w:proofErr w:type="spellEnd"/>
       <w:r>
         <w:rPr>
           <w:rFonts w:ascii="Consolas" w:eastAsia="Times New Roman" w:hAnsi="Consolas" w:cs="Times New Roman"/>
@@ -6214,7 +5857,6 @@
         </w:rPr>
         <w:t xml:space="preserve">, </w:t>
       </w:r>
-      <w:proofErr w:type="spellStart"/>
       <w:r>
         <w:rPr>
           <w:rFonts w:ascii="Consolas" w:eastAsia="Times New Roman" w:hAnsi="Consolas" w:cs="Times New Roman"/>
@@ -6227,7 +5869,6 @@
         </w:rPr>
         <w:t>len</w:t>
       </w:r>
-      <w:proofErr w:type="spellEnd"/>
       <w:r>
         <w:rPr>
           <w:rFonts w:ascii="Consolas" w:eastAsia="Times New Roman" w:hAnsi="Consolas" w:cs="Times New Roman"/>
@@ -6315,7 +5956,6 @@
         </w:rPr>
         <w:t xml:space="preserve"> </w:t>
       </w:r>
-      <w:proofErr w:type="spellStart"/>
       <w:r>
         <w:rPr>
           <w:rFonts w:ascii="Consolas" w:eastAsia="Times New Roman" w:hAnsi="Consolas" w:cs="Times New Roman"/>
@@ -6328,7 +5968,6 @@
         </w:rPr>
         <w:t>z_values</w:t>
       </w:r>
-      <w:proofErr w:type="spellEnd"/>
       <w:r>
         <w:rPr>
           <w:rFonts w:ascii="Consolas" w:eastAsia="Times New Roman" w:hAnsi="Consolas" w:cs="Times New Roman"/>
@@ -6341,7 +5980,6 @@
         </w:rPr>
         <w:t>[</w:t>
       </w:r>
-      <w:proofErr w:type="spellStart"/>
       <w:r>
         <w:rPr>
           <w:rFonts w:ascii="Consolas" w:eastAsia="Times New Roman" w:hAnsi="Consolas" w:cs="Times New Roman"/>
@@ -6354,7 +5992,6 @@
         </w:rPr>
         <w:t>i</w:t>
       </w:r>
-      <w:proofErr w:type="spellEnd"/>
       <w:r>
         <w:rPr>
           <w:rFonts w:ascii="Consolas" w:eastAsia="Times New Roman" w:hAnsi="Consolas" w:cs="Times New Roman"/>
@@ -6391,7 +6028,6 @@
         </w:rPr>
         <w:t xml:space="preserve"> </w:t>
       </w:r>
-      <w:proofErr w:type="spellStart"/>
       <w:r>
         <w:rPr>
           <w:rFonts w:ascii="Consolas" w:eastAsia="Times New Roman" w:hAnsi="Consolas" w:cs="Times New Roman"/>
@@ -6404,7 +6040,6 @@
         </w:rPr>
         <w:t>len_sub</w:t>
       </w:r>
-      <w:proofErr w:type="spellEnd"/>
       <w:r>
         <w:rPr>
           <w:rFonts w:ascii="Consolas" w:eastAsia="Times New Roman" w:hAnsi="Consolas" w:cs="Times New Roman"/>
@@ -6444,7 +6079,6 @@
         </w:rPr>
         <w:t xml:space="preserve">                </w:t>
       </w:r>
-      <w:proofErr w:type="gramStart"/>
       <w:r>
         <w:rPr>
           <w:rFonts w:ascii="Consolas" w:eastAsia="Times New Roman" w:hAnsi="Consolas" w:cs="Times New Roman"/>
@@ -6457,7 +6091,6 @@
         </w:rPr>
         <w:t>return</w:t>
       </w:r>
-      <w:proofErr w:type="gramEnd"/>
       <w:r>
         <w:rPr>
           <w:rFonts w:ascii="Consolas" w:eastAsia="Times New Roman" w:hAnsi="Consolas" w:cs="Times New Roman"/>
@@ -6536,7 +6169,6 @@
         </w:rPr>
         <w:t xml:space="preserve">        </w:t>
       </w:r>
-      <w:proofErr w:type="gramStart"/>
       <w:r>
         <w:rPr>
           <w:rFonts w:ascii="Consolas" w:eastAsia="Times New Roman" w:hAnsi="Consolas" w:cs="Times New Roman"/>
@@ -6549,7 +6181,6 @@
         </w:rPr>
         <w:t>return</w:t>
       </w:r>
-      <w:proofErr w:type="gramEnd"/>
       <w:r>
         <w:rPr>
           <w:rFonts w:ascii="Consolas" w:eastAsia="Times New Roman" w:hAnsi="Consolas" w:cs="Times New Roman"/>
@@ -6608,43 +6239,7 @@
           <w:bCs/>
           <w:lang w:val="en-US"/>
         </w:rPr>
-        <w:t xml:space="preserve">BST </w:t>
-      </w:r>
-      <w:proofErr w:type="spellStart"/>
-      <w:r>
-        <w:rPr>
-          <w:b/>
-          <w:bCs/>
-          <w:lang w:val="en-US"/>
-        </w:rPr>
-        <w:t>inorder</w:t>
-      </w:r>
-      <w:proofErr w:type="spellEnd"/>
-      <w:r>
-        <w:rPr>
-          <w:b/>
-          <w:bCs/>
-          <w:lang w:val="en-US"/>
-        </w:rPr>
-        <w:t xml:space="preserve"> visit with </w:t>
-      </w:r>
-      <w:proofErr w:type="gramStart"/>
-      <w:r>
-        <w:rPr>
-          <w:b/>
-          <w:bCs/>
-          <w:lang w:val="en-US"/>
-        </w:rPr>
-        <w:t>O(</w:t>
-      </w:r>
-      <w:proofErr w:type="gramEnd"/>
-      <w:r>
-        <w:rPr>
-          <w:b/>
-          <w:bCs/>
-          <w:lang w:val="en-US"/>
-        </w:rPr>
-        <w:t xml:space="preserve">1) space </w:t>
+        <w:t xml:space="preserve">BST inorder visit with O(1) space </w:t>
       </w:r>
       <w:r>
         <w:rPr>
@@ -6827,8 +6422,6 @@
         </w:rPr>
         <w:t xml:space="preserve"> </w:t>
       </w:r>
-      <w:proofErr w:type="spellStart"/>
-      <w:proofErr w:type="gramStart"/>
       <w:r>
         <w:rPr>
           <w:rFonts w:ascii="Consolas" w:eastAsia="Times New Roman" w:hAnsi="Consolas" w:cs="Times New Roman"/>
@@ -6841,7 +6434,6 @@
         </w:rPr>
         <w:t>kthSmallest</w:t>
       </w:r>
-      <w:proofErr w:type="spellEnd"/>
       <w:r>
         <w:rPr>
           <w:rFonts w:ascii="Consolas" w:eastAsia="Times New Roman" w:hAnsi="Consolas" w:cs="Times New Roman"/>
@@ -6854,7 +6446,6 @@
         </w:rPr>
         <w:t>(</w:t>
       </w:r>
-      <w:proofErr w:type="gramEnd"/>
       <w:r>
         <w:rPr>
           <w:rFonts w:ascii="Consolas" w:eastAsia="Times New Roman" w:hAnsi="Consolas" w:cs="Times New Roman"/>
@@ -6903,7 +6494,6 @@
         </w:rPr>
         <w:t xml:space="preserve">: </w:t>
       </w:r>
-      <w:proofErr w:type="gramStart"/>
       <w:r>
         <w:rPr>
           <w:rFonts w:ascii="Consolas" w:eastAsia="Times New Roman" w:hAnsi="Consolas" w:cs="Times New Roman"/>
@@ -6928,8 +6518,6 @@
         </w:rPr>
         <w:t>[</w:t>
       </w:r>
-      <w:proofErr w:type="spellStart"/>
-      <w:proofErr w:type="gramEnd"/>
       <w:r>
         <w:rPr>
           <w:rFonts w:ascii="Consolas" w:eastAsia="Times New Roman" w:hAnsi="Consolas" w:cs="Times New Roman"/>
@@ -6942,7 +6530,6 @@
         </w:rPr>
         <w:t>TreeNode</w:t>
       </w:r>
-      <w:proofErr w:type="spellEnd"/>
       <w:r>
         <w:rPr>
           <w:rFonts w:ascii="Consolas" w:eastAsia="Times New Roman" w:hAnsi="Consolas" w:cs="Times New Roman"/>
@@ -7054,7 +6641,6 @@
         </w:rPr>
         <w:t xml:space="preserve">        </w:t>
       </w:r>
-      <w:proofErr w:type="spellStart"/>
       <w:r>
         <w:rPr>
           <w:rFonts w:ascii="Consolas" w:eastAsia="Times New Roman" w:hAnsi="Consolas" w:cs="Times New Roman"/>
@@ -7067,7 +6653,6 @@
         </w:rPr>
         <w:t>curr</w:t>
       </w:r>
-      <w:proofErr w:type="spellEnd"/>
       <w:r>
         <w:rPr>
           <w:rFonts w:ascii="Consolas" w:eastAsia="Times New Roman" w:hAnsi="Consolas" w:cs="Times New Roman"/>
@@ -7182,8 +6767,6 @@
         </w:rPr>
         <w:t xml:space="preserve"> </w:t>
       </w:r>
-      <w:proofErr w:type="spellStart"/>
-      <w:proofErr w:type="gramStart"/>
       <w:r>
         <w:rPr>
           <w:rFonts w:ascii="Consolas" w:eastAsia="Times New Roman" w:hAnsi="Consolas" w:cs="Times New Roman"/>
@@ -7196,8 +6779,6 @@
         </w:rPr>
         <w:t>curr</w:t>
       </w:r>
-      <w:proofErr w:type="spellEnd"/>
-      <w:proofErr w:type="gramEnd"/>
       <w:r>
         <w:rPr>
           <w:rFonts w:ascii="Consolas" w:eastAsia="Times New Roman" w:hAnsi="Consolas" w:cs="Times New Roman"/>
@@ -7285,8 +6866,6 @@
         </w:rPr>
         <w:t xml:space="preserve"> </w:t>
       </w:r>
-      <w:proofErr w:type="spellStart"/>
-      <w:proofErr w:type="gramStart"/>
       <w:r>
         <w:rPr>
           <w:rFonts w:ascii="Consolas" w:eastAsia="Times New Roman" w:hAnsi="Consolas" w:cs="Times New Roman"/>
@@ -7309,21 +6888,7 @@
           <w:lang w:val="en-US" w:eastAsia="it-IT"/>
           <w14:ligatures w14:val="none"/>
         </w:rPr>
-        <w:t>.left</w:t>
-      </w:r>
-      <w:proofErr w:type="spellEnd"/>
-      <w:proofErr w:type="gramEnd"/>
-      <w:r>
-        <w:rPr>
-          <w:rFonts w:ascii="Consolas" w:eastAsia="Times New Roman" w:hAnsi="Consolas" w:cs="Times New Roman"/>
-          <w:color w:val="BBBEBF"/>
-          <w:kern w:val="0"/>
-          <w:sz w:val="21"/>
-          <w:szCs w:val="21"/>
-          <w:lang w:val="en-US" w:eastAsia="it-IT"/>
-          <w14:ligatures w14:val="none"/>
-        </w:rPr>
-        <w:t xml:space="preserve">: </w:t>
+        <w:t xml:space="preserve">.left: </w:t>
       </w:r>
       <w:r>
         <w:rPr>
@@ -7335,22 +6900,8 @@
           <w:lang w:val="en-US" w:eastAsia="it-IT"/>
           <w14:ligatures w14:val="none"/>
         </w:rPr>
-        <w:t xml:space="preserve">#smallest --&gt; </w:t>
-      </w:r>
-      <w:proofErr w:type="spellStart"/>
-      <w:r>
-        <w:rPr>
-          <w:rFonts w:ascii="Consolas" w:eastAsia="Times New Roman" w:hAnsi="Consolas" w:cs="Times New Roman"/>
-          <w:color w:val="8B949E"/>
-          <w:kern w:val="0"/>
-          <w:sz w:val="21"/>
-          <w:szCs w:val="21"/>
-          <w:lang w:val="en-US" w:eastAsia="it-IT"/>
-          <w14:ligatures w14:val="none"/>
-        </w:rPr>
-        <w:t>valuto</w:t>
-      </w:r>
-      <w:proofErr w:type="spellEnd"/>
+        <w:t>#smallest --&gt; valuto</w:t>
+      </w:r>
     </w:p>
     <w:p>
       <w:pPr>
@@ -7612,7 +7163,6 @@
         </w:rPr>
         <w:t xml:space="preserve"> </w:t>
       </w:r>
-      <w:proofErr w:type="spellStart"/>
       <w:r>
         <w:rPr>
           <w:rFonts w:ascii="Consolas" w:eastAsia="Times New Roman" w:hAnsi="Consolas" w:cs="Times New Roman"/>
@@ -7637,7 +7187,6 @@
         </w:rPr>
         <w:t>.val</w:t>
       </w:r>
-      <w:proofErr w:type="spellEnd"/>
     </w:p>
     <w:p>
       <w:pPr>
@@ -7665,7 +7214,6 @@
         </w:rPr>
         <w:t xml:space="preserve">                </w:t>
       </w:r>
-      <w:proofErr w:type="spellStart"/>
       <w:r>
         <w:rPr>
           <w:rFonts w:ascii="Consolas" w:eastAsia="Times New Roman" w:hAnsi="Consolas" w:cs="Times New Roman"/>
@@ -7678,7 +7226,6 @@
         </w:rPr>
         <w:t>curr</w:t>
       </w:r>
-      <w:proofErr w:type="spellEnd"/>
       <w:r>
         <w:rPr>
           <w:rFonts w:ascii="Consolas" w:eastAsia="Times New Roman" w:hAnsi="Consolas" w:cs="Times New Roman"/>
@@ -7715,8 +7262,6 @@
         </w:rPr>
         <w:t xml:space="preserve"> </w:t>
       </w:r>
-      <w:proofErr w:type="spellStart"/>
-      <w:proofErr w:type="gramStart"/>
       <w:r>
         <w:rPr>
           <w:rFonts w:ascii="Consolas" w:eastAsia="Times New Roman" w:hAnsi="Consolas" w:cs="Times New Roman"/>
@@ -7739,59 +7284,19 @@
           <w:lang w:eastAsia="it-IT"/>
           <w14:ligatures w14:val="none"/>
         </w:rPr>
-        <w:t>.right</w:t>
-      </w:r>
-      <w:proofErr w:type="spellEnd"/>
-      <w:proofErr w:type="gramEnd"/>
-      <w:r>
-        <w:rPr>
-          <w:rFonts w:ascii="Consolas" w:eastAsia="Times New Roman" w:hAnsi="Consolas" w:cs="Times New Roman"/>
-          <w:color w:val="BBBEBF"/>
+        <w:t xml:space="preserve">.right </w:t>
+      </w:r>
+      <w:r>
+        <w:rPr>
+          <w:rFonts w:ascii="Consolas" w:eastAsia="Times New Roman" w:hAnsi="Consolas" w:cs="Times New Roman"/>
+          <w:color w:val="8B949E"/>
           <w:kern w:val="0"/>
           <w:sz w:val="21"/>
           <w:szCs w:val="21"/>
           <w:lang w:eastAsia="it-IT"/>
           <w14:ligatures w14:val="none"/>
         </w:rPr>
-        <w:t xml:space="preserve"> </w:t>
-      </w:r>
-      <w:r>
-        <w:rPr>
-          <w:rFonts w:ascii="Consolas" w:eastAsia="Times New Roman" w:hAnsi="Consolas" w:cs="Times New Roman"/>
-          <w:color w:val="8B949E"/>
-          <w:kern w:val="0"/>
-          <w:sz w:val="21"/>
-          <w:szCs w:val="21"/>
-          <w:lang w:eastAsia="it-IT"/>
-          <w14:ligatures w14:val="none"/>
-        </w:rPr>
-        <w:t>#</w:t>
-      </w:r>
-      <w:proofErr w:type="gramStart"/>
-      <w:r>
-        <w:rPr>
-          <w:rFonts w:ascii="Consolas" w:eastAsia="Times New Roman" w:hAnsi="Consolas" w:cs="Times New Roman"/>
-          <w:color w:val="8B949E"/>
-          <w:kern w:val="0"/>
-          <w:sz w:val="21"/>
-          <w:szCs w:val="21"/>
-          <w:lang w:eastAsia="it-IT"/>
-          <w14:ligatures w14:val="none"/>
-        </w:rPr>
-        <w:t>continuo ricerca</w:t>
-      </w:r>
-      <w:proofErr w:type="gramEnd"/>
-      <w:r>
-        <w:rPr>
-          <w:rFonts w:ascii="Consolas" w:eastAsia="Times New Roman" w:hAnsi="Consolas" w:cs="Times New Roman"/>
-          <w:color w:val="8B949E"/>
-          <w:kern w:val="0"/>
-          <w:sz w:val="21"/>
-          <w:szCs w:val="21"/>
-          <w:lang w:eastAsia="it-IT"/>
-          <w14:ligatures w14:val="none"/>
-        </w:rPr>
-        <w:t xml:space="preserve"> a destra (vero destro o SUCCESSORE)</w:t>
+        <w:t>#continuo ricerca a destra (vero destro o SUCCESSORE)</w:t>
       </w:r>
     </w:p>
     <w:p>
@@ -7919,8 +7424,6 @@
         </w:rPr>
         <w:t xml:space="preserve"> </w:t>
       </w:r>
-      <w:proofErr w:type="spellStart"/>
-      <w:proofErr w:type="gramStart"/>
       <w:r>
         <w:rPr>
           <w:rFonts w:ascii="Consolas" w:eastAsia="Times New Roman" w:hAnsi="Consolas" w:cs="Times New Roman"/>
@@ -7945,8 +7448,6 @@
         </w:rPr>
         <w:t>.left</w:t>
       </w:r>
-      <w:proofErr w:type="spellEnd"/>
-      <w:proofErr w:type="gramEnd"/>
     </w:p>
     <w:p>
       <w:pPr>
@@ -7998,8 +7499,6 @@
         </w:rPr>
         <w:t xml:space="preserve"> </w:t>
       </w:r>
-      <w:proofErr w:type="spellStart"/>
-      <w:proofErr w:type="gramStart"/>
       <w:r>
         <w:rPr>
           <w:rFonts w:ascii="Consolas" w:eastAsia="Times New Roman" w:hAnsi="Consolas" w:cs="Times New Roman"/>
@@ -8022,21 +7521,7 @@
           <w:lang w:val="en-US" w:eastAsia="it-IT"/>
           <w14:ligatures w14:val="none"/>
         </w:rPr>
-        <w:t>.right</w:t>
-      </w:r>
-      <w:proofErr w:type="spellEnd"/>
-      <w:proofErr w:type="gramEnd"/>
-      <w:r>
-        <w:rPr>
-          <w:rFonts w:ascii="Consolas" w:eastAsia="Times New Roman" w:hAnsi="Consolas" w:cs="Times New Roman"/>
-          <w:color w:val="BBBEBF"/>
-          <w:kern w:val="0"/>
-          <w:sz w:val="21"/>
-          <w:szCs w:val="21"/>
-          <w:lang w:val="en-US" w:eastAsia="it-IT"/>
-          <w14:ligatures w14:val="none"/>
-        </w:rPr>
-        <w:t xml:space="preserve"> </w:t>
+        <w:t xml:space="preserve">.right </w:t>
       </w:r>
       <w:r>
         <w:rPr>
@@ -8062,8 +7547,6 @@
         </w:rPr>
         <w:t xml:space="preserve"> </w:t>
       </w:r>
-      <w:proofErr w:type="spellStart"/>
-      <w:proofErr w:type="gramStart"/>
       <w:r>
         <w:rPr>
           <w:rFonts w:ascii="Consolas" w:eastAsia="Times New Roman" w:hAnsi="Consolas" w:cs="Times New Roman"/>
@@ -8086,20 +7569,7 @@
           <w:lang w:val="en-US" w:eastAsia="it-IT"/>
           <w14:ligatures w14:val="none"/>
         </w:rPr>
-        <w:t>.right</w:t>
-      </w:r>
-      <w:proofErr w:type="spellEnd"/>
-      <w:r>
-        <w:rPr>
-          <w:rFonts w:ascii="Consolas" w:eastAsia="Times New Roman" w:hAnsi="Consolas" w:cs="Times New Roman"/>
-          <w:color w:val="BBBEBF"/>
-          <w:kern w:val="0"/>
-          <w:sz w:val="21"/>
-          <w:szCs w:val="21"/>
-          <w:lang w:val="en-US" w:eastAsia="it-IT"/>
-          <w14:ligatures w14:val="none"/>
-        </w:rPr>
-        <w:t xml:space="preserve"> </w:t>
+        <w:t xml:space="preserve">.right </w:t>
       </w:r>
       <w:r>
         <w:rPr>
@@ -8113,21 +7583,18 @@
         </w:rPr>
         <w:t>!=</w:t>
       </w:r>
-      <w:proofErr w:type="gramEnd"/>
-      <w:r>
-        <w:rPr>
-          <w:rFonts w:ascii="Consolas" w:eastAsia="Times New Roman" w:hAnsi="Consolas" w:cs="Times New Roman"/>
-          <w:color w:val="BBBEBF"/>
-          <w:kern w:val="0"/>
-          <w:sz w:val="21"/>
-          <w:szCs w:val="21"/>
-          <w:lang w:val="en-US" w:eastAsia="it-IT"/>
-          <w14:ligatures w14:val="none"/>
-        </w:rPr>
-        <w:t xml:space="preserve"> </w:t>
-      </w:r>
-      <w:proofErr w:type="spellStart"/>
-      <w:proofErr w:type="gramStart"/>
+      <w:r>
+        <w:rPr>
+          <w:rFonts w:ascii="Consolas" w:eastAsia="Times New Roman" w:hAnsi="Consolas" w:cs="Times New Roman"/>
+          <w:color w:val="BBBEBF"/>
+          <w:kern w:val="0"/>
+          <w:sz w:val="21"/>
+          <w:szCs w:val="21"/>
+          <w:lang w:val="en-US" w:eastAsia="it-IT"/>
+          <w14:ligatures w14:val="none"/>
+        </w:rPr>
+        <w:t xml:space="preserve"> </w:t>
+      </w:r>
       <w:r>
         <w:rPr>
           <w:rFonts w:ascii="Consolas" w:eastAsia="Times New Roman" w:hAnsi="Consolas" w:cs="Times New Roman"/>
@@ -8140,7 +7607,6 @@
         </w:rPr>
         <w:t>curr</w:t>
       </w:r>
-      <w:proofErr w:type="spellEnd"/>
       <w:r>
         <w:rPr>
           <w:rFonts w:ascii="Consolas" w:eastAsia="Times New Roman" w:hAnsi="Consolas" w:cs="Times New Roman"/>
@@ -8163,20 +7629,7 @@
           <w:lang w:val="en-US" w:eastAsia="it-IT"/>
           <w14:ligatures w14:val="none"/>
         </w:rPr>
-        <w:t>#</w:t>
-      </w:r>
-      <w:proofErr w:type="gramEnd"/>
-      <w:r>
-        <w:rPr>
-          <w:rFonts w:ascii="Consolas" w:eastAsia="Times New Roman" w:hAnsi="Consolas" w:cs="Times New Roman"/>
-          <w:color w:val="8B949E"/>
-          <w:kern w:val="0"/>
-          <w:sz w:val="21"/>
-          <w:szCs w:val="21"/>
-          <w:lang w:val="en-US" w:eastAsia="it-IT"/>
-          <w14:ligatures w14:val="none"/>
-        </w:rPr>
-        <w:t>trovo PREDECESSORE</w:t>
+        <w:t>#trovo PREDECESSORE</w:t>
       </w:r>
     </w:p>
     <w:p>
@@ -8253,8 +7706,6 @@
         </w:rPr>
         <w:t xml:space="preserve"> </w:t>
       </w:r>
-      <w:proofErr w:type="spellStart"/>
-      <w:proofErr w:type="gramStart"/>
       <w:r>
         <w:rPr>
           <w:rFonts w:ascii="Consolas" w:eastAsia="Times New Roman" w:hAnsi="Consolas" w:cs="Times New Roman"/>
@@ -8279,8 +7730,6 @@
         </w:rPr>
         <w:t>.right</w:t>
       </w:r>
-      <w:proofErr w:type="spellEnd"/>
-      <w:proofErr w:type="gramEnd"/>
     </w:p>
     <w:p>
       <w:pPr>
@@ -8371,8 +7820,6 @@
         </w:rPr>
         <w:t xml:space="preserve"> </w:t>
       </w:r>
-      <w:proofErr w:type="spellStart"/>
-      <w:proofErr w:type="gramStart"/>
       <w:r>
         <w:rPr>
           <w:rFonts w:ascii="Consolas" w:eastAsia="Times New Roman" w:hAnsi="Consolas" w:cs="Times New Roman"/>
@@ -8395,21 +7842,7 @@
           <w:lang w:val="en-US" w:eastAsia="it-IT"/>
           <w14:ligatures w14:val="none"/>
         </w:rPr>
-        <w:t>.right</w:t>
-      </w:r>
-      <w:proofErr w:type="spellEnd"/>
-      <w:proofErr w:type="gramEnd"/>
-      <w:r>
-        <w:rPr>
-          <w:rFonts w:ascii="Consolas" w:eastAsia="Times New Roman" w:hAnsi="Consolas" w:cs="Times New Roman"/>
-          <w:color w:val="BBBEBF"/>
-          <w:kern w:val="0"/>
-          <w:sz w:val="21"/>
-          <w:szCs w:val="21"/>
-          <w:lang w:val="en-US" w:eastAsia="it-IT"/>
-          <w14:ligatures w14:val="none"/>
-        </w:rPr>
-        <w:t>:</w:t>
+        <w:t>.right:</w:t>
       </w:r>
     </w:p>
     <w:p>
@@ -8422,7 +7855,7 @@
           <w:kern w:val="0"/>
           <w:sz w:val="21"/>
           <w:szCs w:val="21"/>
-          <w:lang w:eastAsia="it-IT"/>
+          <w:lang w:val="en-US" w:eastAsia="it-IT"/>
           <w14:ligatures w14:val="none"/>
         </w:rPr>
       </w:pPr>
@@ -8438,8 +7871,6 @@
         </w:rPr>
         <w:t xml:space="preserve">                    </w:t>
       </w:r>
-      <w:proofErr w:type="spellStart"/>
-      <w:proofErr w:type="gramStart"/>
       <w:r>
         <w:rPr>
           <w:rFonts w:ascii="Consolas" w:eastAsia="Times New Roman" w:hAnsi="Consolas" w:cs="Times New Roman"/>
@@ -8447,7 +7878,7 @@
           <w:kern w:val="0"/>
           <w:sz w:val="21"/>
           <w:szCs w:val="21"/>
-          <w:lang w:eastAsia="it-IT"/>
+          <w:lang w:val="en-US" w:eastAsia="it-IT"/>
           <w14:ligatures w14:val="none"/>
         </w:rPr>
         <w:t>pred</w:t>
@@ -8459,24 +7890,10 @@
           <w:kern w:val="0"/>
           <w:sz w:val="21"/>
           <w:szCs w:val="21"/>
-          <w:lang w:eastAsia="it-IT"/>
-          <w14:ligatures w14:val="none"/>
-        </w:rPr>
-        <w:t>.right</w:t>
-      </w:r>
-      <w:proofErr w:type="spellEnd"/>
-      <w:proofErr w:type="gramEnd"/>
-      <w:r>
-        <w:rPr>
-          <w:rFonts w:ascii="Consolas" w:eastAsia="Times New Roman" w:hAnsi="Consolas" w:cs="Times New Roman"/>
-          <w:color w:val="BBBEBF"/>
-          <w:kern w:val="0"/>
-          <w:sz w:val="21"/>
-          <w:szCs w:val="21"/>
-          <w:lang w:eastAsia="it-IT"/>
-          <w14:ligatures w14:val="none"/>
-        </w:rPr>
-        <w:t xml:space="preserve"> </w:t>
+          <w:lang w:val="en-US" w:eastAsia="it-IT"/>
+          <w14:ligatures w14:val="none"/>
+        </w:rPr>
+        <w:t xml:space="preserve">.right </w:t>
       </w:r>
       <w:r>
         <w:rPr>
@@ -8485,7 +7902,7 @@
           <w:kern w:val="0"/>
           <w:sz w:val="21"/>
           <w:szCs w:val="21"/>
-          <w:lang w:eastAsia="it-IT"/>
+          <w:lang w:val="en-US" w:eastAsia="it-IT"/>
           <w14:ligatures w14:val="none"/>
         </w:rPr>
         <w:t>=</w:t>
@@ -8497,12 +7914,11 @@
           <w:kern w:val="0"/>
           <w:sz w:val="21"/>
           <w:szCs w:val="21"/>
-          <w:lang w:eastAsia="it-IT"/>
-          <w14:ligatures w14:val="none"/>
-        </w:rPr>
-        <w:t xml:space="preserve"> </w:t>
-      </w:r>
-      <w:proofErr w:type="spellStart"/>
+          <w:lang w:val="en-US" w:eastAsia="it-IT"/>
+          <w14:ligatures w14:val="none"/>
+        </w:rPr>
+        <w:t xml:space="preserve"> </w:t>
+      </w:r>
       <w:r>
         <w:rPr>
           <w:rFonts w:ascii="Consolas" w:eastAsia="Times New Roman" w:hAnsi="Consolas" w:cs="Times New Roman"/>
@@ -8510,12 +7926,11 @@
           <w:kern w:val="0"/>
           <w:sz w:val="21"/>
           <w:szCs w:val="21"/>
-          <w:lang w:eastAsia="it-IT"/>
+          <w:lang w:val="en-US" w:eastAsia="it-IT"/>
           <w14:ligatures w14:val="none"/>
         </w:rPr>
         <w:t>curr</w:t>
       </w:r>
-      <w:proofErr w:type="spellEnd"/>
     </w:p>
     <w:p>
       <w:pPr>
@@ -8527,24 +7942,23 @@
           <w:kern w:val="0"/>
           <w:sz w:val="21"/>
           <w:szCs w:val="21"/>
-          <w:lang w:eastAsia="it-IT"/>
-          <w14:ligatures w14:val="none"/>
-        </w:rPr>
-      </w:pPr>
-      <w:r>
-        <w:rPr>
-          <w:rFonts w:ascii="Consolas" w:eastAsia="Times New Roman" w:hAnsi="Consolas" w:cs="Times New Roman"/>
-          <w:color w:val="BBBEBF"/>
-          <w:kern w:val="0"/>
-          <w:sz w:val="21"/>
-          <w:szCs w:val="21"/>
-          <w:lang w:eastAsia="it-IT"/>
+          <w:lang w:val="en-US" w:eastAsia="it-IT"/>
+          <w14:ligatures w14:val="none"/>
+        </w:rPr>
+      </w:pPr>
+      <w:r>
+        <w:rPr>
+          <w:rFonts w:ascii="Consolas" w:eastAsia="Times New Roman" w:hAnsi="Consolas" w:cs="Times New Roman"/>
+          <w:color w:val="BBBEBF"/>
+          <w:kern w:val="0"/>
+          <w:sz w:val="21"/>
+          <w:szCs w:val="21"/>
+          <w:lang w:val="en-US" w:eastAsia="it-IT"/>
           <w14:ligatures w14:val="none"/>
         </w:rPr>
         <w:lastRenderedPageBreak/>
         <w:t xml:space="preserve">                    </w:t>
       </w:r>
-      <w:proofErr w:type="spellStart"/>
       <w:r>
         <w:rPr>
           <w:rFonts w:ascii="Consolas" w:eastAsia="Times New Roman" w:hAnsi="Consolas" w:cs="Times New Roman"/>
@@ -8552,20 +7966,19 @@
           <w:kern w:val="0"/>
           <w:sz w:val="21"/>
           <w:szCs w:val="21"/>
-          <w:lang w:eastAsia="it-IT"/>
+          <w:lang w:val="en-US" w:eastAsia="it-IT"/>
           <w14:ligatures w14:val="none"/>
         </w:rPr>
         <w:t>curr</w:t>
       </w:r>
-      <w:proofErr w:type="spellEnd"/>
-      <w:r>
-        <w:rPr>
-          <w:rFonts w:ascii="Consolas" w:eastAsia="Times New Roman" w:hAnsi="Consolas" w:cs="Times New Roman"/>
-          <w:color w:val="BBBEBF"/>
-          <w:kern w:val="0"/>
-          <w:sz w:val="21"/>
-          <w:szCs w:val="21"/>
-          <w:lang w:eastAsia="it-IT"/>
+      <w:r>
+        <w:rPr>
+          <w:rFonts w:ascii="Consolas" w:eastAsia="Times New Roman" w:hAnsi="Consolas" w:cs="Times New Roman"/>
+          <w:color w:val="BBBEBF"/>
+          <w:kern w:val="0"/>
+          <w:sz w:val="21"/>
+          <w:szCs w:val="21"/>
+          <w:lang w:val="en-US" w:eastAsia="it-IT"/>
           <w14:ligatures w14:val="none"/>
         </w:rPr>
         <w:t xml:space="preserve"> </w:t>
@@ -8577,7 +7990,7 @@
           <w:kern w:val="0"/>
           <w:sz w:val="21"/>
           <w:szCs w:val="21"/>
-          <w:lang w:eastAsia="it-IT"/>
+          <w:lang w:val="en-US" w:eastAsia="it-IT"/>
           <w14:ligatures w14:val="none"/>
         </w:rPr>
         <w:t>=</w:t>
@@ -8589,12 +8002,11 @@
           <w:kern w:val="0"/>
           <w:sz w:val="21"/>
           <w:szCs w:val="21"/>
-          <w:lang w:eastAsia="it-IT"/>
-          <w14:ligatures w14:val="none"/>
-        </w:rPr>
-        <w:t xml:space="preserve"> </w:t>
-      </w:r>
-      <w:proofErr w:type="spellStart"/>
+          <w:lang w:val="en-US" w:eastAsia="it-IT"/>
+          <w14:ligatures w14:val="none"/>
+        </w:rPr>
+        <w:t xml:space="preserve"> </w:t>
+      </w:r>
       <w:r>
         <w:rPr>
           <w:rFonts w:ascii="Consolas" w:eastAsia="Times New Roman" w:hAnsi="Consolas" w:cs="Times New Roman"/>
@@ -8602,7 +8014,7 @@
           <w:kern w:val="0"/>
           <w:sz w:val="21"/>
           <w:szCs w:val="21"/>
-          <w:lang w:eastAsia="it-IT"/>
+          <w:lang w:val="en-US" w:eastAsia="it-IT"/>
           <w14:ligatures w14:val="none"/>
         </w:rPr>
         <w:t>curr</w:t>
@@ -8614,12 +8026,11 @@
           <w:kern w:val="0"/>
           <w:sz w:val="21"/>
           <w:szCs w:val="21"/>
-          <w:lang w:eastAsia="it-IT"/>
+          <w:lang w:val="en-US" w:eastAsia="it-IT"/>
           <w14:ligatures w14:val="none"/>
         </w:rPr>
         <w:t>.left</w:t>
       </w:r>
-      <w:proofErr w:type="spellEnd"/>
     </w:p>
     <w:p>
       <w:pPr>
@@ -8642,7 +8053,7 @@
           <w:kern w:val="0"/>
           <w:sz w:val="21"/>
           <w:szCs w:val="21"/>
-          <w:lang w:eastAsia="it-IT"/>
+          <w:lang w:val="en-US" w:eastAsia="it-IT"/>
           <w14:ligatures w14:val="none"/>
         </w:rPr>
         <w:t xml:space="preserve">                </w:t>
@@ -8710,8 +8121,6 @@
         </w:rPr>
         <w:t xml:space="preserve">                    </w:t>
       </w:r>
-      <w:proofErr w:type="spellStart"/>
-      <w:proofErr w:type="gramStart"/>
       <w:r>
         <w:rPr>
           <w:rFonts w:ascii="Consolas" w:eastAsia="Times New Roman" w:hAnsi="Consolas" w:cs="Times New Roman"/>
@@ -8734,21 +8143,7 @@
           <w:lang w:val="en-US" w:eastAsia="it-IT"/>
           <w14:ligatures w14:val="none"/>
         </w:rPr>
-        <w:t>.right</w:t>
-      </w:r>
-      <w:proofErr w:type="spellEnd"/>
-      <w:proofErr w:type="gramEnd"/>
-      <w:r>
-        <w:rPr>
-          <w:rFonts w:ascii="Consolas" w:eastAsia="Times New Roman" w:hAnsi="Consolas" w:cs="Times New Roman"/>
-          <w:color w:val="BBBEBF"/>
-          <w:kern w:val="0"/>
-          <w:sz w:val="21"/>
-          <w:szCs w:val="21"/>
-          <w:lang w:val="en-US" w:eastAsia="it-IT"/>
-          <w14:ligatures w14:val="none"/>
-        </w:rPr>
-        <w:t xml:space="preserve"> </w:t>
+        <w:t xml:space="preserve">.right </w:t>
       </w:r>
       <w:r>
         <w:rPr>
@@ -9047,7 +8442,6 @@
         </w:rPr>
         <w:t xml:space="preserve"> </w:t>
       </w:r>
-      <w:proofErr w:type="spellStart"/>
       <w:r>
         <w:rPr>
           <w:rFonts w:ascii="Consolas" w:eastAsia="Times New Roman" w:hAnsi="Consolas" w:cs="Times New Roman"/>
@@ -9072,7 +8466,6 @@
         </w:rPr>
         <w:t>.val</w:t>
       </w:r>
-      <w:proofErr w:type="spellEnd"/>
     </w:p>
     <w:p>
       <w:pPr>
@@ -9100,7 +8493,6 @@
         </w:rPr>
         <w:t xml:space="preserve">                    </w:t>
       </w:r>
-      <w:proofErr w:type="spellStart"/>
       <w:r>
         <w:rPr>
           <w:rFonts w:ascii="Consolas" w:eastAsia="Times New Roman" w:hAnsi="Consolas" w:cs="Times New Roman"/>
@@ -9113,7 +8505,6 @@
         </w:rPr>
         <w:t>curr</w:t>
       </w:r>
-      <w:proofErr w:type="spellEnd"/>
       <w:r>
         <w:rPr>
           <w:rFonts w:ascii="Consolas" w:eastAsia="Times New Roman" w:hAnsi="Consolas" w:cs="Times New Roman"/>
@@ -9150,8 +8541,6 @@
         </w:rPr>
         <w:t xml:space="preserve"> </w:t>
       </w:r>
-      <w:proofErr w:type="spellStart"/>
-      <w:proofErr w:type="gramStart"/>
       <w:r>
         <w:rPr>
           <w:rFonts w:ascii="Consolas" w:eastAsia="Times New Roman" w:hAnsi="Consolas" w:cs="Times New Roman"/>
@@ -9176,8 +8565,6 @@
         </w:rPr>
         <w:t>.right</w:t>
       </w:r>
-      <w:proofErr w:type="spellEnd"/>
-      <w:proofErr w:type="gramEnd"/>
     </w:p>
     <w:p>
       <w:pPr>
@@ -9428,21 +8815,7 @@
         <w:rPr>
           <w:lang w:val="en-US"/>
         </w:rPr>
-        <w:t xml:space="preserve">a sinistra di ROOT) e RIGHT SUB-TREE NODES (a </w:t>
-      </w:r>
-      <w:proofErr w:type="spellStart"/>
-      <w:r>
-        <w:rPr>
-          <w:lang w:val="en-US"/>
-        </w:rPr>
-        <w:t>destra</w:t>
-      </w:r>
-      <w:proofErr w:type="spellEnd"/>
-      <w:r>
-        <w:rPr>
-          <w:lang w:val="en-US"/>
-        </w:rPr>
-        <w:t xml:space="preserve"> di ROOT).</w:t>
+        <w:t>a sinistra di ROOT) e RIGHT SUB-TREE NODES (a destra di ROOT).</w:t>
       </w:r>
     </w:p>
     <w:p>
@@ -9550,15 +8923,7 @@
         <w:t>PRIMO</w:t>
       </w:r>
       <w:r>
-        <w:t xml:space="preserve"> che compare in PRE-ORDER e la ROOT su questo </w:t>
-      </w:r>
-      <w:proofErr w:type="spellStart"/>
-      <w:r>
-        <w:t>subtree</w:t>
-      </w:r>
-      <w:proofErr w:type="spellEnd"/>
-      <w:r>
-        <w:t xml:space="preserve"> </w:t>
+        <w:t xml:space="preserve"> che compare in PRE-ORDER e la ROOT su questo subtree </w:t>
       </w:r>
       <w:r>
         <w:sym w:font="Wingdings" w:char="F0E0"/>
@@ -9599,15 +8964,7 @@
         <w:t>Continuo</w:t>
       </w:r>
       <w:r>
-        <w:t xml:space="preserve"> </w:t>
-      </w:r>
-      <w:proofErr w:type="gramStart"/>
-      <w:r>
-        <w:t>cosi</w:t>
-      </w:r>
-      <w:proofErr w:type="gramEnd"/>
-      <w:r>
-        <w:t xml:space="preserve"> fino ad esaurire nodi (a SX IN-ORDER ho vera ROOT oppure ho esaurito nodi IN ARRAY)</w:t>
+        <w:t xml:space="preserve"> cosi fino ad esaurire nodi (a SX IN-ORDER ho vera ROOT oppure ho esaurito nodi IN ARRAY)</w:t>
       </w:r>
     </w:p>
     <w:p/>
@@ -9685,74 +9042,17 @@
         <w:t xml:space="preserve">O(N) time </w:t>
       </w:r>
       <w:r>
-        <w:t xml:space="preserve">(N = </w:t>
-      </w:r>
-      <w:proofErr w:type="spellStart"/>
-      <w:r>
-        <w:t>length</w:t>
-      </w:r>
-      <w:proofErr w:type="spellEnd"/>
-      <w:r>
-        <w:t xml:space="preserve"> of </w:t>
-      </w:r>
-      <w:proofErr w:type="spellStart"/>
-      <w:r>
-        <w:t>string</w:t>
-      </w:r>
-      <w:proofErr w:type="spellEnd"/>
-      <w:r>
-        <w:t xml:space="preserve">) e </w:t>
+        <w:t xml:space="preserve">(N = length of string) e </w:t>
       </w:r>
       <w:r>
         <w:rPr>
           <w:b/>
           <w:bCs/>
         </w:rPr>
-        <w:t xml:space="preserve">O(T) </w:t>
-      </w:r>
-      <w:proofErr w:type="spellStart"/>
-      <w:r>
-        <w:rPr>
-          <w:b/>
-          <w:bCs/>
-        </w:rPr>
-        <w:t>space</w:t>
-      </w:r>
-      <w:proofErr w:type="spellEnd"/>
-      <w:r>
-        <w:t xml:space="preserve"> (T = </w:t>
-      </w:r>
-      <w:proofErr w:type="spellStart"/>
-      <w:r>
-        <w:t>number</w:t>
-      </w:r>
-      <w:proofErr w:type="spellEnd"/>
-      <w:r>
-        <w:t xml:space="preserve"> of </w:t>
-      </w:r>
-      <w:proofErr w:type="spellStart"/>
-      <w:r>
-        <w:t>different</w:t>
-      </w:r>
-      <w:proofErr w:type="spellEnd"/>
-      <w:r>
-        <w:t xml:space="preserve"> </w:t>
-      </w:r>
-      <w:proofErr w:type="spellStart"/>
-      <w:r>
-        <w:t>paths</w:t>
-      </w:r>
-      <w:proofErr w:type="spellEnd"/>
-      <w:r>
-        <w:t xml:space="preserve"> </w:t>
-      </w:r>
-      <w:proofErr w:type="spellStart"/>
-      <w:r>
-        <w:t>stored</w:t>
-      </w:r>
-      <w:proofErr w:type="spellEnd"/>
-      <w:r>
-        <w:t xml:space="preserve">) facendo si che </w:t>
+        <w:t>O(T) space</w:t>
+      </w:r>
+      <w:r>
+        <w:t xml:space="preserve"> (T = number of different paths stored) facendo si che </w:t>
       </w:r>
       <w:r>
         <w:rPr>
@@ -9875,23 +9175,8 @@
         <w:rPr>
           <w:lang w:val="en-US"/>
         </w:rPr>
-        <w:t xml:space="preserve">A </w:t>
-      </w:r>
-      <w:proofErr w:type="spellStart"/>
-      <w:r>
-        <w:rPr>
-          <w:lang w:val="en-US"/>
-        </w:rPr>
-        <w:t>boolean</w:t>
-      </w:r>
-      <w:proofErr w:type="spellEnd"/>
-      <w:r>
-        <w:rPr>
-          <w:lang w:val="en-US"/>
-        </w:rPr>
-        <w:t xml:space="preserve"> flag </w:t>
-      </w:r>
-      <w:proofErr w:type="spellStart"/>
+        <w:t>A boolean flag </w:t>
+      </w:r>
       <w:r>
         <w:rPr>
           <w:b/>
@@ -9900,7 +9185,6 @@
         </w:rPr>
         <w:t>endOfWord</w:t>
       </w:r>
-      <w:proofErr w:type="spellEnd"/>
       <w:r>
         <w:rPr>
           <w:lang w:val="en-US"/>
@@ -9920,23 +9204,7 @@
         <w:t>Trie</w:t>
       </w:r>
       <w:r>
-        <w:t xml:space="preserve"> </w:t>
-      </w:r>
-      <w:proofErr w:type="spellStart"/>
-      <w:r>
-        <w:t>is</w:t>
-      </w:r>
-      <w:proofErr w:type="spellEnd"/>
-      <w:r>
-        <w:t xml:space="preserve"> </w:t>
-      </w:r>
-      <w:proofErr w:type="spellStart"/>
-      <w:r>
-        <w:t>useful</w:t>
-      </w:r>
-      <w:proofErr w:type="spellEnd"/>
-      <w:r>
-        <w:t>:</w:t>
+        <w:t xml:space="preserve"> is useful:</w:t>
       </w:r>
     </w:p>
     <w:p>
@@ -9955,23 +9223,13 @@
         </w:rPr>
         <w:t>Searching words and prefixes is </w:t>
       </w:r>
-      <w:proofErr w:type="gramStart"/>
       <w:r>
         <w:rPr>
           <w:b/>
           <w:bCs/>
           <w:lang w:val="en-US"/>
         </w:rPr>
-        <w:t>O(</w:t>
-      </w:r>
-      <w:proofErr w:type="gramEnd"/>
-      <w:r>
-        <w:rPr>
-          <w:b/>
-          <w:bCs/>
-          <w:lang w:val="en-US"/>
-        </w:rPr>
-        <w:t>length of word)</w:t>
+        <w:t>O(length of word)</w:t>
       </w:r>
       <w:r>
         <w:rPr>
@@ -10096,16 +9354,7 @@
           <w:color w:val="C00000"/>
           <w:lang w:val="en-US"/>
         </w:rPr>
-        <w:t>KAHN’S ALGORITHM</w:t>
-      </w:r>
-      <w:r>
-        <w:rPr>
-          <w:b/>
-          <w:bCs/>
-          <w:color w:val="C00000"/>
-          <w:lang w:val="en-US"/>
-        </w:rPr>
-        <w:t xml:space="preserve">: </w:t>
+        <w:t xml:space="preserve">KAHN’S ALGORITHM: </w:t>
       </w:r>
       <w:r>
         <w:rPr>
@@ -10141,15 +9390,7 @@
           <w:iCs/>
           <w:lang w:val="en-US"/>
         </w:rPr>
-        <w:t>graphs</w:t>
-      </w:r>
-      <w:r>
-        <w:rPr>
-          <w:i/>
-          <w:iCs/>
-          <w:lang w:val="en-US"/>
-        </w:rPr>
-        <w:t xml:space="preserve"> </w:t>
+        <w:t xml:space="preserve">graphs </w:t>
       </w:r>
       <w:r>
         <w:rPr>
@@ -10243,6 +9484,77 @@
           <w:lang w:val="en-US"/>
         </w:rPr>
         <w:t xml:space="preserve"> array</w:t>
+      </w:r>
+      <w:r>
+        <w:rPr>
+          <w:lang w:val="en-US"/>
+        </w:rPr>
+        <w:t>.</w:t>
+      </w:r>
+    </w:p>
+    <w:p>
+      <w:pPr>
+        <w:rPr>
+          <w:lang w:val="en-US"/>
+        </w:rPr>
+      </w:pPr>
+      <w:r>
+        <w:rPr>
+          <w:b/>
+          <w:bCs/>
+          <w:highlight w:val="yellow"/>
+          <w:lang w:val="en-US"/>
+        </w:rPr>
+        <w:t>N.B.:</w:t>
+      </w:r>
+      <w:r>
+        <w:rPr>
+          <w:lang w:val="en-US"/>
+        </w:rPr>
+        <w:t xml:space="preserve"> We can EQUALLY USE </w:t>
+      </w:r>
+      <w:r>
+        <w:rPr>
+          <w:b/>
+          <w:bCs/>
+          <w:lang w:val="en-US"/>
+        </w:rPr>
+        <w:t>DFS + CYCLE DETETCTION</w:t>
+      </w:r>
+      <w:r>
+        <w:rPr>
+          <w:lang w:val="en-US"/>
+        </w:rPr>
+        <w:t xml:space="preserve"> (stateful) and/or </w:t>
+      </w:r>
+      <w:r>
+        <w:rPr>
+          <w:b/>
+          <w:bCs/>
+          <w:lang w:val="en-US"/>
+        </w:rPr>
+        <w:t>TOPOLOGICAL SORT</w:t>
+      </w:r>
+      <w:r>
+        <w:rPr>
+          <w:lang w:val="en-US"/>
+        </w:rPr>
+        <w:t xml:space="preserve"> (gives us a </w:t>
+      </w:r>
+      <w:r>
+        <w:rPr>
+          <w:i/>
+          <w:iCs/>
+          <w:u w:val="single"/>
+          <w:lang w:val="en-US"/>
+        </w:rPr>
+        <w:t>VALID ORDER of traversal</w:t>
+      </w:r>
+      <w:r>
+        <w:rPr>
+          <w:lang w:val="en-US"/>
+        </w:rPr>
+        <w:t>)</w:t>
       </w:r>
     </w:p>
     <w:p>

</xml_diff>

<commit_message>
Add implementation for validTree function to check if a graph is a valid tree using DFS for cycle detection and edge counting
</commit_message>
<xml_diff>
--- a/docs/PATTERNS.docx
+++ b/docs/PATTERNS.docx
@@ -78,6 +78,7 @@
           <w:lang w:val="en-US"/>
         </w:rPr>
       </w:pPr>
+      <w:proofErr w:type="gramStart"/>
       <w:r>
         <w:rPr>
           <w:b/>
@@ -85,7 +86,17 @@
           <w:color w:val="C00000"/>
           <w:lang w:val="en-US"/>
         </w:rPr>
-        <w:t xml:space="preserve">TOP-K ITEMS: </w:t>
+        <w:t>TOP-K</w:t>
+      </w:r>
+      <w:proofErr w:type="gramEnd"/>
+      <w:r>
+        <w:rPr>
+          <w:b/>
+          <w:bCs/>
+          <w:color w:val="C00000"/>
+          <w:lang w:val="en-US"/>
+        </w:rPr>
+        <w:t xml:space="preserve"> ITEMS: </w:t>
       </w:r>
       <w:r>
         <w:rPr>
@@ -119,21 +130,37 @@
           <w:iCs/>
           <w:lang w:val="en-US"/>
         </w:rPr>
-        <w:t>1_Arrays&amp;String</w:t>
-      </w:r>
+        <w:t>1_Arrays&amp;</w:t>
+      </w:r>
+      <w:proofErr w:type="gramStart"/>
       <w:r>
         <w:rPr>
           <w:i/>
           <w:iCs/>
           <w:lang w:val="en-US"/>
         </w:rPr>
-        <w:t xml:space="preserve"> </w:t>
-      </w:r>
-      <w:r>
-        <w:rPr>
-          <w:lang w:val="en-US"/>
-        </w:rPr>
-        <w:t xml:space="preserve"> problem </w:t>
+        <w:t>String</w:t>
+      </w:r>
+      <w:r>
+        <w:rPr>
+          <w:i/>
+          <w:iCs/>
+          <w:lang w:val="en-US"/>
+        </w:rPr>
+        <w:t xml:space="preserve"> </w:t>
+      </w:r>
+      <w:r>
+        <w:rPr>
+          <w:lang w:val="en-US"/>
+        </w:rPr>
+        <w:t xml:space="preserve"> problem</w:t>
+      </w:r>
+      <w:proofErr w:type="gramEnd"/>
+      <w:r>
+        <w:rPr>
+          <w:lang w:val="en-US"/>
+        </w:rPr>
+        <w:t xml:space="preserve"> </w:t>
       </w:r>
       <w:r>
         <w:rPr>
@@ -341,6 +368,7 @@
           <w14:ligatures w14:val="none"/>
         </w:rPr>
       </w:pPr>
+      <w:proofErr w:type="spellStart"/>
       <w:r>
         <w:rPr>
           <w:rFonts w:ascii="Consolas" w:eastAsia="Times New Roman" w:hAnsi="Consolas" w:cs="Times New Roman"/>
@@ -353,6 +381,7 @@
         </w:rPr>
         <w:t>val</w:t>
       </w:r>
+      <w:proofErr w:type="spellEnd"/>
       <w:r>
         <w:rPr>
           <w:rFonts w:ascii="Consolas" w:eastAsia="Times New Roman" w:hAnsi="Consolas" w:cs="Times New Roman"/>
@@ -402,7 +431,33 @@
           <w:lang w:val="en-US" w:eastAsia="it-IT"/>
           <w14:ligatures w14:val="none"/>
         </w:rPr>
-        <w:t>for p in len(str)</w:t>
+        <w:t xml:space="preserve">for p in </w:t>
+      </w:r>
+      <w:proofErr w:type="spellStart"/>
+      <w:r>
+        <w:rPr>
+          <w:rFonts w:ascii="Consolas" w:eastAsia="Times New Roman" w:hAnsi="Consolas" w:cs="Times New Roman"/>
+          <w:color w:val="C9D1D9"/>
+          <w:kern w:val="0"/>
+          <w:sz w:val="21"/>
+          <w:szCs w:val="21"/>
+          <w:lang w:val="en-US" w:eastAsia="it-IT"/>
+          <w14:ligatures w14:val="none"/>
+        </w:rPr>
+        <w:t>len</w:t>
+      </w:r>
+      <w:proofErr w:type="spellEnd"/>
+      <w:r>
+        <w:rPr>
+          <w:rFonts w:ascii="Consolas" w:eastAsia="Times New Roman" w:hAnsi="Consolas" w:cs="Times New Roman"/>
+          <w:color w:val="C9D1D9"/>
+          <w:kern w:val="0"/>
+          <w:sz w:val="21"/>
+          <w:szCs w:val="21"/>
+          <w:lang w:val="en-US" w:eastAsia="it-IT"/>
+          <w14:ligatures w14:val="none"/>
+        </w:rPr>
+        <w:t>(str)</w:t>
       </w:r>
     </w:p>
     <w:p>
@@ -420,6 +475,7 @@
           <w14:ligatures w14:val="none"/>
         </w:rPr>
       </w:pPr>
+      <w:proofErr w:type="spellStart"/>
       <w:r>
         <w:rPr>
           <w:rFonts w:ascii="Consolas" w:eastAsia="Times New Roman" w:hAnsi="Consolas" w:cs="Times New Roman"/>
@@ -432,6 +488,7 @@
         </w:rPr>
         <w:t>val</w:t>
       </w:r>
+      <w:proofErr w:type="spellEnd"/>
       <w:r>
         <w:rPr>
           <w:rFonts w:ascii="Consolas" w:eastAsia="Times New Roman" w:hAnsi="Consolas" w:cs="Times New Roman"/>
@@ -520,6 +577,7 @@
           <w14:ligatures w14:val="none"/>
         </w:rPr>
       </w:pPr>
+      <w:proofErr w:type="spellStart"/>
       <w:r>
         <w:rPr>
           <w:rFonts w:ascii="Consolas" w:eastAsia="Times New Roman" w:hAnsi="Consolas" w:cs="Times New Roman"/>
@@ -530,7 +588,20 @@
           <w:lang w:val="en-US" w:eastAsia="it-IT"/>
           <w14:ligatures w14:val="none"/>
         </w:rPr>
-        <w:t>val += (</w:t>
+        <w:t>val</w:t>
+      </w:r>
+      <w:proofErr w:type="spellEnd"/>
+      <w:r>
+        <w:rPr>
+          <w:rFonts w:ascii="Consolas" w:eastAsia="Times New Roman" w:hAnsi="Consolas" w:cs="Times New Roman"/>
+          <w:color w:val="C9D1D9"/>
+          <w:kern w:val="0"/>
+          <w:sz w:val="21"/>
+          <w:szCs w:val="21"/>
+          <w:lang w:val="en-US" w:eastAsia="it-IT"/>
+          <w14:ligatures w14:val="none"/>
+        </w:rPr>
+        <w:t xml:space="preserve"> += (</w:t>
       </w:r>
       <w:r>
         <w:rPr>
@@ -744,6 +815,7 @@
           <w14:ligatures w14:val="none"/>
         </w:rPr>
       </w:pPr>
+      <w:proofErr w:type="spellStart"/>
       <w:r>
         <w:rPr>
           <w:rFonts w:ascii="Consolas" w:eastAsia="Times New Roman" w:hAnsi="Consolas" w:cs="Times New Roman"/>
@@ -756,6 +828,7 @@
         </w:rPr>
         <w:t>val</w:t>
       </w:r>
+      <w:proofErr w:type="spellEnd"/>
       <w:r>
         <w:rPr>
           <w:rFonts w:ascii="Consolas" w:eastAsia="Times New Roman" w:hAnsi="Consolas" w:cs="Times New Roman"/>
@@ -820,7 +893,33 @@
           <w:lang w:val="en-US" w:eastAsia="it-IT"/>
           <w14:ligatures w14:val="none"/>
         </w:rPr>
-        <w:t>for p in len(str)</w:t>
+        <w:t xml:space="preserve">for p in </w:t>
+      </w:r>
+      <w:proofErr w:type="spellStart"/>
+      <w:r>
+        <w:rPr>
+          <w:rFonts w:ascii="Consolas" w:eastAsia="Times New Roman" w:hAnsi="Consolas" w:cs="Times New Roman"/>
+          <w:color w:val="C9D1D9"/>
+          <w:kern w:val="0"/>
+          <w:sz w:val="21"/>
+          <w:szCs w:val="21"/>
+          <w:lang w:val="en-US" w:eastAsia="it-IT"/>
+          <w14:ligatures w14:val="none"/>
+        </w:rPr>
+        <w:t>len</w:t>
+      </w:r>
+      <w:proofErr w:type="spellEnd"/>
+      <w:r>
+        <w:rPr>
+          <w:rFonts w:ascii="Consolas" w:eastAsia="Times New Roman" w:hAnsi="Consolas" w:cs="Times New Roman"/>
+          <w:color w:val="C9D1D9"/>
+          <w:kern w:val="0"/>
+          <w:sz w:val="21"/>
+          <w:szCs w:val="21"/>
+          <w:lang w:val="en-US" w:eastAsia="it-IT"/>
+          <w14:ligatures w14:val="none"/>
+        </w:rPr>
+        <w:t>(str)</w:t>
       </w:r>
     </w:p>
     <w:p>
@@ -838,6 +937,7 @@
           <w14:ligatures w14:val="none"/>
         </w:rPr>
       </w:pPr>
+      <w:proofErr w:type="spellStart"/>
       <w:r>
         <w:rPr>
           <w:rFonts w:ascii="Consolas" w:eastAsia="Times New Roman" w:hAnsi="Consolas" w:cs="Times New Roman"/>
@@ -850,6 +950,7 @@
         </w:rPr>
         <w:t>val</w:t>
       </w:r>
+      <w:proofErr w:type="spellEnd"/>
       <w:r>
         <w:rPr>
           <w:rFonts w:ascii="Consolas" w:eastAsia="Times New Roman" w:hAnsi="Consolas" w:cs="Times New Roman"/>
@@ -1394,6 +1495,7 @@
           <w14:ligatures w14:val="none"/>
         </w:rPr>
       </w:pPr>
+      <w:proofErr w:type="gramStart"/>
       <w:r>
         <w:rPr>
           <w:rFonts w:ascii="Consolas" w:eastAsia="Times New Roman" w:hAnsi="Consolas" w:cs="Times New Roman"/>
@@ -1406,7 +1508,82 @@
           <w:lang w:val="en-US" w:eastAsia="it-IT"/>
           <w14:ligatures w14:val="none"/>
         </w:rPr>
-        <w:t>#!SERIALIZATION + PATTERN MATCHING --&gt; O(N + M) time and O(N + M) space</w:t>
+        <w:t>#!SERIALIZATION</w:t>
+      </w:r>
+      <w:proofErr w:type="gramEnd"/>
+      <w:r>
+        <w:rPr>
+          <w:rFonts w:ascii="Consolas" w:eastAsia="Times New Roman" w:hAnsi="Consolas" w:cs="Times New Roman"/>
+          <w:b/>
+          <w:bCs/>
+          <w:color w:val="EE0000"/>
+          <w:kern w:val="0"/>
+          <w:sz w:val="21"/>
+          <w:szCs w:val="21"/>
+          <w:lang w:val="en-US" w:eastAsia="it-IT"/>
+          <w14:ligatures w14:val="none"/>
+        </w:rPr>
+        <w:t xml:space="preserve"> + PATTERN MATCHING --&gt; </w:t>
+      </w:r>
+      <w:proofErr w:type="gramStart"/>
+      <w:r>
+        <w:rPr>
+          <w:rFonts w:ascii="Consolas" w:eastAsia="Times New Roman" w:hAnsi="Consolas" w:cs="Times New Roman"/>
+          <w:b/>
+          <w:bCs/>
+          <w:color w:val="EE0000"/>
+          <w:kern w:val="0"/>
+          <w:sz w:val="21"/>
+          <w:szCs w:val="21"/>
+          <w:lang w:val="en-US" w:eastAsia="it-IT"/>
+          <w14:ligatures w14:val="none"/>
+        </w:rPr>
+        <w:t>O(</w:t>
+      </w:r>
+      <w:proofErr w:type="gramEnd"/>
+      <w:r>
+        <w:rPr>
+          <w:rFonts w:ascii="Consolas" w:eastAsia="Times New Roman" w:hAnsi="Consolas" w:cs="Times New Roman"/>
+          <w:b/>
+          <w:bCs/>
+          <w:color w:val="EE0000"/>
+          <w:kern w:val="0"/>
+          <w:sz w:val="21"/>
+          <w:szCs w:val="21"/>
+          <w:lang w:val="en-US" w:eastAsia="it-IT"/>
+          <w14:ligatures w14:val="none"/>
+        </w:rPr>
+        <w:t xml:space="preserve">N + M) time and </w:t>
+      </w:r>
+      <w:proofErr w:type="gramStart"/>
+      <w:r>
+        <w:rPr>
+          <w:rFonts w:ascii="Consolas" w:eastAsia="Times New Roman" w:hAnsi="Consolas" w:cs="Times New Roman"/>
+          <w:b/>
+          <w:bCs/>
+          <w:color w:val="EE0000"/>
+          <w:kern w:val="0"/>
+          <w:sz w:val="21"/>
+          <w:szCs w:val="21"/>
+          <w:lang w:val="en-US" w:eastAsia="it-IT"/>
+          <w14:ligatures w14:val="none"/>
+        </w:rPr>
+        <w:t>O(</w:t>
+      </w:r>
+      <w:proofErr w:type="gramEnd"/>
+      <w:r>
+        <w:rPr>
+          <w:rFonts w:ascii="Consolas" w:eastAsia="Times New Roman" w:hAnsi="Consolas" w:cs="Times New Roman"/>
+          <w:b/>
+          <w:bCs/>
+          <w:color w:val="EE0000"/>
+          <w:kern w:val="0"/>
+          <w:sz w:val="21"/>
+          <w:szCs w:val="21"/>
+          <w:lang w:val="en-US" w:eastAsia="it-IT"/>
+          <w14:ligatures w14:val="none"/>
+        </w:rPr>
+        <w:t>N + M) space</w:t>
       </w:r>
     </w:p>
     <w:p>
@@ -1522,6 +1699,7 @@
         </w:rPr>
         <w:t xml:space="preserve"> </w:t>
       </w:r>
+      <w:proofErr w:type="gramStart"/>
       <w:r>
         <w:rPr>
           <w:rFonts w:ascii="Consolas" w:eastAsia="Times New Roman" w:hAnsi="Consolas" w:cs="Times New Roman"/>
@@ -1546,6 +1724,7 @@
         </w:rPr>
         <w:t>(</w:t>
       </w:r>
+      <w:proofErr w:type="gramEnd"/>
       <w:r>
         <w:rPr>
           <w:rFonts w:ascii="Consolas" w:eastAsia="Times New Roman" w:hAnsi="Consolas" w:cs="Times New Roman"/>
@@ -1594,6 +1773,7 @@
         </w:rPr>
         <w:t xml:space="preserve">: </w:t>
       </w:r>
+      <w:proofErr w:type="gramStart"/>
       <w:r>
         <w:rPr>
           <w:rFonts w:ascii="Consolas" w:eastAsia="Times New Roman" w:hAnsi="Consolas" w:cs="Times New Roman"/>
@@ -1618,6 +1798,8 @@
         </w:rPr>
         <w:t>[</w:t>
       </w:r>
+      <w:proofErr w:type="spellStart"/>
+      <w:proofErr w:type="gramEnd"/>
       <w:r>
         <w:rPr>
           <w:rFonts w:ascii="Consolas" w:eastAsia="Times New Roman" w:hAnsi="Consolas" w:cs="Times New Roman"/>
@@ -1630,6 +1812,7 @@
         </w:rPr>
         <w:t>TreeNode</w:t>
       </w:r>
+      <w:proofErr w:type="spellEnd"/>
       <w:r>
         <w:rPr>
           <w:rFonts w:ascii="Consolas" w:eastAsia="Times New Roman" w:hAnsi="Consolas" w:cs="Times New Roman"/>
@@ -1850,8 +2033,22 @@
           <w:lang w:val="en-US" w:eastAsia="it-IT"/>
           <w14:ligatures w14:val="none"/>
         </w:rPr>
-        <w:t>"$#"</w:t>
-      </w:r>
+        <w:t>"</w:t>
+      </w:r>
+      <w:proofErr w:type="gramStart"/>
+      <w:r>
+        <w:rPr>
+          <w:rFonts w:ascii="Consolas" w:eastAsia="Times New Roman" w:hAnsi="Consolas" w:cs="Times New Roman"/>
+          <w:color w:val="A5D6FF"/>
+          <w:kern w:val="0"/>
+          <w:sz w:val="21"/>
+          <w:szCs w:val="21"/>
+          <w:lang w:val="en-US" w:eastAsia="it-IT"/>
+          <w14:ligatures w14:val="none"/>
+        </w:rPr>
+        <w:t>$#"</w:t>
+      </w:r>
+      <w:proofErr w:type="gramEnd"/>
     </w:p>
     <w:p>
       <w:pPr>
@@ -1975,6 +2172,7 @@
         </w:rPr>
         <w:t>(</w:t>
       </w:r>
+      <w:proofErr w:type="spellStart"/>
       <w:r>
         <w:rPr>
           <w:rFonts w:ascii="Consolas" w:eastAsia="Times New Roman" w:hAnsi="Consolas" w:cs="Times New Roman"/>
@@ -1997,7 +2195,20 @@
           <w:lang w:val="en-US" w:eastAsia="it-IT"/>
           <w14:ligatures w14:val="none"/>
         </w:rPr>
-        <w:t xml:space="preserve">.val) </w:t>
+        <w:t>.val</w:t>
+      </w:r>
+      <w:proofErr w:type="spellEnd"/>
+      <w:r>
+        <w:rPr>
+          <w:rFonts w:ascii="Consolas" w:eastAsia="Times New Roman" w:hAnsi="Consolas" w:cs="Times New Roman"/>
+          <w:color w:val="BBBEBF"/>
+          <w:kern w:val="0"/>
+          <w:sz w:val="21"/>
+          <w:szCs w:val="21"/>
+          <w:lang w:val="en-US" w:eastAsia="it-IT"/>
+          <w14:ligatures w14:val="none"/>
+        </w:rPr>
+        <w:t xml:space="preserve">) </w:t>
       </w:r>
       <w:r>
         <w:rPr>
@@ -2023,6 +2234,8 @@
         </w:rPr>
         <w:t xml:space="preserve"> </w:t>
       </w:r>
+      <w:proofErr w:type="spellStart"/>
+      <w:proofErr w:type="gramStart"/>
       <w:r>
         <w:rPr>
           <w:rFonts w:ascii="Consolas" w:eastAsia="Times New Roman" w:hAnsi="Consolas" w:cs="Times New Roman"/>
@@ -2059,6 +2272,8 @@
         </w:rPr>
         <w:t>serialize</w:t>
       </w:r>
+      <w:proofErr w:type="spellEnd"/>
+      <w:proofErr w:type="gramEnd"/>
       <w:r>
         <w:rPr>
           <w:rFonts w:ascii="Consolas" w:eastAsia="Times New Roman" w:hAnsi="Consolas" w:cs="Times New Roman"/>
@@ -2071,6 +2286,8 @@
         </w:rPr>
         <w:t>(</w:t>
       </w:r>
+      <w:proofErr w:type="spellStart"/>
+      <w:proofErr w:type="gramStart"/>
       <w:r>
         <w:rPr>
           <w:rFonts w:ascii="Consolas" w:eastAsia="Times New Roman" w:hAnsi="Consolas" w:cs="Times New Roman"/>
@@ -2093,7 +2310,21 @@
           <w:lang w:val="en-US" w:eastAsia="it-IT"/>
           <w14:ligatures w14:val="none"/>
         </w:rPr>
-        <w:t xml:space="preserve">.left) </w:t>
+        <w:t>.left</w:t>
+      </w:r>
+      <w:proofErr w:type="spellEnd"/>
+      <w:proofErr w:type="gramEnd"/>
+      <w:r>
+        <w:rPr>
+          <w:rFonts w:ascii="Consolas" w:eastAsia="Times New Roman" w:hAnsi="Consolas" w:cs="Times New Roman"/>
+          <w:color w:val="BBBEBF"/>
+          <w:kern w:val="0"/>
+          <w:sz w:val="21"/>
+          <w:szCs w:val="21"/>
+          <w:lang w:val="en-US" w:eastAsia="it-IT"/>
+          <w14:ligatures w14:val="none"/>
+        </w:rPr>
+        <w:t xml:space="preserve">) </w:t>
       </w:r>
       <w:r>
         <w:rPr>
@@ -2119,6 +2350,8 @@
         </w:rPr>
         <w:t xml:space="preserve"> </w:t>
       </w:r>
+      <w:proofErr w:type="spellStart"/>
+      <w:proofErr w:type="gramStart"/>
       <w:r>
         <w:rPr>
           <w:rFonts w:ascii="Consolas" w:eastAsia="Times New Roman" w:hAnsi="Consolas" w:cs="Times New Roman"/>
@@ -2155,6 +2388,8 @@
         </w:rPr>
         <w:t>serialize</w:t>
       </w:r>
+      <w:proofErr w:type="spellEnd"/>
+      <w:proofErr w:type="gramEnd"/>
       <w:r>
         <w:rPr>
           <w:rFonts w:ascii="Consolas" w:eastAsia="Times New Roman" w:hAnsi="Consolas" w:cs="Times New Roman"/>
@@ -2167,6 +2402,8 @@
         </w:rPr>
         <w:t>(</w:t>
       </w:r>
+      <w:proofErr w:type="spellStart"/>
+      <w:proofErr w:type="gramStart"/>
       <w:r>
         <w:rPr>
           <w:rFonts w:ascii="Consolas" w:eastAsia="Times New Roman" w:hAnsi="Consolas" w:cs="Times New Roman"/>
@@ -2189,7 +2426,21 @@
           <w:lang w:val="en-US" w:eastAsia="it-IT"/>
           <w14:ligatures w14:val="none"/>
         </w:rPr>
-        <w:t>.right))</w:t>
+        <w:t>.right</w:t>
+      </w:r>
+      <w:proofErr w:type="spellEnd"/>
+      <w:proofErr w:type="gramEnd"/>
+      <w:r>
+        <w:rPr>
+          <w:rFonts w:ascii="Consolas" w:eastAsia="Times New Roman" w:hAnsi="Consolas" w:cs="Times New Roman"/>
+          <w:color w:val="BBBEBF"/>
+          <w:kern w:val="0"/>
+          <w:sz w:val="21"/>
+          <w:szCs w:val="21"/>
+          <w:lang w:val="en-US" w:eastAsia="it-IT"/>
+          <w14:ligatures w14:val="none"/>
+        </w:rPr>
+        <w:t>))</w:t>
       </w:r>
     </w:p>
     <w:p>
@@ -2257,6 +2508,7 @@
         </w:rPr>
         <w:t xml:space="preserve"> </w:t>
       </w:r>
+      <w:proofErr w:type="spellStart"/>
       <w:r>
         <w:rPr>
           <w:rFonts w:ascii="Consolas" w:eastAsia="Times New Roman" w:hAnsi="Consolas" w:cs="Times New Roman"/>
@@ -2267,8 +2519,22 @@
           <w:lang w:val="en-US" w:eastAsia="it-IT"/>
           <w14:ligatures w14:val="none"/>
         </w:rPr>
-        <w:t>z_function</w:t>
-      </w:r>
+        <w:t>z_</w:t>
+      </w:r>
+      <w:proofErr w:type="gramStart"/>
+      <w:r>
+        <w:rPr>
+          <w:rFonts w:ascii="Consolas" w:eastAsia="Times New Roman" w:hAnsi="Consolas" w:cs="Times New Roman"/>
+          <w:color w:val="D2A8FF"/>
+          <w:kern w:val="0"/>
+          <w:sz w:val="21"/>
+          <w:szCs w:val="21"/>
+          <w:lang w:val="en-US" w:eastAsia="it-IT"/>
+          <w14:ligatures w14:val="none"/>
+        </w:rPr>
+        <w:t>function</w:t>
+      </w:r>
+      <w:proofErr w:type="spellEnd"/>
       <w:r>
         <w:rPr>
           <w:rFonts w:ascii="Consolas" w:eastAsia="Times New Roman" w:hAnsi="Consolas" w:cs="Times New Roman"/>
@@ -2281,6 +2547,7 @@
         </w:rPr>
         <w:t>(</w:t>
       </w:r>
+      <w:proofErr w:type="gramEnd"/>
       <w:r>
         <w:rPr>
           <w:rFonts w:ascii="Consolas" w:eastAsia="Times New Roman" w:hAnsi="Consolas" w:cs="Times New Roman"/>
@@ -2500,6 +2767,7 @@
         </w:rPr>
         <w:t xml:space="preserve"> </w:t>
       </w:r>
+      <w:proofErr w:type="spellStart"/>
       <w:r>
         <w:rPr>
           <w:rFonts w:ascii="Consolas" w:eastAsia="Times New Roman" w:hAnsi="Consolas" w:cs="Times New Roman"/>
@@ -2512,6 +2780,7 @@
         </w:rPr>
         <w:t>len</w:t>
       </w:r>
+      <w:proofErr w:type="spellEnd"/>
       <w:r>
         <w:rPr>
           <w:rFonts w:ascii="Consolas" w:eastAsia="Times New Roman" w:hAnsi="Consolas" w:cs="Times New Roman"/>
@@ -2734,6 +3003,7 @@
         </w:rPr>
         <w:t xml:space="preserve">, </w:t>
       </w:r>
+      <w:proofErr w:type="spellStart"/>
       <w:r>
         <w:rPr>
           <w:rFonts w:ascii="Consolas" w:eastAsia="Times New Roman" w:hAnsi="Consolas" w:cs="Times New Roman"/>
@@ -2746,6 +3016,7 @@
         </w:rPr>
         <w:t>len</w:t>
       </w:r>
+      <w:proofErr w:type="spellEnd"/>
       <w:r>
         <w:rPr>
           <w:rFonts w:ascii="Consolas" w:eastAsia="Times New Roman" w:hAnsi="Consolas" w:cs="Times New Roman"/>
@@ -2848,6 +3119,7 @@
         </w:rPr>
         <w:t xml:space="preserve"> </w:t>
       </w:r>
+      <w:proofErr w:type="spellStart"/>
       <w:r>
         <w:rPr>
           <w:rFonts w:ascii="Consolas" w:eastAsia="Times New Roman" w:hAnsi="Consolas" w:cs="Times New Roman"/>
@@ -2860,6 +3132,7 @@
         </w:rPr>
         <w:t>i</w:t>
       </w:r>
+      <w:proofErr w:type="spellEnd"/>
       <w:r>
         <w:rPr>
           <w:rFonts w:ascii="Consolas" w:eastAsia="Times New Roman" w:hAnsi="Consolas" w:cs="Times New Roman"/>
@@ -2896,6 +3169,7 @@
         </w:rPr>
         <w:t xml:space="preserve"> </w:t>
       </w:r>
+      <w:proofErr w:type="gramStart"/>
       <w:r>
         <w:rPr>
           <w:rFonts w:ascii="Consolas" w:eastAsia="Times New Roman" w:hAnsi="Consolas" w:cs="Times New Roman"/>
@@ -2920,6 +3194,7 @@
         </w:rPr>
         <w:t>(</w:t>
       </w:r>
+      <w:proofErr w:type="gramEnd"/>
       <w:r>
         <w:rPr>
           <w:rFonts w:ascii="Consolas" w:eastAsia="Times New Roman" w:hAnsi="Consolas" w:cs="Times New Roman"/>
@@ -3019,6 +3294,7 @@
         </w:rPr>
         <w:t xml:space="preserve"> </w:t>
       </w:r>
+      <w:proofErr w:type="spellStart"/>
       <w:r>
         <w:rPr>
           <w:rFonts w:ascii="Consolas" w:eastAsia="Times New Roman" w:hAnsi="Consolas" w:cs="Times New Roman"/>
@@ -3031,6 +3307,7 @@
         </w:rPr>
         <w:t>i</w:t>
       </w:r>
+      <w:proofErr w:type="spellEnd"/>
       <w:r>
         <w:rPr>
           <w:rFonts w:ascii="Consolas" w:eastAsia="Times New Roman" w:hAnsi="Consolas" w:cs="Times New Roman"/>
@@ -3102,7 +3379,7 @@
           <w:kern w:val="0"/>
           <w:sz w:val="21"/>
           <w:szCs w:val="21"/>
-          <w:lang w:eastAsia="it-IT"/>
+          <w:lang w:val="en-US" w:eastAsia="it-IT"/>
           <w14:ligatures w14:val="none"/>
         </w:rPr>
       </w:pPr>
@@ -3125,7 +3402,7 @@
           <w:kern w:val="0"/>
           <w:sz w:val="21"/>
           <w:szCs w:val="21"/>
-          <w:lang w:eastAsia="it-IT"/>
+          <w:lang w:val="en-US" w:eastAsia="it-IT"/>
           <w14:ligatures w14:val="none"/>
         </w:rPr>
         <w:t>z</w:t>
@@ -3137,11 +3414,12 @@
           <w:kern w:val="0"/>
           <w:sz w:val="21"/>
           <w:szCs w:val="21"/>
-          <w:lang w:eastAsia="it-IT"/>
+          <w:lang w:val="en-US" w:eastAsia="it-IT"/>
           <w14:ligatures w14:val="none"/>
         </w:rPr>
         <w:t>[</w:t>
       </w:r>
+      <w:proofErr w:type="spellStart"/>
       <w:r>
         <w:rPr>
           <w:rFonts w:ascii="Consolas" w:eastAsia="Times New Roman" w:hAnsi="Consolas" w:cs="Times New Roman"/>
@@ -3149,19 +3427,20 @@
           <w:kern w:val="0"/>
           <w:sz w:val="21"/>
           <w:szCs w:val="21"/>
-          <w:lang w:eastAsia="it-IT"/>
+          <w:lang w:val="en-US" w:eastAsia="it-IT"/>
           <w14:ligatures w14:val="none"/>
         </w:rPr>
         <w:t>i</w:t>
       </w:r>
-      <w:r>
-        <w:rPr>
-          <w:rFonts w:ascii="Consolas" w:eastAsia="Times New Roman" w:hAnsi="Consolas" w:cs="Times New Roman"/>
-          <w:color w:val="BBBEBF"/>
-          <w:kern w:val="0"/>
-          <w:sz w:val="21"/>
-          <w:szCs w:val="21"/>
-          <w:lang w:eastAsia="it-IT"/>
+      <w:proofErr w:type="spellEnd"/>
+      <w:r>
+        <w:rPr>
+          <w:rFonts w:ascii="Consolas" w:eastAsia="Times New Roman" w:hAnsi="Consolas" w:cs="Times New Roman"/>
+          <w:color w:val="BBBEBF"/>
+          <w:kern w:val="0"/>
+          <w:sz w:val="21"/>
+          <w:szCs w:val="21"/>
+          <w:lang w:val="en-US" w:eastAsia="it-IT"/>
           <w14:ligatures w14:val="none"/>
         </w:rPr>
         <w:t xml:space="preserve">] </w:t>
@@ -3173,7 +3452,7 @@
           <w:kern w:val="0"/>
           <w:sz w:val="21"/>
           <w:szCs w:val="21"/>
-          <w:lang w:eastAsia="it-IT"/>
+          <w:lang w:val="en-US" w:eastAsia="it-IT"/>
           <w14:ligatures w14:val="none"/>
         </w:rPr>
         <w:t>=</w:t>
@@ -3185,11 +3464,12 @@
           <w:kern w:val="0"/>
           <w:sz w:val="21"/>
           <w:szCs w:val="21"/>
-          <w:lang w:eastAsia="it-IT"/>
-          <w14:ligatures w14:val="none"/>
-        </w:rPr>
-        <w:t xml:space="preserve"> </w:t>
-      </w:r>
+          <w:lang w:val="en-US" w:eastAsia="it-IT"/>
+          <w14:ligatures w14:val="none"/>
+        </w:rPr>
+        <w:t xml:space="preserve"> </w:t>
+      </w:r>
+      <w:proofErr w:type="gramStart"/>
       <w:r>
         <w:rPr>
           <w:rFonts w:ascii="Consolas" w:eastAsia="Times New Roman" w:hAnsi="Consolas" w:cs="Times New Roman"/>
@@ -3197,7 +3477,7 @@
           <w:kern w:val="0"/>
           <w:sz w:val="21"/>
           <w:szCs w:val="21"/>
-          <w:lang w:eastAsia="it-IT"/>
+          <w:lang w:val="en-US" w:eastAsia="it-IT"/>
           <w14:ligatures w14:val="none"/>
         </w:rPr>
         <w:t>min</w:t>
@@ -3209,11 +3489,12 @@
           <w:kern w:val="0"/>
           <w:sz w:val="21"/>
           <w:szCs w:val="21"/>
-          <w:lang w:eastAsia="it-IT"/>
+          <w:lang w:val="en-US" w:eastAsia="it-IT"/>
           <w14:ligatures w14:val="none"/>
         </w:rPr>
         <w:t>(</w:t>
       </w:r>
+      <w:proofErr w:type="gramEnd"/>
       <w:r>
         <w:rPr>
           <w:rFonts w:ascii="Consolas" w:eastAsia="Times New Roman" w:hAnsi="Consolas" w:cs="Times New Roman"/>
@@ -3221,7 +3502,7 @@
           <w:kern w:val="0"/>
           <w:sz w:val="21"/>
           <w:szCs w:val="21"/>
-          <w:lang w:eastAsia="it-IT"/>
+          <w:lang w:val="en-US" w:eastAsia="it-IT"/>
           <w14:ligatures w14:val="none"/>
         </w:rPr>
         <w:t>r</w:t>
@@ -3233,7 +3514,7 @@
           <w:kern w:val="0"/>
           <w:sz w:val="21"/>
           <w:szCs w:val="21"/>
-          <w:lang w:eastAsia="it-IT"/>
+          <w:lang w:val="en-US" w:eastAsia="it-IT"/>
           <w14:ligatures w14:val="none"/>
         </w:rPr>
         <w:t xml:space="preserve"> </w:t>
@@ -3245,7 +3526,7 @@
           <w:kern w:val="0"/>
           <w:sz w:val="21"/>
           <w:szCs w:val="21"/>
-          <w:lang w:eastAsia="it-IT"/>
+          <w:lang w:val="en-US" w:eastAsia="it-IT"/>
           <w14:ligatures w14:val="none"/>
         </w:rPr>
         <w:t>-</w:t>
@@ -3257,11 +3538,12 @@
           <w:kern w:val="0"/>
           <w:sz w:val="21"/>
           <w:szCs w:val="21"/>
-          <w:lang w:eastAsia="it-IT"/>
-          <w14:ligatures w14:val="none"/>
-        </w:rPr>
-        <w:t xml:space="preserve"> </w:t>
-      </w:r>
+          <w:lang w:val="en-US" w:eastAsia="it-IT"/>
+          <w14:ligatures w14:val="none"/>
+        </w:rPr>
+        <w:t xml:space="preserve"> </w:t>
+      </w:r>
+      <w:proofErr w:type="spellStart"/>
       <w:r>
         <w:rPr>
           <w:rFonts w:ascii="Consolas" w:eastAsia="Times New Roman" w:hAnsi="Consolas" w:cs="Times New Roman"/>
@@ -3269,19 +3551,20 @@
           <w:kern w:val="0"/>
           <w:sz w:val="21"/>
           <w:szCs w:val="21"/>
-          <w:lang w:eastAsia="it-IT"/>
+          <w:lang w:val="en-US" w:eastAsia="it-IT"/>
           <w14:ligatures w14:val="none"/>
         </w:rPr>
         <w:t>i</w:t>
       </w:r>
-      <w:r>
-        <w:rPr>
-          <w:rFonts w:ascii="Consolas" w:eastAsia="Times New Roman" w:hAnsi="Consolas" w:cs="Times New Roman"/>
-          <w:color w:val="BBBEBF"/>
-          <w:kern w:val="0"/>
-          <w:sz w:val="21"/>
-          <w:szCs w:val="21"/>
-          <w:lang w:eastAsia="it-IT"/>
+      <w:proofErr w:type="spellEnd"/>
+      <w:r>
+        <w:rPr>
+          <w:rFonts w:ascii="Consolas" w:eastAsia="Times New Roman" w:hAnsi="Consolas" w:cs="Times New Roman"/>
+          <w:color w:val="BBBEBF"/>
+          <w:kern w:val="0"/>
+          <w:sz w:val="21"/>
+          <w:szCs w:val="21"/>
+          <w:lang w:val="en-US" w:eastAsia="it-IT"/>
           <w14:ligatures w14:val="none"/>
         </w:rPr>
         <w:t xml:space="preserve"> </w:t>
@@ -3293,7 +3576,7 @@
           <w:kern w:val="0"/>
           <w:sz w:val="21"/>
           <w:szCs w:val="21"/>
-          <w:lang w:eastAsia="it-IT"/>
+          <w:lang w:val="en-US" w:eastAsia="it-IT"/>
           <w14:ligatures w14:val="none"/>
         </w:rPr>
         <w:t>+</w:t>
@@ -3305,7 +3588,7 @@
           <w:kern w:val="0"/>
           <w:sz w:val="21"/>
           <w:szCs w:val="21"/>
-          <w:lang w:eastAsia="it-IT"/>
+          <w:lang w:val="en-US" w:eastAsia="it-IT"/>
           <w14:ligatures w14:val="none"/>
         </w:rPr>
         <w:t xml:space="preserve"> </w:t>
@@ -3317,7 +3600,7 @@
           <w:kern w:val="0"/>
           <w:sz w:val="21"/>
           <w:szCs w:val="21"/>
-          <w:lang w:eastAsia="it-IT"/>
+          <w:lang w:val="en-US" w:eastAsia="it-IT"/>
           <w14:ligatures w14:val="none"/>
         </w:rPr>
         <w:t>1</w:t>
@@ -3329,11 +3612,12 @@
           <w:kern w:val="0"/>
           <w:sz w:val="21"/>
           <w:szCs w:val="21"/>
-          <w:lang w:eastAsia="it-IT"/>
+          <w:lang w:val="en-US" w:eastAsia="it-IT"/>
           <w14:ligatures w14:val="none"/>
         </w:rPr>
         <w:t xml:space="preserve">, </w:t>
       </w:r>
+      <w:proofErr w:type="gramStart"/>
       <w:r>
         <w:rPr>
           <w:rFonts w:ascii="Consolas" w:eastAsia="Times New Roman" w:hAnsi="Consolas" w:cs="Times New Roman"/>
@@ -3341,7 +3625,7 @@
           <w:kern w:val="0"/>
           <w:sz w:val="21"/>
           <w:szCs w:val="21"/>
-          <w:lang w:eastAsia="it-IT"/>
+          <w:lang w:val="en-US" w:eastAsia="it-IT"/>
           <w14:ligatures w14:val="none"/>
         </w:rPr>
         <w:t>z</w:t>
@@ -3353,11 +3637,13 @@
           <w:kern w:val="0"/>
           <w:sz w:val="21"/>
           <w:szCs w:val="21"/>
-          <w:lang w:eastAsia="it-IT"/>
+          <w:lang w:val="en-US" w:eastAsia="it-IT"/>
           <w14:ligatures w14:val="none"/>
         </w:rPr>
         <w:t>[</w:t>
       </w:r>
+      <w:proofErr w:type="spellStart"/>
+      <w:proofErr w:type="gramEnd"/>
       <w:r>
         <w:rPr>
           <w:rFonts w:ascii="Consolas" w:eastAsia="Times New Roman" w:hAnsi="Consolas" w:cs="Times New Roman"/>
@@ -3365,19 +3651,20 @@
           <w:kern w:val="0"/>
           <w:sz w:val="21"/>
           <w:szCs w:val="21"/>
-          <w:lang w:eastAsia="it-IT"/>
+          <w:lang w:val="en-US" w:eastAsia="it-IT"/>
           <w14:ligatures w14:val="none"/>
         </w:rPr>
         <w:t>i</w:t>
       </w:r>
-      <w:r>
-        <w:rPr>
-          <w:rFonts w:ascii="Consolas" w:eastAsia="Times New Roman" w:hAnsi="Consolas" w:cs="Times New Roman"/>
-          <w:color w:val="BBBEBF"/>
-          <w:kern w:val="0"/>
-          <w:sz w:val="21"/>
-          <w:szCs w:val="21"/>
-          <w:lang w:eastAsia="it-IT"/>
+      <w:proofErr w:type="spellEnd"/>
+      <w:r>
+        <w:rPr>
+          <w:rFonts w:ascii="Consolas" w:eastAsia="Times New Roman" w:hAnsi="Consolas" w:cs="Times New Roman"/>
+          <w:color w:val="BBBEBF"/>
+          <w:kern w:val="0"/>
+          <w:sz w:val="21"/>
+          <w:szCs w:val="21"/>
+          <w:lang w:val="en-US" w:eastAsia="it-IT"/>
           <w14:ligatures w14:val="none"/>
         </w:rPr>
         <w:t xml:space="preserve"> </w:t>
@@ -3389,7 +3676,7 @@
           <w:kern w:val="0"/>
           <w:sz w:val="21"/>
           <w:szCs w:val="21"/>
-          <w:lang w:eastAsia="it-IT"/>
+          <w:lang w:val="en-US" w:eastAsia="it-IT"/>
           <w14:ligatures w14:val="none"/>
         </w:rPr>
         <w:t>-</w:t>
@@ -3401,7 +3688,7 @@
           <w:kern w:val="0"/>
           <w:sz w:val="21"/>
           <w:szCs w:val="21"/>
-          <w:lang w:eastAsia="it-IT"/>
+          <w:lang w:val="en-US" w:eastAsia="it-IT"/>
           <w14:ligatures w14:val="none"/>
         </w:rPr>
         <w:t xml:space="preserve"> </w:t>
@@ -3413,7 +3700,7 @@
           <w:kern w:val="0"/>
           <w:sz w:val="21"/>
           <w:szCs w:val="21"/>
-          <w:lang w:eastAsia="it-IT"/>
+          <w:lang w:val="en-US" w:eastAsia="it-IT"/>
           <w14:ligatures w14:val="none"/>
         </w:rPr>
         <w:t>l</w:t>
@@ -3425,7 +3712,7 @@
           <w:kern w:val="0"/>
           <w:sz w:val="21"/>
           <w:szCs w:val="21"/>
-          <w:lang w:eastAsia="it-IT"/>
+          <w:lang w:val="en-US" w:eastAsia="it-IT"/>
           <w14:ligatures w14:val="none"/>
         </w:rPr>
         <w:t>])</w:t>
@@ -3441,18 +3728,18 @@
           <w:kern w:val="0"/>
           <w:sz w:val="21"/>
           <w:szCs w:val="21"/>
-          <w:lang w:eastAsia="it-IT"/>
-          <w14:ligatures w14:val="none"/>
-        </w:rPr>
-      </w:pPr>
-      <w:r>
-        <w:rPr>
-          <w:rFonts w:ascii="Consolas" w:eastAsia="Times New Roman" w:hAnsi="Consolas" w:cs="Times New Roman"/>
-          <w:color w:val="BBBEBF"/>
-          <w:kern w:val="0"/>
-          <w:sz w:val="21"/>
-          <w:szCs w:val="21"/>
-          <w:lang w:eastAsia="it-IT"/>
+          <w:lang w:val="en-US" w:eastAsia="it-IT"/>
+          <w14:ligatures w14:val="none"/>
+        </w:rPr>
+      </w:pPr>
+      <w:r>
+        <w:rPr>
+          <w:rFonts w:ascii="Consolas" w:eastAsia="Times New Roman" w:hAnsi="Consolas" w:cs="Times New Roman"/>
+          <w:color w:val="BBBEBF"/>
+          <w:kern w:val="0"/>
+          <w:sz w:val="21"/>
+          <w:szCs w:val="21"/>
+          <w:lang w:val="en-US" w:eastAsia="it-IT"/>
           <w14:ligatures w14:val="none"/>
         </w:rPr>
         <w:t xml:space="preserve">            </w:t>
@@ -3479,7 +3766,7 @@
           <w:kern w:val="0"/>
           <w:sz w:val="21"/>
           <w:szCs w:val="21"/>
-          <w:lang w:eastAsia="it-IT"/>
+          <w:lang w:val="en-US" w:eastAsia="it-IT"/>
           <w14:ligatures w14:val="none"/>
         </w:rPr>
         <w:t xml:space="preserve">            </w:t>
@@ -3508,6 +3795,7 @@
         </w:rPr>
         <w:t xml:space="preserve"> </w:t>
       </w:r>
+      <w:proofErr w:type="spellStart"/>
       <w:r>
         <w:rPr>
           <w:rFonts w:ascii="Consolas" w:eastAsia="Times New Roman" w:hAnsi="Consolas" w:cs="Times New Roman"/>
@@ -3520,6 +3808,7 @@
         </w:rPr>
         <w:t>i</w:t>
       </w:r>
+      <w:proofErr w:type="spellEnd"/>
       <w:r>
         <w:rPr>
           <w:rFonts w:ascii="Consolas" w:eastAsia="Times New Roman" w:hAnsi="Consolas" w:cs="Times New Roman"/>
@@ -3580,6 +3869,7 @@
         </w:rPr>
         <w:t>[</w:t>
       </w:r>
+      <w:proofErr w:type="spellStart"/>
       <w:r>
         <w:rPr>
           <w:rFonts w:ascii="Consolas" w:eastAsia="Times New Roman" w:hAnsi="Consolas" w:cs="Times New Roman"/>
@@ -3592,6 +3882,7 @@
         </w:rPr>
         <w:t>i</w:t>
       </w:r>
+      <w:proofErr w:type="spellEnd"/>
       <w:r>
         <w:rPr>
           <w:rFonts w:ascii="Consolas" w:eastAsia="Times New Roman" w:hAnsi="Consolas" w:cs="Times New Roman"/>
@@ -3724,6 +4015,7 @@
         </w:rPr>
         <w:t>[</w:t>
       </w:r>
+      <w:proofErr w:type="spellStart"/>
       <w:r>
         <w:rPr>
           <w:rFonts w:ascii="Consolas" w:eastAsia="Times New Roman" w:hAnsi="Consolas" w:cs="Times New Roman"/>
@@ -3736,6 +4028,7 @@
         </w:rPr>
         <w:t>i</w:t>
       </w:r>
+      <w:proofErr w:type="spellEnd"/>
       <w:r>
         <w:rPr>
           <w:rFonts w:ascii="Consolas" w:eastAsia="Times New Roman" w:hAnsi="Consolas" w:cs="Times New Roman"/>
@@ -3772,6 +4065,7 @@
         </w:rPr>
         <w:t xml:space="preserve"> </w:t>
       </w:r>
+      <w:proofErr w:type="gramStart"/>
       <w:r>
         <w:rPr>
           <w:rFonts w:ascii="Consolas" w:eastAsia="Times New Roman" w:hAnsi="Consolas" w:cs="Times New Roman"/>
@@ -3796,6 +4090,8 @@
         </w:rPr>
         <w:t>[</w:t>
       </w:r>
+      <w:proofErr w:type="spellStart"/>
+      <w:proofErr w:type="gramEnd"/>
       <w:r>
         <w:rPr>
           <w:rFonts w:ascii="Consolas" w:eastAsia="Times New Roman" w:hAnsi="Consolas" w:cs="Times New Roman"/>
@@ -3808,6 +4104,7 @@
         </w:rPr>
         <w:t>i</w:t>
       </w:r>
+      <w:proofErr w:type="spellEnd"/>
       <w:r>
         <w:rPr>
           <w:rFonts w:ascii="Consolas" w:eastAsia="Times New Roman" w:hAnsi="Consolas" w:cs="Times New Roman"/>
@@ -3868,6 +4165,7 @@
         </w:rPr>
         <w:t>[</w:t>
       </w:r>
+      <w:proofErr w:type="spellStart"/>
       <w:r>
         <w:rPr>
           <w:rFonts w:ascii="Consolas" w:eastAsia="Times New Roman" w:hAnsi="Consolas" w:cs="Times New Roman"/>
@@ -3880,6 +4178,7 @@
         </w:rPr>
         <w:t>i</w:t>
       </w:r>
+      <w:proofErr w:type="spellEnd"/>
       <w:r>
         <w:rPr>
           <w:rFonts w:ascii="Consolas" w:eastAsia="Times New Roman" w:hAnsi="Consolas" w:cs="Times New Roman"/>
@@ -4057,6 +4356,7 @@
         </w:rPr>
         <w:t xml:space="preserve">            </w:t>
       </w:r>
+      <w:proofErr w:type="spellStart"/>
       <w:r>
         <w:rPr>
           <w:rFonts w:ascii="Consolas" w:eastAsia="Times New Roman" w:hAnsi="Consolas" w:cs="Times New Roman"/>
@@ -4069,6 +4369,7 @@
         </w:rPr>
         <w:t>if</w:t>
       </w:r>
+      <w:proofErr w:type="spellEnd"/>
       <w:r>
         <w:rPr>
           <w:rFonts w:ascii="Consolas" w:eastAsia="Times New Roman" w:hAnsi="Consolas" w:cs="Times New Roman"/>
@@ -4684,6 +4985,8 @@
         </w:rPr>
         <w:t xml:space="preserve"> </w:t>
       </w:r>
+      <w:proofErr w:type="spellStart"/>
+      <w:proofErr w:type="gramStart"/>
       <w:r>
         <w:rPr>
           <w:rFonts w:ascii="Consolas" w:eastAsia="Times New Roman" w:hAnsi="Consolas" w:cs="Times New Roman"/>
@@ -4696,6 +4999,7 @@
         </w:rPr>
         <w:t>isSubtree</w:t>
       </w:r>
+      <w:proofErr w:type="spellEnd"/>
       <w:r>
         <w:rPr>
           <w:rFonts w:ascii="Consolas" w:eastAsia="Times New Roman" w:hAnsi="Consolas" w:cs="Times New Roman"/>
@@ -4708,6 +5012,7 @@
         </w:rPr>
         <w:t>(</w:t>
       </w:r>
+      <w:proofErr w:type="gramEnd"/>
       <w:r>
         <w:rPr>
           <w:rFonts w:ascii="Consolas" w:eastAsia="Times New Roman" w:hAnsi="Consolas" w:cs="Times New Roman"/>
@@ -4756,6 +5061,7 @@
         </w:rPr>
         <w:t xml:space="preserve">: </w:t>
       </w:r>
+      <w:proofErr w:type="gramStart"/>
       <w:r>
         <w:rPr>
           <w:rFonts w:ascii="Consolas" w:eastAsia="Times New Roman" w:hAnsi="Consolas" w:cs="Times New Roman"/>
@@ -4780,6 +5086,8 @@
         </w:rPr>
         <w:t>[</w:t>
       </w:r>
+      <w:proofErr w:type="spellStart"/>
+      <w:proofErr w:type="gramEnd"/>
       <w:r>
         <w:rPr>
           <w:rFonts w:ascii="Consolas" w:eastAsia="Times New Roman" w:hAnsi="Consolas" w:cs="Times New Roman"/>
@@ -4792,6 +5100,7 @@
         </w:rPr>
         <w:t>TreeNode</w:t>
       </w:r>
+      <w:proofErr w:type="spellEnd"/>
       <w:r>
         <w:rPr>
           <w:rFonts w:ascii="Consolas" w:eastAsia="Times New Roman" w:hAnsi="Consolas" w:cs="Times New Roman"/>
@@ -4804,6 +5113,7 @@
         </w:rPr>
         <w:t xml:space="preserve">], </w:t>
       </w:r>
+      <w:proofErr w:type="spellStart"/>
       <w:r>
         <w:rPr>
           <w:rFonts w:ascii="Consolas" w:eastAsia="Times New Roman" w:hAnsi="Consolas" w:cs="Times New Roman"/>
@@ -4816,6 +5126,7 @@
         </w:rPr>
         <w:t>subRoot</w:t>
       </w:r>
+      <w:proofErr w:type="spellEnd"/>
       <w:r>
         <w:rPr>
           <w:rFonts w:ascii="Consolas" w:eastAsia="Times New Roman" w:hAnsi="Consolas" w:cs="Times New Roman"/>
@@ -4828,6 +5139,7 @@
         </w:rPr>
         <w:t xml:space="preserve">: </w:t>
       </w:r>
+      <w:proofErr w:type="gramStart"/>
       <w:r>
         <w:rPr>
           <w:rFonts w:ascii="Consolas" w:eastAsia="Times New Roman" w:hAnsi="Consolas" w:cs="Times New Roman"/>
@@ -4852,6 +5164,8 @@
         </w:rPr>
         <w:t>[</w:t>
       </w:r>
+      <w:proofErr w:type="spellStart"/>
+      <w:proofErr w:type="gramEnd"/>
       <w:r>
         <w:rPr>
           <w:rFonts w:ascii="Consolas" w:eastAsia="Times New Roman" w:hAnsi="Consolas" w:cs="Times New Roman"/>
@@ -4864,6 +5178,7 @@
         </w:rPr>
         <w:t>TreeNode</w:t>
       </w:r>
+      <w:proofErr w:type="spellEnd"/>
       <w:r>
         <w:rPr>
           <w:rFonts w:ascii="Consolas" w:eastAsia="Times New Roman" w:hAnsi="Consolas" w:cs="Times New Roman"/>
@@ -4927,6 +5242,7 @@
         </w:rPr>
         <w:t xml:space="preserve">        </w:t>
       </w:r>
+      <w:proofErr w:type="spellStart"/>
       <w:r>
         <w:rPr>
           <w:rFonts w:ascii="Consolas" w:eastAsia="Times New Roman" w:hAnsi="Consolas" w:cs="Times New Roman"/>
@@ -4939,6 +5255,7 @@
         </w:rPr>
         <w:t>root_s</w:t>
       </w:r>
+      <w:proofErr w:type="spellEnd"/>
       <w:r>
         <w:rPr>
           <w:rFonts w:ascii="Consolas" w:eastAsia="Times New Roman" w:hAnsi="Consolas" w:cs="Times New Roman"/>
@@ -4975,6 +5292,8 @@
         </w:rPr>
         <w:t xml:space="preserve"> </w:t>
       </w:r>
+      <w:proofErr w:type="spellStart"/>
+      <w:proofErr w:type="gramStart"/>
       <w:r>
         <w:rPr>
           <w:rFonts w:ascii="Consolas" w:eastAsia="Times New Roman" w:hAnsi="Consolas" w:cs="Times New Roman"/>
@@ -5011,6 +5330,8 @@
         </w:rPr>
         <w:t>serialize</w:t>
       </w:r>
+      <w:proofErr w:type="spellEnd"/>
+      <w:proofErr w:type="gramEnd"/>
       <w:r>
         <w:rPr>
           <w:rFonts w:ascii="Consolas" w:eastAsia="Times New Roman" w:hAnsi="Consolas" w:cs="Times New Roman"/>
@@ -5074,6 +5395,7 @@
         </w:rPr>
         <w:t xml:space="preserve">        </w:t>
       </w:r>
+      <w:proofErr w:type="spellStart"/>
       <w:r>
         <w:rPr>
           <w:rFonts w:ascii="Consolas" w:eastAsia="Times New Roman" w:hAnsi="Consolas" w:cs="Times New Roman"/>
@@ -5086,6 +5408,7 @@
         </w:rPr>
         <w:t>subRoot_s</w:t>
       </w:r>
+      <w:proofErr w:type="spellEnd"/>
       <w:r>
         <w:rPr>
           <w:rFonts w:ascii="Consolas" w:eastAsia="Times New Roman" w:hAnsi="Consolas" w:cs="Times New Roman"/>
@@ -5122,6 +5445,8 @@
         </w:rPr>
         <w:t xml:space="preserve"> </w:t>
       </w:r>
+      <w:proofErr w:type="spellStart"/>
+      <w:proofErr w:type="gramStart"/>
       <w:r>
         <w:rPr>
           <w:rFonts w:ascii="Consolas" w:eastAsia="Times New Roman" w:hAnsi="Consolas" w:cs="Times New Roman"/>
@@ -5158,6 +5483,8 @@
         </w:rPr>
         <w:t>serialize</w:t>
       </w:r>
+      <w:proofErr w:type="spellEnd"/>
+      <w:proofErr w:type="gramEnd"/>
       <w:r>
         <w:rPr>
           <w:rFonts w:ascii="Consolas" w:eastAsia="Times New Roman" w:hAnsi="Consolas" w:cs="Times New Roman"/>
@@ -5170,6 +5497,7 @@
         </w:rPr>
         <w:t>(</w:t>
       </w:r>
+      <w:proofErr w:type="spellStart"/>
       <w:r>
         <w:rPr>
           <w:rFonts w:ascii="Consolas" w:eastAsia="Times New Roman" w:hAnsi="Consolas" w:cs="Times New Roman"/>
@@ -5182,6 +5510,7 @@
         </w:rPr>
         <w:t>subRoot</w:t>
       </w:r>
+      <w:proofErr w:type="spellEnd"/>
       <w:r>
         <w:rPr>
           <w:rFonts w:ascii="Consolas" w:eastAsia="Times New Roman" w:hAnsi="Consolas" w:cs="Times New Roman"/>
@@ -5269,6 +5598,7 @@
         </w:rPr>
         <w:t xml:space="preserve"> </w:t>
       </w:r>
+      <w:proofErr w:type="spellStart"/>
       <w:r>
         <w:rPr>
           <w:rFonts w:ascii="Consolas" w:eastAsia="Times New Roman" w:hAnsi="Consolas" w:cs="Times New Roman"/>
@@ -5281,6 +5611,7 @@
         </w:rPr>
         <w:t>subRoot_s</w:t>
       </w:r>
+      <w:proofErr w:type="spellEnd"/>
       <w:r>
         <w:rPr>
           <w:rFonts w:ascii="Consolas" w:eastAsia="Times New Roman" w:hAnsi="Consolas" w:cs="Times New Roman"/>
@@ -5365,6 +5696,7 @@
         </w:rPr>
         <w:t xml:space="preserve"> </w:t>
       </w:r>
+      <w:proofErr w:type="spellStart"/>
       <w:r>
         <w:rPr>
           <w:rFonts w:ascii="Consolas" w:eastAsia="Times New Roman" w:hAnsi="Consolas" w:cs="Times New Roman"/>
@@ -5377,6 +5709,7 @@
         </w:rPr>
         <w:t>root_s</w:t>
       </w:r>
+      <w:proofErr w:type="spellEnd"/>
     </w:p>
     <w:p>
       <w:pPr>
@@ -5419,6 +5752,7 @@
         </w:rPr>
         <w:t xml:space="preserve">        </w:t>
       </w:r>
+      <w:proofErr w:type="spellStart"/>
       <w:r>
         <w:rPr>
           <w:rFonts w:ascii="Consolas" w:eastAsia="Times New Roman" w:hAnsi="Consolas" w:cs="Times New Roman"/>
@@ -5431,6 +5765,7 @@
         </w:rPr>
         <w:t>z_values</w:t>
       </w:r>
+      <w:proofErr w:type="spellEnd"/>
       <w:r>
         <w:rPr>
           <w:rFonts w:ascii="Consolas" w:eastAsia="Times New Roman" w:hAnsi="Consolas" w:cs="Times New Roman"/>
@@ -5467,6 +5802,8 @@
         </w:rPr>
         <w:t xml:space="preserve"> </w:t>
       </w:r>
+      <w:proofErr w:type="spellStart"/>
+      <w:proofErr w:type="gramStart"/>
       <w:r>
         <w:rPr>
           <w:rFonts w:ascii="Consolas" w:eastAsia="Times New Roman" w:hAnsi="Consolas" w:cs="Times New Roman"/>
@@ -5501,8 +5838,22 @@
           <w:lang w:val="en-US" w:eastAsia="it-IT"/>
           <w14:ligatures w14:val="none"/>
         </w:rPr>
-        <w:t>z_function</w:t>
-      </w:r>
+        <w:t>z</w:t>
+      </w:r>
+      <w:proofErr w:type="gramEnd"/>
+      <w:r>
+        <w:rPr>
+          <w:rFonts w:ascii="Consolas" w:eastAsia="Times New Roman" w:hAnsi="Consolas" w:cs="Times New Roman"/>
+          <w:color w:val="D2A8FF"/>
+          <w:kern w:val="0"/>
+          <w:sz w:val="21"/>
+          <w:szCs w:val="21"/>
+          <w:lang w:val="en-US" w:eastAsia="it-IT"/>
+          <w14:ligatures w14:val="none"/>
+        </w:rPr>
+        <w:t>_function</w:t>
+      </w:r>
+      <w:proofErr w:type="spellEnd"/>
       <w:r>
         <w:rPr>
           <w:rFonts w:ascii="Consolas" w:eastAsia="Times New Roman" w:hAnsi="Consolas" w:cs="Times New Roman"/>
@@ -5566,6 +5917,7 @@
         </w:rPr>
         <w:t xml:space="preserve">        </w:t>
       </w:r>
+      <w:proofErr w:type="spellStart"/>
       <w:r>
         <w:rPr>
           <w:rFonts w:ascii="Consolas" w:eastAsia="Times New Roman" w:hAnsi="Consolas" w:cs="Times New Roman"/>
@@ -5578,6 +5930,7 @@
         </w:rPr>
         <w:t>len_sub</w:t>
       </w:r>
+      <w:proofErr w:type="spellEnd"/>
       <w:r>
         <w:rPr>
           <w:rFonts w:ascii="Consolas" w:eastAsia="Times New Roman" w:hAnsi="Consolas" w:cs="Times New Roman"/>
@@ -5614,6 +5967,7 @@
         </w:rPr>
         <w:t xml:space="preserve"> </w:t>
       </w:r>
+      <w:proofErr w:type="spellStart"/>
       <w:r>
         <w:rPr>
           <w:rFonts w:ascii="Consolas" w:eastAsia="Times New Roman" w:hAnsi="Consolas" w:cs="Times New Roman"/>
@@ -5626,6 +5980,7 @@
         </w:rPr>
         <w:t>len</w:t>
       </w:r>
+      <w:proofErr w:type="spellEnd"/>
       <w:r>
         <w:rPr>
           <w:rFonts w:ascii="Consolas" w:eastAsia="Times New Roman" w:hAnsi="Consolas" w:cs="Times New Roman"/>
@@ -5638,6 +5993,7 @@
         </w:rPr>
         <w:t>(</w:t>
       </w:r>
+      <w:proofErr w:type="spellStart"/>
       <w:r>
         <w:rPr>
           <w:rFonts w:ascii="Consolas" w:eastAsia="Times New Roman" w:hAnsi="Consolas" w:cs="Times New Roman"/>
@@ -5650,6 +6006,7 @@
         </w:rPr>
         <w:t>subRoot_s</w:t>
       </w:r>
+      <w:proofErr w:type="spellEnd"/>
       <w:r>
         <w:rPr>
           <w:rFonts w:ascii="Consolas" w:eastAsia="Times New Roman" w:hAnsi="Consolas" w:cs="Times New Roman"/>
@@ -5713,6 +6070,7 @@
         </w:rPr>
         <w:t xml:space="preserve"> </w:t>
       </w:r>
+      <w:proofErr w:type="spellStart"/>
       <w:r>
         <w:rPr>
           <w:rFonts w:ascii="Consolas" w:eastAsia="Times New Roman" w:hAnsi="Consolas" w:cs="Times New Roman"/>
@@ -5725,6 +6083,7 @@
         </w:rPr>
         <w:t>i</w:t>
       </w:r>
+      <w:proofErr w:type="spellEnd"/>
       <w:r>
         <w:rPr>
           <w:rFonts w:ascii="Consolas" w:eastAsia="Times New Roman" w:hAnsi="Consolas" w:cs="Times New Roman"/>
@@ -5761,6 +6120,7 @@
         </w:rPr>
         <w:t xml:space="preserve"> </w:t>
       </w:r>
+      <w:proofErr w:type="gramStart"/>
       <w:r>
         <w:rPr>
           <w:rFonts w:ascii="Consolas" w:eastAsia="Times New Roman" w:hAnsi="Consolas" w:cs="Times New Roman"/>
@@ -5785,6 +6145,8 @@
         </w:rPr>
         <w:t>(</w:t>
       </w:r>
+      <w:proofErr w:type="spellStart"/>
+      <w:proofErr w:type="gramEnd"/>
       <w:r>
         <w:rPr>
           <w:rFonts w:ascii="Consolas" w:eastAsia="Times New Roman" w:hAnsi="Consolas" w:cs="Times New Roman"/>
@@ -5797,6 +6159,7 @@
         </w:rPr>
         <w:t>len_sub</w:t>
       </w:r>
+      <w:proofErr w:type="spellEnd"/>
       <w:r>
         <w:rPr>
           <w:rFonts w:ascii="Consolas" w:eastAsia="Times New Roman" w:hAnsi="Consolas" w:cs="Times New Roman"/>
@@ -5857,6 +6220,7 @@
         </w:rPr>
         <w:t xml:space="preserve">, </w:t>
       </w:r>
+      <w:proofErr w:type="spellStart"/>
       <w:r>
         <w:rPr>
           <w:rFonts w:ascii="Consolas" w:eastAsia="Times New Roman" w:hAnsi="Consolas" w:cs="Times New Roman"/>
@@ -5869,6 +6233,7 @@
         </w:rPr>
         <w:t>len</w:t>
       </w:r>
+      <w:proofErr w:type="spellEnd"/>
       <w:r>
         <w:rPr>
           <w:rFonts w:ascii="Consolas" w:eastAsia="Times New Roman" w:hAnsi="Consolas" w:cs="Times New Roman"/>
@@ -5956,6 +6321,7 @@
         </w:rPr>
         <w:t xml:space="preserve"> </w:t>
       </w:r>
+      <w:proofErr w:type="spellStart"/>
       <w:r>
         <w:rPr>
           <w:rFonts w:ascii="Consolas" w:eastAsia="Times New Roman" w:hAnsi="Consolas" w:cs="Times New Roman"/>
@@ -5968,6 +6334,7 @@
         </w:rPr>
         <w:t>z_values</w:t>
       </w:r>
+      <w:proofErr w:type="spellEnd"/>
       <w:r>
         <w:rPr>
           <w:rFonts w:ascii="Consolas" w:eastAsia="Times New Roman" w:hAnsi="Consolas" w:cs="Times New Roman"/>
@@ -5980,6 +6347,7 @@
         </w:rPr>
         <w:t>[</w:t>
       </w:r>
+      <w:proofErr w:type="spellStart"/>
       <w:r>
         <w:rPr>
           <w:rFonts w:ascii="Consolas" w:eastAsia="Times New Roman" w:hAnsi="Consolas" w:cs="Times New Roman"/>
@@ -5992,6 +6360,7 @@
         </w:rPr>
         <w:t>i</w:t>
       </w:r>
+      <w:proofErr w:type="spellEnd"/>
       <w:r>
         <w:rPr>
           <w:rFonts w:ascii="Consolas" w:eastAsia="Times New Roman" w:hAnsi="Consolas" w:cs="Times New Roman"/>
@@ -6028,6 +6397,7 @@
         </w:rPr>
         <w:t xml:space="preserve"> </w:t>
       </w:r>
+      <w:proofErr w:type="spellStart"/>
       <w:r>
         <w:rPr>
           <w:rFonts w:ascii="Consolas" w:eastAsia="Times New Roman" w:hAnsi="Consolas" w:cs="Times New Roman"/>
@@ -6040,6 +6410,7 @@
         </w:rPr>
         <w:t>len_sub</w:t>
       </w:r>
+      <w:proofErr w:type="spellEnd"/>
       <w:r>
         <w:rPr>
           <w:rFonts w:ascii="Consolas" w:eastAsia="Times New Roman" w:hAnsi="Consolas" w:cs="Times New Roman"/>
@@ -6079,6 +6450,7 @@
         </w:rPr>
         <w:t xml:space="preserve">                </w:t>
       </w:r>
+      <w:proofErr w:type="gramStart"/>
       <w:r>
         <w:rPr>
           <w:rFonts w:ascii="Consolas" w:eastAsia="Times New Roman" w:hAnsi="Consolas" w:cs="Times New Roman"/>
@@ -6091,6 +6463,7 @@
         </w:rPr>
         <w:t>return</w:t>
       </w:r>
+      <w:proofErr w:type="gramEnd"/>
       <w:r>
         <w:rPr>
           <w:rFonts w:ascii="Consolas" w:eastAsia="Times New Roman" w:hAnsi="Consolas" w:cs="Times New Roman"/>
@@ -6169,6 +6542,7 @@
         </w:rPr>
         <w:t xml:space="preserve">        </w:t>
       </w:r>
+      <w:proofErr w:type="gramStart"/>
       <w:r>
         <w:rPr>
           <w:rFonts w:ascii="Consolas" w:eastAsia="Times New Roman" w:hAnsi="Consolas" w:cs="Times New Roman"/>
@@ -6181,6 +6555,7 @@
         </w:rPr>
         <w:t>return</w:t>
       </w:r>
+      <w:proofErr w:type="gramEnd"/>
       <w:r>
         <w:rPr>
           <w:rFonts w:ascii="Consolas" w:eastAsia="Times New Roman" w:hAnsi="Consolas" w:cs="Times New Roman"/>
@@ -6239,7 +6614,43 @@
           <w:bCs/>
           <w:lang w:val="en-US"/>
         </w:rPr>
-        <w:t xml:space="preserve">BST inorder visit with O(1) space </w:t>
+        <w:t xml:space="preserve">BST </w:t>
+      </w:r>
+      <w:proofErr w:type="spellStart"/>
+      <w:r>
+        <w:rPr>
+          <w:b/>
+          <w:bCs/>
+          <w:lang w:val="en-US"/>
+        </w:rPr>
+        <w:t>inorder</w:t>
+      </w:r>
+      <w:proofErr w:type="spellEnd"/>
+      <w:r>
+        <w:rPr>
+          <w:b/>
+          <w:bCs/>
+          <w:lang w:val="en-US"/>
+        </w:rPr>
+        <w:t xml:space="preserve"> visit with </w:t>
+      </w:r>
+      <w:proofErr w:type="gramStart"/>
+      <w:r>
+        <w:rPr>
+          <w:b/>
+          <w:bCs/>
+          <w:lang w:val="en-US"/>
+        </w:rPr>
+        <w:t>O(</w:t>
+      </w:r>
+      <w:proofErr w:type="gramEnd"/>
+      <w:r>
+        <w:rPr>
+          <w:b/>
+          <w:bCs/>
+          <w:lang w:val="en-US"/>
+        </w:rPr>
+        <w:t xml:space="preserve">1) space </w:t>
       </w:r>
       <w:r>
         <w:rPr>
@@ -6422,6 +6833,8 @@
         </w:rPr>
         <w:t xml:space="preserve"> </w:t>
       </w:r>
+      <w:proofErr w:type="spellStart"/>
+      <w:proofErr w:type="gramStart"/>
       <w:r>
         <w:rPr>
           <w:rFonts w:ascii="Consolas" w:eastAsia="Times New Roman" w:hAnsi="Consolas" w:cs="Times New Roman"/>
@@ -6434,6 +6847,7 @@
         </w:rPr>
         <w:t>kthSmallest</w:t>
       </w:r>
+      <w:proofErr w:type="spellEnd"/>
       <w:r>
         <w:rPr>
           <w:rFonts w:ascii="Consolas" w:eastAsia="Times New Roman" w:hAnsi="Consolas" w:cs="Times New Roman"/>
@@ -6446,6 +6860,7 @@
         </w:rPr>
         <w:t>(</w:t>
       </w:r>
+      <w:proofErr w:type="gramEnd"/>
       <w:r>
         <w:rPr>
           <w:rFonts w:ascii="Consolas" w:eastAsia="Times New Roman" w:hAnsi="Consolas" w:cs="Times New Roman"/>
@@ -6494,6 +6909,7 @@
         </w:rPr>
         <w:t xml:space="preserve">: </w:t>
       </w:r>
+      <w:proofErr w:type="gramStart"/>
       <w:r>
         <w:rPr>
           <w:rFonts w:ascii="Consolas" w:eastAsia="Times New Roman" w:hAnsi="Consolas" w:cs="Times New Roman"/>
@@ -6518,6 +6934,8 @@
         </w:rPr>
         <w:t>[</w:t>
       </w:r>
+      <w:proofErr w:type="spellStart"/>
+      <w:proofErr w:type="gramEnd"/>
       <w:r>
         <w:rPr>
           <w:rFonts w:ascii="Consolas" w:eastAsia="Times New Roman" w:hAnsi="Consolas" w:cs="Times New Roman"/>
@@ -6530,6 +6948,7 @@
         </w:rPr>
         <w:t>TreeNode</w:t>
       </w:r>
+      <w:proofErr w:type="spellEnd"/>
       <w:r>
         <w:rPr>
           <w:rFonts w:ascii="Consolas" w:eastAsia="Times New Roman" w:hAnsi="Consolas" w:cs="Times New Roman"/>
@@ -6641,6 +7060,7 @@
         </w:rPr>
         <w:t xml:space="preserve">        </w:t>
       </w:r>
+      <w:proofErr w:type="spellStart"/>
       <w:r>
         <w:rPr>
           <w:rFonts w:ascii="Consolas" w:eastAsia="Times New Roman" w:hAnsi="Consolas" w:cs="Times New Roman"/>
@@ -6653,6 +7073,7 @@
         </w:rPr>
         <w:t>curr</w:t>
       </w:r>
+      <w:proofErr w:type="spellEnd"/>
       <w:r>
         <w:rPr>
           <w:rFonts w:ascii="Consolas" w:eastAsia="Times New Roman" w:hAnsi="Consolas" w:cs="Times New Roman"/>
@@ -6767,6 +7188,8 @@
         </w:rPr>
         <w:t xml:space="preserve"> </w:t>
       </w:r>
+      <w:proofErr w:type="spellStart"/>
+      <w:proofErr w:type="gramStart"/>
       <w:r>
         <w:rPr>
           <w:rFonts w:ascii="Consolas" w:eastAsia="Times New Roman" w:hAnsi="Consolas" w:cs="Times New Roman"/>
@@ -6779,6 +7202,8 @@
         </w:rPr>
         <w:t>curr</w:t>
       </w:r>
+      <w:proofErr w:type="spellEnd"/>
+      <w:proofErr w:type="gramEnd"/>
       <w:r>
         <w:rPr>
           <w:rFonts w:ascii="Consolas" w:eastAsia="Times New Roman" w:hAnsi="Consolas" w:cs="Times New Roman"/>
@@ -6866,6 +7291,8 @@
         </w:rPr>
         <w:t xml:space="preserve"> </w:t>
       </w:r>
+      <w:proofErr w:type="spellStart"/>
+      <w:proofErr w:type="gramStart"/>
       <w:r>
         <w:rPr>
           <w:rFonts w:ascii="Consolas" w:eastAsia="Times New Roman" w:hAnsi="Consolas" w:cs="Times New Roman"/>
@@ -6888,7 +7315,21 @@
           <w:lang w:val="en-US" w:eastAsia="it-IT"/>
           <w14:ligatures w14:val="none"/>
         </w:rPr>
-        <w:t xml:space="preserve">.left: </w:t>
+        <w:t>.left</w:t>
+      </w:r>
+      <w:proofErr w:type="spellEnd"/>
+      <w:proofErr w:type="gramEnd"/>
+      <w:r>
+        <w:rPr>
+          <w:rFonts w:ascii="Consolas" w:eastAsia="Times New Roman" w:hAnsi="Consolas" w:cs="Times New Roman"/>
+          <w:color w:val="BBBEBF"/>
+          <w:kern w:val="0"/>
+          <w:sz w:val="21"/>
+          <w:szCs w:val="21"/>
+          <w:lang w:val="en-US" w:eastAsia="it-IT"/>
+          <w14:ligatures w14:val="none"/>
+        </w:rPr>
+        <w:t xml:space="preserve">: </w:t>
       </w:r>
       <w:r>
         <w:rPr>
@@ -6900,8 +7341,22 @@
           <w:lang w:val="en-US" w:eastAsia="it-IT"/>
           <w14:ligatures w14:val="none"/>
         </w:rPr>
-        <w:t>#smallest --&gt; valuto</w:t>
-      </w:r>
+        <w:t xml:space="preserve">#smallest --&gt; </w:t>
+      </w:r>
+      <w:proofErr w:type="spellStart"/>
+      <w:r>
+        <w:rPr>
+          <w:rFonts w:ascii="Consolas" w:eastAsia="Times New Roman" w:hAnsi="Consolas" w:cs="Times New Roman"/>
+          <w:color w:val="8B949E"/>
+          <w:kern w:val="0"/>
+          <w:sz w:val="21"/>
+          <w:szCs w:val="21"/>
+          <w:lang w:val="en-US" w:eastAsia="it-IT"/>
+          <w14:ligatures w14:val="none"/>
+        </w:rPr>
+        <w:t>valuto</w:t>
+      </w:r>
+      <w:proofErr w:type="spellEnd"/>
     </w:p>
     <w:p>
       <w:pPr>
@@ -7163,6 +7618,7 @@
         </w:rPr>
         <w:t xml:space="preserve"> </w:t>
       </w:r>
+      <w:proofErr w:type="spellStart"/>
       <w:r>
         <w:rPr>
           <w:rFonts w:ascii="Consolas" w:eastAsia="Times New Roman" w:hAnsi="Consolas" w:cs="Times New Roman"/>
@@ -7187,6 +7643,7 @@
         </w:rPr>
         <w:t>.val</w:t>
       </w:r>
+      <w:proofErr w:type="spellEnd"/>
     </w:p>
     <w:p>
       <w:pPr>
@@ -7214,6 +7671,7 @@
         </w:rPr>
         <w:t xml:space="preserve">                </w:t>
       </w:r>
+      <w:proofErr w:type="spellStart"/>
       <w:r>
         <w:rPr>
           <w:rFonts w:ascii="Consolas" w:eastAsia="Times New Roman" w:hAnsi="Consolas" w:cs="Times New Roman"/>
@@ -7226,6 +7684,7 @@
         </w:rPr>
         <w:t>curr</w:t>
       </w:r>
+      <w:proofErr w:type="spellEnd"/>
       <w:r>
         <w:rPr>
           <w:rFonts w:ascii="Consolas" w:eastAsia="Times New Roman" w:hAnsi="Consolas" w:cs="Times New Roman"/>
@@ -7262,6 +7721,8 @@
         </w:rPr>
         <w:t xml:space="preserve"> </w:t>
       </w:r>
+      <w:proofErr w:type="spellStart"/>
+      <w:proofErr w:type="gramStart"/>
       <w:r>
         <w:rPr>
           <w:rFonts w:ascii="Consolas" w:eastAsia="Times New Roman" w:hAnsi="Consolas" w:cs="Times New Roman"/>
@@ -7284,7 +7745,21 @@
           <w:lang w:eastAsia="it-IT"/>
           <w14:ligatures w14:val="none"/>
         </w:rPr>
-        <w:t xml:space="preserve">.right </w:t>
+        <w:t>.right</w:t>
+      </w:r>
+      <w:proofErr w:type="spellEnd"/>
+      <w:proofErr w:type="gramEnd"/>
+      <w:r>
+        <w:rPr>
+          <w:rFonts w:ascii="Consolas" w:eastAsia="Times New Roman" w:hAnsi="Consolas" w:cs="Times New Roman"/>
+          <w:color w:val="BBBEBF"/>
+          <w:kern w:val="0"/>
+          <w:sz w:val="21"/>
+          <w:szCs w:val="21"/>
+          <w:lang w:eastAsia="it-IT"/>
+          <w14:ligatures w14:val="none"/>
+        </w:rPr>
+        <w:t xml:space="preserve"> </w:t>
       </w:r>
       <w:r>
         <w:rPr>
@@ -7296,7 +7771,33 @@
           <w:lang w:eastAsia="it-IT"/>
           <w14:ligatures w14:val="none"/>
         </w:rPr>
-        <w:t>#continuo ricerca a destra (vero destro o SUCCESSORE)</w:t>
+        <w:t>#</w:t>
+      </w:r>
+      <w:proofErr w:type="gramStart"/>
+      <w:r>
+        <w:rPr>
+          <w:rFonts w:ascii="Consolas" w:eastAsia="Times New Roman" w:hAnsi="Consolas" w:cs="Times New Roman"/>
+          <w:color w:val="8B949E"/>
+          <w:kern w:val="0"/>
+          <w:sz w:val="21"/>
+          <w:szCs w:val="21"/>
+          <w:lang w:eastAsia="it-IT"/>
+          <w14:ligatures w14:val="none"/>
+        </w:rPr>
+        <w:t>continuo ricerca</w:t>
+      </w:r>
+      <w:proofErr w:type="gramEnd"/>
+      <w:r>
+        <w:rPr>
+          <w:rFonts w:ascii="Consolas" w:eastAsia="Times New Roman" w:hAnsi="Consolas" w:cs="Times New Roman"/>
+          <w:color w:val="8B949E"/>
+          <w:kern w:val="0"/>
+          <w:sz w:val="21"/>
+          <w:szCs w:val="21"/>
+          <w:lang w:eastAsia="it-IT"/>
+          <w14:ligatures w14:val="none"/>
+        </w:rPr>
+        <w:t xml:space="preserve"> a destra (vero destro o SUCCESSORE)</w:t>
       </w:r>
     </w:p>
     <w:p>
@@ -7424,6 +7925,8 @@
         </w:rPr>
         <w:t xml:space="preserve"> </w:t>
       </w:r>
+      <w:proofErr w:type="spellStart"/>
+      <w:proofErr w:type="gramStart"/>
       <w:r>
         <w:rPr>
           <w:rFonts w:ascii="Consolas" w:eastAsia="Times New Roman" w:hAnsi="Consolas" w:cs="Times New Roman"/>
@@ -7448,6 +7951,8 @@
         </w:rPr>
         <w:t>.left</w:t>
       </w:r>
+      <w:proofErr w:type="spellEnd"/>
+      <w:proofErr w:type="gramEnd"/>
     </w:p>
     <w:p>
       <w:pPr>
@@ -7499,6 +8004,8 @@
         </w:rPr>
         <w:t xml:space="preserve"> </w:t>
       </w:r>
+      <w:proofErr w:type="spellStart"/>
+      <w:proofErr w:type="gramStart"/>
       <w:r>
         <w:rPr>
           <w:rFonts w:ascii="Consolas" w:eastAsia="Times New Roman" w:hAnsi="Consolas" w:cs="Times New Roman"/>
@@ -7521,7 +8028,21 @@
           <w:lang w:val="en-US" w:eastAsia="it-IT"/>
           <w14:ligatures w14:val="none"/>
         </w:rPr>
-        <w:t xml:space="preserve">.right </w:t>
+        <w:t>.right</w:t>
+      </w:r>
+      <w:proofErr w:type="spellEnd"/>
+      <w:proofErr w:type="gramEnd"/>
+      <w:r>
+        <w:rPr>
+          <w:rFonts w:ascii="Consolas" w:eastAsia="Times New Roman" w:hAnsi="Consolas" w:cs="Times New Roman"/>
+          <w:color w:val="BBBEBF"/>
+          <w:kern w:val="0"/>
+          <w:sz w:val="21"/>
+          <w:szCs w:val="21"/>
+          <w:lang w:val="en-US" w:eastAsia="it-IT"/>
+          <w14:ligatures w14:val="none"/>
+        </w:rPr>
+        <w:t xml:space="preserve"> </w:t>
       </w:r>
       <w:r>
         <w:rPr>
@@ -7547,6 +8068,8 @@
         </w:rPr>
         <w:t xml:space="preserve"> </w:t>
       </w:r>
+      <w:proofErr w:type="spellStart"/>
+      <w:proofErr w:type="gramStart"/>
       <w:r>
         <w:rPr>
           <w:rFonts w:ascii="Consolas" w:eastAsia="Times New Roman" w:hAnsi="Consolas" w:cs="Times New Roman"/>
@@ -7569,7 +8092,20 @@
           <w:lang w:val="en-US" w:eastAsia="it-IT"/>
           <w14:ligatures w14:val="none"/>
         </w:rPr>
-        <w:t xml:space="preserve">.right </w:t>
+        <w:t>.right</w:t>
+      </w:r>
+      <w:proofErr w:type="spellEnd"/>
+      <w:r>
+        <w:rPr>
+          <w:rFonts w:ascii="Consolas" w:eastAsia="Times New Roman" w:hAnsi="Consolas" w:cs="Times New Roman"/>
+          <w:color w:val="BBBEBF"/>
+          <w:kern w:val="0"/>
+          <w:sz w:val="21"/>
+          <w:szCs w:val="21"/>
+          <w:lang w:val="en-US" w:eastAsia="it-IT"/>
+          <w14:ligatures w14:val="none"/>
+        </w:rPr>
+        <w:t xml:space="preserve"> </w:t>
       </w:r>
       <w:r>
         <w:rPr>
@@ -7583,18 +8119,21 @@
         </w:rPr>
         <w:t>!=</w:t>
       </w:r>
-      <w:r>
-        <w:rPr>
-          <w:rFonts w:ascii="Consolas" w:eastAsia="Times New Roman" w:hAnsi="Consolas" w:cs="Times New Roman"/>
-          <w:color w:val="BBBEBF"/>
-          <w:kern w:val="0"/>
-          <w:sz w:val="21"/>
-          <w:szCs w:val="21"/>
-          <w:lang w:val="en-US" w:eastAsia="it-IT"/>
-          <w14:ligatures w14:val="none"/>
-        </w:rPr>
-        <w:t xml:space="preserve"> </w:t>
-      </w:r>
+      <w:proofErr w:type="gramEnd"/>
+      <w:r>
+        <w:rPr>
+          <w:rFonts w:ascii="Consolas" w:eastAsia="Times New Roman" w:hAnsi="Consolas" w:cs="Times New Roman"/>
+          <w:color w:val="BBBEBF"/>
+          <w:kern w:val="0"/>
+          <w:sz w:val="21"/>
+          <w:szCs w:val="21"/>
+          <w:lang w:val="en-US" w:eastAsia="it-IT"/>
+          <w14:ligatures w14:val="none"/>
+        </w:rPr>
+        <w:t xml:space="preserve"> </w:t>
+      </w:r>
+      <w:proofErr w:type="spellStart"/>
+      <w:proofErr w:type="gramStart"/>
       <w:r>
         <w:rPr>
           <w:rFonts w:ascii="Consolas" w:eastAsia="Times New Roman" w:hAnsi="Consolas" w:cs="Times New Roman"/>
@@ -7607,6 +8146,7 @@
         </w:rPr>
         <w:t>curr</w:t>
       </w:r>
+      <w:proofErr w:type="spellEnd"/>
       <w:r>
         <w:rPr>
           <w:rFonts w:ascii="Consolas" w:eastAsia="Times New Roman" w:hAnsi="Consolas" w:cs="Times New Roman"/>
@@ -7629,7 +8169,20 @@
           <w:lang w:val="en-US" w:eastAsia="it-IT"/>
           <w14:ligatures w14:val="none"/>
         </w:rPr>
-        <w:t>#trovo PREDECESSORE</w:t>
+        <w:t>#</w:t>
+      </w:r>
+      <w:proofErr w:type="gramEnd"/>
+      <w:r>
+        <w:rPr>
+          <w:rFonts w:ascii="Consolas" w:eastAsia="Times New Roman" w:hAnsi="Consolas" w:cs="Times New Roman"/>
+          <w:color w:val="8B949E"/>
+          <w:kern w:val="0"/>
+          <w:sz w:val="21"/>
+          <w:szCs w:val="21"/>
+          <w:lang w:val="en-US" w:eastAsia="it-IT"/>
+          <w14:ligatures w14:val="none"/>
+        </w:rPr>
+        <w:t>trovo PREDECESSORE</w:t>
       </w:r>
     </w:p>
     <w:p>
@@ -7706,6 +8259,8 @@
         </w:rPr>
         <w:t xml:space="preserve"> </w:t>
       </w:r>
+      <w:proofErr w:type="spellStart"/>
+      <w:proofErr w:type="gramStart"/>
       <w:r>
         <w:rPr>
           <w:rFonts w:ascii="Consolas" w:eastAsia="Times New Roman" w:hAnsi="Consolas" w:cs="Times New Roman"/>
@@ -7730,6 +8285,8 @@
         </w:rPr>
         <w:t>.right</w:t>
       </w:r>
+      <w:proofErr w:type="spellEnd"/>
+      <w:proofErr w:type="gramEnd"/>
     </w:p>
     <w:p>
       <w:pPr>
@@ -7820,6 +8377,8 @@
         </w:rPr>
         <w:t xml:space="preserve"> </w:t>
       </w:r>
+      <w:proofErr w:type="spellStart"/>
+      <w:proofErr w:type="gramStart"/>
       <w:r>
         <w:rPr>
           <w:rFonts w:ascii="Consolas" w:eastAsia="Times New Roman" w:hAnsi="Consolas" w:cs="Times New Roman"/>
@@ -7842,7 +8401,21 @@
           <w:lang w:val="en-US" w:eastAsia="it-IT"/>
           <w14:ligatures w14:val="none"/>
         </w:rPr>
-        <w:t>.right:</w:t>
+        <w:t>.right</w:t>
+      </w:r>
+      <w:proofErr w:type="spellEnd"/>
+      <w:proofErr w:type="gramEnd"/>
+      <w:r>
+        <w:rPr>
+          <w:rFonts w:ascii="Consolas" w:eastAsia="Times New Roman" w:hAnsi="Consolas" w:cs="Times New Roman"/>
+          <w:color w:val="BBBEBF"/>
+          <w:kern w:val="0"/>
+          <w:sz w:val="21"/>
+          <w:szCs w:val="21"/>
+          <w:lang w:val="en-US" w:eastAsia="it-IT"/>
+          <w14:ligatures w14:val="none"/>
+        </w:rPr>
+        <w:t>:</w:t>
       </w:r>
     </w:p>
     <w:p>
@@ -7871,6 +8444,8 @@
         </w:rPr>
         <w:t xml:space="preserve">                    </w:t>
       </w:r>
+      <w:proofErr w:type="spellStart"/>
+      <w:proofErr w:type="gramStart"/>
       <w:r>
         <w:rPr>
           <w:rFonts w:ascii="Consolas" w:eastAsia="Times New Roman" w:hAnsi="Consolas" w:cs="Times New Roman"/>
@@ -7893,7 +8468,21 @@
           <w:lang w:val="en-US" w:eastAsia="it-IT"/>
           <w14:ligatures w14:val="none"/>
         </w:rPr>
-        <w:t xml:space="preserve">.right </w:t>
+        <w:t>.right</w:t>
+      </w:r>
+      <w:proofErr w:type="spellEnd"/>
+      <w:proofErr w:type="gramEnd"/>
+      <w:r>
+        <w:rPr>
+          <w:rFonts w:ascii="Consolas" w:eastAsia="Times New Roman" w:hAnsi="Consolas" w:cs="Times New Roman"/>
+          <w:color w:val="BBBEBF"/>
+          <w:kern w:val="0"/>
+          <w:sz w:val="21"/>
+          <w:szCs w:val="21"/>
+          <w:lang w:val="en-US" w:eastAsia="it-IT"/>
+          <w14:ligatures w14:val="none"/>
+        </w:rPr>
+        <w:t xml:space="preserve"> </w:t>
       </w:r>
       <w:r>
         <w:rPr>
@@ -7919,6 +8508,7 @@
         </w:rPr>
         <w:t xml:space="preserve"> </w:t>
       </w:r>
+      <w:proofErr w:type="spellStart"/>
       <w:r>
         <w:rPr>
           <w:rFonts w:ascii="Consolas" w:eastAsia="Times New Roman" w:hAnsi="Consolas" w:cs="Times New Roman"/>
@@ -7931,6 +8521,7 @@
         </w:rPr>
         <w:t>curr</w:t>
       </w:r>
+      <w:proofErr w:type="spellEnd"/>
     </w:p>
     <w:p>
       <w:pPr>
@@ -7942,7 +8533,7 @@
           <w:kern w:val="0"/>
           <w:sz w:val="21"/>
           <w:szCs w:val="21"/>
-          <w:lang w:val="en-US" w:eastAsia="it-IT"/>
+          <w:lang w:eastAsia="it-IT"/>
           <w14:ligatures w14:val="none"/>
         </w:rPr>
       </w:pPr>
@@ -7959,6 +8550,7 @@
         <w:lastRenderedPageBreak/>
         <w:t xml:space="preserve">                    </w:t>
       </w:r>
+      <w:proofErr w:type="spellStart"/>
       <w:r>
         <w:rPr>
           <w:rFonts w:ascii="Consolas" w:eastAsia="Times New Roman" w:hAnsi="Consolas" w:cs="Times New Roman"/>
@@ -7966,19 +8558,20 @@
           <w:kern w:val="0"/>
           <w:sz w:val="21"/>
           <w:szCs w:val="21"/>
-          <w:lang w:val="en-US" w:eastAsia="it-IT"/>
+          <w:lang w:eastAsia="it-IT"/>
           <w14:ligatures w14:val="none"/>
         </w:rPr>
         <w:t>curr</w:t>
       </w:r>
-      <w:r>
-        <w:rPr>
-          <w:rFonts w:ascii="Consolas" w:eastAsia="Times New Roman" w:hAnsi="Consolas" w:cs="Times New Roman"/>
-          <w:color w:val="BBBEBF"/>
-          <w:kern w:val="0"/>
-          <w:sz w:val="21"/>
-          <w:szCs w:val="21"/>
-          <w:lang w:val="en-US" w:eastAsia="it-IT"/>
+      <w:proofErr w:type="spellEnd"/>
+      <w:r>
+        <w:rPr>
+          <w:rFonts w:ascii="Consolas" w:eastAsia="Times New Roman" w:hAnsi="Consolas" w:cs="Times New Roman"/>
+          <w:color w:val="BBBEBF"/>
+          <w:kern w:val="0"/>
+          <w:sz w:val="21"/>
+          <w:szCs w:val="21"/>
+          <w:lang w:eastAsia="it-IT"/>
           <w14:ligatures w14:val="none"/>
         </w:rPr>
         <w:t xml:space="preserve"> </w:t>
@@ -7990,7 +8583,7 @@
           <w:kern w:val="0"/>
           <w:sz w:val="21"/>
           <w:szCs w:val="21"/>
-          <w:lang w:val="en-US" w:eastAsia="it-IT"/>
+          <w:lang w:eastAsia="it-IT"/>
           <w14:ligatures w14:val="none"/>
         </w:rPr>
         <w:t>=</w:t>
@@ -8002,11 +8595,12 @@
           <w:kern w:val="0"/>
           <w:sz w:val="21"/>
           <w:szCs w:val="21"/>
-          <w:lang w:val="en-US" w:eastAsia="it-IT"/>
-          <w14:ligatures w14:val="none"/>
-        </w:rPr>
-        <w:t xml:space="preserve"> </w:t>
-      </w:r>
+          <w:lang w:eastAsia="it-IT"/>
+          <w14:ligatures w14:val="none"/>
+        </w:rPr>
+        <w:t xml:space="preserve"> </w:t>
+      </w:r>
+      <w:proofErr w:type="spellStart"/>
       <w:r>
         <w:rPr>
           <w:rFonts w:ascii="Consolas" w:eastAsia="Times New Roman" w:hAnsi="Consolas" w:cs="Times New Roman"/>
@@ -8014,7 +8608,7 @@
           <w:kern w:val="0"/>
           <w:sz w:val="21"/>
           <w:szCs w:val="21"/>
-          <w:lang w:val="en-US" w:eastAsia="it-IT"/>
+          <w:lang w:eastAsia="it-IT"/>
           <w14:ligatures w14:val="none"/>
         </w:rPr>
         <w:t>curr</w:t>
@@ -8026,11 +8620,12 @@
           <w:kern w:val="0"/>
           <w:sz w:val="21"/>
           <w:szCs w:val="21"/>
-          <w:lang w:val="en-US" w:eastAsia="it-IT"/>
+          <w:lang w:eastAsia="it-IT"/>
           <w14:ligatures w14:val="none"/>
         </w:rPr>
         <w:t>.left</w:t>
       </w:r>
+      <w:proofErr w:type="spellEnd"/>
     </w:p>
     <w:p>
       <w:pPr>
@@ -8053,7 +8648,7 @@
           <w:kern w:val="0"/>
           <w:sz w:val="21"/>
           <w:szCs w:val="21"/>
-          <w:lang w:val="en-US" w:eastAsia="it-IT"/>
+          <w:lang w:eastAsia="it-IT"/>
           <w14:ligatures w14:val="none"/>
         </w:rPr>
         <w:t xml:space="preserve">                </w:t>
@@ -8121,6 +8716,8 @@
         </w:rPr>
         <w:t xml:space="preserve">                    </w:t>
       </w:r>
+      <w:proofErr w:type="spellStart"/>
+      <w:proofErr w:type="gramStart"/>
       <w:r>
         <w:rPr>
           <w:rFonts w:ascii="Consolas" w:eastAsia="Times New Roman" w:hAnsi="Consolas" w:cs="Times New Roman"/>
@@ -8143,7 +8740,21 @@
           <w:lang w:val="en-US" w:eastAsia="it-IT"/>
           <w14:ligatures w14:val="none"/>
         </w:rPr>
-        <w:t xml:space="preserve">.right </w:t>
+        <w:t>.right</w:t>
+      </w:r>
+      <w:proofErr w:type="spellEnd"/>
+      <w:proofErr w:type="gramEnd"/>
+      <w:r>
+        <w:rPr>
+          <w:rFonts w:ascii="Consolas" w:eastAsia="Times New Roman" w:hAnsi="Consolas" w:cs="Times New Roman"/>
+          <w:color w:val="BBBEBF"/>
+          <w:kern w:val="0"/>
+          <w:sz w:val="21"/>
+          <w:szCs w:val="21"/>
+          <w:lang w:val="en-US" w:eastAsia="it-IT"/>
+          <w14:ligatures w14:val="none"/>
+        </w:rPr>
+        <w:t xml:space="preserve"> </w:t>
       </w:r>
       <w:r>
         <w:rPr>
@@ -8442,6 +9053,7 @@
         </w:rPr>
         <w:t xml:space="preserve"> </w:t>
       </w:r>
+      <w:proofErr w:type="spellStart"/>
       <w:r>
         <w:rPr>
           <w:rFonts w:ascii="Consolas" w:eastAsia="Times New Roman" w:hAnsi="Consolas" w:cs="Times New Roman"/>
@@ -8466,6 +9078,7 @@
         </w:rPr>
         <w:t>.val</w:t>
       </w:r>
+      <w:proofErr w:type="spellEnd"/>
     </w:p>
     <w:p>
       <w:pPr>
@@ -8493,6 +9106,7 @@
         </w:rPr>
         <w:t xml:space="preserve">                    </w:t>
       </w:r>
+      <w:proofErr w:type="spellStart"/>
       <w:r>
         <w:rPr>
           <w:rFonts w:ascii="Consolas" w:eastAsia="Times New Roman" w:hAnsi="Consolas" w:cs="Times New Roman"/>
@@ -8505,6 +9119,7 @@
         </w:rPr>
         <w:t>curr</w:t>
       </w:r>
+      <w:proofErr w:type="spellEnd"/>
       <w:r>
         <w:rPr>
           <w:rFonts w:ascii="Consolas" w:eastAsia="Times New Roman" w:hAnsi="Consolas" w:cs="Times New Roman"/>
@@ -8541,6 +9156,8 @@
         </w:rPr>
         <w:t xml:space="preserve"> </w:t>
       </w:r>
+      <w:proofErr w:type="spellStart"/>
+      <w:proofErr w:type="gramStart"/>
       <w:r>
         <w:rPr>
           <w:rFonts w:ascii="Consolas" w:eastAsia="Times New Roman" w:hAnsi="Consolas" w:cs="Times New Roman"/>
@@ -8565,6 +9182,8 @@
         </w:rPr>
         <w:t>.right</w:t>
       </w:r>
+      <w:proofErr w:type="spellEnd"/>
+      <w:proofErr w:type="gramEnd"/>
     </w:p>
     <w:p>
       <w:pPr>
@@ -8815,7 +9434,21 @@
         <w:rPr>
           <w:lang w:val="en-US"/>
         </w:rPr>
-        <w:t>a sinistra di ROOT) e RIGHT SUB-TREE NODES (a destra di ROOT).</w:t>
+        <w:t xml:space="preserve">a sinistra di ROOT) e RIGHT SUB-TREE NODES (a </w:t>
+      </w:r>
+      <w:proofErr w:type="spellStart"/>
+      <w:r>
+        <w:rPr>
+          <w:lang w:val="en-US"/>
+        </w:rPr>
+        <w:t>destra</w:t>
+      </w:r>
+      <w:proofErr w:type="spellEnd"/>
+      <w:r>
+        <w:rPr>
+          <w:lang w:val="en-US"/>
+        </w:rPr>
+        <w:t xml:space="preserve"> di ROOT).</w:t>
       </w:r>
     </w:p>
     <w:p>
@@ -8923,7 +9556,15 @@
         <w:t>PRIMO</w:t>
       </w:r>
       <w:r>
-        <w:t xml:space="preserve"> che compare in PRE-ORDER e la ROOT su questo subtree </w:t>
+        <w:t xml:space="preserve"> che compare in PRE-ORDER e la ROOT su questo </w:t>
+      </w:r>
+      <w:proofErr w:type="spellStart"/>
+      <w:r>
+        <w:t>subtree</w:t>
+      </w:r>
+      <w:proofErr w:type="spellEnd"/>
+      <w:r>
+        <w:t xml:space="preserve"> </w:t>
       </w:r>
       <w:r>
         <w:sym w:font="Wingdings" w:char="F0E0"/>
@@ -8964,7 +9605,15 @@
         <w:t>Continuo</w:t>
       </w:r>
       <w:r>
-        <w:t xml:space="preserve"> cosi fino ad esaurire nodi (a SX IN-ORDER ho vera ROOT oppure ho esaurito nodi IN ARRAY)</w:t>
+        <w:t xml:space="preserve"> </w:t>
+      </w:r>
+      <w:proofErr w:type="gramStart"/>
+      <w:r>
+        <w:t>cosi</w:t>
+      </w:r>
+      <w:proofErr w:type="gramEnd"/>
+      <w:r>
+        <w:t xml:space="preserve"> fino ad esaurire nodi (a SX IN-ORDER ho vera ROOT oppure ho esaurito nodi IN ARRAY)</w:t>
       </w:r>
     </w:p>
     <w:p/>
@@ -9042,17 +9691,74 @@
         <w:t xml:space="preserve">O(N) time </w:t>
       </w:r>
       <w:r>
-        <w:t xml:space="preserve">(N = length of string) e </w:t>
-      </w:r>
-      <w:r>
-        <w:rPr>
-          <w:b/>
-          <w:bCs/>
-        </w:rPr>
-        <w:t>O(T) space</w:t>
-      </w:r>
-      <w:r>
-        <w:t xml:space="preserve"> (T = number of different paths stored) facendo si che </w:t>
+        <w:t xml:space="preserve">(N = </w:t>
+      </w:r>
+      <w:proofErr w:type="spellStart"/>
+      <w:r>
+        <w:t>length</w:t>
+      </w:r>
+      <w:proofErr w:type="spellEnd"/>
+      <w:r>
+        <w:t xml:space="preserve"> of </w:t>
+      </w:r>
+      <w:proofErr w:type="spellStart"/>
+      <w:r>
+        <w:t>string</w:t>
+      </w:r>
+      <w:proofErr w:type="spellEnd"/>
+      <w:r>
+        <w:t xml:space="preserve">) e </w:t>
+      </w:r>
+      <w:r>
+        <w:rPr>
+          <w:b/>
+          <w:bCs/>
+        </w:rPr>
+        <w:t xml:space="preserve">O(T) </w:t>
+      </w:r>
+      <w:proofErr w:type="spellStart"/>
+      <w:r>
+        <w:rPr>
+          <w:b/>
+          <w:bCs/>
+        </w:rPr>
+        <w:t>space</w:t>
+      </w:r>
+      <w:proofErr w:type="spellEnd"/>
+      <w:r>
+        <w:t xml:space="preserve"> (T = </w:t>
+      </w:r>
+      <w:proofErr w:type="spellStart"/>
+      <w:r>
+        <w:t>number</w:t>
+      </w:r>
+      <w:proofErr w:type="spellEnd"/>
+      <w:r>
+        <w:t xml:space="preserve"> of </w:t>
+      </w:r>
+      <w:proofErr w:type="spellStart"/>
+      <w:r>
+        <w:t>different</w:t>
+      </w:r>
+      <w:proofErr w:type="spellEnd"/>
+      <w:r>
+        <w:t xml:space="preserve"> </w:t>
+      </w:r>
+      <w:proofErr w:type="spellStart"/>
+      <w:r>
+        <w:t>paths</w:t>
+      </w:r>
+      <w:proofErr w:type="spellEnd"/>
+      <w:r>
+        <w:t xml:space="preserve"> </w:t>
+      </w:r>
+      <w:proofErr w:type="spellStart"/>
+      <w:r>
+        <w:t>stored</w:t>
+      </w:r>
+      <w:proofErr w:type="spellEnd"/>
+      <w:r>
+        <w:t xml:space="preserve">) facendo si che </w:t>
       </w:r>
       <w:r>
         <w:rPr>
@@ -9175,8 +9881,23 @@
         <w:rPr>
           <w:lang w:val="en-US"/>
         </w:rPr>
-        <w:t>A boolean flag </w:t>
-      </w:r>
+        <w:t xml:space="preserve">A </w:t>
+      </w:r>
+      <w:proofErr w:type="spellStart"/>
+      <w:r>
+        <w:rPr>
+          <w:lang w:val="en-US"/>
+        </w:rPr>
+        <w:t>boolean</w:t>
+      </w:r>
+      <w:proofErr w:type="spellEnd"/>
+      <w:r>
+        <w:rPr>
+          <w:lang w:val="en-US"/>
+        </w:rPr>
+        <w:t xml:space="preserve"> flag </w:t>
+      </w:r>
+      <w:proofErr w:type="spellStart"/>
       <w:r>
         <w:rPr>
           <w:b/>
@@ -9185,6 +9906,7 @@
         </w:rPr>
         <w:t>endOfWord</w:t>
       </w:r>
+      <w:proofErr w:type="spellEnd"/>
       <w:r>
         <w:rPr>
           <w:lang w:val="en-US"/>
@@ -9204,7 +9926,23 @@
         <w:t>Trie</w:t>
       </w:r>
       <w:r>
-        <w:t xml:space="preserve"> is useful:</w:t>
+        <w:t xml:space="preserve"> </w:t>
+      </w:r>
+      <w:proofErr w:type="spellStart"/>
+      <w:r>
+        <w:t>is</w:t>
+      </w:r>
+      <w:proofErr w:type="spellEnd"/>
+      <w:r>
+        <w:t xml:space="preserve"> </w:t>
+      </w:r>
+      <w:proofErr w:type="spellStart"/>
+      <w:r>
+        <w:t>useful</w:t>
+      </w:r>
+      <w:proofErr w:type="spellEnd"/>
+      <w:r>
+        <w:t>:</w:t>
       </w:r>
     </w:p>
     <w:p>
@@ -9223,13 +9961,23 @@
         </w:rPr>
         <w:t>Searching words and prefixes is </w:t>
       </w:r>
-      <w:r>
-        <w:rPr>
-          <w:b/>
-          <w:bCs/>
-          <w:lang w:val="en-US"/>
-        </w:rPr>
-        <w:t>O(length of word)</w:t>
+      <w:proofErr w:type="gramStart"/>
+      <w:r>
+        <w:rPr>
+          <w:b/>
+          <w:bCs/>
+          <w:lang w:val="en-US"/>
+        </w:rPr>
+        <w:t>O(</w:t>
+      </w:r>
+      <w:proofErr w:type="gramEnd"/>
+      <w:r>
+        <w:rPr>
+          <w:b/>
+          <w:bCs/>
+          <w:lang w:val="en-US"/>
+        </w:rPr>
+        <w:t>length of word)</w:t>
       </w:r>
       <w:r>
         <w:rPr>
@@ -9556,6 +10304,372 @@
         </w:rPr>
         <w:t>)</w:t>
       </w:r>
+    </w:p>
+    <w:p>
+      <w:pPr>
+        <w:rPr>
+          <w:lang w:val="en-US"/>
+        </w:rPr>
+      </w:pPr>
+    </w:p>
+    <w:p>
+      <w:pPr>
+        <w:rPr>
+          <w:lang w:val="en-US"/>
+        </w:rPr>
+      </w:pPr>
+      <w:r>
+        <w:rPr>
+          <w:b/>
+          <w:bCs/>
+          <w:color w:val="C00000"/>
+          <w:lang w:val="en-US"/>
+        </w:rPr>
+        <w:t>VALID TREE</w:t>
+      </w:r>
+      <w:r>
+        <w:rPr>
+          <w:b/>
+          <w:bCs/>
+          <w:color w:val="C00000"/>
+          <w:lang w:val="en-US"/>
+        </w:rPr>
+        <w:t>:</w:t>
+      </w:r>
+      <w:r>
+        <w:rPr>
+          <w:b/>
+          <w:bCs/>
+          <w:color w:val="C00000"/>
+          <w:lang w:val="en-US"/>
+        </w:rPr>
+        <w:t xml:space="preserve"> </w:t>
+      </w:r>
+      <w:r>
+        <w:rPr>
+          <w:lang w:val="en-US"/>
+        </w:rPr>
+        <w:t>see</w:t>
+      </w:r>
+      <w:r>
+        <w:rPr>
+          <w:lang w:val="en-US"/>
+        </w:rPr>
+        <w:t xml:space="preserve"> </w:t>
+      </w:r>
+      <w:r>
+        <w:rPr>
+          <w:i/>
+          <w:iCs/>
+          <w:lang w:val="en-US"/>
+        </w:rPr>
+        <w:t>11</w:t>
+      </w:r>
+      <w:r>
+        <w:rPr>
+          <w:i/>
+          <w:iCs/>
+          <w:lang w:val="en-US"/>
+        </w:rPr>
+        <w:t>_</w:t>
+      </w:r>
+      <w:r>
+        <w:rPr>
+          <w:i/>
+          <w:iCs/>
+          <w:lang w:val="en-US"/>
+        </w:rPr>
+        <w:t xml:space="preserve">graphs </w:t>
+      </w:r>
+      <w:r>
+        <w:rPr>
+          <w:lang w:val="en-US"/>
+        </w:rPr>
+        <w:t xml:space="preserve">problem </w:t>
+      </w:r>
+      <w:r>
+        <w:rPr>
+          <w:b/>
+          <w:bCs/>
+          <w:highlight w:val="yellow"/>
+          <w:lang w:val="en-US"/>
+        </w:rPr>
+        <w:t>VALID_TREE</w:t>
+      </w:r>
+    </w:p>
+    <w:p>
+      <w:pPr>
+        <w:rPr>
+          <w:b/>
+          <w:bCs/>
+          <w:lang w:val="en-US"/>
+        </w:rPr>
+      </w:pPr>
+      <w:r>
+        <w:rPr>
+          <w:lang w:val="en-US"/>
+        </w:rPr>
+        <w:t xml:space="preserve">we can do it with </w:t>
+      </w:r>
+      <w:r>
+        <w:rPr>
+          <w:i/>
+          <w:iCs/>
+          <w:u w:val="single"/>
+          <w:lang w:val="en-US"/>
+        </w:rPr>
+        <w:t>global</w:t>
+      </w:r>
+      <w:r>
+        <w:rPr>
+          <w:lang w:val="en-US"/>
+        </w:rPr>
+        <w:t xml:space="preserve"> </w:t>
+      </w:r>
+      <w:r>
+        <w:rPr>
+          <w:b/>
+          <w:bCs/>
+          <w:lang w:val="en-US"/>
+        </w:rPr>
+        <w:t>VISITED</w:t>
+      </w:r>
+      <w:r>
+        <w:rPr>
+          <w:lang w:val="en-US"/>
+        </w:rPr>
+        <w:t xml:space="preserve"> to detect </w:t>
+      </w:r>
+      <w:r>
+        <w:rPr>
+          <w:b/>
+          <w:bCs/>
+          <w:i/>
+          <w:iCs/>
+          <w:u w:val="single"/>
+          <w:lang w:val="en-US"/>
+        </w:rPr>
+        <w:t>CYCLES</w:t>
+      </w:r>
+      <w:r>
+        <w:rPr>
+          <w:lang w:val="en-US"/>
+        </w:rPr>
+        <w:t xml:space="preserve"> (only 1 </w:t>
+      </w:r>
+      <w:proofErr w:type="spellStart"/>
+      <w:proofErr w:type="gramStart"/>
+      <w:r>
+        <w:rPr>
+          <w:b/>
+          <w:bCs/>
+          <w:color w:val="C00000"/>
+          <w:lang w:val="en-US"/>
+        </w:rPr>
+        <w:t>dfs</w:t>
+      </w:r>
+      <w:proofErr w:type="spellEnd"/>
+      <w:r>
+        <w:rPr>
+          <w:b/>
+          <w:bCs/>
+          <w:color w:val="C00000"/>
+          <w:lang w:val="en-US"/>
+        </w:rPr>
+        <w:t>(</w:t>
+      </w:r>
+      <w:proofErr w:type="gramEnd"/>
+      <w:r>
+        <w:rPr>
+          <w:b/>
+          <w:bCs/>
+          <w:color w:val="C00000"/>
+          <w:lang w:val="en-US"/>
+        </w:rPr>
+        <w:t>node, parent)</w:t>
+      </w:r>
+      <w:r>
+        <w:rPr>
+          <w:color w:val="C00000"/>
+          <w:lang w:val="en-US"/>
+        </w:rPr>
+        <w:t xml:space="preserve"> </w:t>
+      </w:r>
+      <w:r>
+        <w:rPr>
+          <w:lang w:val="en-US"/>
+        </w:rPr>
+        <w:t xml:space="preserve">run, </w:t>
+      </w:r>
+      <w:proofErr w:type="gramStart"/>
+      <w:r>
+        <w:rPr>
+          <w:lang w:val="en-US"/>
+        </w:rPr>
+        <w:t>parent</w:t>
+      </w:r>
+      <w:proofErr w:type="gramEnd"/>
+      <w:r>
+        <w:rPr>
+          <w:lang w:val="en-US"/>
+        </w:rPr>
+        <w:t xml:space="preserve"> because the graph is </w:t>
+      </w:r>
+      <w:proofErr w:type="gramStart"/>
+      <w:r>
+        <w:rPr>
+          <w:lang w:val="en-US"/>
+        </w:rPr>
+        <w:t>undirected</w:t>
+      </w:r>
+      <w:proofErr w:type="gramEnd"/>
+      <w:r>
+        <w:rPr>
+          <w:lang w:val="en-US"/>
+        </w:rPr>
+        <w:t xml:space="preserve"> so we need to </w:t>
+      </w:r>
+      <w:r>
+        <w:rPr>
+          <w:i/>
+          <w:iCs/>
+          <w:lang w:val="en-US"/>
+        </w:rPr>
+        <w:t>skip it in the neighborhood</w:t>
+      </w:r>
+      <w:r>
+        <w:rPr>
+          <w:lang w:val="en-US"/>
+        </w:rPr>
+        <w:t xml:space="preserve">) + </w:t>
+      </w:r>
+      <w:r>
+        <w:rPr>
+          <w:b/>
+          <w:bCs/>
+          <w:lang w:val="en-US"/>
+        </w:rPr>
+        <w:t>CHECK</w:t>
+      </w:r>
+      <w:r>
+        <w:rPr>
+          <w:lang w:val="en-US"/>
+        </w:rPr>
+        <w:t xml:space="preserve"> on </w:t>
+      </w:r>
+      <w:r>
+        <w:rPr>
+          <w:b/>
+          <w:bCs/>
+          <w:lang w:val="en-US"/>
+        </w:rPr>
+        <w:t>number of VISITED NODES to be equal to TOTAL NODES (only 1 CC)</w:t>
+      </w:r>
+    </w:p>
+    <w:p>
+      <w:pPr>
+        <w:rPr>
+          <w:lang w:val="en-US"/>
+        </w:rPr>
+      </w:pPr>
+      <w:r>
+        <w:rPr>
+          <w:lang w:val="en-US"/>
+        </w:rPr>
+        <w:t>Or</w:t>
+      </w:r>
+    </w:p>
+    <w:p>
+      <w:pPr>
+        <w:rPr>
+          <w:b/>
+          <w:bCs/>
+          <w:lang w:val="en-US"/>
+        </w:rPr>
+      </w:pPr>
+      <w:r>
+        <w:rPr>
+          <w:lang w:val="en-US"/>
+        </w:rPr>
+        <w:t xml:space="preserve">By counting </w:t>
+      </w:r>
+      <w:r>
+        <w:rPr>
+          <w:b/>
+          <w:bCs/>
+          <w:lang w:val="en-US"/>
+        </w:rPr>
+        <w:t>E == V – 1</w:t>
+      </w:r>
+      <w:r>
+        <w:rPr>
+          <w:lang w:val="en-US"/>
+        </w:rPr>
+        <w:t xml:space="preserve"> </w:t>
+      </w:r>
+      <w:r>
+        <w:rPr>
+          <w:lang w:val="en-US"/>
+        </w:rPr>
+        <w:sym w:font="Wingdings" w:char="F0E0"/>
+      </w:r>
+      <w:r>
+        <w:rPr>
+          <w:lang w:val="en-US"/>
+        </w:rPr>
+        <w:t xml:space="preserve"> no cycles if connected + </w:t>
+      </w:r>
+      <w:r>
+        <w:rPr>
+          <w:b/>
+          <w:bCs/>
+          <w:lang w:val="en-US"/>
+        </w:rPr>
+        <w:t>ONLY 1 DFS RUN</w:t>
+      </w:r>
+      <w:r>
+        <w:rPr>
+          <w:lang w:val="en-US"/>
+        </w:rPr>
+        <w:t xml:space="preserve"> (no need for parent since we DO NOT want to check cycles here, we just </w:t>
+      </w:r>
+      <w:r>
+        <w:rPr>
+          <w:i/>
+          <w:iCs/>
+          <w:lang w:val="en-US"/>
+        </w:rPr>
+        <w:t>skip the nodes in VISITED set</w:t>
+      </w:r>
+      <w:r>
+        <w:rPr>
+          <w:lang w:val="en-US"/>
+        </w:rPr>
+        <w:t xml:space="preserve">) + </w:t>
+      </w:r>
+      <w:r>
+        <w:rPr>
+          <w:b/>
+          <w:bCs/>
+          <w:lang w:val="en-US"/>
+        </w:rPr>
+        <w:t xml:space="preserve">CHECK </w:t>
+      </w:r>
+      <w:r>
+        <w:rPr>
+          <w:b/>
+          <w:bCs/>
+          <w:lang w:val="en-US"/>
+        </w:rPr>
+        <w:t>on number of VISITED NODES to be equal to TOTAL NODES (only 1 CC)</w:t>
+      </w:r>
+    </w:p>
+    <w:p>
+      <w:pPr>
+        <w:rPr>
+          <w:lang w:val="en-US"/>
+        </w:rPr>
+      </w:pPr>
     </w:p>
     <w:p>
       <w:pPr>

</xml_diff>

<commit_message>
Add implementation for word ladder and redundant connection
</commit_message>
<xml_diff>
--- a/docs/PATTERNS.docx
+++ b/docs/PATTERNS.docx
@@ -2033,22 +2033,8 @@
           <w:lang w:val="en-US" w:eastAsia="it-IT"/>
           <w14:ligatures w14:val="none"/>
         </w:rPr>
-        <w:t>"</w:t>
-      </w:r>
-      <w:proofErr w:type="gramStart"/>
-      <w:r>
-        <w:rPr>
-          <w:rFonts w:ascii="Consolas" w:eastAsia="Times New Roman" w:hAnsi="Consolas" w:cs="Times New Roman"/>
-          <w:color w:val="A5D6FF"/>
-          <w:kern w:val="0"/>
-          <w:sz w:val="21"/>
-          <w:szCs w:val="21"/>
-          <w:lang w:val="en-US" w:eastAsia="it-IT"/>
-          <w14:ligatures w14:val="none"/>
-        </w:rPr>
-        <w:t>$#"</w:t>
-      </w:r>
-      <w:proofErr w:type="gramEnd"/>
+        <w:t>"$#"</w:t>
+      </w:r>
     </w:p>
     <w:p>
       <w:pPr>
@@ -3379,7 +3365,7 @@
           <w:kern w:val="0"/>
           <w:sz w:val="21"/>
           <w:szCs w:val="21"/>
-          <w:lang w:val="en-US" w:eastAsia="it-IT"/>
+          <w:lang w:eastAsia="it-IT"/>
           <w14:ligatures w14:val="none"/>
         </w:rPr>
       </w:pPr>
@@ -3402,7 +3388,7 @@
           <w:kern w:val="0"/>
           <w:sz w:val="21"/>
           <w:szCs w:val="21"/>
-          <w:lang w:val="en-US" w:eastAsia="it-IT"/>
+          <w:lang w:eastAsia="it-IT"/>
           <w14:ligatures w14:val="none"/>
         </w:rPr>
         <w:t>z</w:t>
@@ -3414,12 +3400,11 @@
           <w:kern w:val="0"/>
           <w:sz w:val="21"/>
           <w:szCs w:val="21"/>
-          <w:lang w:val="en-US" w:eastAsia="it-IT"/>
+          <w:lang w:eastAsia="it-IT"/>
           <w14:ligatures w14:val="none"/>
         </w:rPr>
         <w:t>[</w:t>
       </w:r>
-      <w:proofErr w:type="spellStart"/>
       <w:r>
         <w:rPr>
           <w:rFonts w:ascii="Consolas" w:eastAsia="Times New Roman" w:hAnsi="Consolas" w:cs="Times New Roman"/>
@@ -3427,20 +3412,19 @@
           <w:kern w:val="0"/>
           <w:sz w:val="21"/>
           <w:szCs w:val="21"/>
-          <w:lang w:val="en-US" w:eastAsia="it-IT"/>
+          <w:lang w:eastAsia="it-IT"/>
           <w14:ligatures w14:val="none"/>
         </w:rPr>
         <w:t>i</w:t>
       </w:r>
-      <w:proofErr w:type="spellEnd"/>
-      <w:r>
-        <w:rPr>
-          <w:rFonts w:ascii="Consolas" w:eastAsia="Times New Roman" w:hAnsi="Consolas" w:cs="Times New Roman"/>
-          <w:color w:val="BBBEBF"/>
-          <w:kern w:val="0"/>
-          <w:sz w:val="21"/>
-          <w:szCs w:val="21"/>
-          <w:lang w:val="en-US" w:eastAsia="it-IT"/>
+      <w:r>
+        <w:rPr>
+          <w:rFonts w:ascii="Consolas" w:eastAsia="Times New Roman" w:hAnsi="Consolas" w:cs="Times New Roman"/>
+          <w:color w:val="BBBEBF"/>
+          <w:kern w:val="0"/>
+          <w:sz w:val="21"/>
+          <w:szCs w:val="21"/>
+          <w:lang w:eastAsia="it-IT"/>
           <w14:ligatures w14:val="none"/>
         </w:rPr>
         <w:t xml:space="preserve">] </w:t>
@@ -3452,7 +3436,7 @@
           <w:kern w:val="0"/>
           <w:sz w:val="21"/>
           <w:szCs w:val="21"/>
-          <w:lang w:val="en-US" w:eastAsia="it-IT"/>
+          <w:lang w:eastAsia="it-IT"/>
           <w14:ligatures w14:val="none"/>
         </w:rPr>
         <w:t>=</w:t>
@@ -3464,7 +3448,7 @@
           <w:kern w:val="0"/>
           <w:sz w:val="21"/>
           <w:szCs w:val="21"/>
-          <w:lang w:val="en-US" w:eastAsia="it-IT"/>
+          <w:lang w:eastAsia="it-IT"/>
           <w14:ligatures w14:val="none"/>
         </w:rPr>
         <w:t xml:space="preserve"> </w:t>
@@ -3477,7 +3461,7 @@
           <w:kern w:val="0"/>
           <w:sz w:val="21"/>
           <w:szCs w:val="21"/>
-          <w:lang w:val="en-US" w:eastAsia="it-IT"/>
+          <w:lang w:eastAsia="it-IT"/>
           <w14:ligatures w14:val="none"/>
         </w:rPr>
         <w:t>min</w:t>
@@ -3489,7 +3473,7 @@
           <w:kern w:val="0"/>
           <w:sz w:val="21"/>
           <w:szCs w:val="21"/>
-          <w:lang w:val="en-US" w:eastAsia="it-IT"/>
+          <w:lang w:eastAsia="it-IT"/>
           <w14:ligatures w14:val="none"/>
         </w:rPr>
         <w:t>(</w:t>
@@ -3502,7 +3486,7 @@
           <w:kern w:val="0"/>
           <w:sz w:val="21"/>
           <w:szCs w:val="21"/>
-          <w:lang w:val="en-US" w:eastAsia="it-IT"/>
+          <w:lang w:eastAsia="it-IT"/>
           <w14:ligatures w14:val="none"/>
         </w:rPr>
         <w:t>r</w:t>
@@ -3514,7 +3498,7 @@
           <w:kern w:val="0"/>
           <w:sz w:val="21"/>
           <w:szCs w:val="21"/>
-          <w:lang w:val="en-US" w:eastAsia="it-IT"/>
+          <w:lang w:eastAsia="it-IT"/>
           <w14:ligatures w14:val="none"/>
         </w:rPr>
         <w:t xml:space="preserve"> </w:t>
@@ -3526,7 +3510,7 @@
           <w:kern w:val="0"/>
           <w:sz w:val="21"/>
           <w:szCs w:val="21"/>
-          <w:lang w:val="en-US" w:eastAsia="it-IT"/>
+          <w:lang w:eastAsia="it-IT"/>
           <w14:ligatures w14:val="none"/>
         </w:rPr>
         <w:t>-</w:t>
@@ -3538,12 +3522,11 @@
           <w:kern w:val="0"/>
           <w:sz w:val="21"/>
           <w:szCs w:val="21"/>
-          <w:lang w:val="en-US" w:eastAsia="it-IT"/>
-          <w14:ligatures w14:val="none"/>
-        </w:rPr>
-        <w:t xml:space="preserve"> </w:t>
-      </w:r>
-      <w:proofErr w:type="spellStart"/>
+          <w:lang w:eastAsia="it-IT"/>
+          <w14:ligatures w14:val="none"/>
+        </w:rPr>
+        <w:t xml:space="preserve"> </w:t>
+      </w:r>
       <w:r>
         <w:rPr>
           <w:rFonts w:ascii="Consolas" w:eastAsia="Times New Roman" w:hAnsi="Consolas" w:cs="Times New Roman"/>
@@ -3551,20 +3534,19 @@
           <w:kern w:val="0"/>
           <w:sz w:val="21"/>
           <w:szCs w:val="21"/>
-          <w:lang w:val="en-US" w:eastAsia="it-IT"/>
+          <w:lang w:eastAsia="it-IT"/>
           <w14:ligatures w14:val="none"/>
         </w:rPr>
         <w:t>i</w:t>
       </w:r>
-      <w:proofErr w:type="spellEnd"/>
-      <w:r>
-        <w:rPr>
-          <w:rFonts w:ascii="Consolas" w:eastAsia="Times New Roman" w:hAnsi="Consolas" w:cs="Times New Roman"/>
-          <w:color w:val="BBBEBF"/>
-          <w:kern w:val="0"/>
-          <w:sz w:val="21"/>
-          <w:szCs w:val="21"/>
-          <w:lang w:val="en-US" w:eastAsia="it-IT"/>
+      <w:r>
+        <w:rPr>
+          <w:rFonts w:ascii="Consolas" w:eastAsia="Times New Roman" w:hAnsi="Consolas" w:cs="Times New Roman"/>
+          <w:color w:val="BBBEBF"/>
+          <w:kern w:val="0"/>
+          <w:sz w:val="21"/>
+          <w:szCs w:val="21"/>
+          <w:lang w:eastAsia="it-IT"/>
           <w14:ligatures w14:val="none"/>
         </w:rPr>
         <w:t xml:space="preserve"> </w:t>
@@ -3576,7 +3558,7 @@
           <w:kern w:val="0"/>
           <w:sz w:val="21"/>
           <w:szCs w:val="21"/>
-          <w:lang w:val="en-US" w:eastAsia="it-IT"/>
+          <w:lang w:eastAsia="it-IT"/>
           <w14:ligatures w14:val="none"/>
         </w:rPr>
         <w:t>+</w:t>
@@ -3588,7 +3570,7 @@
           <w:kern w:val="0"/>
           <w:sz w:val="21"/>
           <w:szCs w:val="21"/>
-          <w:lang w:val="en-US" w:eastAsia="it-IT"/>
+          <w:lang w:eastAsia="it-IT"/>
           <w14:ligatures w14:val="none"/>
         </w:rPr>
         <w:t xml:space="preserve"> </w:t>
@@ -3600,7 +3582,7 @@
           <w:kern w:val="0"/>
           <w:sz w:val="21"/>
           <w:szCs w:val="21"/>
-          <w:lang w:val="en-US" w:eastAsia="it-IT"/>
+          <w:lang w:eastAsia="it-IT"/>
           <w14:ligatures w14:val="none"/>
         </w:rPr>
         <w:t>1</w:t>
@@ -3612,7 +3594,7 @@
           <w:kern w:val="0"/>
           <w:sz w:val="21"/>
           <w:szCs w:val="21"/>
-          <w:lang w:val="en-US" w:eastAsia="it-IT"/>
+          <w:lang w:eastAsia="it-IT"/>
           <w14:ligatures w14:val="none"/>
         </w:rPr>
         <w:t xml:space="preserve">, </w:t>
@@ -3625,7 +3607,7 @@
           <w:kern w:val="0"/>
           <w:sz w:val="21"/>
           <w:szCs w:val="21"/>
-          <w:lang w:val="en-US" w:eastAsia="it-IT"/>
+          <w:lang w:eastAsia="it-IT"/>
           <w14:ligatures w14:val="none"/>
         </w:rPr>
         <w:t>z</w:t>
@@ -3637,12 +3619,11 @@
           <w:kern w:val="0"/>
           <w:sz w:val="21"/>
           <w:szCs w:val="21"/>
-          <w:lang w:val="en-US" w:eastAsia="it-IT"/>
+          <w:lang w:eastAsia="it-IT"/>
           <w14:ligatures w14:val="none"/>
         </w:rPr>
         <w:t>[</w:t>
       </w:r>
-      <w:proofErr w:type="spellStart"/>
       <w:proofErr w:type="gramEnd"/>
       <w:r>
         <w:rPr>
@@ -3651,20 +3632,19 @@
           <w:kern w:val="0"/>
           <w:sz w:val="21"/>
           <w:szCs w:val="21"/>
-          <w:lang w:val="en-US" w:eastAsia="it-IT"/>
+          <w:lang w:eastAsia="it-IT"/>
           <w14:ligatures w14:val="none"/>
         </w:rPr>
         <w:t>i</w:t>
       </w:r>
-      <w:proofErr w:type="spellEnd"/>
-      <w:r>
-        <w:rPr>
-          <w:rFonts w:ascii="Consolas" w:eastAsia="Times New Roman" w:hAnsi="Consolas" w:cs="Times New Roman"/>
-          <w:color w:val="BBBEBF"/>
-          <w:kern w:val="0"/>
-          <w:sz w:val="21"/>
-          <w:szCs w:val="21"/>
-          <w:lang w:val="en-US" w:eastAsia="it-IT"/>
+      <w:r>
+        <w:rPr>
+          <w:rFonts w:ascii="Consolas" w:eastAsia="Times New Roman" w:hAnsi="Consolas" w:cs="Times New Roman"/>
+          <w:color w:val="BBBEBF"/>
+          <w:kern w:val="0"/>
+          <w:sz w:val="21"/>
+          <w:szCs w:val="21"/>
+          <w:lang w:eastAsia="it-IT"/>
           <w14:ligatures w14:val="none"/>
         </w:rPr>
         <w:t xml:space="preserve"> </w:t>
@@ -3676,7 +3656,7 @@
           <w:kern w:val="0"/>
           <w:sz w:val="21"/>
           <w:szCs w:val="21"/>
-          <w:lang w:val="en-US" w:eastAsia="it-IT"/>
+          <w:lang w:eastAsia="it-IT"/>
           <w14:ligatures w14:val="none"/>
         </w:rPr>
         <w:t>-</w:t>
@@ -3688,7 +3668,7 @@
           <w:kern w:val="0"/>
           <w:sz w:val="21"/>
           <w:szCs w:val="21"/>
-          <w:lang w:val="en-US" w:eastAsia="it-IT"/>
+          <w:lang w:eastAsia="it-IT"/>
           <w14:ligatures w14:val="none"/>
         </w:rPr>
         <w:t xml:space="preserve"> </w:t>
@@ -3700,7 +3680,7 @@
           <w:kern w:val="0"/>
           <w:sz w:val="21"/>
           <w:szCs w:val="21"/>
-          <w:lang w:val="en-US" w:eastAsia="it-IT"/>
+          <w:lang w:eastAsia="it-IT"/>
           <w14:ligatures w14:val="none"/>
         </w:rPr>
         <w:t>l</w:t>
@@ -3712,7 +3692,7 @@
           <w:kern w:val="0"/>
           <w:sz w:val="21"/>
           <w:szCs w:val="21"/>
-          <w:lang w:val="en-US" w:eastAsia="it-IT"/>
+          <w:lang w:eastAsia="it-IT"/>
           <w14:ligatures w14:val="none"/>
         </w:rPr>
         <w:t>])</w:t>
@@ -3728,18 +3708,18 @@
           <w:kern w:val="0"/>
           <w:sz w:val="21"/>
           <w:szCs w:val="21"/>
-          <w:lang w:val="en-US" w:eastAsia="it-IT"/>
-          <w14:ligatures w14:val="none"/>
-        </w:rPr>
-      </w:pPr>
-      <w:r>
-        <w:rPr>
-          <w:rFonts w:ascii="Consolas" w:eastAsia="Times New Roman" w:hAnsi="Consolas" w:cs="Times New Roman"/>
-          <w:color w:val="BBBEBF"/>
-          <w:kern w:val="0"/>
-          <w:sz w:val="21"/>
-          <w:szCs w:val="21"/>
-          <w:lang w:val="en-US" w:eastAsia="it-IT"/>
+          <w:lang w:eastAsia="it-IT"/>
+          <w14:ligatures w14:val="none"/>
+        </w:rPr>
+      </w:pPr>
+      <w:r>
+        <w:rPr>
+          <w:rFonts w:ascii="Consolas" w:eastAsia="Times New Roman" w:hAnsi="Consolas" w:cs="Times New Roman"/>
+          <w:color w:val="BBBEBF"/>
+          <w:kern w:val="0"/>
+          <w:sz w:val="21"/>
+          <w:szCs w:val="21"/>
+          <w:lang w:eastAsia="it-IT"/>
           <w14:ligatures w14:val="none"/>
         </w:rPr>
         <w:t xml:space="preserve">            </w:t>
@@ -3766,7 +3746,7 @@
           <w:kern w:val="0"/>
           <w:sz w:val="21"/>
           <w:szCs w:val="21"/>
-          <w:lang w:val="en-US" w:eastAsia="it-IT"/>
+          <w:lang w:eastAsia="it-IT"/>
           <w14:ligatures w14:val="none"/>
         </w:rPr>
         <w:t xml:space="preserve">            </w:t>
@@ -6450,7 +6430,6 @@
         </w:rPr>
         <w:t xml:space="preserve">                </w:t>
       </w:r>
-      <w:proofErr w:type="gramStart"/>
       <w:r>
         <w:rPr>
           <w:rFonts w:ascii="Consolas" w:eastAsia="Times New Roman" w:hAnsi="Consolas" w:cs="Times New Roman"/>
@@ -6463,7 +6442,6 @@
         </w:rPr>
         <w:t>return</w:t>
       </w:r>
-      <w:proofErr w:type="gramEnd"/>
       <w:r>
         <w:rPr>
           <w:rFonts w:ascii="Consolas" w:eastAsia="Times New Roman" w:hAnsi="Consolas" w:cs="Times New Roman"/>
@@ -6542,7 +6520,6 @@
         </w:rPr>
         <w:t xml:space="preserve">        </w:t>
       </w:r>
-      <w:proofErr w:type="gramStart"/>
       <w:r>
         <w:rPr>
           <w:rFonts w:ascii="Consolas" w:eastAsia="Times New Roman" w:hAnsi="Consolas" w:cs="Times New Roman"/>
@@ -6555,7 +6532,6 @@
         </w:rPr>
         <w:t>return</w:t>
       </w:r>
-      <w:proofErr w:type="gramEnd"/>
       <w:r>
         <w:rPr>
           <w:rFonts w:ascii="Consolas" w:eastAsia="Times New Roman" w:hAnsi="Consolas" w:cs="Times New Roman"/>
@@ -7189,7 +7165,6 @@
         <w:t xml:space="preserve"> </w:t>
       </w:r>
       <w:proofErr w:type="spellStart"/>
-      <w:proofErr w:type="gramStart"/>
       <w:r>
         <w:rPr>
           <w:rFonts w:ascii="Consolas" w:eastAsia="Times New Roman" w:hAnsi="Consolas" w:cs="Times New Roman"/>
@@ -7203,7 +7178,6 @@
         <w:t>curr</w:t>
       </w:r>
       <w:proofErr w:type="spellEnd"/>
-      <w:proofErr w:type="gramEnd"/>
       <w:r>
         <w:rPr>
           <w:rFonts w:ascii="Consolas" w:eastAsia="Times New Roman" w:hAnsi="Consolas" w:cs="Times New Roman"/>
@@ -8133,7 +8107,6 @@
         <w:t xml:space="preserve"> </w:t>
       </w:r>
       <w:proofErr w:type="spellStart"/>
-      <w:proofErr w:type="gramStart"/>
       <w:r>
         <w:rPr>
           <w:rFonts w:ascii="Consolas" w:eastAsia="Times New Roman" w:hAnsi="Consolas" w:cs="Times New Roman"/>
@@ -8169,20 +8142,7 @@
           <w:lang w:val="en-US" w:eastAsia="it-IT"/>
           <w14:ligatures w14:val="none"/>
         </w:rPr>
-        <w:t>#</w:t>
-      </w:r>
-      <w:proofErr w:type="gramEnd"/>
-      <w:r>
-        <w:rPr>
-          <w:rFonts w:ascii="Consolas" w:eastAsia="Times New Roman" w:hAnsi="Consolas" w:cs="Times New Roman"/>
-          <w:color w:val="8B949E"/>
-          <w:kern w:val="0"/>
-          <w:sz w:val="21"/>
-          <w:szCs w:val="21"/>
-          <w:lang w:val="en-US" w:eastAsia="it-IT"/>
-          <w14:ligatures w14:val="none"/>
-        </w:rPr>
-        <w:t>trovo PREDECESSORE</w:t>
+        <w:t>#trovo PREDECESSORE</w:t>
       </w:r>
     </w:p>
     <w:p>
@@ -8533,7 +8493,7 @@
           <w:kern w:val="0"/>
           <w:sz w:val="21"/>
           <w:szCs w:val="21"/>
-          <w:lang w:eastAsia="it-IT"/>
+          <w:lang w:val="en-US" w:eastAsia="it-IT"/>
           <w14:ligatures w14:val="none"/>
         </w:rPr>
       </w:pPr>
@@ -8558,7 +8518,7 @@
           <w:kern w:val="0"/>
           <w:sz w:val="21"/>
           <w:szCs w:val="21"/>
-          <w:lang w:eastAsia="it-IT"/>
+          <w:lang w:val="en-US" w:eastAsia="it-IT"/>
           <w14:ligatures w14:val="none"/>
         </w:rPr>
         <w:t>curr</w:t>
@@ -8571,7 +8531,7 @@
           <w:kern w:val="0"/>
           <w:sz w:val="21"/>
           <w:szCs w:val="21"/>
-          <w:lang w:eastAsia="it-IT"/>
+          <w:lang w:val="en-US" w:eastAsia="it-IT"/>
           <w14:ligatures w14:val="none"/>
         </w:rPr>
         <w:t xml:space="preserve"> </w:t>
@@ -8583,7 +8543,7 @@
           <w:kern w:val="0"/>
           <w:sz w:val="21"/>
           <w:szCs w:val="21"/>
-          <w:lang w:eastAsia="it-IT"/>
+          <w:lang w:val="en-US" w:eastAsia="it-IT"/>
           <w14:ligatures w14:val="none"/>
         </w:rPr>
         <w:t>=</w:t>
@@ -8595,126 +8555,10 @@
           <w:kern w:val="0"/>
           <w:sz w:val="21"/>
           <w:szCs w:val="21"/>
-          <w:lang w:eastAsia="it-IT"/>
-          <w14:ligatures w14:val="none"/>
-        </w:rPr>
-        <w:t xml:space="preserve"> </w:t>
-      </w:r>
-      <w:proofErr w:type="spellStart"/>
-      <w:r>
-        <w:rPr>
-          <w:rFonts w:ascii="Consolas" w:eastAsia="Times New Roman" w:hAnsi="Consolas" w:cs="Times New Roman"/>
-          <w:color w:val="C9D1D9"/>
-          <w:kern w:val="0"/>
-          <w:sz w:val="21"/>
-          <w:szCs w:val="21"/>
-          <w:lang w:eastAsia="it-IT"/>
-          <w14:ligatures w14:val="none"/>
-        </w:rPr>
-        <w:t>curr</w:t>
-      </w:r>
-      <w:r>
-        <w:rPr>
-          <w:rFonts w:ascii="Consolas" w:eastAsia="Times New Roman" w:hAnsi="Consolas" w:cs="Times New Roman"/>
-          <w:color w:val="BBBEBF"/>
-          <w:kern w:val="0"/>
-          <w:sz w:val="21"/>
-          <w:szCs w:val="21"/>
-          <w:lang w:eastAsia="it-IT"/>
-          <w14:ligatures w14:val="none"/>
-        </w:rPr>
-        <w:t>.left</w:t>
-      </w:r>
-      <w:proofErr w:type="spellEnd"/>
-    </w:p>
-    <w:p>
-      <w:pPr>
-        <w:shd w:val="clear" w:color="auto" w:fill="121314"/>
-        <w:spacing w:after="0" w:line="285" w:lineRule="atLeast"/>
-        <w:rPr>
-          <w:rFonts w:ascii="Consolas" w:eastAsia="Times New Roman" w:hAnsi="Consolas" w:cs="Times New Roman"/>
-          <w:color w:val="BBBEBF"/>
-          <w:kern w:val="0"/>
-          <w:sz w:val="21"/>
-          <w:szCs w:val="21"/>
-          <w:lang w:eastAsia="it-IT"/>
-          <w14:ligatures w14:val="none"/>
-        </w:rPr>
-      </w:pPr>
-      <w:r>
-        <w:rPr>
-          <w:rFonts w:ascii="Consolas" w:eastAsia="Times New Roman" w:hAnsi="Consolas" w:cs="Times New Roman"/>
-          <w:color w:val="BBBEBF"/>
-          <w:kern w:val="0"/>
-          <w:sz w:val="21"/>
-          <w:szCs w:val="21"/>
-          <w:lang w:eastAsia="it-IT"/>
-          <w14:ligatures w14:val="none"/>
-        </w:rPr>
-        <w:t xml:space="preserve">                </w:t>
-      </w:r>
-      <w:r>
-        <w:rPr>
-          <w:rFonts w:ascii="Consolas" w:eastAsia="Times New Roman" w:hAnsi="Consolas" w:cs="Times New Roman"/>
-          <w:color w:val="C586C0"/>
-          <w:kern w:val="0"/>
-          <w:sz w:val="21"/>
-          <w:szCs w:val="21"/>
-          <w:lang w:eastAsia="it-IT"/>
-          <w14:ligatures w14:val="none"/>
-        </w:rPr>
-        <w:t>else</w:t>
-      </w:r>
-      <w:r>
-        <w:rPr>
-          <w:rFonts w:ascii="Consolas" w:eastAsia="Times New Roman" w:hAnsi="Consolas" w:cs="Times New Roman"/>
-          <w:color w:val="BBBEBF"/>
-          <w:kern w:val="0"/>
-          <w:sz w:val="21"/>
-          <w:szCs w:val="21"/>
-          <w:lang w:eastAsia="it-IT"/>
-          <w14:ligatures w14:val="none"/>
-        </w:rPr>
-        <w:t xml:space="preserve">: </w:t>
-      </w:r>
-      <w:r>
-        <w:rPr>
-          <w:rFonts w:ascii="Consolas" w:eastAsia="Times New Roman" w:hAnsi="Consolas" w:cs="Times New Roman"/>
-          <w:color w:val="8B949E"/>
-          <w:kern w:val="0"/>
-          <w:sz w:val="21"/>
-          <w:szCs w:val="21"/>
-          <w:lang w:eastAsia="it-IT"/>
-          <w14:ligatures w14:val="none"/>
-        </w:rPr>
-        <w:t>#qui entro quando sto risalendo --&gt; valuto in risalita ogni nodo CURR</w:t>
-      </w:r>
-    </w:p>
-    <w:p>
-      <w:pPr>
-        <w:shd w:val="clear" w:color="auto" w:fill="121314"/>
-        <w:spacing w:after="0" w:line="285" w:lineRule="atLeast"/>
-        <w:rPr>
-          <w:rFonts w:ascii="Consolas" w:eastAsia="Times New Roman" w:hAnsi="Consolas" w:cs="Times New Roman"/>
-          <w:color w:val="BBBEBF"/>
-          <w:kern w:val="0"/>
-          <w:sz w:val="21"/>
-          <w:szCs w:val="21"/>
-          <w:lang w:val="en-US" w:eastAsia="it-IT"/>
-          <w14:ligatures w14:val="none"/>
-        </w:rPr>
-      </w:pPr>
-      <w:r>
-        <w:rPr>
-          <w:rFonts w:ascii="Consolas" w:eastAsia="Times New Roman" w:hAnsi="Consolas" w:cs="Times New Roman"/>
-          <w:color w:val="BBBEBF"/>
-          <w:kern w:val="0"/>
-          <w:sz w:val="21"/>
-          <w:szCs w:val="21"/>
-          <w:lang w:eastAsia="it-IT"/>
-          <w14:ligatures w14:val="none"/>
-        </w:rPr>
-        <w:t xml:space="preserve">                    </w:t>
+          <w:lang w:val="en-US" w:eastAsia="it-IT"/>
+          <w14:ligatures w14:val="none"/>
+        </w:rPr>
+        <w:t xml:space="preserve"> </w:t>
       </w:r>
       <w:proofErr w:type="spellStart"/>
       <w:proofErr w:type="gramStart"/>
@@ -8728,342 +8572,6 @@
           <w:lang w:val="en-US" w:eastAsia="it-IT"/>
           <w14:ligatures w14:val="none"/>
         </w:rPr>
-        <w:t>pred</w:t>
-      </w:r>
-      <w:r>
-        <w:rPr>
-          <w:rFonts w:ascii="Consolas" w:eastAsia="Times New Roman" w:hAnsi="Consolas" w:cs="Times New Roman"/>
-          <w:color w:val="BBBEBF"/>
-          <w:kern w:val="0"/>
-          <w:sz w:val="21"/>
-          <w:szCs w:val="21"/>
-          <w:lang w:val="en-US" w:eastAsia="it-IT"/>
-          <w14:ligatures w14:val="none"/>
-        </w:rPr>
-        <w:t>.right</w:t>
-      </w:r>
-      <w:proofErr w:type="spellEnd"/>
-      <w:proofErr w:type="gramEnd"/>
-      <w:r>
-        <w:rPr>
-          <w:rFonts w:ascii="Consolas" w:eastAsia="Times New Roman" w:hAnsi="Consolas" w:cs="Times New Roman"/>
-          <w:color w:val="BBBEBF"/>
-          <w:kern w:val="0"/>
-          <w:sz w:val="21"/>
-          <w:szCs w:val="21"/>
-          <w:lang w:val="en-US" w:eastAsia="it-IT"/>
-          <w14:ligatures w14:val="none"/>
-        </w:rPr>
-        <w:t xml:space="preserve"> </w:t>
-      </w:r>
-      <w:r>
-        <w:rPr>
-          <w:rFonts w:ascii="Consolas" w:eastAsia="Times New Roman" w:hAnsi="Consolas" w:cs="Times New Roman"/>
-          <w:color w:val="D4D4D4"/>
-          <w:kern w:val="0"/>
-          <w:sz w:val="21"/>
-          <w:szCs w:val="21"/>
-          <w:lang w:val="en-US" w:eastAsia="it-IT"/>
-          <w14:ligatures w14:val="none"/>
-        </w:rPr>
-        <w:t>=</w:t>
-      </w:r>
-      <w:r>
-        <w:rPr>
-          <w:rFonts w:ascii="Consolas" w:eastAsia="Times New Roman" w:hAnsi="Consolas" w:cs="Times New Roman"/>
-          <w:color w:val="BBBEBF"/>
-          <w:kern w:val="0"/>
-          <w:sz w:val="21"/>
-          <w:szCs w:val="21"/>
-          <w:lang w:val="en-US" w:eastAsia="it-IT"/>
-          <w14:ligatures w14:val="none"/>
-        </w:rPr>
-        <w:t xml:space="preserve"> </w:t>
-      </w:r>
-      <w:r>
-        <w:rPr>
-          <w:rFonts w:ascii="Consolas" w:eastAsia="Times New Roman" w:hAnsi="Consolas" w:cs="Times New Roman"/>
-          <w:color w:val="569CD6"/>
-          <w:kern w:val="0"/>
-          <w:sz w:val="21"/>
-          <w:szCs w:val="21"/>
-          <w:lang w:val="en-US" w:eastAsia="it-IT"/>
-          <w14:ligatures w14:val="none"/>
-        </w:rPr>
-        <w:t>None</w:t>
-      </w:r>
-    </w:p>
-    <w:p>
-      <w:pPr>
-        <w:shd w:val="clear" w:color="auto" w:fill="121314"/>
-        <w:spacing w:after="0" w:line="285" w:lineRule="atLeast"/>
-        <w:rPr>
-          <w:rFonts w:ascii="Consolas" w:eastAsia="Times New Roman" w:hAnsi="Consolas" w:cs="Times New Roman"/>
-          <w:color w:val="BBBEBF"/>
-          <w:kern w:val="0"/>
-          <w:sz w:val="21"/>
-          <w:szCs w:val="21"/>
-          <w:lang w:val="en-US" w:eastAsia="it-IT"/>
-          <w14:ligatures w14:val="none"/>
-        </w:rPr>
-      </w:pPr>
-      <w:r>
-        <w:rPr>
-          <w:rFonts w:ascii="Consolas" w:eastAsia="Times New Roman" w:hAnsi="Consolas" w:cs="Times New Roman"/>
-          <w:color w:val="BBBEBF"/>
-          <w:kern w:val="0"/>
-          <w:sz w:val="21"/>
-          <w:szCs w:val="21"/>
-          <w:lang w:val="en-US" w:eastAsia="it-IT"/>
-          <w14:ligatures w14:val="none"/>
-        </w:rPr>
-        <w:t xml:space="preserve">                    </w:t>
-      </w:r>
-      <w:r>
-        <w:rPr>
-          <w:rFonts w:ascii="Consolas" w:eastAsia="Times New Roman" w:hAnsi="Consolas" w:cs="Times New Roman"/>
-          <w:color w:val="FFA657"/>
-          <w:kern w:val="0"/>
-          <w:sz w:val="21"/>
-          <w:szCs w:val="21"/>
-          <w:lang w:val="en-US" w:eastAsia="it-IT"/>
-          <w14:ligatures w14:val="none"/>
-        </w:rPr>
-        <w:t>k</w:t>
-      </w:r>
-      <w:r>
-        <w:rPr>
-          <w:rFonts w:ascii="Consolas" w:eastAsia="Times New Roman" w:hAnsi="Consolas" w:cs="Times New Roman"/>
-          <w:color w:val="BBBEBF"/>
-          <w:kern w:val="0"/>
-          <w:sz w:val="21"/>
-          <w:szCs w:val="21"/>
-          <w:lang w:val="en-US" w:eastAsia="it-IT"/>
-          <w14:ligatures w14:val="none"/>
-        </w:rPr>
-        <w:t xml:space="preserve"> </w:t>
-      </w:r>
-      <w:r>
-        <w:rPr>
-          <w:rFonts w:ascii="Consolas" w:eastAsia="Times New Roman" w:hAnsi="Consolas" w:cs="Times New Roman"/>
-          <w:color w:val="D4D4D4"/>
-          <w:kern w:val="0"/>
-          <w:sz w:val="21"/>
-          <w:szCs w:val="21"/>
-          <w:lang w:val="en-US" w:eastAsia="it-IT"/>
-          <w14:ligatures w14:val="none"/>
-        </w:rPr>
-        <w:t>-=</w:t>
-      </w:r>
-      <w:r>
-        <w:rPr>
-          <w:rFonts w:ascii="Consolas" w:eastAsia="Times New Roman" w:hAnsi="Consolas" w:cs="Times New Roman"/>
-          <w:color w:val="BBBEBF"/>
-          <w:kern w:val="0"/>
-          <w:sz w:val="21"/>
-          <w:szCs w:val="21"/>
-          <w:lang w:val="en-US" w:eastAsia="it-IT"/>
-          <w14:ligatures w14:val="none"/>
-        </w:rPr>
-        <w:t xml:space="preserve"> </w:t>
-      </w:r>
-      <w:r>
-        <w:rPr>
-          <w:rFonts w:ascii="Consolas" w:eastAsia="Times New Roman" w:hAnsi="Consolas" w:cs="Times New Roman"/>
-          <w:color w:val="B5CEA8"/>
-          <w:kern w:val="0"/>
-          <w:sz w:val="21"/>
-          <w:szCs w:val="21"/>
-          <w:lang w:val="en-US" w:eastAsia="it-IT"/>
-          <w14:ligatures w14:val="none"/>
-        </w:rPr>
-        <w:t>1</w:t>
-      </w:r>
-    </w:p>
-    <w:p>
-      <w:pPr>
-        <w:shd w:val="clear" w:color="auto" w:fill="121314"/>
-        <w:spacing w:after="0" w:line="285" w:lineRule="atLeast"/>
-        <w:rPr>
-          <w:rFonts w:ascii="Consolas" w:eastAsia="Times New Roman" w:hAnsi="Consolas" w:cs="Times New Roman"/>
-          <w:color w:val="BBBEBF"/>
-          <w:kern w:val="0"/>
-          <w:sz w:val="21"/>
-          <w:szCs w:val="21"/>
-          <w:lang w:val="en-US" w:eastAsia="it-IT"/>
-          <w14:ligatures w14:val="none"/>
-        </w:rPr>
-      </w:pPr>
-      <w:r>
-        <w:rPr>
-          <w:rFonts w:ascii="Consolas" w:eastAsia="Times New Roman" w:hAnsi="Consolas" w:cs="Times New Roman"/>
-          <w:color w:val="BBBEBF"/>
-          <w:kern w:val="0"/>
-          <w:sz w:val="21"/>
-          <w:szCs w:val="21"/>
-          <w:lang w:val="en-US" w:eastAsia="it-IT"/>
-          <w14:ligatures w14:val="none"/>
-        </w:rPr>
-        <w:t xml:space="preserve">                    </w:t>
-      </w:r>
-      <w:r>
-        <w:rPr>
-          <w:rFonts w:ascii="Consolas" w:eastAsia="Times New Roman" w:hAnsi="Consolas" w:cs="Times New Roman"/>
-          <w:color w:val="C586C0"/>
-          <w:kern w:val="0"/>
-          <w:sz w:val="21"/>
-          <w:szCs w:val="21"/>
-          <w:lang w:val="en-US" w:eastAsia="it-IT"/>
-          <w14:ligatures w14:val="none"/>
-        </w:rPr>
-        <w:t>if</w:t>
-      </w:r>
-      <w:r>
-        <w:rPr>
-          <w:rFonts w:ascii="Consolas" w:eastAsia="Times New Roman" w:hAnsi="Consolas" w:cs="Times New Roman"/>
-          <w:color w:val="BBBEBF"/>
-          <w:kern w:val="0"/>
-          <w:sz w:val="21"/>
-          <w:szCs w:val="21"/>
-          <w:lang w:val="en-US" w:eastAsia="it-IT"/>
-          <w14:ligatures w14:val="none"/>
-        </w:rPr>
-        <w:t xml:space="preserve"> </w:t>
-      </w:r>
-      <w:r>
-        <w:rPr>
-          <w:rFonts w:ascii="Consolas" w:eastAsia="Times New Roman" w:hAnsi="Consolas" w:cs="Times New Roman"/>
-          <w:color w:val="FFA657"/>
-          <w:kern w:val="0"/>
-          <w:sz w:val="21"/>
-          <w:szCs w:val="21"/>
-          <w:lang w:val="en-US" w:eastAsia="it-IT"/>
-          <w14:ligatures w14:val="none"/>
-        </w:rPr>
-        <w:t>k</w:t>
-      </w:r>
-      <w:r>
-        <w:rPr>
-          <w:rFonts w:ascii="Consolas" w:eastAsia="Times New Roman" w:hAnsi="Consolas" w:cs="Times New Roman"/>
-          <w:color w:val="BBBEBF"/>
-          <w:kern w:val="0"/>
-          <w:sz w:val="21"/>
-          <w:szCs w:val="21"/>
-          <w:lang w:val="en-US" w:eastAsia="it-IT"/>
-          <w14:ligatures w14:val="none"/>
-        </w:rPr>
-        <w:t xml:space="preserve"> </w:t>
-      </w:r>
-      <w:r>
-        <w:rPr>
-          <w:rFonts w:ascii="Consolas" w:eastAsia="Times New Roman" w:hAnsi="Consolas" w:cs="Times New Roman"/>
-          <w:color w:val="D4D4D4"/>
-          <w:kern w:val="0"/>
-          <w:sz w:val="21"/>
-          <w:szCs w:val="21"/>
-          <w:lang w:val="en-US" w:eastAsia="it-IT"/>
-          <w14:ligatures w14:val="none"/>
-        </w:rPr>
-        <w:t>==</w:t>
-      </w:r>
-      <w:r>
-        <w:rPr>
-          <w:rFonts w:ascii="Consolas" w:eastAsia="Times New Roman" w:hAnsi="Consolas" w:cs="Times New Roman"/>
-          <w:color w:val="BBBEBF"/>
-          <w:kern w:val="0"/>
-          <w:sz w:val="21"/>
-          <w:szCs w:val="21"/>
-          <w:lang w:val="en-US" w:eastAsia="it-IT"/>
-          <w14:ligatures w14:val="none"/>
-        </w:rPr>
-        <w:t xml:space="preserve"> </w:t>
-      </w:r>
-      <w:r>
-        <w:rPr>
-          <w:rFonts w:ascii="Consolas" w:eastAsia="Times New Roman" w:hAnsi="Consolas" w:cs="Times New Roman"/>
-          <w:color w:val="B5CEA8"/>
-          <w:kern w:val="0"/>
-          <w:sz w:val="21"/>
-          <w:szCs w:val="21"/>
-          <w:lang w:val="en-US" w:eastAsia="it-IT"/>
-          <w14:ligatures w14:val="none"/>
-        </w:rPr>
-        <w:t>0</w:t>
-      </w:r>
-      <w:r>
-        <w:rPr>
-          <w:rFonts w:ascii="Consolas" w:eastAsia="Times New Roman" w:hAnsi="Consolas" w:cs="Times New Roman"/>
-          <w:color w:val="BBBEBF"/>
-          <w:kern w:val="0"/>
-          <w:sz w:val="21"/>
-          <w:szCs w:val="21"/>
-          <w:lang w:val="en-US" w:eastAsia="it-IT"/>
-          <w14:ligatures w14:val="none"/>
-        </w:rPr>
-        <w:t>:</w:t>
-      </w:r>
-    </w:p>
-    <w:p>
-      <w:pPr>
-        <w:shd w:val="clear" w:color="auto" w:fill="121314"/>
-        <w:spacing w:after="0" w:line="285" w:lineRule="atLeast"/>
-        <w:rPr>
-          <w:rFonts w:ascii="Consolas" w:eastAsia="Times New Roman" w:hAnsi="Consolas" w:cs="Times New Roman"/>
-          <w:color w:val="BBBEBF"/>
-          <w:kern w:val="0"/>
-          <w:sz w:val="21"/>
-          <w:szCs w:val="21"/>
-          <w:lang w:val="en-US" w:eastAsia="it-IT"/>
-          <w14:ligatures w14:val="none"/>
-        </w:rPr>
-      </w:pPr>
-      <w:r>
-        <w:rPr>
-          <w:rFonts w:ascii="Consolas" w:eastAsia="Times New Roman" w:hAnsi="Consolas" w:cs="Times New Roman"/>
-          <w:color w:val="BBBEBF"/>
-          <w:kern w:val="0"/>
-          <w:sz w:val="21"/>
-          <w:szCs w:val="21"/>
-          <w:lang w:val="en-US" w:eastAsia="it-IT"/>
-          <w14:ligatures w14:val="none"/>
-        </w:rPr>
-        <w:t xml:space="preserve">                        </w:t>
-      </w:r>
-      <w:r>
-        <w:rPr>
-          <w:rFonts w:ascii="Consolas" w:eastAsia="Times New Roman" w:hAnsi="Consolas" w:cs="Times New Roman"/>
-          <w:color w:val="C586C0"/>
-          <w:kern w:val="0"/>
-          <w:sz w:val="21"/>
-          <w:szCs w:val="21"/>
-          <w:lang w:val="en-US" w:eastAsia="it-IT"/>
-          <w14:ligatures w14:val="none"/>
-        </w:rPr>
-        <w:t>return</w:t>
-      </w:r>
-      <w:r>
-        <w:rPr>
-          <w:rFonts w:ascii="Consolas" w:eastAsia="Times New Roman" w:hAnsi="Consolas" w:cs="Times New Roman"/>
-          <w:color w:val="BBBEBF"/>
-          <w:kern w:val="0"/>
-          <w:sz w:val="21"/>
-          <w:szCs w:val="21"/>
-          <w:lang w:val="en-US" w:eastAsia="it-IT"/>
-          <w14:ligatures w14:val="none"/>
-        </w:rPr>
-        <w:t xml:space="preserve"> </w:t>
-      </w:r>
-      <w:proofErr w:type="spellStart"/>
-      <w:r>
-        <w:rPr>
-          <w:rFonts w:ascii="Consolas" w:eastAsia="Times New Roman" w:hAnsi="Consolas" w:cs="Times New Roman"/>
-          <w:color w:val="C9D1D9"/>
-          <w:kern w:val="0"/>
-          <w:sz w:val="21"/>
-          <w:szCs w:val="21"/>
-          <w:lang w:val="en-US" w:eastAsia="it-IT"/>
-          <w14:ligatures w14:val="none"/>
-        </w:rPr>
         <w:t>curr</w:t>
       </w:r>
       <w:r>
@@ -9076,111 +8584,7 @@
           <w:lang w:val="en-US" w:eastAsia="it-IT"/>
           <w14:ligatures w14:val="none"/>
         </w:rPr>
-        <w:t>.val</w:t>
-      </w:r>
-      <w:proofErr w:type="spellEnd"/>
-    </w:p>
-    <w:p>
-      <w:pPr>
-        <w:shd w:val="clear" w:color="auto" w:fill="121314"/>
-        <w:spacing w:after="0" w:line="285" w:lineRule="atLeast"/>
-        <w:rPr>
-          <w:rFonts w:ascii="Consolas" w:eastAsia="Times New Roman" w:hAnsi="Consolas" w:cs="Times New Roman"/>
-          <w:color w:val="BBBEBF"/>
-          <w:kern w:val="0"/>
-          <w:sz w:val="21"/>
-          <w:szCs w:val="21"/>
-          <w:lang w:val="en-US" w:eastAsia="it-IT"/>
-          <w14:ligatures w14:val="none"/>
-        </w:rPr>
-      </w:pPr>
-      <w:r>
-        <w:rPr>
-          <w:rFonts w:ascii="Consolas" w:eastAsia="Times New Roman" w:hAnsi="Consolas" w:cs="Times New Roman"/>
-          <w:color w:val="BBBEBF"/>
-          <w:kern w:val="0"/>
-          <w:sz w:val="21"/>
-          <w:szCs w:val="21"/>
-          <w:lang w:val="en-US" w:eastAsia="it-IT"/>
-          <w14:ligatures w14:val="none"/>
-        </w:rPr>
-        <w:t xml:space="preserve">                    </w:t>
-      </w:r>
-      <w:proofErr w:type="spellStart"/>
-      <w:r>
-        <w:rPr>
-          <w:rFonts w:ascii="Consolas" w:eastAsia="Times New Roman" w:hAnsi="Consolas" w:cs="Times New Roman"/>
-          <w:color w:val="C9D1D9"/>
-          <w:kern w:val="0"/>
-          <w:sz w:val="21"/>
-          <w:szCs w:val="21"/>
-          <w:lang w:val="en-US" w:eastAsia="it-IT"/>
-          <w14:ligatures w14:val="none"/>
-        </w:rPr>
-        <w:t>curr</w:t>
-      </w:r>
-      <w:proofErr w:type="spellEnd"/>
-      <w:r>
-        <w:rPr>
-          <w:rFonts w:ascii="Consolas" w:eastAsia="Times New Roman" w:hAnsi="Consolas" w:cs="Times New Roman"/>
-          <w:color w:val="BBBEBF"/>
-          <w:kern w:val="0"/>
-          <w:sz w:val="21"/>
-          <w:szCs w:val="21"/>
-          <w:lang w:val="en-US" w:eastAsia="it-IT"/>
-          <w14:ligatures w14:val="none"/>
-        </w:rPr>
-        <w:t xml:space="preserve"> </w:t>
-      </w:r>
-      <w:r>
-        <w:rPr>
-          <w:rFonts w:ascii="Consolas" w:eastAsia="Times New Roman" w:hAnsi="Consolas" w:cs="Times New Roman"/>
-          <w:color w:val="D4D4D4"/>
-          <w:kern w:val="0"/>
-          <w:sz w:val="21"/>
-          <w:szCs w:val="21"/>
-          <w:lang w:val="en-US" w:eastAsia="it-IT"/>
-          <w14:ligatures w14:val="none"/>
-        </w:rPr>
-        <w:t>=</w:t>
-      </w:r>
-      <w:r>
-        <w:rPr>
-          <w:rFonts w:ascii="Consolas" w:eastAsia="Times New Roman" w:hAnsi="Consolas" w:cs="Times New Roman"/>
-          <w:color w:val="BBBEBF"/>
-          <w:kern w:val="0"/>
-          <w:sz w:val="21"/>
-          <w:szCs w:val="21"/>
-          <w:lang w:val="en-US" w:eastAsia="it-IT"/>
-          <w14:ligatures w14:val="none"/>
-        </w:rPr>
-        <w:t xml:space="preserve"> </w:t>
-      </w:r>
-      <w:proofErr w:type="spellStart"/>
-      <w:proofErr w:type="gramStart"/>
-      <w:r>
-        <w:rPr>
-          <w:rFonts w:ascii="Consolas" w:eastAsia="Times New Roman" w:hAnsi="Consolas" w:cs="Times New Roman"/>
-          <w:color w:val="C9D1D9"/>
-          <w:kern w:val="0"/>
-          <w:sz w:val="21"/>
-          <w:szCs w:val="21"/>
-          <w:lang w:val="en-US" w:eastAsia="it-IT"/>
-          <w14:ligatures w14:val="none"/>
-        </w:rPr>
-        <w:t>curr</w:t>
-      </w:r>
-      <w:r>
-        <w:rPr>
-          <w:rFonts w:ascii="Consolas" w:eastAsia="Times New Roman" w:hAnsi="Consolas" w:cs="Times New Roman"/>
-          <w:color w:val="BBBEBF"/>
-          <w:kern w:val="0"/>
-          <w:sz w:val="21"/>
-          <w:szCs w:val="21"/>
-          <w:lang w:val="en-US" w:eastAsia="it-IT"/>
-          <w14:ligatures w14:val="none"/>
-        </w:rPr>
-        <w:t>.right</w:t>
+        <w:t>.left</w:t>
       </w:r>
       <w:proofErr w:type="spellEnd"/>
       <w:proofErr w:type="gramEnd"/>
@@ -9195,6 +8599,564 @@
           <w:kern w:val="0"/>
           <w:sz w:val="21"/>
           <w:szCs w:val="21"/>
+          <w:lang w:eastAsia="it-IT"/>
+          <w14:ligatures w14:val="none"/>
+        </w:rPr>
+      </w:pPr>
+      <w:r>
+        <w:rPr>
+          <w:rFonts w:ascii="Consolas" w:eastAsia="Times New Roman" w:hAnsi="Consolas" w:cs="Times New Roman"/>
+          <w:color w:val="BBBEBF"/>
+          <w:kern w:val="0"/>
+          <w:sz w:val="21"/>
+          <w:szCs w:val="21"/>
+          <w:lang w:val="en-US" w:eastAsia="it-IT"/>
+          <w14:ligatures w14:val="none"/>
+        </w:rPr>
+        <w:t xml:space="preserve">                </w:t>
+      </w:r>
+      <w:r>
+        <w:rPr>
+          <w:rFonts w:ascii="Consolas" w:eastAsia="Times New Roman" w:hAnsi="Consolas" w:cs="Times New Roman"/>
+          <w:color w:val="C586C0"/>
+          <w:kern w:val="0"/>
+          <w:sz w:val="21"/>
+          <w:szCs w:val="21"/>
+          <w:lang w:eastAsia="it-IT"/>
+          <w14:ligatures w14:val="none"/>
+        </w:rPr>
+        <w:t>else</w:t>
+      </w:r>
+      <w:r>
+        <w:rPr>
+          <w:rFonts w:ascii="Consolas" w:eastAsia="Times New Roman" w:hAnsi="Consolas" w:cs="Times New Roman"/>
+          <w:color w:val="BBBEBF"/>
+          <w:kern w:val="0"/>
+          <w:sz w:val="21"/>
+          <w:szCs w:val="21"/>
+          <w:lang w:eastAsia="it-IT"/>
+          <w14:ligatures w14:val="none"/>
+        </w:rPr>
+        <w:t xml:space="preserve">: </w:t>
+      </w:r>
+      <w:r>
+        <w:rPr>
+          <w:rFonts w:ascii="Consolas" w:eastAsia="Times New Roman" w:hAnsi="Consolas" w:cs="Times New Roman"/>
+          <w:color w:val="8B949E"/>
+          <w:kern w:val="0"/>
+          <w:sz w:val="21"/>
+          <w:szCs w:val="21"/>
+          <w:lang w:eastAsia="it-IT"/>
+          <w14:ligatures w14:val="none"/>
+        </w:rPr>
+        <w:t>#qui entro quando sto risalendo --&gt; valuto in risalita ogni nodo CURR</w:t>
+      </w:r>
+    </w:p>
+    <w:p>
+      <w:pPr>
+        <w:shd w:val="clear" w:color="auto" w:fill="121314"/>
+        <w:spacing w:after="0" w:line="285" w:lineRule="atLeast"/>
+        <w:rPr>
+          <w:rFonts w:ascii="Consolas" w:eastAsia="Times New Roman" w:hAnsi="Consolas" w:cs="Times New Roman"/>
+          <w:color w:val="BBBEBF"/>
+          <w:kern w:val="0"/>
+          <w:sz w:val="21"/>
+          <w:szCs w:val="21"/>
+          <w:lang w:val="en-US" w:eastAsia="it-IT"/>
+          <w14:ligatures w14:val="none"/>
+        </w:rPr>
+      </w:pPr>
+      <w:r>
+        <w:rPr>
+          <w:rFonts w:ascii="Consolas" w:eastAsia="Times New Roman" w:hAnsi="Consolas" w:cs="Times New Roman"/>
+          <w:color w:val="BBBEBF"/>
+          <w:kern w:val="0"/>
+          <w:sz w:val="21"/>
+          <w:szCs w:val="21"/>
+          <w:lang w:eastAsia="it-IT"/>
+          <w14:ligatures w14:val="none"/>
+        </w:rPr>
+        <w:t xml:space="preserve">                    </w:t>
+      </w:r>
+      <w:proofErr w:type="spellStart"/>
+      <w:proofErr w:type="gramStart"/>
+      <w:r>
+        <w:rPr>
+          <w:rFonts w:ascii="Consolas" w:eastAsia="Times New Roman" w:hAnsi="Consolas" w:cs="Times New Roman"/>
+          <w:color w:val="C9D1D9"/>
+          <w:kern w:val="0"/>
+          <w:sz w:val="21"/>
+          <w:szCs w:val="21"/>
+          <w:lang w:val="en-US" w:eastAsia="it-IT"/>
+          <w14:ligatures w14:val="none"/>
+        </w:rPr>
+        <w:t>pred</w:t>
+      </w:r>
+      <w:r>
+        <w:rPr>
+          <w:rFonts w:ascii="Consolas" w:eastAsia="Times New Roman" w:hAnsi="Consolas" w:cs="Times New Roman"/>
+          <w:color w:val="BBBEBF"/>
+          <w:kern w:val="0"/>
+          <w:sz w:val="21"/>
+          <w:szCs w:val="21"/>
+          <w:lang w:val="en-US" w:eastAsia="it-IT"/>
+          <w14:ligatures w14:val="none"/>
+        </w:rPr>
+        <w:t>.right</w:t>
+      </w:r>
+      <w:proofErr w:type="spellEnd"/>
+      <w:proofErr w:type="gramEnd"/>
+      <w:r>
+        <w:rPr>
+          <w:rFonts w:ascii="Consolas" w:eastAsia="Times New Roman" w:hAnsi="Consolas" w:cs="Times New Roman"/>
+          <w:color w:val="BBBEBF"/>
+          <w:kern w:val="0"/>
+          <w:sz w:val="21"/>
+          <w:szCs w:val="21"/>
+          <w:lang w:val="en-US" w:eastAsia="it-IT"/>
+          <w14:ligatures w14:val="none"/>
+        </w:rPr>
+        <w:t xml:space="preserve"> </w:t>
+      </w:r>
+      <w:r>
+        <w:rPr>
+          <w:rFonts w:ascii="Consolas" w:eastAsia="Times New Roman" w:hAnsi="Consolas" w:cs="Times New Roman"/>
+          <w:color w:val="D4D4D4"/>
+          <w:kern w:val="0"/>
+          <w:sz w:val="21"/>
+          <w:szCs w:val="21"/>
+          <w:lang w:val="en-US" w:eastAsia="it-IT"/>
+          <w14:ligatures w14:val="none"/>
+        </w:rPr>
+        <w:t>=</w:t>
+      </w:r>
+      <w:r>
+        <w:rPr>
+          <w:rFonts w:ascii="Consolas" w:eastAsia="Times New Roman" w:hAnsi="Consolas" w:cs="Times New Roman"/>
+          <w:color w:val="BBBEBF"/>
+          <w:kern w:val="0"/>
+          <w:sz w:val="21"/>
+          <w:szCs w:val="21"/>
+          <w:lang w:val="en-US" w:eastAsia="it-IT"/>
+          <w14:ligatures w14:val="none"/>
+        </w:rPr>
+        <w:t xml:space="preserve"> </w:t>
+      </w:r>
+      <w:r>
+        <w:rPr>
+          <w:rFonts w:ascii="Consolas" w:eastAsia="Times New Roman" w:hAnsi="Consolas" w:cs="Times New Roman"/>
+          <w:color w:val="569CD6"/>
+          <w:kern w:val="0"/>
+          <w:sz w:val="21"/>
+          <w:szCs w:val="21"/>
+          <w:lang w:val="en-US" w:eastAsia="it-IT"/>
+          <w14:ligatures w14:val="none"/>
+        </w:rPr>
+        <w:t>None</w:t>
+      </w:r>
+    </w:p>
+    <w:p>
+      <w:pPr>
+        <w:shd w:val="clear" w:color="auto" w:fill="121314"/>
+        <w:spacing w:after="0" w:line="285" w:lineRule="atLeast"/>
+        <w:rPr>
+          <w:rFonts w:ascii="Consolas" w:eastAsia="Times New Roman" w:hAnsi="Consolas" w:cs="Times New Roman"/>
+          <w:color w:val="BBBEBF"/>
+          <w:kern w:val="0"/>
+          <w:sz w:val="21"/>
+          <w:szCs w:val="21"/>
+          <w:lang w:val="en-US" w:eastAsia="it-IT"/>
+          <w14:ligatures w14:val="none"/>
+        </w:rPr>
+      </w:pPr>
+      <w:r>
+        <w:rPr>
+          <w:rFonts w:ascii="Consolas" w:eastAsia="Times New Roman" w:hAnsi="Consolas" w:cs="Times New Roman"/>
+          <w:color w:val="BBBEBF"/>
+          <w:kern w:val="0"/>
+          <w:sz w:val="21"/>
+          <w:szCs w:val="21"/>
+          <w:lang w:val="en-US" w:eastAsia="it-IT"/>
+          <w14:ligatures w14:val="none"/>
+        </w:rPr>
+        <w:t xml:space="preserve">                    </w:t>
+      </w:r>
+      <w:r>
+        <w:rPr>
+          <w:rFonts w:ascii="Consolas" w:eastAsia="Times New Roman" w:hAnsi="Consolas" w:cs="Times New Roman"/>
+          <w:color w:val="FFA657"/>
+          <w:kern w:val="0"/>
+          <w:sz w:val="21"/>
+          <w:szCs w:val="21"/>
+          <w:lang w:val="en-US" w:eastAsia="it-IT"/>
+          <w14:ligatures w14:val="none"/>
+        </w:rPr>
+        <w:t>k</w:t>
+      </w:r>
+      <w:r>
+        <w:rPr>
+          <w:rFonts w:ascii="Consolas" w:eastAsia="Times New Roman" w:hAnsi="Consolas" w:cs="Times New Roman"/>
+          <w:color w:val="BBBEBF"/>
+          <w:kern w:val="0"/>
+          <w:sz w:val="21"/>
+          <w:szCs w:val="21"/>
+          <w:lang w:val="en-US" w:eastAsia="it-IT"/>
+          <w14:ligatures w14:val="none"/>
+        </w:rPr>
+        <w:t xml:space="preserve"> </w:t>
+      </w:r>
+      <w:r>
+        <w:rPr>
+          <w:rFonts w:ascii="Consolas" w:eastAsia="Times New Roman" w:hAnsi="Consolas" w:cs="Times New Roman"/>
+          <w:color w:val="D4D4D4"/>
+          <w:kern w:val="0"/>
+          <w:sz w:val="21"/>
+          <w:szCs w:val="21"/>
+          <w:lang w:val="en-US" w:eastAsia="it-IT"/>
+          <w14:ligatures w14:val="none"/>
+        </w:rPr>
+        <w:t>-=</w:t>
+      </w:r>
+      <w:r>
+        <w:rPr>
+          <w:rFonts w:ascii="Consolas" w:eastAsia="Times New Roman" w:hAnsi="Consolas" w:cs="Times New Roman"/>
+          <w:color w:val="BBBEBF"/>
+          <w:kern w:val="0"/>
+          <w:sz w:val="21"/>
+          <w:szCs w:val="21"/>
+          <w:lang w:val="en-US" w:eastAsia="it-IT"/>
+          <w14:ligatures w14:val="none"/>
+        </w:rPr>
+        <w:t xml:space="preserve"> </w:t>
+      </w:r>
+      <w:r>
+        <w:rPr>
+          <w:rFonts w:ascii="Consolas" w:eastAsia="Times New Roman" w:hAnsi="Consolas" w:cs="Times New Roman"/>
+          <w:color w:val="B5CEA8"/>
+          <w:kern w:val="0"/>
+          <w:sz w:val="21"/>
+          <w:szCs w:val="21"/>
+          <w:lang w:val="en-US" w:eastAsia="it-IT"/>
+          <w14:ligatures w14:val="none"/>
+        </w:rPr>
+        <w:t>1</w:t>
+      </w:r>
+    </w:p>
+    <w:p>
+      <w:pPr>
+        <w:shd w:val="clear" w:color="auto" w:fill="121314"/>
+        <w:spacing w:after="0" w:line="285" w:lineRule="atLeast"/>
+        <w:rPr>
+          <w:rFonts w:ascii="Consolas" w:eastAsia="Times New Roman" w:hAnsi="Consolas" w:cs="Times New Roman"/>
+          <w:color w:val="BBBEBF"/>
+          <w:kern w:val="0"/>
+          <w:sz w:val="21"/>
+          <w:szCs w:val="21"/>
+          <w:lang w:val="en-US" w:eastAsia="it-IT"/>
+          <w14:ligatures w14:val="none"/>
+        </w:rPr>
+      </w:pPr>
+      <w:r>
+        <w:rPr>
+          <w:rFonts w:ascii="Consolas" w:eastAsia="Times New Roman" w:hAnsi="Consolas" w:cs="Times New Roman"/>
+          <w:color w:val="BBBEBF"/>
+          <w:kern w:val="0"/>
+          <w:sz w:val="21"/>
+          <w:szCs w:val="21"/>
+          <w:lang w:val="en-US" w:eastAsia="it-IT"/>
+          <w14:ligatures w14:val="none"/>
+        </w:rPr>
+        <w:t xml:space="preserve">                    </w:t>
+      </w:r>
+      <w:r>
+        <w:rPr>
+          <w:rFonts w:ascii="Consolas" w:eastAsia="Times New Roman" w:hAnsi="Consolas" w:cs="Times New Roman"/>
+          <w:color w:val="C586C0"/>
+          <w:kern w:val="0"/>
+          <w:sz w:val="21"/>
+          <w:szCs w:val="21"/>
+          <w:lang w:val="en-US" w:eastAsia="it-IT"/>
+          <w14:ligatures w14:val="none"/>
+        </w:rPr>
+        <w:t>if</w:t>
+      </w:r>
+      <w:r>
+        <w:rPr>
+          <w:rFonts w:ascii="Consolas" w:eastAsia="Times New Roman" w:hAnsi="Consolas" w:cs="Times New Roman"/>
+          <w:color w:val="BBBEBF"/>
+          <w:kern w:val="0"/>
+          <w:sz w:val="21"/>
+          <w:szCs w:val="21"/>
+          <w:lang w:val="en-US" w:eastAsia="it-IT"/>
+          <w14:ligatures w14:val="none"/>
+        </w:rPr>
+        <w:t xml:space="preserve"> </w:t>
+      </w:r>
+      <w:r>
+        <w:rPr>
+          <w:rFonts w:ascii="Consolas" w:eastAsia="Times New Roman" w:hAnsi="Consolas" w:cs="Times New Roman"/>
+          <w:color w:val="FFA657"/>
+          <w:kern w:val="0"/>
+          <w:sz w:val="21"/>
+          <w:szCs w:val="21"/>
+          <w:lang w:val="en-US" w:eastAsia="it-IT"/>
+          <w14:ligatures w14:val="none"/>
+        </w:rPr>
+        <w:t>k</w:t>
+      </w:r>
+      <w:r>
+        <w:rPr>
+          <w:rFonts w:ascii="Consolas" w:eastAsia="Times New Roman" w:hAnsi="Consolas" w:cs="Times New Roman"/>
+          <w:color w:val="BBBEBF"/>
+          <w:kern w:val="0"/>
+          <w:sz w:val="21"/>
+          <w:szCs w:val="21"/>
+          <w:lang w:val="en-US" w:eastAsia="it-IT"/>
+          <w14:ligatures w14:val="none"/>
+        </w:rPr>
+        <w:t xml:space="preserve"> </w:t>
+      </w:r>
+      <w:r>
+        <w:rPr>
+          <w:rFonts w:ascii="Consolas" w:eastAsia="Times New Roman" w:hAnsi="Consolas" w:cs="Times New Roman"/>
+          <w:color w:val="D4D4D4"/>
+          <w:kern w:val="0"/>
+          <w:sz w:val="21"/>
+          <w:szCs w:val="21"/>
+          <w:lang w:val="en-US" w:eastAsia="it-IT"/>
+          <w14:ligatures w14:val="none"/>
+        </w:rPr>
+        <w:t>==</w:t>
+      </w:r>
+      <w:r>
+        <w:rPr>
+          <w:rFonts w:ascii="Consolas" w:eastAsia="Times New Roman" w:hAnsi="Consolas" w:cs="Times New Roman"/>
+          <w:color w:val="BBBEBF"/>
+          <w:kern w:val="0"/>
+          <w:sz w:val="21"/>
+          <w:szCs w:val="21"/>
+          <w:lang w:val="en-US" w:eastAsia="it-IT"/>
+          <w14:ligatures w14:val="none"/>
+        </w:rPr>
+        <w:t xml:space="preserve"> </w:t>
+      </w:r>
+      <w:r>
+        <w:rPr>
+          <w:rFonts w:ascii="Consolas" w:eastAsia="Times New Roman" w:hAnsi="Consolas" w:cs="Times New Roman"/>
+          <w:color w:val="B5CEA8"/>
+          <w:kern w:val="0"/>
+          <w:sz w:val="21"/>
+          <w:szCs w:val="21"/>
+          <w:lang w:val="en-US" w:eastAsia="it-IT"/>
+          <w14:ligatures w14:val="none"/>
+        </w:rPr>
+        <w:t>0</w:t>
+      </w:r>
+      <w:r>
+        <w:rPr>
+          <w:rFonts w:ascii="Consolas" w:eastAsia="Times New Roman" w:hAnsi="Consolas" w:cs="Times New Roman"/>
+          <w:color w:val="BBBEBF"/>
+          <w:kern w:val="0"/>
+          <w:sz w:val="21"/>
+          <w:szCs w:val="21"/>
+          <w:lang w:val="en-US" w:eastAsia="it-IT"/>
+          <w14:ligatures w14:val="none"/>
+        </w:rPr>
+        <w:t>:</w:t>
+      </w:r>
+    </w:p>
+    <w:p>
+      <w:pPr>
+        <w:shd w:val="clear" w:color="auto" w:fill="121314"/>
+        <w:spacing w:after="0" w:line="285" w:lineRule="atLeast"/>
+        <w:rPr>
+          <w:rFonts w:ascii="Consolas" w:eastAsia="Times New Roman" w:hAnsi="Consolas" w:cs="Times New Roman"/>
+          <w:color w:val="BBBEBF"/>
+          <w:kern w:val="0"/>
+          <w:sz w:val="21"/>
+          <w:szCs w:val="21"/>
+          <w:lang w:val="en-US" w:eastAsia="it-IT"/>
+          <w14:ligatures w14:val="none"/>
+        </w:rPr>
+      </w:pPr>
+      <w:r>
+        <w:rPr>
+          <w:rFonts w:ascii="Consolas" w:eastAsia="Times New Roman" w:hAnsi="Consolas" w:cs="Times New Roman"/>
+          <w:color w:val="BBBEBF"/>
+          <w:kern w:val="0"/>
+          <w:sz w:val="21"/>
+          <w:szCs w:val="21"/>
+          <w:lang w:val="en-US" w:eastAsia="it-IT"/>
+          <w14:ligatures w14:val="none"/>
+        </w:rPr>
+        <w:t xml:space="preserve">                        </w:t>
+      </w:r>
+      <w:r>
+        <w:rPr>
+          <w:rFonts w:ascii="Consolas" w:eastAsia="Times New Roman" w:hAnsi="Consolas" w:cs="Times New Roman"/>
+          <w:color w:val="C586C0"/>
+          <w:kern w:val="0"/>
+          <w:sz w:val="21"/>
+          <w:szCs w:val="21"/>
+          <w:lang w:val="en-US" w:eastAsia="it-IT"/>
+          <w14:ligatures w14:val="none"/>
+        </w:rPr>
+        <w:t>return</w:t>
+      </w:r>
+      <w:r>
+        <w:rPr>
+          <w:rFonts w:ascii="Consolas" w:eastAsia="Times New Roman" w:hAnsi="Consolas" w:cs="Times New Roman"/>
+          <w:color w:val="BBBEBF"/>
+          <w:kern w:val="0"/>
+          <w:sz w:val="21"/>
+          <w:szCs w:val="21"/>
+          <w:lang w:val="en-US" w:eastAsia="it-IT"/>
+          <w14:ligatures w14:val="none"/>
+        </w:rPr>
+        <w:t xml:space="preserve"> </w:t>
+      </w:r>
+      <w:proofErr w:type="spellStart"/>
+      <w:r>
+        <w:rPr>
+          <w:rFonts w:ascii="Consolas" w:eastAsia="Times New Roman" w:hAnsi="Consolas" w:cs="Times New Roman"/>
+          <w:color w:val="C9D1D9"/>
+          <w:kern w:val="0"/>
+          <w:sz w:val="21"/>
+          <w:szCs w:val="21"/>
+          <w:lang w:val="en-US" w:eastAsia="it-IT"/>
+          <w14:ligatures w14:val="none"/>
+        </w:rPr>
+        <w:t>curr</w:t>
+      </w:r>
+      <w:r>
+        <w:rPr>
+          <w:rFonts w:ascii="Consolas" w:eastAsia="Times New Roman" w:hAnsi="Consolas" w:cs="Times New Roman"/>
+          <w:color w:val="BBBEBF"/>
+          <w:kern w:val="0"/>
+          <w:sz w:val="21"/>
+          <w:szCs w:val="21"/>
+          <w:lang w:val="en-US" w:eastAsia="it-IT"/>
+          <w14:ligatures w14:val="none"/>
+        </w:rPr>
+        <w:t>.val</w:t>
+      </w:r>
+      <w:proofErr w:type="spellEnd"/>
+    </w:p>
+    <w:p>
+      <w:pPr>
+        <w:shd w:val="clear" w:color="auto" w:fill="121314"/>
+        <w:spacing w:after="0" w:line="285" w:lineRule="atLeast"/>
+        <w:rPr>
+          <w:rFonts w:ascii="Consolas" w:eastAsia="Times New Roman" w:hAnsi="Consolas" w:cs="Times New Roman"/>
+          <w:color w:val="BBBEBF"/>
+          <w:kern w:val="0"/>
+          <w:sz w:val="21"/>
+          <w:szCs w:val="21"/>
+          <w:lang w:val="en-US" w:eastAsia="it-IT"/>
+          <w14:ligatures w14:val="none"/>
+        </w:rPr>
+      </w:pPr>
+      <w:r>
+        <w:rPr>
+          <w:rFonts w:ascii="Consolas" w:eastAsia="Times New Roman" w:hAnsi="Consolas" w:cs="Times New Roman"/>
+          <w:color w:val="BBBEBF"/>
+          <w:kern w:val="0"/>
+          <w:sz w:val="21"/>
+          <w:szCs w:val="21"/>
+          <w:lang w:val="en-US" w:eastAsia="it-IT"/>
+          <w14:ligatures w14:val="none"/>
+        </w:rPr>
+        <w:t xml:space="preserve">                    </w:t>
+      </w:r>
+      <w:proofErr w:type="spellStart"/>
+      <w:r>
+        <w:rPr>
+          <w:rFonts w:ascii="Consolas" w:eastAsia="Times New Roman" w:hAnsi="Consolas" w:cs="Times New Roman"/>
+          <w:color w:val="C9D1D9"/>
+          <w:kern w:val="0"/>
+          <w:sz w:val="21"/>
+          <w:szCs w:val="21"/>
+          <w:lang w:val="en-US" w:eastAsia="it-IT"/>
+          <w14:ligatures w14:val="none"/>
+        </w:rPr>
+        <w:t>curr</w:t>
+      </w:r>
+      <w:proofErr w:type="spellEnd"/>
+      <w:r>
+        <w:rPr>
+          <w:rFonts w:ascii="Consolas" w:eastAsia="Times New Roman" w:hAnsi="Consolas" w:cs="Times New Roman"/>
+          <w:color w:val="BBBEBF"/>
+          <w:kern w:val="0"/>
+          <w:sz w:val="21"/>
+          <w:szCs w:val="21"/>
+          <w:lang w:val="en-US" w:eastAsia="it-IT"/>
+          <w14:ligatures w14:val="none"/>
+        </w:rPr>
+        <w:t xml:space="preserve"> </w:t>
+      </w:r>
+      <w:r>
+        <w:rPr>
+          <w:rFonts w:ascii="Consolas" w:eastAsia="Times New Roman" w:hAnsi="Consolas" w:cs="Times New Roman"/>
+          <w:color w:val="D4D4D4"/>
+          <w:kern w:val="0"/>
+          <w:sz w:val="21"/>
+          <w:szCs w:val="21"/>
+          <w:lang w:val="en-US" w:eastAsia="it-IT"/>
+          <w14:ligatures w14:val="none"/>
+        </w:rPr>
+        <w:t>=</w:t>
+      </w:r>
+      <w:r>
+        <w:rPr>
+          <w:rFonts w:ascii="Consolas" w:eastAsia="Times New Roman" w:hAnsi="Consolas" w:cs="Times New Roman"/>
+          <w:color w:val="BBBEBF"/>
+          <w:kern w:val="0"/>
+          <w:sz w:val="21"/>
+          <w:szCs w:val="21"/>
+          <w:lang w:val="en-US" w:eastAsia="it-IT"/>
+          <w14:ligatures w14:val="none"/>
+        </w:rPr>
+        <w:t xml:space="preserve"> </w:t>
+      </w:r>
+      <w:proofErr w:type="spellStart"/>
+      <w:proofErr w:type="gramStart"/>
+      <w:r>
+        <w:rPr>
+          <w:rFonts w:ascii="Consolas" w:eastAsia="Times New Roman" w:hAnsi="Consolas" w:cs="Times New Roman"/>
+          <w:color w:val="C9D1D9"/>
+          <w:kern w:val="0"/>
+          <w:sz w:val="21"/>
+          <w:szCs w:val="21"/>
+          <w:lang w:val="en-US" w:eastAsia="it-IT"/>
+          <w14:ligatures w14:val="none"/>
+        </w:rPr>
+        <w:t>curr</w:t>
+      </w:r>
+      <w:r>
+        <w:rPr>
+          <w:rFonts w:ascii="Consolas" w:eastAsia="Times New Roman" w:hAnsi="Consolas" w:cs="Times New Roman"/>
+          <w:color w:val="BBBEBF"/>
+          <w:kern w:val="0"/>
+          <w:sz w:val="21"/>
+          <w:szCs w:val="21"/>
+          <w:lang w:val="en-US" w:eastAsia="it-IT"/>
+          <w14:ligatures w14:val="none"/>
+        </w:rPr>
+        <w:t>.right</w:t>
+      </w:r>
+      <w:proofErr w:type="spellEnd"/>
+      <w:proofErr w:type="gramEnd"/>
+    </w:p>
+    <w:p>
+      <w:pPr>
+        <w:shd w:val="clear" w:color="auto" w:fill="121314"/>
+        <w:spacing w:after="0" w:line="285" w:lineRule="atLeast"/>
+        <w:rPr>
+          <w:rFonts w:ascii="Consolas" w:eastAsia="Times New Roman" w:hAnsi="Consolas" w:cs="Times New Roman"/>
+          <w:color w:val="BBBEBF"/>
+          <w:kern w:val="0"/>
+          <w:sz w:val="21"/>
+          <w:szCs w:val="21"/>
           <w:lang w:val="en-US" w:eastAsia="it-IT"/>
           <w14:ligatures w14:val="none"/>
         </w:rPr>
@@ -9374,7 +9336,7 @@
     </w:p>
     <w:p>
       <w:pPr>
-        <w:pStyle w:val="Paragrafoelenco"/>
+        <w:pStyle w:val="ListParagraph"/>
         <w:numPr>
           <w:ilvl w:val="0"/>
           <w:numId w:val="1"/>
@@ -9407,7 +9369,7 @@
     </w:p>
     <w:p>
       <w:pPr>
-        <w:pStyle w:val="Paragrafoelenco"/>
+        <w:pStyle w:val="ListParagraph"/>
         <w:numPr>
           <w:ilvl w:val="0"/>
           <w:numId w:val="1"/>
@@ -9453,7 +9415,7 @@
     </w:p>
     <w:p>
       <w:pPr>
-        <w:pStyle w:val="Paragrafoelenco"/>
+        <w:pStyle w:val="ListParagraph"/>
         <w:rPr>
           <w:b/>
           <w:bCs/>
@@ -9463,7 +9425,7 @@
     </w:p>
     <w:p>
       <w:pPr>
-        <w:pStyle w:val="Paragrafoelenco"/>
+        <w:pStyle w:val="ListParagraph"/>
       </w:pPr>
       <w:r>
         <w:t xml:space="preserve">Quindi partendo dalla </w:t>
@@ -9527,7 +9489,7 @@
     </w:p>
     <w:p>
       <w:pPr>
-        <w:pStyle w:val="Paragrafoelenco"/>
+        <w:pStyle w:val="ListParagraph"/>
       </w:pPr>
       <w:r>
         <w:t xml:space="preserve">Prendo quelli </w:t>
@@ -9595,7 +9557,7 @@
     </w:p>
     <w:p>
       <w:pPr>
-        <w:pStyle w:val="Paragrafoelenco"/>
+        <w:pStyle w:val="ListParagraph"/>
       </w:pPr>
       <w:r>
         <w:rPr>
@@ -10325,25 +10287,7 @@
           <w:color w:val="C00000"/>
           <w:lang w:val="en-US"/>
         </w:rPr>
-        <w:t>VALID TREE</w:t>
-      </w:r>
-      <w:r>
-        <w:rPr>
-          <w:b/>
-          <w:bCs/>
-          <w:color w:val="C00000"/>
-          <w:lang w:val="en-US"/>
-        </w:rPr>
-        <w:t>:</w:t>
-      </w:r>
-      <w:r>
-        <w:rPr>
-          <w:b/>
-          <w:bCs/>
-          <w:color w:val="C00000"/>
-          <w:lang w:val="en-US"/>
-        </w:rPr>
-        <w:t xml:space="preserve"> </w:t>
+        <w:t xml:space="preserve">VALID TREE: </w:t>
       </w:r>
       <w:r>
         <w:rPr>
@@ -10499,21 +10443,7 @@
         <w:rPr>
           <w:lang w:val="en-US"/>
         </w:rPr>
-        <w:t xml:space="preserve">run, </w:t>
-      </w:r>
-      <w:proofErr w:type="gramStart"/>
-      <w:r>
-        <w:rPr>
-          <w:lang w:val="en-US"/>
-        </w:rPr>
-        <w:t>parent</w:t>
-      </w:r>
-      <w:proofErr w:type="gramEnd"/>
-      <w:r>
-        <w:rPr>
-          <w:lang w:val="en-US"/>
-        </w:rPr>
-        <w:t xml:space="preserve"> because the graph is </w:t>
+        <w:t xml:space="preserve">run, parent because the graph is </w:t>
       </w:r>
       <w:proofErr w:type="gramStart"/>
       <w:r>
@@ -10653,15 +10583,213 @@
           <w:bCs/>
           <w:lang w:val="en-US"/>
         </w:rPr>
-        <w:t xml:space="preserve">CHECK </w:t>
-      </w:r>
-      <w:r>
-        <w:rPr>
-          <w:b/>
-          <w:bCs/>
-          <w:lang w:val="en-US"/>
-        </w:rPr>
-        <w:t>on number of VISITED NODES to be equal to TOTAL NODES (only 1 CC)</w:t>
+        <w:t>CHECK on number of VISITED NODES to be equal to TOTAL NODES (only 1 CC)</w:t>
+      </w:r>
+      <w:r>
+        <w:rPr>
+          <w:b/>
+          <w:bCs/>
+          <w:lang w:val="en-US"/>
+        </w:rPr>
+        <w:t>.</w:t>
+      </w:r>
+    </w:p>
+    <w:p>
+      <w:pPr>
+        <w:rPr>
+          <w:b/>
+          <w:bCs/>
+          <w:lang w:val="en-US"/>
+        </w:rPr>
+      </w:pPr>
+    </w:p>
+    <w:p>
+      <w:pPr>
+        <w:rPr>
+          <w:b/>
+          <w:bCs/>
+          <w:color w:val="C00000"/>
+          <w:lang w:val="en-US"/>
+        </w:rPr>
+      </w:pPr>
+      <w:r>
+        <w:rPr>
+          <w:b/>
+          <w:bCs/>
+          <w:color w:val="C00000"/>
+          <w:lang w:val="en-US"/>
+        </w:rPr>
+        <w:t>UNION-FIND WITH I</w:t>
+      </w:r>
+      <w:r>
+        <w:rPr>
+          <w:b/>
+          <w:bCs/>
+          <w:color w:val="C00000"/>
+          <w:lang w:val="en-US"/>
+        </w:rPr>
+        <w:t>N</w:t>
+      </w:r>
+      <w:r>
+        <w:rPr>
+          <w:b/>
+          <w:bCs/>
+          <w:color w:val="C00000"/>
+          <w:lang w:val="en-US"/>
+        </w:rPr>
+        <w:t>VERSE ACKERMANN FUNCTION</w:t>
+      </w:r>
+      <w:r>
+        <w:rPr>
+          <w:b/>
+          <w:bCs/>
+          <w:color w:val="C00000"/>
+          <w:lang w:val="en-US"/>
+        </w:rPr>
+        <w:t>:</w:t>
+      </w:r>
+    </w:p>
+    <w:p>
+      <w:pPr>
+        <w:rPr>
+          <w:b/>
+          <w:bCs/>
+          <w:lang w:val="en-US"/>
+        </w:rPr>
+      </w:pPr>
+      <w:r>
+        <w:rPr>
+          <w:lang w:val="en-US"/>
+        </w:rPr>
+        <w:t xml:space="preserve">When traversing up the tree to find the root, </w:t>
+      </w:r>
+      <w:r>
+        <w:rPr>
+          <w:b/>
+          <w:bCs/>
+          <w:lang w:val="en-US"/>
+        </w:rPr>
+        <w:t>update the parent pointer</w:t>
+      </w:r>
+      <w:r>
+        <w:rPr>
+          <w:lang w:val="en-US"/>
+        </w:rPr>
+        <w:t xml:space="preserve"> of every node along the way to </w:t>
+      </w:r>
+      <w:r>
+        <w:rPr>
+          <w:b/>
+          <w:bCs/>
+          <w:lang w:val="en-US"/>
+        </w:rPr>
+        <w:t>point directly to the root</w:t>
+      </w:r>
+      <w:r>
+        <w:rPr>
+          <w:lang w:val="en-US"/>
+        </w:rPr>
+        <w:t xml:space="preserve">. This flattens the tree and reduces the amortized time complexity of </w:t>
+      </w:r>
+      <w:r>
+        <w:rPr>
+          <w:rStyle w:val="HTMLCode"/>
+          <w:rFonts w:ascii="Arial" w:eastAsiaTheme="minorHAnsi" w:hAnsi="Arial" w:cs="Arial"/>
+          <w:lang w:val="en-US"/>
+        </w:rPr>
+        <w:t>find</w:t>
+      </w:r>
+      <w:r>
+        <w:rPr>
+          <w:lang w:val="en-US"/>
+        </w:rPr>
+        <w:t xml:space="preserve"> to </w:t>
+      </w:r>
+      <w:proofErr w:type="gramStart"/>
+      <w:r>
+        <w:rPr>
+          <w:rStyle w:val="math-inline"/>
+          <w:rFonts w:ascii="Arial" w:hAnsi="Arial" w:cs="Arial"/>
+          <w:b/>
+          <w:bCs/>
+          <w:lang w:val="en-US"/>
+        </w:rPr>
+        <w:t>O(</w:t>
+      </w:r>
+      <w:proofErr w:type="gramEnd"/>
+      <w:r>
+        <w:rPr>
+          <w:rStyle w:val="math-inline"/>
+          <w:rFonts w:ascii="Arial" w:hAnsi="Arial" w:cs="Arial"/>
+          <w:b/>
+          <w:bCs/>
+          <w:lang w:val="en-US"/>
+        </w:rPr>
+        <w:t>alpha</w:t>
+      </w:r>
+      <w:r>
+        <w:rPr>
+          <w:rStyle w:val="math-inline"/>
+          <w:rFonts w:ascii="Arial" w:hAnsi="Arial" w:cs="Arial"/>
+          <w:b/>
+          <w:bCs/>
+          <w:lang w:val="en-US"/>
+        </w:rPr>
+        <w:t xml:space="preserve"> * </w:t>
+      </w:r>
+      <w:r>
+        <w:rPr>
+          <w:rStyle w:val="math-inline"/>
+          <w:rFonts w:ascii="Arial" w:hAnsi="Arial" w:cs="Arial"/>
+          <w:b/>
+          <w:bCs/>
+          <w:lang w:val="en-US"/>
+        </w:rPr>
+        <w:t>(N))</w:t>
+      </w:r>
+      <w:r>
+        <w:rPr>
+          <w:rStyle w:val="math-inline"/>
+          <w:rFonts w:ascii="Arial" w:hAnsi="Arial" w:cs="Arial"/>
+          <w:lang w:val="en-US"/>
+        </w:rPr>
+        <w:t xml:space="preserve"> </w:t>
+      </w:r>
+      <w:r>
+        <w:rPr>
+          <w:lang w:val="en-US"/>
+        </w:rPr>
+        <w:t xml:space="preserve">(the Inverse Ackermann function), which is effectively </w:t>
+      </w:r>
+      <w:proofErr w:type="gramStart"/>
+      <w:r>
+        <w:rPr>
+          <w:rStyle w:val="math-inline"/>
+          <w:rFonts w:ascii="Arial" w:hAnsi="Arial" w:cs="Arial"/>
+          <w:b/>
+          <w:bCs/>
+          <w:lang w:val="en-US"/>
+        </w:rPr>
+        <w:t>O(</w:t>
+      </w:r>
+      <w:proofErr w:type="gramEnd"/>
+      <w:r>
+        <w:rPr>
+          <w:rStyle w:val="math-inline"/>
+          <w:rFonts w:ascii="Arial" w:hAnsi="Arial" w:cs="Arial"/>
+          <w:b/>
+          <w:bCs/>
+          <w:lang w:val="en-US"/>
+        </w:rPr>
+        <w:t>1)</w:t>
+      </w:r>
+      <w:r>
+        <w:rPr>
+          <w:b/>
+          <w:bCs/>
+          <w:lang w:val="en-US"/>
+        </w:rPr>
+        <w:t>.</w:t>
       </w:r>
     </w:p>
     <w:p>
@@ -11517,15 +11645,15 @@
     <w:lsdException w:name="Unresolved Mention" w:semiHidden="1" w:unhideWhenUsed="1"/>
     <w:lsdException w:name="Smart Link" w:semiHidden="1" w:unhideWhenUsed="1"/>
   </w:latentStyles>
-  <w:style w:type="paragraph" w:default="1" w:styleId="Normale">
+  <w:style w:type="paragraph" w:default="1" w:styleId="Normal">
     <w:name w:val="Normal"/>
     <w:qFormat/>
   </w:style>
-  <w:style w:type="paragraph" w:styleId="Titolo1">
+  <w:style w:type="paragraph" w:styleId="Heading1">
     <w:name w:val="heading 1"/>
-    <w:basedOn w:val="Normale"/>
-    <w:next w:val="Normale"/>
-    <w:link w:val="Titolo1Carattere"/>
+    <w:basedOn w:val="Normal"/>
+    <w:next w:val="Normal"/>
+    <w:link w:val="Heading1Char"/>
     <w:uiPriority w:val="9"/>
     <w:qFormat/>
     <w:rsid w:val="00B76C90"/>
@@ -11542,11 +11670,11 @@
       <w:szCs w:val="40"/>
     </w:rPr>
   </w:style>
-  <w:style w:type="paragraph" w:styleId="Titolo2">
+  <w:style w:type="paragraph" w:styleId="Heading2">
     <w:name w:val="heading 2"/>
-    <w:basedOn w:val="Normale"/>
-    <w:next w:val="Normale"/>
-    <w:link w:val="Titolo2Carattere"/>
+    <w:basedOn w:val="Normal"/>
+    <w:next w:val="Normal"/>
+    <w:link w:val="Heading2Char"/>
     <w:uiPriority w:val="9"/>
     <w:semiHidden/>
     <w:unhideWhenUsed/>
@@ -11565,11 +11693,11 @@
       <w:szCs w:val="32"/>
     </w:rPr>
   </w:style>
-  <w:style w:type="paragraph" w:styleId="Titolo3">
+  <w:style w:type="paragraph" w:styleId="Heading3">
     <w:name w:val="heading 3"/>
-    <w:basedOn w:val="Normale"/>
-    <w:next w:val="Normale"/>
-    <w:link w:val="Titolo3Carattere"/>
+    <w:basedOn w:val="Normal"/>
+    <w:next w:val="Normal"/>
+    <w:link w:val="Heading3Char"/>
     <w:uiPriority w:val="9"/>
     <w:semiHidden/>
     <w:unhideWhenUsed/>
@@ -11588,11 +11716,11 @@
       <w:szCs w:val="28"/>
     </w:rPr>
   </w:style>
-  <w:style w:type="paragraph" w:styleId="Titolo4">
+  <w:style w:type="paragraph" w:styleId="Heading4">
     <w:name w:val="heading 4"/>
-    <w:basedOn w:val="Normale"/>
-    <w:next w:val="Normale"/>
-    <w:link w:val="Titolo4Carattere"/>
+    <w:basedOn w:val="Normal"/>
+    <w:next w:val="Normal"/>
+    <w:link w:val="Heading4Char"/>
     <w:uiPriority w:val="9"/>
     <w:semiHidden/>
     <w:unhideWhenUsed/>
@@ -11611,11 +11739,11 @@
       <w:color w:val="0F4761" w:themeColor="accent1" w:themeShade="BF"/>
     </w:rPr>
   </w:style>
-  <w:style w:type="paragraph" w:styleId="Titolo5">
+  <w:style w:type="paragraph" w:styleId="Heading5">
     <w:name w:val="heading 5"/>
-    <w:basedOn w:val="Normale"/>
-    <w:next w:val="Normale"/>
-    <w:link w:val="Titolo5Carattere"/>
+    <w:basedOn w:val="Normal"/>
+    <w:next w:val="Normal"/>
+    <w:link w:val="Heading5Char"/>
     <w:uiPriority w:val="9"/>
     <w:semiHidden/>
     <w:unhideWhenUsed/>
@@ -11632,11 +11760,11 @@
       <w:color w:val="0F4761" w:themeColor="accent1" w:themeShade="BF"/>
     </w:rPr>
   </w:style>
-  <w:style w:type="paragraph" w:styleId="Titolo6">
+  <w:style w:type="paragraph" w:styleId="Heading6">
     <w:name w:val="heading 6"/>
-    <w:basedOn w:val="Normale"/>
-    <w:next w:val="Normale"/>
-    <w:link w:val="Titolo6Carattere"/>
+    <w:basedOn w:val="Normal"/>
+    <w:next w:val="Normal"/>
+    <w:link w:val="Heading6Char"/>
     <w:uiPriority w:val="9"/>
     <w:semiHidden/>
     <w:unhideWhenUsed/>
@@ -11655,11 +11783,11 @@
       <w:color w:val="595959" w:themeColor="text1" w:themeTint="A6"/>
     </w:rPr>
   </w:style>
-  <w:style w:type="paragraph" w:styleId="Titolo7">
+  <w:style w:type="paragraph" w:styleId="Heading7">
     <w:name w:val="heading 7"/>
-    <w:basedOn w:val="Normale"/>
-    <w:next w:val="Normale"/>
-    <w:link w:val="Titolo7Carattere"/>
+    <w:basedOn w:val="Normal"/>
+    <w:next w:val="Normal"/>
+    <w:link w:val="Heading7Char"/>
     <w:uiPriority w:val="9"/>
     <w:semiHidden/>
     <w:unhideWhenUsed/>
@@ -11676,11 +11804,11 @@
       <w:color w:val="595959" w:themeColor="text1" w:themeTint="A6"/>
     </w:rPr>
   </w:style>
-  <w:style w:type="paragraph" w:styleId="Titolo8">
+  <w:style w:type="paragraph" w:styleId="Heading8">
     <w:name w:val="heading 8"/>
-    <w:basedOn w:val="Normale"/>
-    <w:next w:val="Normale"/>
-    <w:link w:val="Titolo8Carattere"/>
+    <w:basedOn w:val="Normal"/>
+    <w:next w:val="Normal"/>
+    <w:link w:val="Heading8Char"/>
     <w:uiPriority w:val="9"/>
     <w:semiHidden/>
     <w:unhideWhenUsed/>
@@ -11699,11 +11827,11 @@
       <w:color w:val="272727" w:themeColor="text1" w:themeTint="D8"/>
     </w:rPr>
   </w:style>
-  <w:style w:type="paragraph" w:styleId="Titolo9">
+  <w:style w:type="paragraph" w:styleId="Heading9">
     <w:name w:val="heading 9"/>
-    <w:basedOn w:val="Normale"/>
-    <w:next w:val="Normale"/>
-    <w:link w:val="Titolo9Carattere"/>
+    <w:basedOn w:val="Normal"/>
+    <w:next w:val="Normal"/>
+    <w:link w:val="Heading9Char"/>
     <w:uiPriority w:val="9"/>
     <w:semiHidden/>
     <w:unhideWhenUsed/>
@@ -11720,13 +11848,13 @@
       <w:color w:val="272727" w:themeColor="text1" w:themeTint="D8"/>
     </w:rPr>
   </w:style>
-  <w:style w:type="character" w:default="1" w:styleId="Carpredefinitoparagrafo">
+  <w:style w:type="character" w:default="1" w:styleId="DefaultParagraphFont">
     <w:name w:val="Default Paragraph Font"/>
     <w:uiPriority w:val="1"/>
     <w:semiHidden/>
     <w:unhideWhenUsed/>
   </w:style>
-  <w:style w:type="table" w:default="1" w:styleId="Tabellanormale">
+  <w:style w:type="table" w:default="1" w:styleId="TableNormal">
     <w:name w:val="Normal Table"/>
     <w:uiPriority w:val="99"/>
     <w:semiHidden/>
@@ -11741,16 +11869,16 @@
       </w:tblCellMar>
     </w:tblPr>
   </w:style>
-  <w:style w:type="numbering" w:default="1" w:styleId="Nessunelenco">
+  <w:style w:type="numbering" w:default="1" w:styleId="NoList">
     <w:name w:val="No List"/>
     <w:uiPriority w:val="99"/>
     <w:semiHidden/>
     <w:unhideWhenUsed/>
   </w:style>
-  <w:style w:type="character" w:customStyle="1" w:styleId="Titolo1Carattere">
-    <w:name w:val="Titolo 1 Carattere"/>
-    <w:basedOn w:val="Carpredefinitoparagrafo"/>
-    <w:link w:val="Titolo1"/>
+  <w:style w:type="character" w:customStyle="1" w:styleId="Heading1Char">
+    <w:name w:val="Heading 1 Char"/>
+    <w:basedOn w:val="DefaultParagraphFont"/>
+    <w:link w:val="Heading1"/>
     <w:uiPriority w:val="9"/>
     <w:rsid w:val="00B76C90"/>
     <w:rPr>
@@ -11760,10 +11888,10 @@
       <w:szCs w:val="40"/>
     </w:rPr>
   </w:style>
-  <w:style w:type="character" w:customStyle="1" w:styleId="Titolo2Carattere">
-    <w:name w:val="Titolo 2 Carattere"/>
-    <w:basedOn w:val="Carpredefinitoparagrafo"/>
-    <w:link w:val="Titolo2"/>
+  <w:style w:type="character" w:customStyle="1" w:styleId="Heading2Char">
+    <w:name w:val="Heading 2 Char"/>
+    <w:basedOn w:val="DefaultParagraphFont"/>
+    <w:link w:val="Heading2"/>
     <w:uiPriority w:val="9"/>
     <w:semiHidden/>
     <w:rsid w:val="00B76C90"/>
@@ -11774,10 +11902,10 @@
       <w:szCs w:val="32"/>
     </w:rPr>
   </w:style>
-  <w:style w:type="character" w:customStyle="1" w:styleId="Titolo3Carattere">
-    <w:name w:val="Titolo 3 Carattere"/>
-    <w:basedOn w:val="Carpredefinitoparagrafo"/>
-    <w:link w:val="Titolo3"/>
+  <w:style w:type="character" w:customStyle="1" w:styleId="Heading3Char">
+    <w:name w:val="Heading 3 Char"/>
+    <w:basedOn w:val="DefaultParagraphFont"/>
+    <w:link w:val="Heading3"/>
     <w:uiPriority w:val="9"/>
     <w:semiHidden/>
     <w:rsid w:val="00B76C90"/>
@@ -11788,10 +11916,10 @@
       <w:szCs w:val="28"/>
     </w:rPr>
   </w:style>
-  <w:style w:type="character" w:customStyle="1" w:styleId="Titolo4Carattere">
-    <w:name w:val="Titolo 4 Carattere"/>
-    <w:basedOn w:val="Carpredefinitoparagrafo"/>
-    <w:link w:val="Titolo4"/>
+  <w:style w:type="character" w:customStyle="1" w:styleId="Heading4Char">
+    <w:name w:val="Heading 4 Char"/>
+    <w:basedOn w:val="DefaultParagraphFont"/>
+    <w:link w:val="Heading4"/>
     <w:uiPriority w:val="9"/>
     <w:semiHidden/>
     <w:rsid w:val="00B76C90"/>
@@ -11802,10 +11930,10 @@
       <w:color w:val="0F4761" w:themeColor="accent1" w:themeShade="BF"/>
     </w:rPr>
   </w:style>
-  <w:style w:type="character" w:customStyle="1" w:styleId="Titolo5Carattere">
-    <w:name w:val="Titolo 5 Carattere"/>
-    <w:basedOn w:val="Carpredefinitoparagrafo"/>
-    <w:link w:val="Titolo5"/>
+  <w:style w:type="character" w:customStyle="1" w:styleId="Heading5Char">
+    <w:name w:val="Heading 5 Char"/>
+    <w:basedOn w:val="DefaultParagraphFont"/>
+    <w:link w:val="Heading5"/>
     <w:uiPriority w:val="9"/>
     <w:semiHidden/>
     <w:rsid w:val="00B76C90"/>
@@ -11814,10 +11942,10 @@
       <w:color w:val="0F4761" w:themeColor="accent1" w:themeShade="BF"/>
     </w:rPr>
   </w:style>
-  <w:style w:type="character" w:customStyle="1" w:styleId="Titolo6Carattere">
-    <w:name w:val="Titolo 6 Carattere"/>
-    <w:basedOn w:val="Carpredefinitoparagrafo"/>
-    <w:link w:val="Titolo6"/>
+  <w:style w:type="character" w:customStyle="1" w:styleId="Heading6Char">
+    <w:name w:val="Heading 6 Char"/>
+    <w:basedOn w:val="DefaultParagraphFont"/>
+    <w:link w:val="Heading6"/>
     <w:uiPriority w:val="9"/>
     <w:semiHidden/>
     <w:rsid w:val="00B76C90"/>
@@ -11828,10 +11956,10 @@
       <w:color w:val="595959" w:themeColor="text1" w:themeTint="A6"/>
     </w:rPr>
   </w:style>
-  <w:style w:type="character" w:customStyle="1" w:styleId="Titolo7Carattere">
-    <w:name w:val="Titolo 7 Carattere"/>
-    <w:basedOn w:val="Carpredefinitoparagrafo"/>
-    <w:link w:val="Titolo7"/>
+  <w:style w:type="character" w:customStyle="1" w:styleId="Heading7Char">
+    <w:name w:val="Heading 7 Char"/>
+    <w:basedOn w:val="DefaultParagraphFont"/>
+    <w:link w:val="Heading7"/>
     <w:uiPriority w:val="9"/>
     <w:semiHidden/>
     <w:rsid w:val="00B76C90"/>
@@ -11840,10 +11968,10 @@
       <w:color w:val="595959" w:themeColor="text1" w:themeTint="A6"/>
     </w:rPr>
   </w:style>
-  <w:style w:type="character" w:customStyle="1" w:styleId="Titolo8Carattere">
-    <w:name w:val="Titolo 8 Carattere"/>
-    <w:basedOn w:val="Carpredefinitoparagrafo"/>
-    <w:link w:val="Titolo8"/>
+  <w:style w:type="character" w:customStyle="1" w:styleId="Heading8Char">
+    <w:name w:val="Heading 8 Char"/>
+    <w:basedOn w:val="DefaultParagraphFont"/>
+    <w:link w:val="Heading8"/>
     <w:uiPriority w:val="9"/>
     <w:semiHidden/>
     <w:rsid w:val="00B76C90"/>
@@ -11854,10 +11982,10 @@
       <w:color w:val="272727" w:themeColor="text1" w:themeTint="D8"/>
     </w:rPr>
   </w:style>
-  <w:style w:type="character" w:customStyle="1" w:styleId="Titolo9Carattere">
-    <w:name w:val="Titolo 9 Carattere"/>
-    <w:basedOn w:val="Carpredefinitoparagrafo"/>
-    <w:link w:val="Titolo9"/>
+  <w:style w:type="character" w:customStyle="1" w:styleId="Heading9Char">
+    <w:name w:val="Heading 9 Char"/>
+    <w:basedOn w:val="DefaultParagraphFont"/>
+    <w:link w:val="Heading9"/>
     <w:uiPriority w:val="9"/>
     <w:semiHidden/>
     <w:rsid w:val="00B76C90"/>
@@ -11866,11 +11994,11 @@
       <w:color w:val="272727" w:themeColor="text1" w:themeTint="D8"/>
     </w:rPr>
   </w:style>
-  <w:style w:type="paragraph" w:styleId="Titolo">
+  <w:style w:type="paragraph" w:styleId="Title">
     <w:name w:val="Title"/>
-    <w:basedOn w:val="Normale"/>
-    <w:next w:val="Normale"/>
-    <w:link w:val="TitoloCarattere"/>
+    <w:basedOn w:val="Normal"/>
+    <w:next w:val="Normal"/>
+    <w:link w:val="TitleChar"/>
     <w:uiPriority w:val="10"/>
     <w:qFormat/>
     <w:rsid w:val="00B76C90"/>
@@ -11886,10 +12014,10 @@
       <w:szCs w:val="56"/>
     </w:rPr>
   </w:style>
-  <w:style w:type="character" w:customStyle="1" w:styleId="TitoloCarattere">
-    <w:name w:val="Titolo Carattere"/>
-    <w:basedOn w:val="Carpredefinitoparagrafo"/>
-    <w:link w:val="Titolo"/>
+  <w:style w:type="character" w:customStyle="1" w:styleId="TitleChar">
+    <w:name w:val="Title Char"/>
+    <w:basedOn w:val="DefaultParagraphFont"/>
+    <w:link w:val="Title"/>
     <w:uiPriority w:val="10"/>
     <w:rsid w:val="00B76C90"/>
     <w:rPr>
@@ -11900,11 +12028,11 @@
       <w:szCs w:val="56"/>
     </w:rPr>
   </w:style>
-  <w:style w:type="paragraph" w:styleId="Sottotitolo">
+  <w:style w:type="paragraph" w:styleId="Subtitle">
     <w:name w:val="Subtitle"/>
-    <w:basedOn w:val="Normale"/>
-    <w:next w:val="Normale"/>
-    <w:link w:val="SottotitoloCarattere"/>
+    <w:basedOn w:val="Normal"/>
+    <w:next w:val="Normal"/>
+    <w:link w:val="SubtitleChar"/>
     <w:uiPriority w:val="11"/>
     <w:qFormat/>
     <w:rsid w:val="00B76C90"/>
@@ -11921,10 +12049,10 @@
       <w:szCs w:val="28"/>
     </w:rPr>
   </w:style>
-  <w:style w:type="character" w:customStyle="1" w:styleId="SottotitoloCarattere">
-    <w:name w:val="Sottotitolo Carattere"/>
-    <w:basedOn w:val="Carpredefinitoparagrafo"/>
-    <w:link w:val="Sottotitolo"/>
+  <w:style w:type="character" w:customStyle="1" w:styleId="SubtitleChar">
+    <w:name w:val="Subtitle Char"/>
+    <w:basedOn w:val="DefaultParagraphFont"/>
+    <w:link w:val="Subtitle"/>
     <w:uiPriority w:val="11"/>
     <w:rsid w:val="00B76C90"/>
     <w:rPr>
@@ -11935,11 +12063,11 @@
       <w:szCs w:val="28"/>
     </w:rPr>
   </w:style>
-  <w:style w:type="paragraph" w:styleId="Citazione">
+  <w:style w:type="paragraph" w:styleId="Quote">
     <w:name w:val="Quote"/>
-    <w:basedOn w:val="Normale"/>
-    <w:next w:val="Normale"/>
-    <w:link w:val="CitazioneCarattere"/>
+    <w:basedOn w:val="Normal"/>
+    <w:next w:val="Normal"/>
+    <w:link w:val="QuoteChar"/>
     <w:uiPriority w:val="29"/>
     <w:qFormat/>
     <w:rsid w:val="00B76C90"/>
@@ -11953,10 +12081,10 @@
       <w:color w:val="404040" w:themeColor="text1" w:themeTint="BF"/>
     </w:rPr>
   </w:style>
-  <w:style w:type="character" w:customStyle="1" w:styleId="CitazioneCarattere">
-    <w:name w:val="Citazione Carattere"/>
-    <w:basedOn w:val="Carpredefinitoparagrafo"/>
-    <w:link w:val="Citazione"/>
+  <w:style w:type="character" w:customStyle="1" w:styleId="QuoteChar">
+    <w:name w:val="Quote Char"/>
+    <w:basedOn w:val="DefaultParagraphFont"/>
+    <w:link w:val="Quote"/>
     <w:uiPriority w:val="29"/>
     <w:rsid w:val="00B76C90"/>
     <w:rPr>
@@ -11965,9 +12093,9 @@
       <w:color w:val="404040" w:themeColor="text1" w:themeTint="BF"/>
     </w:rPr>
   </w:style>
-  <w:style w:type="paragraph" w:styleId="Paragrafoelenco">
+  <w:style w:type="paragraph" w:styleId="ListParagraph">
     <w:name w:val="List Paragraph"/>
-    <w:basedOn w:val="Normale"/>
+    <w:basedOn w:val="Normal"/>
     <w:uiPriority w:val="34"/>
     <w:qFormat/>
     <w:rsid w:val="00B76C90"/>
@@ -11976,9 +12104,9 @@
       <w:contextualSpacing/>
     </w:pPr>
   </w:style>
-  <w:style w:type="character" w:styleId="Enfasiintensa">
+  <w:style w:type="character" w:styleId="IntenseEmphasis">
     <w:name w:val="Intense Emphasis"/>
-    <w:basedOn w:val="Carpredefinitoparagrafo"/>
+    <w:basedOn w:val="DefaultParagraphFont"/>
     <w:uiPriority w:val="21"/>
     <w:qFormat/>
     <w:rsid w:val="00B76C90"/>
@@ -11988,11 +12116,11 @@
       <w:color w:val="0F4761" w:themeColor="accent1" w:themeShade="BF"/>
     </w:rPr>
   </w:style>
-  <w:style w:type="paragraph" w:styleId="Citazioneintensa">
+  <w:style w:type="paragraph" w:styleId="IntenseQuote">
     <w:name w:val="Intense Quote"/>
-    <w:basedOn w:val="Normale"/>
-    <w:next w:val="Normale"/>
-    <w:link w:val="CitazioneintensaCarattere"/>
+    <w:basedOn w:val="Normal"/>
+    <w:next w:val="Normal"/>
+    <w:link w:val="IntenseQuoteChar"/>
     <w:uiPriority w:val="30"/>
     <w:qFormat/>
     <w:rsid w:val="00B76C90"/>
@@ -12011,10 +12139,10 @@
       <w:color w:val="0F4761" w:themeColor="accent1" w:themeShade="BF"/>
     </w:rPr>
   </w:style>
-  <w:style w:type="character" w:customStyle="1" w:styleId="CitazioneintensaCarattere">
-    <w:name w:val="Citazione intensa Carattere"/>
-    <w:basedOn w:val="Carpredefinitoparagrafo"/>
-    <w:link w:val="Citazioneintensa"/>
+  <w:style w:type="character" w:customStyle="1" w:styleId="IntenseQuoteChar">
+    <w:name w:val="Intense Quote Char"/>
+    <w:basedOn w:val="DefaultParagraphFont"/>
+    <w:link w:val="IntenseQuote"/>
     <w:uiPriority w:val="30"/>
     <w:rsid w:val="00B76C90"/>
     <w:rPr>
@@ -12023,9 +12151,9 @@
       <w:color w:val="0F4761" w:themeColor="accent1" w:themeShade="BF"/>
     </w:rPr>
   </w:style>
-  <w:style w:type="character" w:styleId="Riferimentointenso">
+  <w:style w:type="character" w:styleId="IntenseReference">
     <w:name w:val="Intense Reference"/>
-    <w:basedOn w:val="Carpredefinitoparagrafo"/>
+    <w:basedOn w:val="DefaultParagraphFont"/>
     <w:uiPriority w:val="32"/>
     <w:qFormat/>
     <w:rsid w:val="00B76C90"/>
@@ -12036,6 +12164,24 @@
       <w:color w:val="0F4761" w:themeColor="accent1" w:themeShade="BF"/>
       <w:spacing w:val="5"/>
     </w:rPr>
+  </w:style>
+  <w:style w:type="character" w:styleId="HTMLCode">
+    <w:name w:val="HTML Code"/>
+    <w:basedOn w:val="DefaultParagraphFont"/>
+    <w:uiPriority w:val="99"/>
+    <w:semiHidden/>
+    <w:unhideWhenUsed/>
+    <w:rsid w:val="00204719"/>
+    <w:rPr>
+      <w:rFonts w:ascii="Courier New" w:eastAsia="Times New Roman" w:hAnsi="Courier New" w:cs="Courier New"/>
+      <w:sz w:val="20"/>
+      <w:szCs w:val="20"/>
+    </w:rPr>
+  </w:style>
+  <w:style w:type="character" w:customStyle="1" w:styleId="math-inline">
+    <w:name w:val="math-inline"/>
+    <w:basedOn w:val="DefaultParagraphFont"/>
+    <w:rsid w:val="00204719"/>
   </w:style>
 </w:styles>
 </file>

</xml_diff>

<commit_message>
Update PATTERNS.docx with new content
</commit_message>
<xml_diff>
--- a/docs/PATTERNS.docx
+++ b/docs/PATTERNS.docx
@@ -10648,6 +10648,54 @@
         </w:rPr>
         <w:t>:</w:t>
       </w:r>
+      <w:r>
+        <w:rPr>
+          <w:b/>
+          <w:bCs/>
+          <w:color w:val="C00000"/>
+          <w:lang w:val="en-US"/>
+        </w:rPr>
+        <w:t xml:space="preserve"> </w:t>
+      </w:r>
+      <w:r>
+        <w:rPr>
+          <w:i/>
+          <w:iCs/>
+          <w:lang w:val="en-US"/>
+        </w:rPr>
+        <w:t>11</w:t>
+      </w:r>
+      <w:r>
+        <w:rPr>
+          <w:i/>
+          <w:iCs/>
+          <w:lang w:val="en-US"/>
+        </w:rPr>
+        <w:t>_</w:t>
+      </w:r>
+      <w:r>
+        <w:rPr>
+          <w:i/>
+          <w:iCs/>
+          <w:lang w:val="en-US"/>
+        </w:rPr>
+        <w:t xml:space="preserve">graphs </w:t>
+      </w:r>
+      <w:r>
+        <w:rPr>
+          <w:lang w:val="en-US"/>
+        </w:rPr>
+        <w:t xml:space="preserve">problem </w:t>
+      </w:r>
+      <w:r>
+        <w:rPr>
+          <w:b/>
+          <w:bCs/>
+          <w:highlight w:val="yellow"/>
+          <w:lang w:val="en-US"/>
+        </w:rPr>
+        <w:t>684_redundant_connection</w:t>
+      </w:r>
     </w:p>
     <w:p>
       <w:pPr>
@@ -10802,17 +10850,215 @@
     <w:p>
       <w:pPr>
         <w:rPr>
-          <w:lang w:val="en-US"/>
-        </w:rPr>
-      </w:pPr>
+          <w:b/>
+          <w:bCs/>
+          <w:color w:val="C00000"/>
+          <w:lang w:val="en-US"/>
+        </w:rPr>
+      </w:pPr>
+      <w:r>
+        <w:rPr>
+          <w:b/>
+          <w:bCs/>
+          <w:color w:val="C00000"/>
+          <w:lang w:val="en-US"/>
+        </w:rPr>
+        <w:t xml:space="preserve">WORD LADDER: </w:t>
+      </w:r>
+      <w:r>
+        <w:rPr>
+          <w:i/>
+          <w:iCs/>
+          <w:lang w:val="en-US"/>
+        </w:rPr>
+        <w:t>11</w:t>
+      </w:r>
+      <w:r>
+        <w:rPr>
+          <w:i/>
+          <w:iCs/>
+          <w:lang w:val="en-US"/>
+        </w:rPr>
+        <w:t>_</w:t>
+      </w:r>
+      <w:r>
+        <w:rPr>
+          <w:i/>
+          <w:iCs/>
+          <w:lang w:val="en-US"/>
+        </w:rPr>
+        <w:t xml:space="preserve">graphs </w:t>
+      </w:r>
+      <w:r>
+        <w:rPr>
+          <w:lang w:val="en-US"/>
+        </w:rPr>
+        <w:t xml:space="preserve">problem </w:t>
+      </w:r>
+      <w:r>
+        <w:rPr>
+          <w:b/>
+          <w:bCs/>
+          <w:highlight w:val="yellow"/>
+          <w:lang w:val="en-US"/>
+        </w:rPr>
+        <w:t>127</w:t>
+      </w:r>
+      <w:r>
+        <w:rPr>
+          <w:b/>
+          <w:bCs/>
+          <w:highlight w:val="yellow"/>
+          <w:lang w:val="en-US"/>
+        </w:rPr>
+        <w:t>_</w:t>
+      </w:r>
+      <w:r>
+        <w:rPr>
+          <w:b/>
+          <w:bCs/>
+          <w:highlight w:val="yellow"/>
+          <w:lang w:val="en-US"/>
+        </w:rPr>
+        <w:t>word_ladder</w:t>
+      </w:r>
     </w:p>
     <w:p>
       <w:pPr>
         <w:rPr>
-          <w:lang w:val="en-US"/>
-        </w:rPr>
-      </w:pPr>
+          <w:b/>
+          <w:bCs/>
+          <w:lang w:val="en-US"/>
+        </w:rPr>
+      </w:pPr>
+      <w:r>
+        <w:rPr>
+          <w:lang w:val="en-US"/>
+        </w:rPr>
+        <w:t xml:space="preserve">Find </w:t>
+      </w:r>
+      <w:r>
+        <w:rPr>
+          <w:b/>
+          <w:bCs/>
+          <w:lang w:val="en-US"/>
+        </w:rPr>
+        <w:t>patterns</w:t>
+      </w:r>
+      <w:r>
+        <w:rPr>
+          <w:lang w:val="en-US"/>
+        </w:rPr>
+        <w:t xml:space="preserve"> and then create graphs with </w:t>
+      </w:r>
+      <w:r>
+        <w:rPr>
+          <w:b/>
+          <w:bCs/>
+          <w:lang w:val="en-US"/>
+        </w:rPr>
+        <w:t xml:space="preserve">pattern </w:t>
+      </w:r>
+      <w:r>
+        <w:rPr>
+          <w:b/>
+          <w:bCs/>
+          <w:lang w:val="en-US"/>
+        </w:rPr>
+        <w:sym w:font="Wingdings" w:char="F0E0"/>
+      </w:r>
+      <w:r>
+        <w:rPr>
+          <w:b/>
+          <w:bCs/>
+          <w:lang w:val="en-US"/>
+        </w:rPr>
+        <w:t xml:space="preserve"> [LIST OF ELEMENTS IN THE ORIGINAL LIST BELONGING TO THIS PATTERN]</w:t>
+      </w:r>
+      <w:r>
+        <w:rPr>
+          <w:b/>
+          <w:bCs/>
+          <w:lang w:val="en-US"/>
+        </w:rPr>
+        <w:t>.</w:t>
+      </w:r>
     </w:p>
+    <w:p>
+      <w:pPr>
+        <w:rPr>
+          <w:color w:val="C00000"/>
+        </w:rPr>
+      </w:pPr>
+      <w:r>
+        <w:t xml:space="preserve">Poi faccio </w:t>
+      </w:r>
+      <w:r>
+        <w:rPr>
+          <w:b/>
+          <w:bCs/>
+        </w:rPr>
+        <w:t>BFS</w:t>
+      </w:r>
+      <w:r>
+        <w:t xml:space="preserve"> mettendo nella </w:t>
+      </w:r>
+      <w:proofErr w:type="spellStart"/>
+      <w:r>
+        <w:rPr>
+          <w:b/>
+          <w:bCs/>
+        </w:rPr>
+        <w:t>queue</w:t>
+      </w:r>
+      <w:proofErr w:type="spellEnd"/>
+      <w:r>
+        <w:t xml:space="preserve"> solo </w:t>
+      </w:r>
+      <w:r>
+        <w:rPr>
+          <w:b/>
+          <w:bCs/>
+        </w:rPr>
+        <w:t>WORD REALI</w:t>
+      </w:r>
+      <w:r>
+        <w:t xml:space="preserve"> della ORIGINL LIST cercando tra i </w:t>
+      </w:r>
+      <w:proofErr w:type="spellStart"/>
+      <w:r>
+        <w:rPr>
+          <w:b/>
+          <w:bCs/>
+        </w:rPr>
+        <w:t>neighbors</w:t>
+      </w:r>
+      <w:proofErr w:type="spellEnd"/>
+      <w:r>
+        <w:t xml:space="preserve"> del pattern (calcolato </w:t>
+      </w:r>
+      <w:r>
+        <w:rPr>
+          <w:b/>
+          <w:bCs/>
+        </w:rPr>
+        <w:t>on-the-</w:t>
+      </w:r>
+      <w:proofErr w:type="spellStart"/>
+      <w:r>
+        <w:rPr>
+          <w:b/>
+          <w:bCs/>
+        </w:rPr>
+        <w:t>fly</w:t>
+      </w:r>
+      <w:proofErr w:type="spellEnd"/>
+      <w:r>
+        <w:t>) della WORD.</w:t>
+      </w:r>
+    </w:p>
+    <w:p/>
+    <w:p/>
     <w:sectPr>
       <w:pgSz w:w="11906" w:h="16838"/>
       <w:pgMar w:top="1417" w:right="1134" w:bottom="1134" w:left="1134" w:header="708" w:footer="708" w:gutter="0"/>

</xml_diff>

<commit_message>
Add implementation for hammingWeight function to count the number of 1 bits in an integer
</commit_message>
<xml_diff>
--- a/docs/PATTERNS.docx
+++ b/docs/PATTERNS.docx
@@ -10637,16 +10637,7 @@
           <w:color w:val="C00000"/>
           <w:lang w:val="en-US"/>
         </w:rPr>
-        <w:t>VERSE ACKERMANN FUNCTION</w:t>
-      </w:r>
-      <w:r>
-        <w:rPr>
-          <w:b/>
-          <w:bCs/>
-          <w:color w:val="C00000"/>
-          <w:lang w:val="en-US"/>
-        </w:rPr>
-        <w:t>:</w:t>
+        <w:t>VERSE ACKERMANN FUNCTION:</w:t>
       </w:r>
       <w:r>
         <w:rPr>
@@ -10773,18 +10764,23 @@
           <w:bCs/>
           <w:lang w:val="en-US"/>
         </w:rPr>
-        <w:t>alpha</w:t>
+        <w:t>alpha * (N))</w:t>
       </w:r>
       <w:r>
         <w:rPr>
           <w:rStyle w:val="math-inline"/>
           <w:rFonts w:ascii="Arial" w:hAnsi="Arial" w:cs="Arial"/>
-          <w:b/>
-          <w:bCs/>
-          <w:lang w:val="en-US"/>
-        </w:rPr>
-        <w:t xml:space="preserve"> * </w:t>
-      </w:r>
+          <w:lang w:val="en-US"/>
+        </w:rPr>
+        <w:t xml:space="preserve"> </w:t>
+      </w:r>
+      <w:r>
+        <w:rPr>
+          <w:lang w:val="en-US"/>
+        </w:rPr>
+        <w:t xml:space="preserve">(the Inverse Ackermann function), which is effectively </w:t>
+      </w:r>
+      <w:proofErr w:type="gramStart"/>
       <w:r>
         <w:rPr>
           <w:rStyle w:val="math-inline"/>
@@ -10793,38 +10789,13 @@
           <w:bCs/>
           <w:lang w:val="en-US"/>
         </w:rPr>
-        <w:t>(N))</w:t>
-      </w:r>
+        <w:t>O(</w:t>
+      </w:r>
+      <w:proofErr w:type="gramEnd"/>
       <w:r>
         <w:rPr>
           <w:rStyle w:val="math-inline"/>
           <w:rFonts w:ascii="Arial" w:hAnsi="Arial" w:cs="Arial"/>
-          <w:lang w:val="en-US"/>
-        </w:rPr>
-        <w:t xml:space="preserve"> </w:t>
-      </w:r>
-      <w:r>
-        <w:rPr>
-          <w:lang w:val="en-US"/>
-        </w:rPr>
-        <w:t xml:space="preserve">(the Inverse Ackermann function), which is effectively </w:t>
-      </w:r>
-      <w:proofErr w:type="gramStart"/>
-      <w:r>
-        <w:rPr>
-          <w:rStyle w:val="math-inline"/>
-          <w:rFonts w:ascii="Arial" w:hAnsi="Arial" w:cs="Arial"/>
-          <w:b/>
-          <w:bCs/>
-          <w:lang w:val="en-US"/>
-        </w:rPr>
-        <w:t>O(</w:t>
-      </w:r>
-      <w:proofErr w:type="gramEnd"/>
-      <w:r>
-        <w:rPr>
-          <w:rStyle w:val="math-inline"/>
-          <w:rFonts w:ascii="Arial" w:hAnsi="Arial" w:cs="Arial"/>
           <w:b/>
           <w:bCs/>
           <w:lang w:val="en-US"/>
@@ -10911,16 +10882,7 @@
           <w:highlight w:val="yellow"/>
           <w:lang w:val="en-US"/>
         </w:rPr>
-        <w:t>_</w:t>
-      </w:r>
-      <w:r>
-        <w:rPr>
-          <w:b/>
-          <w:bCs/>
-          <w:highlight w:val="yellow"/>
-          <w:lang w:val="en-US"/>
-        </w:rPr>
-        <w:t>word_ladder</w:t>
+        <w:t>_word_ladder</w:t>
       </w:r>
     </w:p>
     <w:p>
@@ -11059,6 +11021,219 @@
     </w:p>
     <w:p/>
     <w:p/>
+    <w:p/>
+    <w:p/>
+    <w:p/>
+    <w:p/>
+    <w:p/>
+    <w:p/>
+    <w:p/>
+    <w:p>
+      <w:pPr>
+        <w:rPr>
+          <w:b/>
+          <w:bCs/>
+          <w:color w:val="4EA72E" w:themeColor="accent6"/>
+          <w:sz w:val="40"/>
+          <w:szCs w:val="40"/>
+          <w:lang w:val="en-US"/>
+        </w:rPr>
+      </w:pPr>
+      <w:r>
+        <w:rPr>
+          <w:b/>
+          <w:bCs/>
+          <w:color w:val="4EA72E" w:themeColor="accent6"/>
+          <w:sz w:val="40"/>
+          <w:szCs w:val="40"/>
+          <w:lang w:val="en-US"/>
+        </w:rPr>
+        <w:lastRenderedPageBreak/>
+        <w:t>BIT MANIPULATION</w:t>
+      </w:r>
+      <w:r>
+        <w:rPr>
+          <w:b/>
+          <w:bCs/>
+          <w:color w:val="4EA72E" w:themeColor="accent6"/>
+          <w:sz w:val="40"/>
+          <w:szCs w:val="40"/>
+          <w:lang w:val="en-US"/>
+        </w:rPr>
+        <w:t>:</w:t>
+      </w:r>
+    </w:p>
+    <w:p>
+      <w:pPr>
+        <w:rPr>
+          <w:b/>
+          <w:bCs/>
+          <w:lang w:val="en-US"/>
+        </w:rPr>
+      </w:pPr>
+    </w:p>
+    <w:p>
+      <w:pPr>
+        <w:rPr>
+          <w:b/>
+          <w:bCs/>
+          <w:color w:val="C00000"/>
+          <w:lang w:val="en-US"/>
+        </w:rPr>
+      </w:pPr>
+      <w:r>
+        <w:rPr>
+          <w:b/>
+          <w:bCs/>
+          <w:color w:val="C00000"/>
+          <w:lang w:val="en-US"/>
+        </w:rPr>
+        <w:t>COUNT ONES</w:t>
+      </w:r>
+      <w:r>
+        <w:rPr>
+          <w:b/>
+          <w:bCs/>
+          <w:color w:val="C00000"/>
+          <w:lang w:val="en-US"/>
+        </w:rPr>
+        <w:t xml:space="preserve">: </w:t>
+      </w:r>
+      <w:r>
+        <w:rPr>
+          <w:lang w:val="en-US"/>
+        </w:rPr>
+        <w:t>see</w:t>
+      </w:r>
+      <w:r>
+        <w:rPr>
+          <w:i/>
+          <w:iCs/>
+          <w:lang w:val="en-US"/>
+        </w:rPr>
+        <w:t xml:space="preserve"> 17</w:t>
+      </w:r>
+      <w:r>
+        <w:rPr>
+          <w:i/>
+          <w:iCs/>
+          <w:lang w:val="en-US"/>
+        </w:rPr>
+        <w:t>_</w:t>
+      </w:r>
+      <w:r>
+        <w:rPr>
+          <w:i/>
+          <w:iCs/>
+          <w:lang w:val="en-US"/>
+        </w:rPr>
+        <w:t xml:space="preserve">graphs </w:t>
+      </w:r>
+      <w:r>
+        <w:rPr>
+          <w:lang w:val="en-US"/>
+        </w:rPr>
+        <w:t xml:space="preserve">problem </w:t>
+      </w:r>
+      <w:r>
+        <w:rPr>
+          <w:b/>
+          <w:bCs/>
+          <w:highlight w:val="yellow"/>
+          <w:lang w:val="en-US"/>
+        </w:rPr>
+        <w:t>191</w:t>
+      </w:r>
+      <w:r>
+        <w:rPr>
+          <w:b/>
+          <w:bCs/>
+          <w:highlight w:val="yellow"/>
+          <w:lang w:val="en-US"/>
+        </w:rPr>
+        <w:t>_</w:t>
+      </w:r>
+      <w:r>
+        <w:rPr>
+          <w:b/>
+          <w:bCs/>
+          <w:highlight w:val="yellow"/>
+          <w:lang w:val="en-US"/>
+        </w:rPr>
+        <w:t>number_of_ones</w:t>
+      </w:r>
+    </w:p>
+    <w:p>
+      <w:pPr>
+        <w:rPr>
+          <w:lang w:val="en-US"/>
+        </w:rPr>
+      </w:pPr>
+      <w:r>
+        <w:rPr>
+          <w:lang w:val="en-US"/>
+        </w:rPr>
+        <w:t xml:space="preserve">IF WE DO </w:t>
+      </w:r>
+      <w:r>
+        <w:rPr>
+          <w:b/>
+          <w:bCs/>
+          <w:lang w:val="en-US"/>
+        </w:rPr>
+        <w:t>n – 1</w:t>
+      </w:r>
+      <w:r>
+        <w:rPr>
+          <w:lang w:val="en-US"/>
+        </w:rPr>
+        <w:t xml:space="preserve"> we flip the LEST SIGNIFICANT 1 to 0 and TRANSFORM ALL THE ZEROS TO ITS RIGHT TO ONES (if any)</w:t>
+      </w:r>
+    </w:p>
+    <w:p>
+      <w:pPr>
+        <w:rPr>
+          <w:lang w:val="en-US"/>
+        </w:rPr>
+      </w:pPr>
+      <w:r>
+        <w:rPr>
+          <w:lang w:val="en-US"/>
+        </w:rPr>
+        <w:t xml:space="preserve">IF WE DO </w:t>
+      </w:r>
+      <w:r>
+        <w:rPr>
+          <w:b/>
+          <w:bCs/>
+          <w:lang w:val="en-US"/>
+        </w:rPr>
+        <w:t>n &amp; (n – 1)</w:t>
+      </w:r>
+      <w:r>
+        <w:rPr>
+          <w:lang w:val="en-US"/>
+        </w:rPr>
+        <w:t xml:space="preserve"> we TRANSFORM TO 0 the LEAST SIGNIFICANT ONE present in n skipping iterating over the leading ZEROS</w:t>
+      </w:r>
+    </w:p>
+    <w:p>
+      <w:pPr>
+        <w:rPr>
+          <w:b/>
+          <w:bCs/>
+          <w:lang w:val="en-US"/>
+        </w:rPr>
+      </w:pPr>
+      <w:r>
+        <w:rPr>
+          <w:b/>
+          <w:bCs/>
+          <w:lang w:val="en-US"/>
+        </w:rPr>
+        <w:t>I CAN CONTINUE UNTIL N IS 0</w:t>
+      </w:r>
+    </w:p>
     <w:sectPr>
       <w:pgSz w:w="11906" w:h="16838"/>
       <w:pgMar w:top="1417" w:right="1134" w:bottom="1134" w:left="1134" w:header="708" w:footer="708" w:gutter="0"/>
@@ -12097,7 +12272,6 @@
   <w:style w:type="character" w:default="1" w:styleId="DefaultParagraphFont">
     <w:name w:val="Default Paragraph Font"/>
     <w:uiPriority w:val="1"/>
-    <w:semiHidden/>
     <w:unhideWhenUsed/>
   </w:style>
   <w:style w:type="table" w:default="1" w:styleId="TableNormal">

</xml_diff>

<commit_message>
Add implementation for word break problem
</commit_message>
<xml_diff>
--- a/docs/PATTERNS.docx
+++ b/docs/PATTERNS.docx
@@ -10080,7 +10080,25 @@
           <w:color w:val="C00000"/>
           <w:lang w:val="en-US"/>
         </w:rPr>
-        <w:t>AHO COEASIK</w:t>
+        <w:t>AHO CO</w:t>
+      </w:r>
+      <w:r>
+        <w:rPr>
+          <w:b/>
+          <w:bCs/>
+          <w:color w:val="C00000"/>
+          <w:lang w:val="en-US"/>
+        </w:rPr>
+        <w:t>R</w:t>
+      </w:r>
+      <w:r>
+        <w:rPr>
+          <w:b/>
+          <w:bCs/>
+          <w:color w:val="C00000"/>
+          <w:lang w:val="en-US"/>
+        </w:rPr>
+        <w:t>ASIK</w:t>
       </w:r>
       <w:r>
         <w:rPr>
@@ -12416,13 +12434,69 @@
         <w:rPr>
           <w:lang w:val="en-US"/>
         </w:rPr>
-        <w:t xml:space="preserve"> per MAXIMUM SUBARRAY SUM e MAXIMUM S</w:t>
-      </w:r>
-      <w:r>
-        <w:rPr>
-          <w:lang w:val="en-US"/>
-        </w:rPr>
-        <w:t xml:space="preserve">UBARRAY PRODUCT. </w:t>
+        <w:t xml:space="preserve"> per </w:t>
+      </w:r>
+      <w:r>
+        <w:rPr>
+          <w:b/>
+          <w:bCs/>
+          <w:lang w:val="en-US"/>
+        </w:rPr>
+        <w:t>MAXIMUM SUBARRAY</w:t>
+      </w:r>
+      <w:r>
+        <w:rPr>
+          <w:lang w:val="en-US"/>
+        </w:rPr>
+        <w:t xml:space="preserve"> </w:t>
+      </w:r>
+      <w:r>
+        <w:rPr>
+          <w:b/>
+          <w:bCs/>
+          <w:i/>
+          <w:iCs/>
+          <w:u w:val="single"/>
+          <w:lang w:val="en-US"/>
+        </w:rPr>
+        <w:t>SUM</w:t>
+      </w:r>
+      <w:r>
+        <w:rPr>
+          <w:lang w:val="en-US"/>
+        </w:rPr>
+        <w:t xml:space="preserve"> e </w:t>
+      </w:r>
+      <w:r>
+        <w:rPr>
+          <w:b/>
+          <w:bCs/>
+          <w:lang w:val="en-US"/>
+        </w:rPr>
+        <w:t>MAXIMUM SUBARRAY</w:t>
+      </w:r>
+      <w:r>
+        <w:rPr>
+          <w:lang w:val="en-US"/>
+        </w:rPr>
+        <w:t xml:space="preserve"> </w:t>
+      </w:r>
+      <w:r>
+        <w:rPr>
+          <w:b/>
+          <w:bCs/>
+          <w:i/>
+          <w:iCs/>
+          <w:u w:val="single"/>
+          <w:lang w:val="en-US"/>
+        </w:rPr>
+        <w:t>PRODUCT</w:t>
+      </w:r>
+      <w:r>
+        <w:rPr>
+          <w:lang w:val="en-US"/>
+        </w:rPr>
+        <w:t xml:space="preserve">. </w:t>
       </w:r>
     </w:p>
     <w:p>

</xml_diff>

<commit_message>
Update schedule to mark Greedy paradigm as complete
</commit_message>
<xml_diff>
--- a/docs/PATTERNS.docx
+++ b/docs/PATTERNS.docx
@@ -8404,7 +8404,7 @@
           <w:kern w:val="0"/>
           <w:sz w:val="21"/>
           <w:szCs w:val="21"/>
-          <w:lang w:val="en-US" w:eastAsia="it-IT"/>
+          <w:lang w:eastAsia="it-IT"/>
           <w14:ligatures w14:val="none"/>
         </w:rPr>
       </w:pPr>
@@ -8429,7 +8429,7 @@
           <w:kern w:val="0"/>
           <w:sz w:val="21"/>
           <w:szCs w:val="21"/>
-          <w:lang w:val="en-US" w:eastAsia="it-IT"/>
+          <w:lang w:eastAsia="it-IT"/>
           <w14:ligatures w14:val="none"/>
         </w:rPr>
         <w:t>pred</w:t>
@@ -8441,7 +8441,7 @@
           <w:kern w:val="0"/>
           <w:sz w:val="21"/>
           <w:szCs w:val="21"/>
-          <w:lang w:val="en-US" w:eastAsia="it-IT"/>
+          <w:lang w:eastAsia="it-IT"/>
           <w14:ligatures w14:val="none"/>
         </w:rPr>
         <w:t>.right</w:t>
@@ -8455,7 +8455,7 @@
           <w:kern w:val="0"/>
           <w:sz w:val="21"/>
           <w:szCs w:val="21"/>
-          <w:lang w:val="en-US" w:eastAsia="it-IT"/>
+          <w:lang w:eastAsia="it-IT"/>
           <w14:ligatures w14:val="none"/>
         </w:rPr>
         <w:t xml:space="preserve"> </w:t>
@@ -8467,7 +8467,7 @@
           <w:kern w:val="0"/>
           <w:sz w:val="21"/>
           <w:szCs w:val="21"/>
-          <w:lang w:val="en-US" w:eastAsia="it-IT"/>
+          <w:lang w:eastAsia="it-IT"/>
           <w14:ligatures w14:val="none"/>
         </w:rPr>
         <w:t>=</w:t>
@@ -8479,7 +8479,7 @@
           <w:kern w:val="0"/>
           <w:sz w:val="21"/>
           <w:szCs w:val="21"/>
-          <w:lang w:val="en-US" w:eastAsia="it-IT"/>
+          <w:lang w:eastAsia="it-IT"/>
           <w14:ligatures w14:val="none"/>
         </w:rPr>
         <w:t xml:space="preserve"> </w:t>
@@ -8492,7 +8492,7 @@
           <w:kern w:val="0"/>
           <w:sz w:val="21"/>
           <w:szCs w:val="21"/>
-          <w:lang w:val="en-US" w:eastAsia="it-IT"/>
+          <w:lang w:eastAsia="it-IT"/>
           <w14:ligatures w14:val="none"/>
         </w:rPr>
         <w:t>curr</w:t>
@@ -8509,18 +8509,18 @@
           <w:kern w:val="0"/>
           <w:sz w:val="21"/>
           <w:szCs w:val="21"/>
-          <w:lang w:val="en-US" w:eastAsia="it-IT"/>
-          <w14:ligatures w14:val="none"/>
-        </w:rPr>
-      </w:pPr>
-      <w:r>
-        <w:rPr>
-          <w:rFonts w:ascii="Consolas" w:eastAsia="Times New Roman" w:hAnsi="Consolas" w:cs="Times New Roman"/>
-          <w:color w:val="BBBEBF"/>
-          <w:kern w:val="0"/>
-          <w:sz w:val="21"/>
-          <w:szCs w:val="21"/>
-          <w:lang w:val="en-US" w:eastAsia="it-IT"/>
+          <w:lang w:eastAsia="it-IT"/>
+          <w14:ligatures w14:val="none"/>
+        </w:rPr>
+      </w:pPr>
+      <w:r>
+        <w:rPr>
+          <w:rFonts w:ascii="Consolas" w:eastAsia="Times New Roman" w:hAnsi="Consolas" w:cs="Times New Roman"/>
+          <w:color w:val="BBBEBF"/>
+          <w:kern w:val="0"/>
+          <w:sz w:val="21"/>
+          <w:szCs w:val="21"/>
+          <w:lang w:eastAsia="it-IT"/>
           <w14:ligatures w14:val="none"/>
         </w:rPr>
         <w:lastRenderedPageBreak/>
@@ -8534,7 +8534,7 @@
           <w:kern w:val="0"/>
           <w:sz w:val="21"/>
           <w:szCs w:val="21"/>
-          <w:lang w:val="en-US" w:eastAsia="it-IT"/>
+          <w:lang w:eastAsia="it-IT"/>
           <w14:ligatures w14:val="none"/>
         </w:rPr>
         <w:t>curr</w:t>
@@ -8547,7 +8547,7 @@
           <w:kern w:val="0"/>
           <w:sz w:val="21"/>
           <w:szCs w:val="21"/>
-          <w:lang w:val="en-US" w:eastAsia="it-IT"/>
+          <w:lang w:eastAsia="it-IT"/>
           <w14:ligatures w14:val="none"/>
         </w:rPr>
         <w:t xml:space="preserve"> </w:t>
@@ -8559,7 +8559,7 @@
           <w:kern w:val="0"/>
           <w:sz w:val="21"/>
           <w:szCs w:val="21"/>
-          <w:lang w:val="en-US" w:eastAsia="it-IT"/>
+          <w:lang w:eastAsia="it-IT"/>
           <w14:ligatures w14:val="none"/>
         </w:rPr>
         <w:t>=</w:t>
@@ -8571,13 +8571,12 @@
           <w:kern w:val="0"/>
           <w:sz w:val="21"/>
           <w:szCs w:val="21"/>
-          <w:lang w:val="en-US" w:eastAsia="it-IT"/>
+          <w:lang w:eastAsia="it-IT"/>
           <w14:ligatures w14:val="none"/>
         </w:rPr>
         <w:t xml:space="preserve"> </w:t>
       </w:r>
       <w:proofErr w:type="spellStart"/>
-      <w:proofErr w:type="gramStart"/>
       <w:r>
         <w:rPr>
           <w:rFonts w:ascii="Consolas" w:eastAsia="Times New Roman" w:hAnsi="Consolas" w:cs="Times New Roman"/>
@@ -8585,7 +8584,7 @@
           <w:kern w:val="0"/>
           <w:sz w:val="21"/>
           <w:szCs w:val="21"/>
-          <w:lang w:val="en-US" w:eastAsia="it-IT"/>
+          <w:lang w:eastAsia="it-IT"/>
           <w14:ligatures w14:val="none"/>
         </w:rPr>
         <w:t>curr</w:t>
@@ -8597,13 +8596,12 @@
           <w:kern w:val="0"/>
           <w:sz w:val="21"/>
           <w:szCs w:val="21"/>
-          <w:lang w:val="en-US" w:eastAsia="it-IT"/>
+          <w:lang w:eastAsia="it-IT"/>
           <w14:ligatures w14:val="none"/>
         </w:rPr>
         <w:t>.left</w:t>
       </w:r>
       <w:proofErr w:type="spellEnd"/>
-      <w:proofErr w:type="gramEnd"/>
     </w:p>
     <w:p>
       <w:pPr>
@@ -8626,7 +8624,7 @@
           <w:kern w:val="0"/>
           <w:sz w:val="21"/>
           <w:szCs w:val="21"/>
-          <w:lang w:val="en-US" w:eastAsia="it-IT"/>
+          <w:lang w:eastAsia="it-IT"/>
           <w14:ligatures w14:val="none"/>
         </w:rPr>
         <w:t xml:space="preserve">                </w:t>
@@ -10098,25 +10096,7 @@
           <w:color w:val="C00000"/>
           <w:lang w:val="en-US"/>
         </w:rPr>
-        <w:t>ASIK</w:t>
-      </w:r>
-      <w:r>
-        <w:rPr>
-          <w:b/>
-          <w:bCs/>
-          <w:color w:val="C00000"/>
-          <w:lang w:val="en-US"/>
-        </w:rPr>
-        <w:t xml:space="preserve"> ALGORITHM:</w:t>
-      </w:r>
-      <w:r>
-        <w:rPr>
-          <w:b/>
-          <w:bCs/>
-          <w:color w:val="C00000"/>
-          <w:lang w:val="en-US"/>
-        </w:rPr>
-        <w:t xml:space="preserve"> </w:t>
+        <w:t xml:space="preserve">ASIK ALGORITHM: </w:t>
       </w:r>
       <w:r>
         <w:rPr>
@@ -10124,15 +10104,7 @@
           <w:iCs/>
           <w:lang w:val="en-US"/>
         </w:rPr>
-        <w:t xml:space="preserve">see </w:t>
-      </w:r>
-      <w:r>
-        <w:rPr>
-          <w:i/>
-          <w:iCs/>
-          <w:lang w:val="en-US"/>
-        </w:rPr>
-        <w:t>NeetCode150\8_tries\AHO</w:t>
+        <w:t>see NeetCode150\8_tries\AHO</w:t>
       </w:r>
     </w:p>
     <w:p>
@@ -12057,11 +12029,6 @@
     <w:p/>
     <w:p/>
     <w:p/>
-    <w:p/>
-    <w:p/>
-    <w:p/>
-    <w:p/>
-    <w:p/>
     <w:p>
       <w:pPr>
         <w:rPr>
@@ -12315,25 +12282,7 @@
           <w:color w:val="C00000"/>
           <w:lang w:val="en-US"/>
         </w:rPr>
-        <w:t>KADANE’S ALGORITHM</w:t>
-      </w:r>
-      <w:r>
-        <w:rPr>
-          <w:b/>
-          <w:bCs/>
-          <w:color w:val="C00000"/>
-          <w:lang w:val="en-US"/>
-        </w:rPr>
-        <w:t>:</w:t>
-      </w:r>
-      <w:r>
-        <w:rPr>
-          <w:b/>
-          <w:bCs/>
-          <w:color w:val="C00000"/>
-          <w:lang w:val="en-US"/>
-        </w:rPr>
-        <w:t xml:space="preserve"> </w:t>
+        <w:t xml:space="preserve">KADANE’S ALGORITHM: </w:t>
       </w:r>
       <w:r>
         <w:rPr>
@@ -12386,16 +12335,7 @@
           <w:highlight w:val="yellow"/>
           <w:lang w:val="en-US"/>
         </w:rPr>
-        <w:t>1</w:t>
-      </w:r>
-      <w:r>
-        <w:rPr>
-          <w:b/>
-          <w:bCs/>
-          <w:highlight w:val="yellow"/>
-          <w:lang w:val="en-US"/>
-        </w:rPr>
-        <w:t>52</w:t>
+        <w:t>152</w:t>
       </w:r>
       <w:r>
         <w:rPr>
@@ -12524,7 +12464,6 @@
         <w:pStyle w:val="Paragrafoelenco"/>
       </w:pPr>
       <w:r>
-        <w:lastRenderedPageBreak/>
         <w:t xml:space="preserve">Mantiene il MASSIMO tra </w:t>
       </w:r>
       <w:r>
@@ -12965,6 +12904,7 @@
           <w:lang w:eastAsia="it-IT"/>
           <w14:ligatures w14:val="none"/>
         </w:rPr>
+        <w:lastRenderedPageBreak/>
         <w:t xml:space="preserve">    </w:t>
       </w:r>
       <w:proofErr w:type="spellStart"/>
@@ -14021,13 +13961,7 @@
       <w:proofErr w:type="spellEnd"/>
       <w:proofErr w:type="gramStart"/>
       <w:r>
-        <w:t>)</w:t>
-      </w:r>
-      <w:r>
-        <w:t xml:space="preserve"> </w:t>
-      </w:r>
-      <w:r>
-        <w:t>,</w:t>
+        <w:t>) ,</w:t>
       </w:r>
       <w:proofErr w:type="gramEnd"/>
       <w:r>
@@ -14048,14 +13982,7 @@
           <w:b/>
           <w:bCs/>
         </w:rPr>
-        <w:t>CURRENT NUM * CURM</w:t>
-      </w:r>
-      <w:r>
-        <w:rPr>
-          <w:b/>
-          <w:bCs/>
-        </w:rPr>
-        <w:t>IN</w:t>
+        <w:t>CURRENT NUM * CURMIN</w:t>
       </w:r>
       <w:r>
         <w:t xml:space="preserve"> (</w:t>
@@ -14066,10 +13993,7 @@
       </w:r>
       <w:proofErr w:type="spellEnd"/>
       <w:r>
-        <w:t xml:space="preserve"> </w:t>
-      </w:r>
-      <w:r>
-        <w:t xml:space="preserve">min </w:t>
+        <w:t xml:space="preserve"> min </w:t>
       </w:r>
       <w:proofErr w:type="spellStart"/>
       <w:r>
@@ -14077,16 +14001,7 @@
       </w:r>
       <w:proofErr w:type="spellEnd"/>
       <w:r>
-        <w:t>, dato che se incontro due numeri negativi possono diventare positivi</w:t>
-      </w:r>
-      <w:r>
-        <w:t xml:space="preserve">) </w:t>
-      </w:r>
-      <w:r>
-        <w:t xml:space="preserve"> </w:t>
-      </w:r>
-      <w:r>
-        <w:t xml:space="preserve"> </w:t>
+        <w:t xml:space="preserve">, dato che se incontro due numeri negativi possono diventare positivi)   </w:t>
       </w:r>
     </w:p>
     <w:p>
@@ -17052,6 +16967,7 @@
   <w:style w:type="character" w:default="1" w:styleId="Carpredefinitoparagrafo">
     <w:name w:val="Default Paragraph Font"/>
     <w:uiPriority w:val="1"/>
+    <w:semiHidden/>
     <w:unhideWhenUsed/>
   </w:style>
   <w:style w:type="table" w:default="1" w:styleId="Tabellanormale">

</xml_diff>

<commit_message>
Add implementations for Merge Intervals problem using sorting, sweep line algorithm, and greedy approaches
</commit_message>
<xml_diff>
--- a/docs/PATTERNS.docx
+++ b/docs/PATTERNS.docx
@@ -8404,7 +8404,7 @@
           <w:kern w:val="0"/>
           <w:sz w:val="21"/>
           <w:szCs w:val="21"/>
-          <w:lang w:eastAsia="it-IT"/>
+          <w:lang w:val="en-US" w:eastAsia="it-IT"/>
           <w14:ligatures w14:val="none"/>
         </w:rPr>
       </w:pPr>
@@ -8429,7 +8429,7 @@
           <w:kern w:val="0"/>
           <w:sz w:val="21"/>
           <w:szCs w:val="21"/>
-          <w:lang w:eastAsia="it-IT"/>
+          <w:lang w:val="en-US" w:eastAsia="it-IT"/>
           <w14:ligatures w14:val="none"/>
         </w:rPr>
         <w:t>pred</w:t>
@@ -8441,7 +8441,7 @@
           <w:kern w:val="0"/>
           <w:sz w:val="21"/>
           <w:szCs w:val="21"/>
-          <w:lang w:eastAsia="it-IT"/>
+          <w:lang w:val="en-US" w:eastAsia="it-IT"/>
           <w14:ligatures w14:val="none"/>
         </w:rPr>
         <w:t>.right</w:t>
@@ -8455,7 +8455,7 @@
           <w:kern w:val="0"/>
           <w:sz w:val="21"/>
           <w:szCs w:val="21"/>
-          <w:lang w:eastAsia="it-IT"/>
+          <w:lang w:val="en-US" w:eastAsia="it-IT"/>
           <w14:ligatures w14:val="none"/>
         </w:rPr>
         <w:t xml:space="preserve"> </w:t>
@@ -8467,7 +8467,7 @@
           <w:kern w:val="0"/>
           <w:sz w:val="21"/>
           <w:szCs w:val="21"/>
-          <w:lang w:eastAsia="it-IT"/>
+          <w:lang w:val="en-US" w:eastAsia="it-IT"/>
           <w14:ligatures w14:val="none"/>
         </w:rPr>
         <w:t>=</w:t>
@@ -8479,7 +8479,7 @@
           <w:kern w:val="0"/>
           <w:sz w:val="21"/>
           <w:szCs w:val="21"/>
-          <w:lang w:eastAsia="it-IT"/>
+          <w:lang w:val="en-US" w:eastAsia="it-IT"/>
           <w14:ligatures w14:val="none"/>
         </w:rPr>
         <w:t xml:space="preserve"> </w:t>
@@ -8492,7 +8492,7 @@
           <w:kern w:val="0"/>
           <w:sz w:val="21"/>
           <w:szCs w:val="21"/>
-          <w:lang w:eastAsia="it-IT"/>
+          <w:lang w:val="en-US" w:eastAsia="it-IT"/>
           <w14:ligatures w14:val="none"/>
         </w:rPr>
         <w:t>curr</w:t>
@@ -8509,18 +8509,18 @@
           <w:kern w:val="0"/>
           <w:sz w:val="21"/>
           <w:szCs w:val="21"/>
-          <w:lang w:eastAsia="it-IT"/>
-          <w14:ligatures w14:val="none"/>
-        </w:rPr>
-      </w:pPr>
-      <w:r>
-        <w:rPr>
-          <w:rFonts w:ascii="Consolas" w:eastAsia="Times New Roman" w:hAnsi="Consolas" w:cs="Times New Roman"/>
-          <w:color w:val="BBBEBF"/>
-          <w:kern w:val="0"/>
-          <w:sz w:val="21"/>
-          <w:szCs w:val="21"/>
-          <w:lang w:eastAsia="it-IT"/>
+          <w:lang w:val="en-US" w:eastAsia="it-IT"/>
+          <w14:ligatures w14:val="none"/>
+        </w:rPr>
+      </w:pPr>
+      <w:r>
+        <w:rPr>
+          <w:rFonts w:ascii="Consolas" w:eastAsia="Times New Roman" w:hAnsi="Consolas" w:cs="Times New Roman"/>
+          <w:color w:val="BBBEBF"/>
+          <w:kern w:val="0"/>
+          <w:sz w:val="21"/>
+          <w:szCs w:val="21"/>
+          <w:lang w:val="en-US" w:eastAsia="it-IT"/>
           <w14:ligatures w14:val="none"/>
         </w:rPr>
         <w:lastRenderedPageBreak/>
@@ -8534,7 +8534,7 @@
           <w:kern w:val="0"/>
           <w:sz w:val="21"/>
           <w:szCs w:val="21"/>
-          <w:lang w:eastAsia="it-IT"/>
+          <w:lang w:val="en-US" w:eastAsia="it-IT"/>
           <w14:ligatures w14:val="none"/>
         </w:rPr>
         <w:t>curr</w:t>
@@ -8547,7 +8547,7 @@
           <w:kern w:val="0"/>
           <w:sz w:val="21"/>
           <w:szCs w:val="21"/>
-          <w:lang w:eastAsia="it-IT"/>
+          <w:lang w:val="en-US" w:eastAsia="it-IT"/>
           <w14:ligatures w14:val="none"/>
         </w:rPr>
         <w:t xml:space="preserve"> </w:t>
@@ -8559,7 +8559,7 @@
           <w:kern w:val="0"/>
           <w:sz w:val="21"/>
           <w:szCs w:val="21"/>
-          <w:lang w:eastAsia="it-IT"/>
+          <w:lang w:val="en-US" w:eastAsia="it-IT"/>
           <w14:ligatures w14:val="none"/>
         </w:rPr>
         <w:t>=</w:t>
@@ -8571,12 +8571,13 @@
           <w:kern w:val="0"/>
           <w:sz w:val="21"/>
           <w:szCs w:val="21"/>
-          <w:lang w:eastAsia="it-IT"/>
+          <w:lang w:val="en-US" w:eastAsia="it-IT"/>
           <w14:ligatures w14:val="none"/>
         </w:rPr>
         <w:t xml:space="preserve"> </w:t>
       </w:r>
       <w:proofErr w:type="spellStart"/>
+      <w:proofErr w:type="gramStart"/>
       <w:r>
         <w:rPr>
           <w:rFonts w:ascii="Consolas" w:eastAsia="Times New Roman" w:hAnsi="Consolas" w:cs="Times New Roman"/>
@@ -8584,7 +8585,7 @@
           <w:kern w:val="0"/>
           <w:sz w:val="21"/>
           <w:szCs w:val="21"/>
-          <w:lang w:eastAsia="it-IT"/>
+          <w:lang w:val="en-US" w:eastAsia="it-IT"/>
           <w14:ligatures w14:val="none"/>
         </w:rPr>
         <w:t>curr</w:t>
@@ -8596,12 +8597,13 @@
           <w:kern w:val="0"/>
           <w:sz w:val="21"/>
           <w:szCs w:val="21"/>
-          <w:lang w:eastAsia="it-IT"/>
+          <w:lang w:val="en-US" w:eastAsia="it-IT"/>
           <w14:ligatures w14:val="none"/>
         </w:rPr>
         <w:t>.left</w:t>
       </w:r>
       <w:proofErr w:type="spellEnd"/>
+      <w:proofErr w:type="gramEnd"/>
     </w:p>
     <w:p>
       <w:pPr>
@@ -8624,7 +8626,7 @@
           <w:kern w:val="0"/>
           <w:sz w:val="21"/>
           <w:szCs w:val="21"/>
-          <w:lang w:eastAsia="it-IT"/>
+          <w:lang w:val="en-US" w:eastAsia="it-IT"/>
           <w14:ligatures w14:val="none"/>
         </w:rPr>
         <w:t xml:space="preserve">                </w:t>
@@ -12027,8 +12029,6 @@
     </w:p>
     <w:p/>
     <w:p/>
-    <w:p/>
-    <w:p/>
     <w:p>
       <w:pPr>
         <w:rPr>
@@ -12904,7 +12904,6 @@
           <w:lang w:eastAsia="it-IT"/>
           <w14:ligatures w14:val="none"/>
         </w:rPr>
-        <w:lastRenderedPageBreak/>
         <w:t xml:space="preserve">    </w:t>
       </w:r>
       <w:proofErr w:type="spellStart"/>
@@ -13193,6 +13192,7 @@
           <w:lang w:val="en-US" w:eastAsia="it-IT"/>
           <w14:ligatures w14:val="none"/>
         </w:rPr>
+        <w:lastRenderedPageBreak/>
         <w:t xml:space="preserve">    </w:t>
       </w:r>
       <w:r>
@@ -15615,13 +15615,637 @@
     </w:p>
     <w:p>
       <w:pPr>
+        <w:rPr>
+          <w:b/>
+          <w:bCs/>
+          <w:lang w:val="en-US"/>
+        </w:rPr>
+      </w:pPr>
+    </w:p>
+    <w:p>
+      <w:pPr>
+        <w:rPr>
+          <w:b/>
+          <w:bCs/>
+          <w:color w:val="4EA72E" w:themeColor="accent6"/>
+          <w:sz w:val="40"/>
+          <w:szCs w:val="40"/>
+          <w:lang w:val="en-US"/>
+        </w:rPr>
+      </w:pPr>
+      <w:r>
+        <w:rPr>
+          <w:b/>
+          <w:bCs/>
+          <w:color w:val="4EA72E" w:themeColor="accent6"/>
+          <w:sz w:val="40"/>
+          <w:szCs w:val="40"/>
+          <w:lang w:val="en-US"/>
+        </w:rPr>
+        <w:t>INTERVALS</w:t>
+      </w:r>
+      <w:r>
+        <w:rPr>
+          <w:b/>
+          <w:bCs/>
+          <w:color w:val="4EA72E" w:themeColor="accent6"/>
+          <w:sz w:val="40"/>
+          <w:szCs w:val="40"/>
+          <w:lang w:val="en-US"/>
+        </w:rPr>
+        <w:t>:</w:t>
+      </w:r>
+    </w:p>
+    <w:p>
+      <w:pPr>
+        <w:rPr>
+          <w:b/>
+          <w:bCs/>
+          <w:lang w:val="en-US"/>
+        </w:rPr>
+      </w:pPr>
+      <w:r>
+        <w:rPr>
+          <w:b/>
+          <w:bCs/>
+          <w:color w:val="C00000"/>
+          <w:lang w:val="en-US"/>
+        </w:rPr>
+        <w:t xml:space="preserve">MERGE: </w:t>
+      </w:r>
+      <w:r>
+        <w:rPr>
+          <w:lang w:val="en-US"/>
+        </w:rPr>
+        <w:t>see</w:t>
+      </w:r>
+      <w:r>
+        <w:rPr>
+          <w:i/>
+          <w:iCs/>
+          <w:lang w:val="en-US"/>
+        </w:rPr>
+        <w:t xml:space="preserve"> 1</w:t>
+      </w:r>
+      <w:r>
+        <w:rPr>
+          <w:i/>
+          <w:iCs/>
+          <w:lang w:val="en-US"/>
+        </w:rPr>
+        <w:t>6</w:t>
+      </w:r>
+      <w:r>
+        <w:rPr>
+          <w:i/>
+          <w:iCs/>
+          <w:lang w:val="en-US"/>
+        </w:rPr>
+        <w:t>_</w:t>
+      </w:r>
+      <w:r>
+        <w:rPr>
+          <w:i/>
+          <w:iCs/>
+          <w:lang w:val="en-US"/>
+        </w:rPr>
+        <w:t>INTERVALS</w:t>
+      </w:r>
+      <w:r>
+        <w:rPr>
+          <w:i/>
+          <w:iCs/>
+          <w:lang w:val="en-US"/>
+        </w:rPr>
+        <w:t xml:space="preserve"> </w:t>
+      </w:r>
+      <w:r>
+        <w:rPr>
+          <w:lang w:val="en-US"/>
+        </w:rPr>
+        <w:t xml:space="preserve">problem </w:t>
+      </w:r>
+      <w:r>
+        <w:rPr>
+          <w:b/>
+          <w:bCs/>
+          <w:highlight w:val="yellow"/>
+          <w:lang w:val="en-US"/>
+        </w:rPr>
+        <w:t>56_merge_intervals</w:t>
+      </w:r>
+    </w:p>
+    <w:p>
+      <w:r>
+        <w:t>Possiamo farlo in vari modi:</w:t>
+      </w:r>
+    </w:p>
+    <w:p>
+      <w:pPr>
         <w:pStyle w:val="Paragrafoelenco"/>
-        <w:rPr>
-          <w:b/>
-          <w:bCs/>
-          <w:lang w:val="en-US"/>
-        </w:rPr>
-      </w:pPr>
+        <w:numPr>
+          <w:ilvl w:val="1"/>
+          <w:numId w:val="2"/>
+        </w:numPr>
+        <w:rPr>
+          <w:b/>
+          <w:bCs/>
+        </w:rPr>
+      </w:pPr>
+      <w:r>
+        <w:rPr>
+          <w:b/>
+          <w:bCs/>
+        </w:rPr>
+        <w:t>SORTING:</w:t>
+      </w:r>
+      <w:r>
+        <w:rPr>
+          <w:b/>
+          <w:bCs/>
+        </w:rPr>
+        <w:t xml:space="preserve"> </w:t>
+      </w:r>
+      <w:r>
+        <w:t xml:space="preserve">ordiniamo per START crescente e aggiorniamo solo END di </w:t>
+      </w:r>
+      <w:proofErr w:type="gramStart"/>
+      <w:r>
+        <w:t>res[</w:t>
+      </w:r>
+      <w:proofErr w:type="gramEnd"/>
+      <w:r>
+        <w:t xml:space="preserve">-1]  </w:t>
+      </w:r>
+      <w:r>
+        <w:sym w:font="Wingdings" w:char="F0E0"/>
+      </w:r>
+      <w:r>
+        <w:t xml:space="preserve"> </w:t>
+      </w:r>
+      <w:r>
+        <w:rPr>
+          <w:b/>
+          <w:bCs/>
+        </w:rPr>
+        <w:t>O(</w:t>
+      </w:r>
+      <w:proofErr w:type="spellStart"/>
+      <w:r>
+        <w:rPr>
+          <w:b/>
+          <w:bCs/>
+        </w:rPr>
+        <w:t>NlogN</w:t>
+      </w:r>
+      <w:proofErr w:type="spellEnd"/>
+      <w:r>
+        <w:rPr>
+          <w:b/>
+          <w:bCs/>
+        </w:rPr>
+        <w:t xml:space="preserve">) time and </w:t>
+      </w:r>
+      <w:proofErr w:type="gramStart"/>
+      <w:r>
+        <w:rPr>
+          <w:b/>
+          <w:bCs/>
+        </w:rPr>
+        <w:t>O(</w:t>
+      </w:r>
+      <w:proofErr w:type="gramEnd"/>
+      <w:r>
+        <w:rPr>
+          <w:b/>
+          <w:bCs/>
+        </w:rPr>
+        <w:t xml:space="preserve">1) extra </w:t>
+      </w:r>
+      <w:proofErr w:type="spellStart"/>
+      <w:r>
+        <w:rPr>
+          <w:b/>
+          <w:bCs/>
+        </w:rPr>
+        <w:t>space</w:t>
+      </w:r>
+      <w:proofErr w:type="spellEnd"/>
+    </w:p>
+    <w:p>
+      <w:pPr>
+        <w:pStyle w:val="Paragrafoelenco"/>
+        <w:numPr>
+          <w:ilvl w:val="1"/>
+          <w:numId w:val="2"/>
+        </w:numPr>
+        <w:rPr>
+          <w:b/>
+          <w:bCs/>
+        </w:rPr>
+      </w:pPr>
+      <w:r>
+        <w:rPr>
+          <w:b/>
+          <w:bCs/>
+        </w:rPr>
+        <w:t>SWEEP LINE ALGORITHM:</w:t>
+      </w:r>
+      <w:r>
+        <w:t xml:space="preserve"> </w:t>
+      </w:r>
+      <w:r>
+        <w:t xml:space="preserve">contiamo il numero di intervalli </w:t>
+      </w:r>
+      <w:r>
+        <w:rPr>
+          <w:b/>
+          <w:bCs/>
+        </w:rPr>
+        <w:t>ATTUALMENTE ATTIVI</w:t>
+      </w:r>
+      <w:r>
+        <w:t xml:space="preserve"> mediante positive </w:t>
+      </w:r>
+      <w:proofErr w:type="spellStart"/>
+      <w:r>
+        <w:t>count</w:t>
+      </w:r>
+      <w:proofErr w:type="spellEnd"/>
+      <w:r>
+        <w:t xml:space="preserve"> su start e negative </w:t>
+      </w:r>
+      <w:proofErr w:type="spellStart"/>
+      <w:r>
+        <w:t>count</w:t>
+      </w:r>
+      <w:proofErr w:type="spellEnd"/>
+      <w:r>
+        <w:t xml:space="preserve"> su end </w:t>
+      </w:r>
+      <w:r>
+        <w:sym w:font="Wingdings" w:char="F0E0"/>
+      </w:r>
+      <w:r>
+        <w:t xml:space="preserve"> iteriamo su </w:t>
+      </w:r>
+      <w:r>
+        <w:rPr>
+          <w:b/>
+          <w:bCs/>
+        </w:rPr>
+        <w:t>TIME ORDINATI</w:t>
+      </w:r>
+      <w:r>
+        <w:t xml:space="preserve"> e aggiorniamo </w:t>
+      </w:r>
+      <w:proofErr w:type="spellStart"/>
+      <w:r>
+        <w:t>count</w:t>
+      </w:r>
+      <w:proofErr w:type="spellEnd"/>
+      <w:r>
+        <w:t xml:space="preserve"> globale </w:t>
+      </w:r>
+      <w:r>
+        <w:sym w:font="Wingdings" w:char="F0E0"/>
+      </w:r>
+      <w:r>
+        <w:t xml:space="preserve"> quando </w:t>
+      </w:r>
+      <w:proofErr w:type="spellStart"/>
+      <w:r>
+        <w:t>count</w:t>
+      </w:r>
+      <w:proofErr w:type="spellEnd"/>
+      <w:r>
+        <w:t xml:space="preserve"> va a </w:t>
+      </w:r>
+      <w:r>
+        <w:rPr>
+          <w:i/>
+          <w:iCs/>
+          <w:u w:val="single"/>
+        </w:rPr>
+        <w:t>ZERO</w:t>
+      </w:r>
+      <w:r>
+        <w:t xml:space="preserve"> </w:t>
+      </w:r>
+      <w:r>
+        <w:sym w:font="Wingdings" w:char="F0E0"/>
+      </w:r>
+      <w:r>
+        <w:t xml:space="preserve"> intervallo </w:t>
+      </w:r>
+      <w:r>
+        <w:rPr>
+          <w:i/>
+          <w:iCs/>
+          <w:u w:val="single"/>
+        </w:rPr>
+        <w:t>terminato</w:t>
+      </w:r>
+      <w:r>
+        <w:t xml:space="preserve"> </w:t>
+      </w:r>
+      <w:r>
+        <w:sym w:font="Wingdings" w:char="F0E0"/>
+      </w:r>
+      <w:r>
+        <w:t xml:space="preserve"> aggiungiamo alla soluzione </w:t>
+      </w:r>
+      <w:r>
+        <w:sym w:font="Wingdings" w:char="F0E0"/>
+      </w:r>
+      <w:r>
+        <w:t xml:space="preserve"> </w:t>
+      </w:r>
+      <w:r>
+        <w:rPr>
+          <w:b/>
+          <w:bCs/>
+        </w:rPr>
+        <w:t>O(</w:t>
+      </w:r>
+      <w:proofErr w:type="spellStart"/>
+      <w:r>
+        <w:rPr>
+          <w:b/>
+          <w:bCs/>
+        </w:rPr>
+        <w:t>NlogN</w:t>
+      </w:r>
+      <w:proofErr w:type="spellEnd"/>
+      <w:r>
+        <w:rPr>
+          <w:b/>
+          <w:bCs/>
+        </w:rPr>
+        <w:t>) time and O(</w:t>
+      </w:r>
+      <w:r>
+        <w:rPr>
+          <w:b/>
+          <w:bCs/>
+        </w:rPr>
+        <w:t>N</w:t>
+      </w:r>
+      <w:r>
+        <w:rPr>
+          <w:b/>
+          <w:bCs/>
+        </w:rPr>
+        <w:t xml:space="preserve">) extra </w:t>
+      </w:r>
+      <w:proofErr w:type="spellStart"/>
+      <w:r>
+        <w:rPr>
+          <w:b/>
+          <w:bCs/>
+        </w:rPr>
+        <w:t>space</w:t>
+      </w:r>
+      <w:proofErr w:type="spellEnd"/>
+    </w:p>
+    <w:p>
+      <w:pPr>
+        <w:pStyle w:val="Paragrafoelenco"/>
+        <w:numPr>
+          <w:ilvl w:val="1"/>
+          <w:numId w:val="2"/>
+        </w:numPr>
+        <w:rPr>
+          <w:b/>
+          <w:bCs/>
+        </w:rPr>
+      </w:pPr>
+      <w:r>
+        <w:rPr>
+          <w:b/>
+          <w:bCs/>
+        </w:rPr>
+        <w:t>GREEDY:</w:t>
+      </w:r>
+      <w:r>
+        <w:t xml:space="preserve"> teniamo tracia di </w:t>
+      </w:r>
+      <w:r>
+        <w:rPr>
+          <w:b/>
+          <w:bCs/>
+        </w:rPr>
+        <w:t xml:space="preserve">TUTTI gli start da 0 a </w:t>
+      </w:r>
+      <w:proofErr w:type="spellStart"/>
+      <w:r>
+        <w:rPr>
+          <w:b/>
+          <w:bCs/>
+        </w:rPr>
+        <w:t>max_start</w:t>
+      </w:r>
+      <w:proofErr w:type="spellEnd"/>
+      <w:r>
+        <w:t xml:space="preserve"> e per ognuno associamo il </w:t>
+      </w:r>
+      <w:r>
+        <w:rPr>
+          <w:b/>
+          <w:bCs/>
+        </w:rPr>
+        <w:t>FARTHEST END raggiungibile</w:t>
+      </w:r>
+      <w:r>
+        <w:t xml:space="preserve">. Iteriamo su questi start </w:t>
+      </w:r>
+      <w:r>
+        <w:sym w:font="Wingdings" w:char="F0E0"/>
+      </w:r>
+      <w:r>
+        <w:t xml:space="preserve"> </w:t>
+      </w:r>
+      <w:r>
+        <w:rPr>
+          <w:b/>
+          <w:bCs/>
+        </w:rPr>
+        <w:t xml:space="preserve">aggiorniamo </w:t>
+      </w:r>
+      <w:proofErr w:type="spellStart"/>
+      <w:r>
+        <w:rPr>
+          <w:b/>
+          <w:bCs/>
+        </w:rPr>
+        <w:t>farthest</w:t>
+      </w:r>
+      <w:proofErr w:type="spellEnd"/>
+      <w:r>
+        <w:t xml:space="preserve"> se </w:t>
+      </w:r>
+      <w:r>
+        <w:rPr>
+          <w:i/>
+          <w:iCs/>
+          <w:u w:val="single"/>
+        </w:rPr>
+        <w:t>start esiste</w:t>
+      </w:r>
+      <w:r>
+        <w:t xml:space="preserve"> in </w:t>
+      </w:r>
+      <w:proofErr w:type="spellStart"/>
+      <w:r>
+        <w:t>intervals</w:t>
+      </w:r>
+      <w:proofErr w:type="spellEnd"/>
+      <w:r>
+        <w:t xml:space="preserve"> </w:t>
+      </w:r>
+      <w:r>
+        <w:sym w:font="Wingdings" w:char="F0E0"/>
+      </w:r>
+      <w:r>
+        <w:t xml:space="preserve"> se </w:t>
+      </w:r>
+      <w:r>
+        <w:rPr>
+          <w:b/>
+          <w:bCs/>
+        </w:rPr>
+        <w:t xml:space="preserve">start raggiunge </w:t>
+      </w:r>
+      <w:proofErr w:type="spellStart"/>
+      <w:r>
+        <w:rPr>
+          <w:b/>
+          <w:bCs/>
+        </w:rPr>
+        <w:t>farthest</w:t>
+      </w:r>
+      <w:proofErr w:type="spellEnd"/>
+      <w:r>
+        <w:t xml:space="preserve"> </w:t>
+      </w:r>
+      <w:r>
+        <w:sym w:font="Wingdings" w:char="F0E0"/>
+      </w:r>
+      <w:r>
+        <w:t xml:space="preserve"> aggiungiamo </w:t>
+      </w:r>
+      <w:r>
+        <w:rPr>
+          <w:b/>
+          <w:bCs/>
+        </w:rPr>
+        <w:t xml:space="preserve">[start, </w:t>
+      </w:r>
+      <w:proofErr w:type="spellStart"/>
+      <w:r>
+        <w:rPr>
+          <w:b/>
+          <w:bCs/>
+        </w:rPr>
+        <w:t>farthest</w:t>
+      </w:r>
+      <w:proofErr w:type="spellEnd"/>
+      <w:r>
+        <w:rPr>
+          <w:b/>
+          <w:bCs/>
+        </w:rPr>
+        <w:t xml:space="preserve">] </w:t>
+      </w:r>
+      <w:r>
+        <w:lastRenderedPageBreak/>
+        <w:t xml:space="preserve">alla soluzione e ricominciamo </w:t>
+      </w:r>
+      <w:r>
+        <w:rPr>
+          <w:i/>
+          <w:iCs/>
+          <w:u w:val="single"/>
+        </w:rPr>
+        <w:t xml:space="preserve">pulendo </w:t>
+      </w:r>
+      <w:proofErr w:type="spellStart"/>
+      <w:r>
+        <w:rPr>
+          <w:i/>
+          <w:iCs/>
+          <w:u w:val="single"/>
+        </w:rPr>
+        <w:t>farthest</w:t>
+      </w:r>
+      <w:proofErr w:type="spellEnd"/>
+      <w:r>
+        <w:rPr>
+          <w:i/>
+          <w:iCs/>
+          <w:u w:val="single"/>
+        </w:rPr>
+        <w:t xml:space="preserve"> </w:t>
+      </w:r>
+      <w:r>
+        <w:sym w:font="Wingdings" w:char="F0E0"/>
+      </w:r>
+      <w:r>
+        <w:t xml:space="preserve"> </w:t>
+      </w:r>
+      <w:proofErr w:type="gramStart"/>
+      <w:r>
+        <w:rPr>
+          <w:b/>
+          <w:bCs/>
+        </w:rPr>
+        <w:t>O(</w:t>
+      </w:r>
+      <w:proofErr w:type="gramEnd"/>
+      <w:r>
+        <w:rPr>
+          <w:b/>
+          <w:bCs/>
+        </w:rPr>
+        <w:t>N</w:t>
+      </w:r>
+      <w:r>
+        <w:rPr>
+          <w:b/>
+          <w:bCs/>
+        </w:rPr>
+        <w:t xml:space="preserve"> + MAX_START</w:t>
+      </w:r>
+      <w:r>
+        <w:rPr>
+          <w:b/>
+          <w:bCs/>
+        </w:rPr>
+        <w:t>) time and O(</w:t>
+      </w:r>
+      <w:r>
+        <w:rPr>
+          <w:b/>
+          <w:bCs/>
+        </w:rPr>
+        <w:t>MAX_START</w:t>
+      </w:r>
+      <w:r>
+        <w:rPr>
+          <w:b/>
+          <w:bCs/>
+        </w:rPr>
+        <w:t xml:space="preserve">) extra </w:t>
+      </w:r>
+      <w:proofErr w:type="spellStart"/>
+      <w:r>
+        <w:rPr>
+          <w:b/>
+          <w:bCs/>
+        </w:rPr>
+        <w:t>space</w:t>
+      </w:r>
+      <w:proofErr w:type="spellEnd"/>
     </w:p>
     <w:sectPr>
       <w:pgSz w:w="11906" w:h="16838"/>
@@ -15751,7 +16375,7 @@
   <w:abstractNum w:abstractNumId="1" w15:restartNumberingAfterBreak="0">
     <w:nsid w:val="08392BBB"/>
     <w:multiLevelType w:val="multilevel"/>
-    <w:tmpl w:val="B53659C0"/>
+    <w:tmpl w:val="70C22350"/>
     <w:lvl w:ilvl="0">
       <w:start w:val="1"/>
       <w:numFmt w:val="bullet"/>
@@ -15768,20 +16392,18 @@
         <w:sz w:val="20"/>
       </w:rPr>
     </w:lvl>
-    <w:lvl w:ilvl="1" w:tentative="1">
+    <w:lvl w:ilvl="1">
       <w:start w:val="1"/>
-      <w:numFmt w:val="bullet"/>
-      <w:lvlText w:val=""/>
+      <w:numFmt w:val="decimal"/>
+      <w:lvlText w:val="%2)"/>
       <w:lvlJc w:val="left"/>
       <w:pPr>
-        <w:tabs>
-          <w:tab w:val="num" w:pos="1440"/>
-        </w:tabs>
         <w:ind w:left="1440" w:hanging="360"/>
       </w:pPr>
       <w:rPr>
-        <w:rFonts w:ascii="Symbol" w:hAnsi="Symbol" w:hint="default"/>
-        <w:sz w:val="20"/>
+        <w:rFonts w:hint="default"/>
+        <w:b/>
+        <w:bCs w:val="0"/>
       </w:rPr>
     </w:lvl>
     <w:lvl w:ilvl="2" w:tentative="1">

</xml_diff>